<commit_message>
Wrote blurb on a nother nice study
</commit_message>
<xml_diff>
--- a/ms/ms.docx
+++ b/ms/ms.docx
@@ -184,18 +184,218 @@
         <w:t xml:space="preserve">) demonstrating the potential for conferring thermal tolerance to other plant species. The mechanisms by which fungal-virus associations confer thermal tolerance are not yet understood but are hypothesized to involve scavenging of reactive oxygen species (ROS) by fungal endophytes generated by plant defense mechanisms in response to heat stress.</w:t>
       </w:r>
     </w:p>
+    <w:p>
+      <w:pPr>
+        <w:pStyle w:val="BodyText"/>
+      </w:pPr>
+      <w:r>
+        <w:t xml:space="preserve">Li</w:t>
+      </w:r>
+      <w:r>
+        <w:t xml:space="preserve"> </w:t>
+      </w:r>
+      <w:r>
+        <w:rPr>
+          <w:iCs/>
+          <w:i/>
+        </w:rPr>
+        <w:t xml:space="preserve">et al</w:t>
+      </w:r>
+      <w:r>
+        <w:t xml:space="preserve"> </w:t>
+      </w:r>
+      <w:r>
+        <w:t xml:space="preserve">[2]</w:t>
+      </w:r>
+      <w:r>
+        <w:t xml:space="preserve"> </w:t>
+      </w:r>
+      <w:r>
+        <w:t xml:space="preserve">measured the thermal tolerance landscape for three aphid species that are pests for cereal crops globally to understand whether it could predict changes in community abundance. Using a thermal death time (TDT) approach to estimate the culmuative impacts of heat stress on survival they found that one species,</w:t>
+      </w:r>
+      <w:r>
+        <w:t xml:space="preserve"> </w:t>
+      </w:r>
+      <w:r>
+        <w:rPr>
+          <w:iCs/>
+          <w:i/>
+        </w:rPr>
+        <w:t xml:space="preserve">Rhopalosiphum padi</w:t>
+      </w:r>
+      <w:r>
+        <w:t xml:space="preserve">, showed high heat tolerance and accumulated less injury over natural temperature fluctuations, which may explain the increase in relative abundance of this species with extremely high temperatures observed in southern parts of its range. Li</w:t>
+      </w:r>
+      <w:r>
+        <w:t xml:space="preserve"> </w:t>
+      </w:r>
+      <w:r>
+        <w:rPr>
+          <w:iCs/>
+          <w:i/>
+        </w:rPr>
+        <w:t xml:space="preserve">et al</w:t>
+      </w:r>
+      <w:r>
+        <w:t xml:space="preserve"> </w:t>
+      </w:r>
+      <w:r>
+        <w:t xml:space="preserve">[2]</w:t>
+      </w:r>
+      <w:r>
+        <w:t xml:space="preserve"> </w:t>
+      </w:r>
+      <w:r>
+        <w:t xml:space="preserve">also found that different life-stages were affected differently by heat stress, with adults being more thermally tolerant than early developmental stages emphasising the need for models to capture such variation. However, such findings do not incorperate acclimation to heat stress or different microhabitat choice by the different species, which are both likely to be important for predicting the impacts of heat stress on community structure.</w:t>
+      </w:r>
+    </w:p>
     <w:bookmarkEnd w:id="20"/>
-    <w:bookmarkStart w:id="23" w:name="references"/>
+    <w:bookmarkStart w:id="21" w:name="X59e7b704256c8cc5dd63fceb7c1b3e3e4c292cd"/>
     <w:p>
       <w:pPr>
         <w:pStyle w:val="Heading1"/>
       </w:pPr>
       <w:r>
+        <w:t xml:space="preserve">Methods for manipulating thermal tolerance</w:t>
+      </w:r>
+    </w:p>
+    <w:p>
+      <w:pPr>
+        <w:pStyle w:val="FirstParagraph"/>
+      </w:pPr>
+      <w:r>
+        <w:rPr>
+          <w:iCs/>
+          <w:i/>
+        </w:rPr>
+        <w:t xml:space="preserve">Genetic engineering</w:t>
+      </w:r>
+      <w:r>
+        <w:t xml:space="preserve">: The use of genetic engineering to confer thermal tolerance to plants and animals is a promising avenue for enhancing thermal tolerance. For example, the overexpression of heat shock proteins (HSPs) in plants has been shown to enhance thermal tolerance. HSPs are a family of proteins that are upregulated in response to heat stress and are involved in protein folding and degradation, and the prevention of protein aggregation. CRISPR-Cas9 gene editing technology has been used to enhance thermal tolerance in plants by modifying genes involved in heat stress response.</w:t>
+      </w:r>
+    </w:p>
+    <w:p>
+      <w:pPr>
+        <w:pStyle w:val="BodyText"/>
+      </w:pPr>
+      <w:r>
+        <w:rPr>
+          <w:iCs/>
+          <w:i/>
+        </w:rPr>
+        <w:t xml:space="preserve">Selective breeding</w:t>
+      </w:r>
+      <w:r>
+        <w:t xml:space="preserve">: Artifical selection will be a useful avenue for both plants and animals to enhance thermal tolerance.</w:t>
+      </w:r>
+    </w:p>
+    <w:bookmarkEnd w:id="21"/>
+    <w:bookmarkStart w:id="23" w:name="X3db4787e514ceab4b2e9d0fd0ec7e860bb5f3cb"/>
+    <w:p>
+      <w:pPr>
+        <w:pStyle w:val="Heading1"/>
+      </w:pPr>
+      <w:r>
+        <w:t xml:space="preserve">Opportunities for modelling thermal tolerance landscapes to capture interactions*</w:t>
+      </w:r>
+    </w:p>
+    <w:p>
+      <w:pPr>
+        <w:pStyle w:val="FirstParagraph"/>
+      </w:pPr>
+      <w:r>
+        <w:t xml:space="preserve">-chat with Mike about this some more.</w:t>
+      </w:r>
+    </w:p>
+    <w:bookmarkStart w:id="22" w:name="Xe39187ca0e04528b0c65e890d7679dd29275baf"/>
+    <w:p>
+      <w:pPr>
+        <w:pStyle w:val="Heading2"/>
+      </w:pPr>
+      <w:r>
+        <w:t xml:space="preserve">Differenecs in focus for plants and animals</w:t>
+      </w:r>
+    </w:p>
+    <w:p>
+      <w:pPr>
+        <w:numPr>
+          <w:ilvl w:val="0"/>
+          <w:numId w:val="1001"/>
+        </w:numPr>
+        <w:pStyle w:val="Compact"/>
+      </w:pPr>
+      <w:r>
+        <w:t xml:space="preserve">Animals behave. We need to model that. HOw do changes in behaviour impact inetractions with other species and the environment. How might this impact plant productivity</w:t>
+      </w:r>
+    </w:p>
+    <w:bookmarkEnd w:id="22"/>
+    <w:bookmarkEnd w:id="23"/>
+    <w:bookmarkStart w:id="24" w:name="future-directions"/>
+    <w:p>
+      <w:pPr>
+        <w:pStyle w:val="Heading1"/>
+      </w:pPr>
+      <w:r>
+        <w:t xml:space="preserve">Future Directions</w:t>
+      </w:r>
+    </w:p>
+    <w:p>
+      <w:pPr>
+        <w:pStyle w:val="FirstParagraph"/>
+      </w:pPr>
+      <w:r>
+        <w:rPr>
+          <w:iCs/>
+          <w:i/>
+        </w:rPr>
+        <w:t xml:space="preserve">Better understanding of the mechanisms enhancing thermal tolerance in plants and animals</w:t>
+      </w:r>
+      <w:r>
+        <w:t xml:space="preserve">: We need to understand the genomic, cellular and physiological processes that confer greater thermal tolerance and help prepare organisms for future heat stress events.</w:t>
+      </w:r>
+    </w:p>
+    <w:p>
+      <w:pPr>
+        <w:pStyle w:val="BodyText"/>
+      </w:pPr>
+      <w:r>
+        <w:rPr>
+          <w:iCs/>
+          <w:i/>
+        </w:rPr>
+        <w:t xml:space="preserve">Modelling inetractions among plants and animals to build community thermal tolerance landscapes and predict how heat stress events will affect communities</w:t>
+      </w:r>
+      <w:r>
+        <w:t xml:space="preserve">: We need to understand how thermal tolerance of individual species will affect the thermal tolerance of communities and ecosystems.</w:t>
+      </w:r>
+    </w:p>
+    <w:p>
+      <w:pPr>
+        <w:pStyle w:val="BodyText"/>
+      </w:pPr>
+      <w:r>
+        <w:rPr>
+          <w:iCs/>
+          <w:i/>
+        </w:rPr>
+        <w:t xml:space="preserve">Trade-offs between thermal tolerance and other traits</w:t>
+      </w:r>
+      <w:r>
+        <w:t xml:space="preserve">: We need to understand the trade-offs between thermal tolerance and other traits such as growth rate, reproduction, and competitive ability. It is fine to confer greater thermal tolerance resistance but if this comes at a cost to reproduction, growth or biomass accumulation, then it may not be beneficial. NEED EXAPLES</w:t>
+      </w:r>
+    </w:p>
+    <w:bookmarkEnd w:id="24"/>
+    <w:bookmarkStart w:id="28" w:name="references"/>
+    <w:p>
+      <w:pPr>
+        <w:pStyle w:val="Heading1"/>
+      </w:pPr>
+      <w:r>
         <w:t xml:space="preserve">References</w:t>
       </w:r>
     </w:p>
-    <w:bookmarkStart w:id="22" w:name="refs"/>
-    <w:bookmarkStart w:id="21" w:name="ref-marquez2007virus"/>
+    <w:bookmarkStart w:id="27" w:name="refs"/>
+    <w:bookmarkStart w:id="25" w:name="ref-marquez2007virus"/>
     <w:p>
       <w:pPr>
         <w:pStyle w:val="Bibliography"/>
@@ -245,9 +445,60 @@
         <w:t xml:space="preserve">315, 513–515</w:t>
       </w:r>
     </w:p>
-    <w:bookmarkEnd w:id="21"/>
-    <w:bookmarkEnd w:id="22"/>
-    <w:bookmarkEnd w:id="23"/>
+    <w:bookmarkEnd w:id="25"/>
+    <w:bookmarkStart w:id="26" w:name="ref-li2023interspecific"/>
+    <w:p>
+      <w:pPr>
+        <w:pStyle w:val="Bibliography"/>
+      </w:pPr>
+      <w:r>
+        <w:t xml:space="preserve">2.</w:t>
+      </w:r>
+      <w:r>
+        <w:t xml:space="preserve"> </w:t>
+      </w:r>
+      <w:r>
+        <w:t xml:space="preserve">	</w:t>
+      </w:r>
+      <w:r>
+        <w:t xml:space="preserve">Li, Y.-J.</w:t>
+      </w:r>
+      <w:r>
+        <w:t xml:space="preserve"> </w:t>
+      </w:r>
+      <w:r>
+        <w:rPr>
+          <w:iCs/>
+          <w:i/>
+        </w:rPr>
+        <w:t xml:space="preserve">et al.</w:t>
+      </w:r>
+      <w:r>
+        <w:t xml:space="preserve"> </w:t>
+      </w:r>
+      <w:r>
+        <w:t xml:space="preserve">(2023) Interspecific differences in thermal tolerance landscape explain aphid community abundance under climate change.</w:t>
+      </w:r>
+      <w:r>
+        <w:t xml:space="preserve"> </w:t>
+      </w:r>
+      <w:r>
+        <w:rPr>
+          <w:iCs/>
+          <w:i/>
+        </w:rPr>
+        <w:t xml:space="preserve">Journal of Thermal Biology</w:t>
+      </w:r>
+      <w:r>
+        <w:t xml:space="preserve"> </w:t>
+      </w:r>
+      <w:r>
+        <w:t xml:space="preserve">114, 103583</w:t>
+      </w:r>
+    </w:p>
+    <w:bookmarkEnd w:id="26"/>
+    <w:bookmarkEnd w:id="27"/>
+    <w:bookmarkEnd w:id="28"/>
     <w:sectPr>
       <w:pgSz w:h="15840" w:w="12240"/>
       <w:pgMar w:bottom="851" w:footer="720" w:gutter="0" w:header="720" w:left="851" w:right="851" w:top="851"/>
@@ -829,6 +1080,82 @@
       </w:pPr>
     </w:lvl>
   </w:abstractNum>
+  <w:abstractNum w:abstractNumId="991">
+    <w:nsid w:val="A991"/>
+    <w:multiLevelType w:val="multilevel"/>
+    <w:lvl w:ilvl="0">
+      <w:numFmt w:val="bullet"/>
+      <w:lvlText w:val="•"/>
+      <w:lvlJc w:val="left"/>
+      <w:pPr>
+        <w:ind w:left="720" w:hanging="480"/>
+      </w:pPr>
+    </w:lvl>
+    <w:lvl w:ilvl="1">
+      <w:numFmt w:val="bullet"/>
+      <w:lvlText w:val="–"/>
+      <w:lvlJc w:val="left"/>
+      <w:pPr>
+        <w:ind w:left="1440" w:hanging="480"/>
+      </w:pPr>
+    </w:lvl>
+    <w:lvl w:ilvl="2">
+      <w:numFmt w:val="bullet"/>
+      <w:lvlText w:val="•"/>
+      <w:lvlJc w:val="left"/>
+      <w:pPr>
+        <w:ind w:left="2160" w:hanging="480"/>
+      </w:pPr>
+    </w:lvl>
+    <w:lvl w:ilvl="3">
+      <w:numFmt w:val="bullet"/>
+      <w:lvlText w:val="–"/>
+      <w:lvlJc w:val="left"/>
+      <w:pPr>
+        <w:ind w:left="2880" w:hanging="480"/>
+      </w:pPr>
+    </w:lvl>
+    <w:lvl w:ilvl="4">
+      <w:numFmt w:val="bullet"/>
+      <w:lvlText w:val="•"/>
+      <w:lvlJc w:val="left"/>
+      <w:pPr>
+        <w:ind w:left="3600" w:hanging="480"/>
+      </w:pPr>
+    </w:lvl>
+    <w:lvl w:ilvl="5">
+      <w:numFmt w:val="bullet"/>
+      <w:lvlText w:val="–"/>
+      <w:lvlJc w:val="left"/>
+      <w:pPr>
+        <w:ind w:left="4320" w:hanging="480"/>
+      </w:pPr>
+    </w:lvl>
+    <w:lvl w:ilvl="6">
+      <w:numFmt w:val="bullet"/>
+      <w:lvlText w:val="•"/>
+      <w:lvlJc w:val="left"/>
+      <w:pPr>
+        <w:ind w:left="5040" w:hanging="480"/>
+      </w:pPr>
+    </w:lvl>
+    <w:lvl w:ilvl="7">
+      <w:numFmt w:val="bullet"/>
+      <w:lvlText w:val="–"/>
+      <w:lvlJc w:val="left"/>
+      <w:pPr>
+        <w:ind w:left="5760" w:hanging="480"/>
+      </w:pPr>
+    </w:lvl>
+    <w:lvl w:ilvl="8">
+      <w:numFmt w:val="bullet"/>
+      <w:lvlText w:val="•"/>
+      <w:lvlJc w:val="left"/>
+      <w:pPr>
+        <w:ind w:left="6480" w:hanging="480"/>
+      </w:pPr>
+    </w:lvl>
+  </w:abstractNum>
   <w:num w16cid:durableId="423309980" w:numId="1">
     <w:abstractNumId w:val="11"/>
   </w:num>
@@ -1041,6 +1368,9 @@
   </w:num>
   <w:num w:numId="1000">
     <w:abstractNumId w:val="990"/>
+  </w:num>
+  <w:num w:numId="1001">
+    <w:abstractNumId w:val="991"/>
   </w:num>
 </w:numbering>
 </file>

</xml_diff>

<commit_message>
Updating outline based on discussions with group
</commit_message>
<xml_diff>
--- a/ms/ms.docx
+++ b/ms/ms.docx
@@ -76,122 +76,444 @@
         <w:t xml:space="preserve">world</w:t>
       </w:r>
     </w:p>
-    <w:bookmarkStart w:id="20" w:name="introduction"/>
+    <w:bookmarkStart w:id="20" w:name="introduction-dan"/>
     <w:p>
       <w:pPr>
         <w:pStyle w:val="Heading1"/>
       </w:pPr>
       <w:r>
-        <w:t xml:space="preserve">Introduction</w:t>
-      </w:r>
-    </w:p>
-    <w:p>
-      <w:pPr>
-        <w:pStyle w:val="FirstParagraph"/>
-      </w:pPr>
-      <w:r>
-        <w:t xml:space="preserve">Climate change is expected to result in warmer and more variable thermal environments globally resulting in more frequent and severe heat wave events</w:t>
-      </w:r>
-      <w:r>
-        <w:t xml:space="preserve"> </w:t>
-      </w:r>
-      <w:r>
-        <w:t xml:space="preserve">[1,2]</w:t>
-      </w:r>
-      <w:r>
-        <w:t xml:space="preserve">. Greater thermal variability will result in organisms experiencing more extreme heat wave events that exceed species tolerance limits. Exceeding physiological limits will have profound impacts on organismal growth, survival and reproduction with cascading effects on population dynamics, community composition and ecosystem services that human populations rely upon. Climate variability has already resulted in dramatic declines in pollinator abundance</w:t>
-      </w:r>
-      <w:r>
-        <w:t xml:space="preserve"> </w:t>
-      </w:r>
-      <w:r>
-        <w:t xml:space="preserve">[3]</w:t>
-      </w:r>
-      <w:r>
-        <w:t xml:space="preserve"> </w:t>
-      </w:r>
-      <w:r>
-        <w:t xml:space="preserve">and in crop yields globally</w:t>
-      </w:r>
-      <w:r>
-        <w:t xml:space="preserve"> </w:t>
-      </w:r>
-      <w:r>
-        <w:t xml:space="preserve">[4,5]</w:t>
-      </w:r>
-      <w:r>
-        <w:t xml:space="preserve">, but the causes underlying such declines are not fully understood. Declines are likely driven by a combination of direct effects of heat stress on plant and insect physiology, indirect effects on interactions among species – including the microbial communities with which they interact</w:t>
-      </w:r>
-      <w:r>
-        <w:t xml:space="preserve"> </w:t>
-      </w:r>
-      <w:r>
-        <w:t xml:space="preserve">[6]</w:t>
-      </w:r>
-      <w:r>
-        <w:t xml:space="preserve"> </w:t>
-      </w:r>
-      <w:r>
-        <w:t xml:space="preserve">– and how temperature interacts with other environmental stressors. Understanding the dynamic interplay between direct and indirect interactions has been hampered by the complexity of community interactions, lack of methods for measuring and predicting changes in interaction strength in diverse communities and how such interactions impact community assembly</w:t>
-      </w:r>
-      <w:r>
-        <w:t xml:space="preserve"> </w:t>
-      </w:r>
-      <w:r>
-        <w:t xml:space="preserve">[6]</w:t>
-      </w:r>
-      <w:r>
-        <w:t xml:space="preserve">. Understanding how thermal tolerance varies across populations and communities is crucial for predicting how climate change will affect ecosystems and the services they provide.</w:t>
-      </w:r>
-    </w:p>
-    <w:p>
-      <w:pPr>
+        <w:t xml:space="preserve">Introduction (Dan)</w:t>
+      </w:r>
+    </w:p>
+    <w:p>
+      <w:pPr>
+        <w:pStyle w:val="Compact"/>
         <w:numPr>
           <w:ilvl w:val="0"/>
           <w:numId w:val="1001"/>
         </w:numPr>
       </w:pPr>
       <w:r>
-        <w:t xml:space="preserve">thermal load sensitivity, damage and repair as key concepts to introduce</w:t>
-      </w:r>
-    </w:p>
-    <w:p>
-      <w:pPr>
+        <w:t xml:space="preserve">What is the problem? Extreme heat events are increasing in intensity and frequency globally.</w:t>
+      </w:r>
+    </w:p>
+    <w:p>
+      <w:pPr>
+        <w:pStyle w:val="Compact"/>
         <w:numPr>
           <w:ilvl w:val="0"/>
           <w:numId w:val="1001"/>
         </w:numPr>
       </w:pPr>
       <w:r>
-        <w:t xml:space="preserve">What we hope to achieve in the paper.</w:t>
+        <w:t xml:space="preserve">Why is it important? Heat stress can have profound impacts on plant / animal survival and reproduction that can reshape communities by impacting population growth and abundance.</w:t>
+      </w:r>
+    </w:p>
+    <w:p>
+      <w:pPr>
+        <w:pStyle w:val="Compact"/>
+        <w:numPr>
+          <w:ilvl w:val="0"/>
+          <w:numId w:val="1001"/>
+        </w:numPr>
+      </w:pPr>
+      <w:r>
+        <w:t xml:space="preserve">What are the knowledge gaps with respect to predicting heat stress responses on entire communities?</w:t>
+      </w:r>
+    </w:p>
+    <w:p>
+      <w:pPr>
+        <w:pStyle w:val="Compact"/>
+        <w:numPr>
+          <w:ilvl w:val="1"/>
+          <w:numId w:val="1002"/>
+        </w:numPr>
+      </w:pPr>
+      <w:r>
+        <w:t xml:space="preserve">We lack a mechanistic understanding of how heat stress impacts interactions among species in communities.</w:t>
+      </w:r>
+    </w:p>
+    <w:p>
+      <w:pPr>
+        <w:pStyle w:val="Compact"/>
+        <w:numPr>
+          <w:ilvl w:val="1"/>
+          <w:numId w:val="1002"/>
+        </w:numPr>
+      </w:pPr>
+      <w:r>
+        <w:t xml:space="preserve">We lack an integrated modelling framework that transcends disparate disciplines that are siloed to predict how heat stress will affect communities.</w:t>
+      </w:r>
+    </w:p>
+    <w:p>
+      <w:pPr>
+        <w:pStyle w:val="Compact"/>
+        <w:numPr>
+          <w:ilvl w:val="1"/>
+          <w:numId w:val="1002"/>
+        </w:numPr>
+      </w:pPr>
+      <w:r>
+        <w:t xml:space="preserve">Integrating modeling approaches across disciplines is critical to predicting how heat stress will affect communities.</w:t>
+      </w:r>
+    </w:p>
+    <w:p>
+      <w:pPr>
+        <w:pStyle w:val="Compact"/>
+        <w:numPr>
+          <w:ilvl w:val="0"/>
+          <w:numId w:val="1001"/>
+        </w:numPr>
+      </w:pPr>
+      <w:r>
+        <w:t xml:space="preserve">What we hope to achieve in the paper to overcome this challenge.</w:t>
+      </w:r>
+    </w:p>
+    <w:p>
+      <w:pPr>
+        <w:pStyle w:val="FirstParagraph"/>
+      </w:pPr>
+      <w:r>
+        <w:t xml:space="preserve">Climate change is expected to result in warmer and more variable thermal environments globally resulting in more frequent and severe heat wave events</w:t>
+      </w:r>
+      <w:r>
+        <w:t xml:space="preserve"> </w:t>
+      </w:r>
+      <w:r>
+        <w:t xml:space="preserve">[1,2]</w:t>
+      </w:r>
+      <w:r>
+        <w:t xml:space="preserve">. Greater thermal variability will result in organisms experiencing more extreme heat wave events that exceed species tolerance limits. Exceeding physiological limits will have profound impacts on organismal growth, survival and reproduction with cascading effects on population dynamics, community composition and ecosystem services that human populations rely upon. Climate variability has already resulted in dramatic declines in pollinator abundance</w:t>
+      </w:r>
+      <w:r>
+        <w:t xml:space="preserve"> </w:t>
+      </w:r>
+      <w:r>
+        <w:t xml:space="preserve">[3]</w:t>
+      </w:r>
+      <w:r>
+        <w:t xml:space="preserve"> </w:t>
+      </w:r>
+      <w:r>
+        <w:t xml:space="preserve">and in crop yields globally</w:t>
+      </w:r>
+      <w:r>
+        <w:t xml:space="preserve"> </w:t>
+      </w:r>
+      <w:r>
+        <w:t xml:space="preserve">[4,5]</w:t>
+      </w:r>
+      <w:r>
+        <w:t xml:space="preserve">, but the causes underlying such declines are not fully understood. Declines are likely driven by a combination of direct effects of heat stress on plant and insect physiology, indirect effects on interactions among species – including the microbial communities with which they interact</w:t>
+      </w:r>
+      <w:r>
+        <w:t xml:space="preserve"> </w:t>
+      </w:r>
+      <w:r>
+        <w:t xml:space="preserve">[6]</w:t>
+      </w:r>
+      <w:r>
+        <w:t xml:space="preserve"> </w:t>
+      </w:r>
+      <w:r>
+        <w:t xml:space="preserve">– and how temperature interacts with other environmental stressors. Understanding the dynamic interplay between direct and indirect interactions has been hampered by the complexity of community interactions, lack of methods for measuring and predicting changes in interaction strength in diverse communities and how such interactions impact community assembly</w:t>
+      </w:r>
+      <w:r>
+        <w:t xml:space="preserve"> </w:t>
+      </w:r>
+      <w:r>
+        <w:t xml:space="preserve">[6]</w:t>
+      </w:r>
+      <w:r>
+        <w:t xml:space="preserve">. Understanding how thermal tolerance varies across populations and communities is crucial for predicting how climate change will affect ecosystems and the services they provide.</w:t>
       </w:r>
     </w:p>
     <w:bookmarkEnd w:id="20"/>
-    <w:bookmarkStart w:id="21" w:name="Xace65f94a87ca63a4d39ef3eefa6af6060fa4e6"/>
+    <w:bookmarkStart w:id="21" w:name="Xd79c562522abe4ff7b2b4e4d08f68fe8886aa03"/>
     <w:p>
       <w:pPr>
         <w:pStyle w:val="Heading1"/>
       </w:pPr>
       <w:r>
-        <w:t xml:space="preserve">Interactions among species affect thermal tolerance: direct and indirect effects</w:t>
-      </w:r>
-    </w:p>
-    <w:p>
-      <w:pPr>
-        <w:pStyle w:val="FirstParagraph"/>
-      </w:pPr>
-      <w:r>
-        <w:t xml:space="preserve">Competition among species within a community can influence a focal species’ tolerance to heat stress. Competition can influence microhabitat selection and the availability of thermal refugia which can protect against thermal extremes, the diet of a focal species that can indirectly influence physiological tolerance of temperature stress, and the availability of resources that can help buffer against heat stress. For example, Li</w:t>
-      </w:r>
-      <w:r>
-        <w:t xml:space="preserve"> </w:t>
-      </w:r>
-      <w:r>
-        <w:rPr>
-          <w:i/>
-          <w:iCs/>
-        </w:rPr>
-        <w:t xml:space="preserve">et al.</w:t>
+        <w:t xml:space="preserve">How can we model the effects of extreme temperatures on individual species within communities? Capturing the balance between physiological damage and repair using thermal load sensitivity theory (Dan, Adrienne)</w:t>
+      </w:r>
+    </w:p>
+    <w:p>
+      <w:pPr>
+        <w:pStyle w:val="Compact"/>
+        <w:numPr>
+          <w:ilvl w:val="0"/>
+          <w:numId w:val="1003"/>
+        </w:numPr>
+      </w:pPr>
+      <w:r>
+        <w:t xml:space="preserve">Introduce thermal load sensitivity theory</w:t>
+      </w:r>
+    </w:p>
+    <w:p>
+      <w:pPr>
+        <w:pStyle w:val="Compact"/>
+        <w:numPr>
+          <w:ilvl w:val="1"/>
+          <w:numId w:val="1004"/>
+        </w:numPr>
+      </w:pPr>
+      <w:r>
+        <w:t xml:space="preserve">Heat effects depend on the</w:t>
+      </w:r>
+      <w:r>
+        <w:t xml:space="preserve"> </w:t>
+      </w:r>
+      <w:r>
+        <w:rPr>
+          <w:i/>
+          <w:iCs/>
+        </w:rPr>
+        <w:t xml:space="preserve">exposure</w:t>
+      </w:r>
+      <w:r>
+        <w:t xml:space="preserve"> </w:t>
+      </w:r>
+      <w:r>
+        <w:t xml:space="preserve">and</w:t>
+      </w:r>
+      <w:r>
+        <w:t xml:space="preserve"> </w:t>
+      </w:r>
+      <w:r>
+        <w:rPr>
+          <w:i/>
+          <w:iCs/>
+        </w:rPr>
+        <w:t xml:space="preserve">sensitivity</w:t>
+      </w:r>
+    </w:p>
+    <w:p>
+      <w:pPr>
+        <w:pStyle w:val="Compact"/>
+        <w:numPr>
+          <w:ilvl w:val="1"/>
+          <w:numId w:val="1004"/>
+        </w:numPr>
+      </w:pPr>
+      <w:r>
+        <w:t xml:space="preserve">Mechanistically involves the accumulation of damage and repair over time in response to a temperature stressor</w:t>
+      </w:r>
+    </w:p>
+    <w:p>
+      <w:pPr>
+        <w:pStyle w:val="Compact"/>
+        <w:numPr>
+          <w:ilvl w:val="1"/>
+          <w:numId w:val="1004"/>
+        </w:numPr>
+      </w:pPr>
+      <w:r>
+        <w:t xml:space="preserve">We know different species will be exposed to extreme heat at different life stages</w:t>
+      </w:r>
+    </w:p>
+    <w:p>
+      <w:pPr>
+        <w:pStyle w:val="Compact"/>
+        <w:numPr>
+          <w:ilvl w:val="1"/>
+          <w:numId w:val="1004"/>
+        </w:numPr>
+      </w:pPr>
+      <w:r>
+        <w:t xml:space="preserve">We know sensitivity will vary across species and life stages</w:t>
+      </w:r>
+    </w:p>
+    <w:p>
+      <w:pPr>
+        <w:pStyle w:val="Compact"/>
+        <w:numPr>
+          <w:ilvl w:val="1"/>
+          <w:numId w:val="1004"/>
+        </w:numPr>
+      </w:pPr>
+      <w:r>
+        <w:t xml:space="preserve">We can make predictions about impacts of heat on: 1) survival and 2) reproduction across life stages and even tissues</w:t>
+      </w:r>
+    </w:p>
+    <w:p>
+      <w:pPr>
+        <w:pStyle w:val="Compact"/>
+        <w:numPr>
+          <w:ilvl w:val="1"/>
+          <w:numId w:val="1004"/>
+        </w:numPr>
+      </w:pPr>
+      <w:r>
+        <w:t xml:space="preserve">Can be applied to both plants and animals- allows for lagged effects of heat stress on survival and reproduction in response to short term heat stress events</w:t>
+      </w:r>
+    </w:p>
+    <w:p>
+      <w:pPr>
+        <w:pStyle w:val="Compact"/>
+        <w:numPr>
+          <w:ilvl w:val="1"/>
+          <w:numId w:val="1004"/>
+        </w:numPr>
+      </w:pPr>
+      <w:r>
+        <w:t xml:space="preserve">Captured by modelling thermal effects of the severity of temperature and the amount of time an organism is exposed to that temperature on survival and reproduction of given life stages</w:t>
+      </w:r>
+    </w:p>
+    <w:p>
+      <w:pPr>
+        <w:pStyle w:val="Compact"/>
+        <w:numPr>
+          <w:ilvl w:val="1"/>
+          <w:numId w:val="1004"/>
+        </w:numPr>
+      </w:pPr>
+      <w:r>
+        <w:t xml:space="preserve">Concepts can be applied to both plants and animals, and targeted to key tissues</w:t>
+      </w:r>
+    </w:p>
+    <w:p>
+      <w:pPr>
+        <w:pStyle w:val="Compact"/>
+        <w:numPr>
+          <w:ilvl w:val="1"/>
+          <w:numId w:val="1004"/>
+        </w:numPr>
+      </w:pPr>
+      <w:r>
+        <w:t xml:space="preserve">Critical to TLS is the idea of damage accumulation and repair over time in response to a temperature stressor</w:t>
+      </w:r>
+    </w:p>
+    <w:p>
+      <w:pPr>
+        <w:pStyle w:val="Compact"/>
+        <w:numPr>
+          <w:ilvl w:val="1"/>
+          <w:numId w:val="1004"/>
+        </w:numPr>
+      </w:pPr>
+      <w:r>
+        <w:t xml:space="preserve">Figure 1: demonstrating how thermal load sensitivity can be used to predict heat stress impacts on plants and animals, survival, reproductive tissue. Simplified.</w:t>
+      </w:r>
+    </w:p>
+    <w:bookmarkEnd w:id="21"/>
+    <w:bookmarkStart w:id="22" w:name="Xe1d1003736343a29cd08870891dffad4c6d0df0"/>
+    <w:p>
+      <w:pPr>
+        <w:pStyle w:val="Heading1"/>
+      </w:pPr>
+      <w:r>
+        <w:t xml:space="preserve">How can we model temperature</w:t>
+      </w:r>
+      <w:r>
+        <w:t xml:space="preserve"> </w:t>
+      </w:r>
+      <w:r>
+        <w:rPr>
+          <w:i/>
+          <w:iCs/>
+        </w:rPr>
+        <w:t xml:space="preserve">exposure</w:t>
+      </w:r>
+      <w:r>
+        <w:t xml:space="preserve"> </w:t>
+      </w:r>
+      <w:r>
+        <w:t xml:space="preserve">across diverse species and communities? Combining TLS with biophysical and dynamic energy budget models (Mike, Belinda, Dan)</w:t>
+      </w:r>
+    </w:p>
+    <w:p>
+      <w:pPr>
+        <w:pStyle w:val="Compact"/>
+        <w:numPr>
+          <w:ilvl w:val="0"/>
+          <w:numId w:val="1005"/>
+        </w:numPr>
+      </w:pPr>
+      <w:r>
+        <w:t xml:space="preserve">Introduce biophysical and dynamic energy budget models</w:t>
+      </w:r>
+    </w:p>
+    <w:p>
+      <w:pPr>
+        <w:pStyle w:val="Compact"/>
+        <w:numPr>
+          <w:ilvl w:val="1"/>
+          <w:numId w:val="1006"/>
+        </w:numPr>
+      </w:pPr>
+      <w:r>
+        <w:t xml:space="preserve">Biophysical models are used to predict how temperature affects the energy balance of an organism</w:t>
+      </w:r>
+    </w:p>
+    <w:p>
+      <w:pPr>
+        <w:pStyle w:val="Compact"/>
+        <w:numPr>
+          <w:ilvl w:val="1"/>
+          <w:numId w:val="1006"/>
+        </w:numPr>
+      </w:pPr>
+      <w:r>
+        <w:t xml:space="preserve">DEB models are used to predict how temperature affects the energy budget of an organism</w:t>
+      </w:r>
+    </w:p>
+    <w:p>
+      <w:pPr>
+        <w:pStyle w:val="Compact"/>
+        <w:numPr>
+          <w:ilvl w:val="1"/>
+          <w:numId w:val="1006"/>
+        </w:numPr>
+      </w:pPr>
+      <w:r>
+        <w:t xml:space="preserve">Both models can be used to predict how temperature affects the growth, reproduction and survival of an organism</w:t>
+      </w:r>
+    </w:p>
+    <w:p>
+      <w:pPr>
+        <w:pStyle w:val="Compact"/>
+        <w:numPr>
+          <w:ilvl w:val="1"/>
+          <w:numId w:val="1006"/>
+        </w:numPr>
+      </w:pPr>
+      <w:r>
+        <w:t xml:space="preserve">Combining these models with TLS can help predict how temperature affects the survival and reproduction of a focal species in a community</w:t>
+      </w:r>
+    </w:p>
+    <w:bookmarkEnd w:id="22"/>
+    <w:bookmarkStart w:id="23" w:name="X912421511e823c06f4fc0f9a5ad59fbaf0e5b09"/>
+    <w:p>
+      <w:pPr>
+        <w:pStyle w:val="Heading1"/>
+      </w:pPr>
+      <w:r>
+        <w:t xml:space="preserve">How can we link mechanistic physiological models with population and community ecology theory? (Margie)</w:t>
+      </w:r>
+    </w:p>
+    <w:p>
+      <w:pPr>
+        <w:pStyle w:val="Compact"/>
+        <w:numPr>
+          <w:ilvl w:val="0"/>
+          <w:numId w:val="1007"/>
+        </w:numPr>
+      </w:pPr>
+      <w:r>
+        <w:t xml:space="preserve">Introducing population and network models to link outputs from DEB (survival, reproduction, abundance) to population growth.</w:t>
+      </w:r>
+    </w:p>
+    <w:p>
+      <w:pPr>
+        <w:pStyle w:val="Compact"/>
+        <w:numPr>
+          <w:ilvl w:val="0"/>
+          <w:numId w:val="1007"/>
+        </w:numPr>
+      </w:pPr>
+      <w:r>
+        <w:t xml:space="preserve">How people are analysing communities with network theory. Some important papers</w:t>
       </w:r>
       <w:r>
         <w:t xml:space="preserve"> </w:t>
@@ -203,26 +525,186 @@
         <w:t xml:space="preserve"> </w:t>
       </w:r>
       <w:r>
-        <w:t xml:space="preserve">measured the thermal tolerance landscape for three aphid species that are pests for cereal crops globally to understand whether they could predict changes in community abundance. Using a thermal death time (TDT) approach to estimate the cumulative impacts of heat stress on survival they found that one species,</w:t>
-      </w:r>
-      <w:r>
-        <w:t xml:space="preserve"> </w:t>
-      </w:r>
-      <w:r>
-        <w:rPr>
-          <w:i/>
-          <w:iCs/>
-        </w:rPr>
-        <w:t xml:space="preserve">Rhopalosiphum padi</w:t>
-      </w:r>
-      <w:r>
-        <w:t xml:space="preserve">, showed high heat tolerance and accumulated less injury over natural temperature fluctuations. The ability to maintain high relative abundance in the face of extreme heat may allow this species to outcompete other aphids explaining why it dominates in southern parts of its range.</w:t>
-      </w:r>
-    </w:p>
-    <w:p>
-      <w:pPr>
-        <w:pStyle w:val="BodyText"/>
-      </w:pPr>
+        <w:t xml:space="preserve">[8]</w:t>
+      </w:r>
+      <w:r>
+        <w:t xml:space="preserve"> </w:t>
+      </w:r>
+      <w:r>
+        <w:t xml:space="preserve">[9]</w:t>
+      </w:r>
+      <w:r>
+        <w:t xml:space="preserve"> </w:t>
+      </w:r>
+      <w:r>
+        <w:t xml:space="preserve">[10]</w:t>
+      </w:r>
+      <w:r>
+        <w:t xml:space="preserve"> </w:t>
+      </w:r>
+      <w:r>
+        <w:t xml:space="preserve">[11]</w:t>
+      </w:r>
+      <w:r>
+        <w:t xml:space="preserve"> </w:t>
+      </w:r>
+      <w:r>
+        <w:t xml:space="preserve">[12]</w:t>
+      </w:r>
+      <w:r>
+        <w:t xml:space="preserve"> </w:t>
+      </w:r>
+      <w:r>
+        <w:t xml:space="preserve">[13]</w:t>
+      </w:r>
+      <w:r>
+        <w:t xml:space="preserve"> </w:t>
+      </w:r>
+      <w:r>
+        <w:t xml:space="preserve">Should also look at this book</w:t>
+      </w:r>
+      <w:r>
+        <w:t xml:space="preserve"> </w:t>
+      </w:r>
+      <w:r>
+        <w:t xml:space="preserve">[14]</w:t>
+      </w:r>
+    </w:p>
+    <w:p>
+      <w:pPr>
+        <w:pStyle w:val="Compact"/>
+        <w:numPr>
+          <w:ilvl w:val="0"/>
+          <w:numId w:val="1007"/>
+        </w:numPr>
+      </w:pPr>
+      <w:r>
+        <w:t xml:space="preserve">How can we capture interactions among species within the community to predict how heat stress will affect community structure?</w:t>
+      </w:r>
+    </w:p>
+    <w:p>
+      <w:pPr>
+        <w:pStyle w:val="Compact"/>
+        <w:numPr>
+          <w:ilvl w:val="0"/>
+          <w:numId w:val="1007"/>
+        </w:numPr>
+      </w:pPr>
+      <w:r>
+        <w:t xml:space="preserve">Figure 2: demonstrating how TLS, biophysical and DEB models can be used to predict heat stress impacts on plants and animals, growth, reproduction, survival. (Dan, Margie)</w:t>
+      </w:r>
+    </w:p>
+    <w:p>
+      <w:pPr>
+        <w:pStyle w:val="Compact"/>
+        <w:numPr>
+          <w:ilvl w:val="0"/>
+          <w:numId w:val="1007"/>
+        </w:numPr>
+      </w:pPr>
+      <w:r>
+        <w:t xml:space="preserve">Also this is a cool paper</w:t>
+      </w:r>
+      <w:r>
+        <w:t xml:space="preserve"> </w:t>
+      </w:r>
+      <w:r>
+        <w:t xml:space="preserve">[15]</w:t>
+      </w:r>
+      <w:r>
+        <w:t xml:space="preserve"> </w:t>
+      </w:r>
+      <w:r>
+        <w:t xml:space="preserve">on carnivores diets by DNA sequencing fecal data</w:t>
+      </w:r>
+      <w:r>
+        <w:t xml:space="preserve"> </w:t>
+      </w:r>
+      <w:r>
+        <w:t xml:space="preserve">-The other way to model interactions us using foundational community ecology/ species abundance models see</w:t>
+      </w:r>
+      <w:r>
+        <w:t xml:space="preserve"> </w:t>
+      </w:r>
+      <w:r>
+        <w:t xml:space="preserve">[16]</w:t>
+      </w:r>
+      <w:r>
+        <w:t xml:space="preserve">. We can here model the actual abundance of a given species and it would seem more flexible to incorporate thermal tolerance infor into these models.</w:t>
+      </w:r>
+    </w:p>
+    <w:p>
+      <w:pPr>
+        <w:pStyle w:val="Compact"/>
+        <w:numPr>
+          <w:ilvl w:val="0"/>
+          <w:numId w:val="1007"/>
+        </w:numPr>
+      </w:pPr>
+      <w:r>
+        <w:t xml:space="preserve">have a close look at</w:t>
+      </w:r>
+      <w:r>
+        <w:t xml:space="preserve"> </w:t>
+      </w:r>
+      <w:r>
+        <w:t xml:space="preserve">[17]</w:t>
+      </w:r>
+      <w:r>
+        <w:t xml:space="preserve"> </w:t>
+      </w:r>
+      <w:r>
+        <w:t xml:space="preserve">and</w:t>
+      </w:r>
+      <w:r>
+        <w:t xml:space="preserve"> </w:t>
+      </w:r>
+      <w:r>
+        <w:t xml:space="preserve">[18]</w:t>
+      </w:r>
+      <w:r>
+        <w:t xml:space="preserve">, limitations</w:t>
+      </w:r>
+      <w:r>
+        <w:t xml:space="preserve"> </w:t>
+      </w:r>
+      <w:r>
+        <w:t xml:space="preserve">[19]</w:t>
+      </w:r>
+    </w:p>
+    <w:bookmarkEnd w:id="23"/>
+    <w:bookmarkStart w:id="28" w:name="X22f4f8993ac5e02c1c02562bfee744814059371"/>
+    <w:p>
+      <w:pPr>
+        <w:pStyle w:val="Heading1"/>
+      </w:pPr>
+      <w:r>
+        <w:t xml:space="preserve">How can heat waves shape and reshape species interactions in communities? (Brajesh, Brendan, James, Everyone else who wants to contribute)</w:t>
+      </w:r>
+    </w:p>
+    <w:bookmarkStart w:id="24" w:name="Xe34842ac768b085f030f6d0dbe9681669a9fdf0"/>
+    <w:p>
+      <w:pPr>
+        <w:pStyle w:val="Heading3"/>
+      </w:pPr>
+      <w:r>
+        <w:t xml:space="preserve">Microbial communities can impact thermal sensitivity plants and animals (Brajesh)</w:t>
+      </w:r>
+    </w:p>
+    <w:p>
+      <w:pPr>
+        <w:pStyle w:val="Compact"/>
+        <w:numPr>
+          <w:ilvl w:val="0"/>
+          <w:numId w:val="1008"/>
+        </w:numPr>
+      </w:pPr>
+      <w:r>
+        <w:t xml:space="preserve">focus on direct interactions</w:t>
+      </w:r>
+      <w:r>
+        <w:t xml:space="preserve"> </w:t>
+      </w:r>
       <w:r>
         <w:t xml:space="preserve">Interactions with symbiotic microbiota can also directly impact thermal tolerance of a focal species. For example, in plants, Márquez</w:t>
       </w:r>
@@ -240,7 +722,7 @@
         <w:t xml:space="preserve"> </w:t>
       </w:r>
       <w:r>
-        <w:t xml:space="preserve">[8]</w:t>
+        <w:t xml:space="preserve">[20]</w:t>
       </w:r>
       <w:r>
         <w:t xml:space="preserve"> </w:t>
@@ -320,140 +802,137 @@
     </w:p>
     <w:p>
       <w:pPr>
-        <w:pStyle w:val="BodyText"/>
-      </w:pPr>
-      <w:r>
-        <w:t xml:space="preserve">Li</w:t>
-      </w:r>
-      <w:r>
-        <w:t xml:space="preserve"> </w:t>
-      </w:r>
-      <w:r>
-        <w:rPr>
-          <w:i/>
-          <w:iCs/>
-        </w:rPr>
-        <w:t xml:space="preserve">et al.</w:t>
-      </w:r>
-      <w:r>
-        <w:t xml:space="preserve"> </w:t>
-      </w:r>
-      <w:r>
-        <w:t xml:space="preserve">[7]</w:t>
-      </w:r>
-      <w:r>
-        <w:t xml:space="preserve"> </w:t>
-      </w:r>
-      <w:r>
-        <w:t xml:space="preserve">also found that different life-stages were affected differently by heat stress, with adults being more thermally tolerant than early developmental stages emphasising the need for models to capture such variation. However, such findings do not incorporate acclimation to heat stress or different microhabitat choice by the different species, which are both likely to be important for predicting the impacts of heat stress on community structure. It also ignores how interspecific interactions between competing aphid species will also likely mediate species abundance. It would be worth while integrating thermal tolerance landscapes with ecological models that capture interspecific interactions to better predict how heat stress will affect community structure.</w:t>
-      </w:r>
-    </w:p>
-    <w:bookmarkEnd w:id="21"/>
-    <w:bookmarkStart w:id="22" w:name="Xee71b23a3bfba9486df53b408fa32142440fe3f"/>
-    <w:p>
-      <w:pPr>
-        <w:pStyle w:val="Heading1"/>
-      </w:pPr>
-      <w:r>
-        <w:t xml:space="preserve">Modelling thermal tolerance landscapes to capture interactions*</w:t>
-      </w:r>
-    </w:p>
-    <w:p>
-      <w:pPr>
-        <w:pStyle w:val="FirstParagraph"/>
-      </w:pPr>
-      <w:r>
-        <w:t xml:space="preserve">-chat with Margie and Mike about this some more. But see</w:t>
-      </w:r>
-      <w:r>
-        <w:t xml:space="preserve"> </w:t>
-      </w:r>
-      <w:r>
-        <w:t xml:space="preserve">[9]</w:t>
-      </w:r>
-      <w:r>
-        <w:t xml:space="preserve">. The paper provides a framework for modelling soil plant interactions</w:t>
-      </w:r>
-    </w:p>
-    <w:bookmarkEnd w:id="22"/>
-    <w:bookmarkStart w:id="23" w:name="Xe98fee70a1a4497be6167e16692a4718ebda2c9"/>
-    <w:p>
-      <w:pPr>
-        <w:pStyle w:val="Heading1"/>
-      </w:pPr>
-      <w:r>
-        <w:t xml:space="preserve">Methods for manipulating thermal tolerance to maintain functional interactions</w:t>
-      </w:r>
-    </w:p>
-    <w:p>
-      <w:pPr>
-        <w:pStyle w:val="FirstParagraph"/>
-      </w:pPr>
-      <w:r>
-        <w:rPr>
-          <w:i/>
-          <w:iCs/>
-        </w:rPr>
-        <w:t xml:space="preserve">Genetic engineering</w:t>
-      </w:r>
-      <w:r>
-        <w:t xml:space="preserve">: The use of genetic engineering to confer thermal tolerance to plants and animals is a promising avenue for enhancing thermal tolerance. For example, the over-expression of heat shock proteins (HSPs) in plants has been shown to enhance thermal tolerance. HSPs are a family of proteins that are up-regulated in response to heat stress and are involved in protein folding and degradation, and the prevention of protein aggregation. CRISPR-Cas9 gene editing technology has been used to enhance thermal tolerance in plants by modifying genes involved in heat stress response.</w:t>
-      </w:r>
-    </w:p>
-    <w:p>
-      <w:pPr>
-        <w:pStyle w:val="BodyText"/>
-      </w:pPr>
-      <w:r>
-        <w:rPr>
-          <w:i/>
-          <w:iCs/>
-        </w:rPr>
-        <w:t xml:space="preserve">Selective breeding</w:t>
-      </w:r>
-      <w:r>
-        <w:t xml:space="preserve">: Artificial selection will be a useful avenue for both plants and animals to enhance thermal tolerance.</w:t>
-      </w:r>
-    </w:p>
-    <w:bookmarkEnd w:id="23"/>
-    <w:bookmarkStart w:id="26" w:name="X7385f1a4ae0a1334b9488feaa5582190eecdbf8"/>
-    <w:p>
-      <w:pPr>
-        <w:pStyle w:val="Heading1"/>
-      </w:pPr>
-      <w:r>
-        <w:t xml:space="preserve">Applications of thermal tolerance landscapes in a changing world</w:t>
-      </w:r>
-    </w:p>
-    <w:bookmarkStart w:id="24" w:name="Xcfdc77780683b0e9013b28cbb3a4499e0df0c8f"/>
-    <w:p>
-      <w:pPr>
-        <w:pStyle w:val="Heading2"/>
-      </w:pPr>
-      <w:r>
-        <w:t xml:space="preserve">Differences in focus for plants and animals</w:t>
-      </w:r>
-    </w:p>
-    <w:p>
-      <w:pPr>
         <w:pStyle w:val="Compact"/>
         <w:numPr>
           <w:ilvl w:val="0"/>
-          <w:numId w:val="1002"/>
+          <w:numId w:val="1008"/>
         </w:numPr>
       </w:pPr>
       <w:r>
-        <w:t xml:space="preserve">Animals behave. We need to model that. HOw do changes in behaviour impact interactions with other species and the environment. How might this impact plant productivity</w:t>
+        <w:t xml:space="preserve">See</w:t>
+      </w:r>
+      <w:r>
+        <w:t xml:space="preserve"> </w:t>
+      </w:r>
+      <w:r>
+        <w:t xml:space="preserve">[21]</w:t>
+      </w:r>
+      <w:r>
+        <w:t xml:space="preserve">. The paper provides a framework for modelling soil plant interactions</w:t>
       </w:r>
     </w:p>
     <w:bookmarkEnd w:id="24"/>
-    <w:bookmarkStart w:id="25" w:name="X735253c6585851f7b91b58224381313220451dd"/>
-    <w:p>
-      <w:pPr>
-        <w:pStyle w:val="Heading2"/>
-      </w:pPr>
-      <w:r>
-        <w:t xml:space="preserve">Network theory can integrate thermal tolerance landscapes with ecological models</w:t>
+    <w:bookmarkStart w:id="25" w:name="X24738ef4513767bb724ce8804ac017259eaf2ee"/>
+    <w:p>
+      <w:pPr>
+        <w:pStyle w:val="Heading3"/>
+      </w:pPr>
+      <w:r>
+        <w:t xml:space="preserve">Water availability can impact thermal sensitivity of plants and animals (Brendan)</w:t>
+      </w:r>
+    </w:p>
+    <w:bookmarkEnd w:id="25"/>
+    <w:bookmarkStart w:id="26" w:name="X1934a01dca617640c62902cb6b54ad742133dfc"/>
+    <w:p>
+      <w:pPr>
+        <w:pStyle w:val="Heading3"/>
+      </w:pPr>
+      <w:r>
+        <w:t xml:space="preserve">Competition can impact thermal sensitivity of plants and animals (James? Feel free to add a different section title here.)</w:t>
+      </w:r>
+    </w:p>
+    <w:p>
+      <w:pPr>
+        <w:pStyle w:val="FirstParagraph"/>
+      </w:pPr>
+      <w:r>
+        <w:t xml:space="preserve">Competition among species within a community can influence a focal species’ tolerance to heat stress. Competition can influence microhabitat selection and the availability of thermal refugia which can protect against thermal extremes, the diet of a focal species that can indirectly influence physiological tolerance of temperature stress, and the availability of resources that can help buffer against heat stress. For example, Li</w:t>
+      </w:r>
+      <w:r>
+        <w:t xml:space="preserve"> </w:t>
+      </w:r>
+      <w:r>
+        <w:rPr>
+          <w:i/>
+          <w:iCs/>
+        </w:rPr>
+        <w:t xml:space="preserve">et al.</w:t>
+      </w:r>
+      <w:r>
+        <w:t xml:space="preserve"> </w:t>
+      </w:r>
+      <w:r>
+        <w:t xml:space="preserve">[22]</w:t>
+      </w:r>
+      <w:r>
+        <w:t xml:space="preserve"> </w:t>
+      </w:r>
+      <w:r>
+        <w:t xml:space="preserve">measured the thermal tolerance landscape for three aphid species that are pests for cereal crops globally to understand whether they could predict changes in community abundance. Using a thermal death time (TDT) approach to estimate the cumulative impacts of heat stress on survival they found that one species,</w:t>
+      </w:r>
+      <w:r>
+        <w:t xml:space="preserve"> </w:t>
+      </w:r>
+      <w:r>
+        <w:rPr>
+          <w:i/>
+          <w:iCs/>
+        </w:rPr>
+        <w:t xml:space="preserve">Rhopalosiphum padi</w:t>
+      </w:r>
+      <w:r>
+        <w:t xml:space="preserve">, showed high heat tolerance and accumulated less injury over natural temperature fluctuations. The ability to maintain high relative abundance in the face of extreme heat may allow this species to outcompete other aphids explaining why it dominates in southern parts of its range.</w:t>
+      </w:r>
+    </w:p>
+    <w:p>
+      <w:pPr>
+        <w:pStyle w:val="BodyText"/>
+      </w:pPr>
+      <w:r>
+        <w:t xml:space="preserve">Li</w:t>
+      </w:r>
+      <w:r>
+        <w:t xml:space="preserve"> </w:t>
+      </w:r>
+      <w:r>
+        <w:rPr>
+          <w:i/>
+          <w:iCs/>
+        </w:rPr>
+        <w:t xml:space="preserve">et al.</w:t>
+      </w:r>
+      <w:r>
+        <w:t xml:space="preserve"> </w:t>
+      </w:r>
+      <w:r>
+        <w:t xml:space="preserve">[22]</w:t>
+      </w:r>
+      <w:r>
+        <w:t xml:space="preserve"> </w:t>
+      </w:r>
+      <w:r>
+        <w:t xml:space="preserve">also found that different life-stages were affected differently by heat stress, with adults being more thermally tolerant than early developmental stages emphasising the need for models to capture such variation. However, such findings do not incorporate acclimation to heat stress or different microhabitat choice by the different species, which are both likely to be important for predicting the impacts of heat stress on community structure. It also ignores how interspecific interactions between competing aphid species will also likely mediate species abundance. It would be worth while integrating thermal tolerance landscapes with ecological models that capture interspecific interactions to better predict how heat stress will affect community structure.</w:t>
+      </w:r>
+    </w:p>
+    <w:bookmarkEnd w:id="26"/>
+    <w:bookmarkStart w:id="27" w:name="Xdbc91e02dcd505372e716f3d2147fb46ffba4bf"/>
+    <w:p>
+      <w:pPr>
+        <w:pStyle w:val="Heading3"/>
+      </w:pPr>
+      <w:r>
+        <w:t xml:space="preserve">Acclimation can impact thermal sensitivity of plants and animals (Everyone)</w:t>
+      </w:r>
+    </w:p>
+    <w:bookmarkEnd w:id="27"/>
+    <w:bookmarkEnd w:id="28"/>
+    <w:bookmarkStart w:id="29" w:name="X72b44c4c6a53929829ba5ca13af9de121d8949f"/>
+    <w:p>
+      <w:pPr>
+        <w:pStyle w:val="Heading1"/>
+      </w:pPr>
+      <w:r>
+        <w:t xml:space="preserve">Applications of thermal tolerance landscapes in a changing world (Alison, Owen and everyone)</w:t>
       </w:r>
     </w:p>
     <w:p>
@@ -461,65 +940,57 @@
         <w:pStyle w:val="Compact"/>
         <w:numPr>
           <w:ilvl w:val="0"/>
-          <w:numId w:val="1003"/>
+          <w:numId w:val="1009"/>
         </w:numPr>
       </w:pPr>
       <w:r>
-        <w:t xml:space="preserve">seems like most people are analysing communities with network theory. Some important papers</w:t>
-      </w:r>
-      <w:r>
-        <w:t xml:space="preserve"> </w:t>
-      </w:r>
-      <w:r>
-        <w:t xml:space="preserve">[10]</w:t>
-      </w:r>
-      <w:r>
-        <w:t xml:space="preserve"> </w:t>
-      </w:r>
-      <w:r>
-        <w:t xml:space="preserve">[11]</w:t>
-      </w:r>
-      <w:r>
-        <w:t xml:space="preserve"> </w:t>
-      </w:r>
-      <w:r>
-        <w:t xml:space="preserve">[12]</w:t>
-      </w:r>
-      <w:r>
-        <w:t xml:space="preserve"> </w:t>
-      </w:r>
-      <w:r>
-        <w:t xml:space="preserve">[13]</w:t>
-      </w:r>
-      <w:r>
-        <w:t xml:space="preserve"> </w:t>
-      </w:r>
-      <w:r>
-        <w:t xml:space="preserve">[14]</w:t>
-      </w:r>
-      <w:r>
-        <w:t xml:space="preserve"> </w:t>
-      </w:r>
-      <w:r>
-        <w:t xml:space="preserve">[15]</w:t>
-      </w:r>
-      <w:r>
-        <w:t xml:space="preserve"> </w:t>
-      </w:r>
-      <w:r>
-        <w:t xml:space="preserve">[16]</w:t>
-      </w:r>
-      <w:r>
-        <w:t xml:space="preserve"> </w:t>
-      </w:r>
-      <w:r>
-        <w:t xml:space="preserve">Should also look at this book</w:t>
-      </w:r>
-      <w:r>
-        <w:t xml:space="preserve"> </w:t>
-      </w:r>
-      <w:r>
-        <w:t xml:space="preserve">[17]</w:t>
+        <w:t xml:space="preserve">Applications in:</w:t>
+      </w:r>
+    </w:p>
+    <w:p>
+      <w:pPr>
+        <w:pStyle w:val="Compact"/>
+        <w:numPr>
+          <w:ilvl w:val="1"/>
+          <w:numId w:val="1010"/>
+        </w:numPr>
+      </w:pPr>
+      <w:r>
+        <w:t xml:space="preserve">Agriculture</w:t>
+      </w:r>
+    </w:p>
+    <w:p>
+      <w:pPr>
+        <w:pStyle w:val="Compact"/>
+        <w:numPr>
+          <w:ilvl w:val="1"/>
+          <w:numId w:val="1010"/>
+        </w:numPr>
+      </w:pPr>
+      <w:r>
+        <w:t xml:space="preserve">Pest control</w:t>
+      </w:r>
+    </w:p>
+    <w:p>
+      <w:pPr>
+        <w:pStyle w:val="Compact"/>
+        <w:numPr>
+          <w:ilvl w:val="1"/>
+          <w:numId w:val="1010"/>
+        </w:numPr>
+      </w:pPr>
+      <w:r>
+        <w:t xml:space="preserve">Conservation</w:t>
+      </w:r>
+    </w:p>
+    <w:bookmarkEnd w:id="29"/>
+    <w:bookmarkStart w:id="30" w:name="X1773ddaab3dd6dcbde3cb84fd5d8e78515a444b"/>
+    <w:p>
+      <w:pPr>
+        <w:pStyle w:val="Heading1"/>
+      </w:pPr>
+      <w:r>
+        <w:t xml:space="preserve">Innovative solutions for maintaining functional interactions in the face of extreme heat events (Everyone)</w:t>
       </w:r>
     </w:p>
     <w:p>
@@ -527,25 +998,14 @@
         <w:pStyle w:val="FirstParagraph"/>
       </w:pPr>
       <w:r>
-        <w:t xml:space="preserve">have a close look at</w:t>
-      </w:r>
-      <w:r>
-        <w:t xml:space="preserve"> </w:t>
-      </w:r>
-      <w:r>
-        <w:t xml:space="preserve">[18]</w:t>
-      </w:r>
-      <w:r>
-        <w:t xml:space="preserve"> </w:t>
-      </w:r>
-      <w:r>
-        <w:t xml:space="preserve">and</w:t>
-      </w:r>
-      <w:r>
-        <w:t xml:space="preserve"> </w:t>
-      </w:r>
-      <w:r>
-        <w:t xml:space="preserve">[19]</w:t>
+        <w:rPr>
+          <w:i/>
+          <w:iCs/>
+        </w:rPr>
+        <w:t xml:space="preserve">Genetic engineering</w:t>
+      </w:r>
+      <w:r>
+        <w:t xml:space="preserve">: The use of genetic engineering to confer thermal tolerance to plants and animals is a promising avenue for enhancing thermal tolerance. For example, the over-expression of heat shock proteins (HSPs) in plants has been shown to enhance thermal tolerance. HSPs are a family of proteins that are up-regulated in response to heat stress and are involved in protein folding and degradation, and the prevention of protein aggregation. CRISPR-Cas9 gene editing technology has been used to enhance thermal tolerance in plants by modifying genes involved in heat stress response.</w:t>
       </w:r>
     </w:p>
     <w:p>
@@ -553,13 +1013,14 @@
         <w:pStyle w:val="BodyText"/>
       </w:pPr>
       <w:r>
-        <w:t xml:space="preserve">limitations</w:t>
-      </w:r>
-      <w:r>
-        <w:t xml:space="preserve"> </w:t>
-      </w:r>
-      <w:r>
-        <w:t xml:space="preserve">[20]</w:t>
+        <w:rPr>
+          <w:i/>
+          <w:iCs/>
+        </w:rPr>
+        <w:t xml:space="preserve">Selective breeding</w:t>
+      </w:r>
+      <w:r>
+        <w:t xml:space="preserve">: Artificial selection will be a useful avenue for both plants and animals to enhance thermal tolerance.</w:t>
       </w:r>
     </w:p>
     <w:p>
@@ -567,41 +1028,18 @@
         <w:pStyle w:val="BodyText"/>
       </w:pPr>
       <w:r>
-        <w:t xml:space="preserve">Also this is a cool paper</w:t>
-      </w:r>
-      <w:r>
-        <w:t xml:space="preserve"> </w:t>
-      </w:r>
-      <w:r>
-        <w:t xml:space="preserve">[21]</w:t>
-      </w:r>
-      <w:r>
-        <w:t xml:space="preserve"> </w:t>
-      </w:r>
-      <w:r>
-        <w:t xml:space="preserve">on carnivores diets by DNA sequencing fecal data</w:t>
-      </w:r>
-    </w:p>
-    <w:p>
-      <w:pPr>
-        <w:pStyle w:val="BodyText"/>
-      </w:pPr>
-      <w:r>
-        <w:t xml:space="preserve">The other way to model interactions us using foundational community ecology/ species abundance models see</w:t>
-      </w:r>
-      <w:r>
-        <w:t xml:space="preserve"> </w:t>
-      </w:r>
-      <w:r>
-        <w:t xml:space="preserve">[22]</w:t>
-      </w:r>
-      <w:r>
-        <w:t xml:space="preserve">. We can here model the actual abundance of a given species and it would seem more flexible to incorporate thermal tolerance infor into these models.</w:t>
-      </w:r>
-    </w:p>
-    <w:bookmarkEnd w:id="25"/>
-    <w:bookmarkEnd w:id="26"/>
-    <w:bookmarkStart w:id="27" w:name="future-directions"/>
+        <w:rPr>
+          <w:i/>
+          <w:iCs/>
+        </w:rPr>
+        <w:t xml:space="preserve">Cooler landscapes</w:t>
+      </w:r>
+      <w:r>
+        <w:t xml:space="preserve">: Landscapes can be designed to provide thermal refugia for plants and animals. For example, planting trees in urban areas can provide shade and reduce the urban heat island effect. Similarly, planting hedgerows in agricultural landscapes can provide thermal refugia for beneficial insects and pollinators.</w:t>
+      </w:r>
+    </w:p>
+    <w:bookmarkEnd w:id="30"/>
+    <w:bookmarkStart w:id="35" w:name="future-directions"/>
     <w:p>
       <w:pPr>
         <w:pStyle w:val="Heading1"/>
@@ -610,9 +1048,10 @@
         <w:t xml:space="preserve">Future Directions</w:t>
       </w:r>
     </w:p>
-    <w:p>
-      <w:pPr>
-        <w:pStyle w:val="FirstParagraph"/>
+    <w:bookmarkStart w:id="31" w:name="X31af800422944976d7563c55da852b974856f47"/>
+    <w:p>
+      <w:pPr>
+        <w:pStyle w:val="Heading4"/>
       </w:pPr>
       <w:r>
         <w:rPr>
@@ -625,24 +1064,11 @@
         <w:t xml:space="preserve">: We need to understand the genomic, cellular and physiological processes that confer greater thermal tolerance and help prepare organisms for future heat stress events.</w:t>
       </w:r>
     </w:p>
-    <w:p>
-      <w:pPr>
-        <w:pStyle w:val="BodyText"/>
-      </w:pPr>
-      <w:r>
-        <w:rPr>
-          <w:i/>
-          <w:iCs/>
-        </w:rPr>
-        <w:t xml:space="preserve">Modelling interactions among plants and animals to build community thermal tolerance landscapes and predict how heat stress events will affect communities</w:t>
-      </w:r>
-      <w:r>
-        <w:t xml:space="preserve">: We need to understand how thermal tolerance of individual species will affect the thermal tolerance of communities and ecosystems.</w:t>
-      </w:r>
-    </w:p>
-    <w:p>
-      <w:pPr>
-        <w:pStyle w:val="BodyText"/>
+    <w:bookmarkEnd w:id="31"/>
+    <w:bookmarkStart w:id="32" w:name="Xb8962087c69835a1c39f1de3a27edf2b62848b9"/>
+    <w:p>
+      <w:pPr>
+        <w:pStyle w:val="Heading4"/>
       </w:pPr>
       <w:r>
         <w:rPr>
@@ -652,11 +1078,46 @@
         <w:t xml:space="preserve">Trade-offs between thermal tolerance and other traits</w:t>
       </w:r>
       <w:r>
-        <w:t xml:space="preserve">: We need to understand the trade-offs between thermal tolerance and other traits such as growth rate, reproduction, and competitive ability. It is fine to confer greater thermal tolerance resistance but if this comes at a cost to reproduction, growth or biomass accumulation, then it may not be beneficial. NEED EXAMPLES</w:t>
-      </w:r>
-    </w:p>
-    <w:bookmarkEnd w:id="27"/>
-    <w:bookmarkStart w:id="51" w:name="references"/>
+        <w:t xml:space="preserve">: We need to understand the trade-offs between thermal tolerance and other traits such as growth rate, reproduction, and competitive ability. It is fine to confer greater thermal tolerance resistance but if this comes at a cost to reproduction, growth or biomass accumulation, then it may not be beneficial. (Strand 1 folks)</w:t>
+      </w:r>
+    </w:p>
+    <w:bookmarkEnd w:id="32"/>
+    <w:bookmarkStart w:id="33" w:name="Xbb6a1781224964eec5409b3879f03550788dea1"/>
+    <w:p>
+      <w:pPr>
+        <w:pStyle w:val="Heading4"/>
+      </w:pPr>
+      <w:r>
+        <w:rPr>
+          <w:i/>
+          <w:iCs/>
+        </w:rPr>
+        <w:t xml:space="preserve">Behavioural responses to heat stress</w:t>
+      </w:r>
+      <w:r>
+        <w:t xml:space="preserve">: Animals behave. We need to model that. How do changes in behaviour impact interactions with other species and the environment. How might this impact plant productivity (Mike, Dan, DEB models)</w:t>
+      </w:r>
+    </w:p>
+    <w:bookmarkEnd w:id="33"/>
+    <w:bookmarkStart w:id="34" w:name="X541f23b31264c4aabafb87866f9acef6dcc0af4"/>
+    <w:p>
+      <w:pPr>
+        <w:pStyle w:val="Heading4"/>
+      </w:pPr>
+      <w:r>
+        <w:rPr>
+          <w:i/>
+          <w:iCs/>
+        </w:rPr>
+        <w:t xml:space="preserve">Evolutionary dynamics leading to changes in thermal sensitivity and exposure</w:t>
+      </w:r>
+      <w:r>
+        <w:t xml:space="preserve">: We need to understand how thermal sensitivity and exposure will evolve in response to climate change. (Ary)</w:t>
+      </w:r>
+    </w:p>
+    <w:bookmarkEnd w:id="34"/>
+    <w:bookmarkEnd w:id="35"/>
+    <w:bookmarkStart w:id="59" w:name="references"/>
     <w:p>
       <w:pPr>
         <w:pStyle w:val="Heading1"/>
@@ -665,8 +1126,8 @@
         <w:t xml:space="preserve">References</w:t>
       </w:r>
     </w:p>
-    <w:bookmarkStart w:id="50" w:name="refs"/>
-    <w:bookmarkStart w:id="28" w:name="ref-barriopedro2023heat"/>
+    <w:bookmarkStart w:id="58" w:name="refs"/>
+    <w:bookmarkStart w:id="36" w:name="ref-barriopedro2023heat"/>
     <w:p>
       <w:pPr>
         <w:pStyle w:val="Bibliography"/>
@@ -716,8 +1177,8 @@
         <w:t xml:space="preserve">61, e2022RG000780</w:t>
       </w:r>
     </w:p>
-    <w:bookmarkEnd w:id="28"/>
-    <w:bookmarkStart w:id="29" w:name="ref-aglas2024recent"/>
+    <w:bookmarkEnd w:id="36"/>
+    <w:bookmarkStart w:id="37" w:name="ref-aglas2024recent"/>
     <w:p>
       <w:pPr>
         <w:pStyle w:val="Bibliography"/>
@@ -764,8 +1225,8 @@
         <w:t xml:space="preserve">, Copernicus Meetings</w:t>
       </w:r>
     </w:p>
-    <w:bookmarkEnd w:id="29"/>
-    <w:bookmarkStart w:id="30" w:name="ref-kazenel2024heat"/>
+    <w:bookmarkEnd w:id="37"/>
+    <w:bookmarkStart w:id="38" w:name="ref-kazenel2024heat"/>
     <w:p>
       <w:pPr>
         <w:pStyle w:val="Bibliography"/>
@@ -809,8 +1270,8 @@
         <w:t xml:space="preserve">Nature</w:t>
       </w:r>
     </w:p>
-    <w:bookmarkEnd w:id="30"/>
-    <w:bookmarkStart w:id="31" w:name="ref-zhao2017temperature"/>
+    <w:bookmarkEnd w:id="38"/>
+    <w:bookmarkStart w:id="39" w:name="ref-zhao2017temperature"/>
     <w:p>
       <w:pPr>
         <w:pStyle w:val="Bibliography"/>
@@ -860,8 +1321,8 @@
         <w:t xml:space="preserve">114, 9326–9331</w:t>
       </w:r>
     </w:p>
-    <w:bookmarkEnd w:id="31"/>
-    <w:bookmarkStart w:id="32" w:name="ref-tito2018global"/>
+    <w:bookmarkEnd w:id="39"/>
+    <w:bookmarkStart w:id="40" w:name="ref-tito2018global"/>
     <w:p>
       <w:pPr>
         <w:pStyle w:val="Bibliography"/>
@@ -911,8 +1372,8 @@
         <w:t xml:space="preserve">24, e592–e602</w:t>
       </w:r>
     </w:p>
-    <w:bookmarkEnd w:id="32"/>
-    <w:bookmarkStart w:id="33" w:name="ref-trivedi2022plant"/>
+    <w:bookmarkEnd w:id="40"/>
+    <w:bookmarkStart w:id="41" w:name="ref-trivedi2022plant"/>
     <w:p>
       <w:pPr>
         <w:pStyle w:val="Bibliography"/>
@@ -962,8 +1423,8 @@
         <w:t xml:space="preserve">234, 1951–1959</w:t>
       </w:r>
     </w:p>
-    <w:bookmarkEnd w:id="33"/>
-    <w:bookmarkStart w:id="34" w:name="ref-li2023interspecific"/>
+    <w:bookmarkEnd w:id="41"/>
+    <w:bookmarkStart w:id="42" w:name="ref-delmas2019analysing"/>
     <w:p>
       <w:pPr>
         <w:pStyle w:val="Bibliography"/>
@@ -978,6 +1439,682 @@
         <w:t xml:space="preserve">	</w:t>
       </w:r>
       <w:r>
+        <w:t xml:space="preserve">Delmas, E.</w:t>
+      </w:r>
+      <w:r>
+        <w:t xml:space="preserve"> </w:t>
+      </w:r>
+      <w:r>
+        <w:rPr>
+          <w:i/>
+          <w:iCs/>
+        </w:rPr>
+        <w:t xml:space="preserve">et al.</w:t>
+      </w:r>
+      <w:r>
+        <w:t xml:space="preserve"> </w:t>
+      </w:r>
+      <w:r>
+        <w:t xml:space="preserve">(2019) Analysing ecological networks of species interactions.</w:t>
+      </w:r>
+      <w:r>
+        <w:t xml:space="preserve"> </w:t>
+      </w:r>
+      <w:r>
+        <w:rPr>
+          <w:i/>
+          <w:iCs/>
+        </w:rPr>
+        <w:t xml:space="preserve">Biological Reviews</w:t>
+      </w:r>
+      <w:r>
+        <w:t xml:space="preserve"> </w:t>
+      </w:r>
+      <w:r>
+        <w:t xml:space="preserve">94, 16–36</w:t>
+      </w:r>
+    </w:p>
+    <w:bookmarkEnd w:id="42"/>
+    <w:bookmarkStart w:id="43" w:name="ref-godoy2019coexistence"/>
+    <w:p>
+      <w:pPr>
+        <w:pStyle w:val="Bibliography"/>
+      </w:pPr>
+      <w:r>
+        <w:t xml:space="preserve">8.</w:t>
+      </w:r>
+      <w:r>
+        <w:t xml:space="preserve"> </w:t>
+      </w:r>
+      <w:r>
+        <w:t xml:space="preserve">	</w:t>
+      </w:r>
+      <w:r>
+        <w:t xml:space="preserve">Godoy, O. (2019) Coexistence theory as a tool to understand biological invasions in species interaction networks: Implications for the study of novel ecosystems.</w:t>
+      </w:r>
+      <w:r>
+        <w:t xml:space="preserve"> </w:t>
+      </w:r>
+      <w:r>
+        <w:rPr>
+          <w:i/>
+          <w:iCs/>
+        </w:rPr>
+        <w:t xml:space="preserve">Functional Ecology</w:t>
+      </w:r>
+      <w:r>
+        <w:t xml:space="preserve"> </w:t>
+      </w:r>
+      <w:r>
+        <w:t xml:space="preserve">33, 1190–1201</w:t>
+      </w:r>
+    </w:p>
+    <w:bookmarkEnd w:id="43"/>
+    <w:bookmarkStart w:id="44" w:name="ref-poisot2021global"/>
+    <w:p>
+      <w:pPr>
+        <w:pStyle w:val="Bibliography"/>
+      </w:pPr>
+      <w:r>
+        <w:t xml:space="preserve">9.</w:t>
+      </w:r>
+      <w:r>
+        <w:t xml:space="preserve"> </w:t>
+      </w:r>
+      <w:r>
+        <w:t xml:space="preserve">	</w:t>
+      </w:r>
+      <w:r>
+        <w:t xml:space="preserve">Poisot, T.</w:t>
+      </w:r>
+      <w:r>
+        <w:t xml:space="preserve"> </w:t>
+      </w:r>
+      <w:r>
+        <w:rPr>
+          <w:i/>
+          <w:iCs/>
+        </w:rPr>
+        <w:t xml:space="preserve">et al.</w:t>
+      </w:r>
+      <w:r>
+        <w:t xml:space="preserve"> </w:t>
+      </w:r>
+      <w:r>
+        <w:t xml:space="preserve">(2021) Global knowledge gaps in species interaction networks data.</w:t>
+      </w:r>
+      <w:r>
+        <w:t xml:space="preserve"> </w:t>
+      </w:r>
+      <w:r>
+        <w:rPr>
+          <w:i/>
+          <w:iCs/>
+        </w:rPr>
+        <w:t xml:space="preserve">Journal of Biogeography</w:t>
+      </w:r>
+      <w:r>
+        <w:t xml:space="preserve"> </w:t>
+      </w:r>
+      <w:r>
+        <w:t xml:space="preserve">48, 1552–1563</w:t>
+      </w:r>
+    </w:p>
+    <w:bookmarkEnd w:id="44"/>
+    <w:bookmarkStart w:id="45" w:name="ref-hui2019invade"/>
+    <w:p>
+      <w:pPr>
+        <w:pStyle w:val="Bibliography"/>
+      </w:pPr>
+      <w:r>
+        <w:t xml:space="preserve">10.</w:t>
+      </w:r>
+      <w:r>
+        <w:t xml:space="preserve"> </w:t>
+      </w:r>
+      <w:r>
+        <w:t xml:space="preserve">	</w:t>
+      </w:r>
+      <w:r>
+        <w:t xml:space="preserve">Hui, C. and Richardson, D.M. (2019) How to invade an ecological network.</w:t>
+      </w:r>
+      <w:r>
+        <w:t xml:space="preserve"> </w:t>
+      </w:r>
+      <w:r>
+        <w:rPr>
+          <w:i/>
+          <w:iCs/>
+        </w:rPr>
+        <w:t xml:space="preserve">Trends in ecology &amp; evolution</w:t>
+      </w:r>
+      <w:r>
+        <w:t xml:space="preserve"> </w:t>
+      </w:r>
+      <w:r>
+        <w:t xml:space="preserve">34, 121–131</w:t>
+      </w:r>
+    </w:p>
+    <w:bookmarkEnd w:id="45"/>
+    <w:bookmarkStart w:id="46" w:name="ref-gomez2023role"/>
+    <w:p>
+      <w:pPr>
+        <w:pStyle w:val="Bibliography"/>
+      </w:pPr>
+      <w:r>
+        <w:t xml:space="preserve">11.</w:t>
+      </w:r>
+      <w:r>
+        <w:t xml:space="preserve"> </w:t>
+      </w:r>
+      <w:r>
+        <w:t xml:space="preserve">	</w:t>
+      </w:r>
+      <w:r>
+        <w:t xml:space="preserve">Gómez, J.M.</w:t>
+      </w:r>
+      <w:r>
+        <w:t xml:space="preserve"> </w:t>
+      </w:r>
+      <w:r>
+        <w:rPr>
+          <w:i/>
+          <w:iCs/>
+        </w:rPr>
+        <w:t xml:space="preserve">et al.</w:t>
+      </w:r>
+      <w:r>
+        <w:t xml:space="preserve"> </w:t>
+      </w:r>
+      <w:r>
+        <w:t xml:space="preserve">(2023) The role of phenotypic plasticity in shaping ecological networks.</w:t>
+      </w:r>
+      <w:r>
+        <w:t xml:space="preserve"> </w:t>
+      </w:r>
+      <w:r>
+        <w:rPr>
+          <w:i/>
+          <w:iCs/>
+        </w:rPr>
+        <w:t xml:space="preserve">Ecology Letters</w:t>
+      </w:r>
+      <w:r>
+        <w:t xml:space="preserve"> </w:t>
+      </w:r>
+      <w:r>
+        <w:t xml:space="preserve">26, S47–S61</w:t>
+      </w:r>
+    </w:p>
+    <w:bookmarkEnd w:id="46"/>
+    <w:bookmarkStart w:id="47" w:name="ref-lytle2023matrix"/>
+    <w:p>
+      <w:pPr>
+        <w:pStyle w:val="Bibliography"/>
+      </w:pPr>
+      <w:r>
+        <w:t xml:space="preserve">12.</w:t>
+      </w:r>
+      <w:r>
+        <w:t xml:space="preserve"> </w:t>
+      </w:r>
+      <w:r>
+        <w:t xml:space="preserve">	</w:t>
+      </w:r>
+      <w:r>
+        <w:t xml:space="preserve">Lytle, D.A. and Tonkin, J.D. (2023) Matrix community models for ecology and evolution.</w:t>
+      </w:r>
+      <w:r>
+        <w:t xml:space="preserve"> </w:t>
+      </w:r>
+      <w:r>
+        <w:rPr>
+          <w:i/>
+          <w:iCs/>
+        </w:rPr>
+        <w:t xml:space="preserve">npj Biodiversity</w:t>
+      </w:r>
+      <w:r>
+        <w:t xml:space="preserve"> </w:t>
+      </w:r>
+      <w:r>
+        <w:t xml:space="preserve">2, 26</w:t>
+      </w:r>
+    </w:p>
+    <w:bookmarkEnd w:id="47"/>
+    <w:bookmarkStart w:id="48" w:name="ref-petsopoulos2021using"/>
+    <w:p>
+      <w:pPr>
+        <w:pStyle w:val="Bibliography"/>
+      </w:pPr>
+      <w:r>
+        <w:t xml:space="preserve">13.</w:t>
+      </w:r>
+      <w:r>
+        <w:t xml:space="preserve"> </w:t>
+      </w:r>
+      <w:r>
+        <w:t xml:space="preserve">	</w:t>
+      </w:r>
+      <w:r>
+        <w:t xml:space="preserve">Petsopoulos, D.</w:t>
+      </w:r>
+      <w:r>
+        <w:t xml:space="preserve"> </w:t>
+      </w:r>
+      <w:r>
+        <w:rPr>
+          <w:i/>
+          <w:iCs/>
+        </w:rPr>
+        <w:t xml:space="preserve">et al.</w:t>
+      </w:r>
+      <w:r>
+        <w:t xml:space="preserve"> </w:t>
+      </w:r>
+      <w:r>
+        <w:t xml:space="preserve">(2021) Using network ecology to understand and mitigate long-term insect declines.</w:t>
+      </w:r>
+      <w:r>
+        <w:t xml:space="preserve"> </w:t>
+      </w:r>
+      <w:r>
+        <w:rPr>
+          <w:i/>
+          <w:iCs/>
+        </w:rPr>
+        <w:t xml:space="preserve">Ecological Entomology</w:t>
+      </w:r>
+    </w:p>
+    <w:bookmarkEnd w:id="48"/>
+    <w:bookmarkStart w:id="49" w:name="ref-dale2021quantitative"/>
+    <w:p>
+      <w:pPr>
+        <w:pStyle w:val="Bibliography"/>
+      </w:pPr>
+      <w:r>
+        <w:t xml:space="preserve">14.</w:t>
+      </w:r>
+      <w:r>
+        <w:t xml:space="preserve"> </w:t>
+      </w:r>
+      <w:r>
+        <w:t xml:space="preserve">	</w:t>
+      </w:r>
+      <w:r>
+        <w:t xml:space="preserve">Dale, M.R. and Fortin, M.-J. (2021)</w:t>
+      </w:r>
+      <w:r>
+        <w:t xml:space="preserve"> </w:t>
+      </w:r>
+      <w:r>
+        <w:rPr>
+          <w:i/>
+          <w:iCs/>
+        </w:rPr>
+        <w:t xml:space="preserve">Quantitative analysis of ecological networks</w:t>
+      </w:r>
+      <w:r>
+        <w:t xml:space="preserve">, Cambridge University Press</w:t>
+      </w:r>
+    </w:p>
+    <w:bookmarkEnd w:id="49"/>
+    <w:bookmarkStart w:id="50" w:name="ref-lu2023food"/>
+    <w:p>
+      <w:pPr>
+        <w:pStyle w:val="Bibliography"/>
+      </w:pPr>
+      <w:r>
+        <w:t xml:space="preserve">15.</w:t>
+      </w:r>
+      <w:r>
+        <w:t xml:space="preserve"> </w:t>
+      </w:r>
+      <w:r>
+        <w:t xml:space="preserve">	</w:t>
+      </w:r>
+      <w:r>
+        <w:t xml:space="preserve">Lu, Q.</w:t>
+      </w:r>
+      <w:r>
+        <w:t xml:space="preserve"> </w:t>
+      </w:r>
+      <w:r>
+        <w:rPr>
+          <w:i/>
+          <w:iCs/>
+        </w:rPr>
+        <w:t xml:space="preserve">et al.</w:t>
+      </w:r>
+      <w:r>
+        <w:t xml:space="preserve"> </w:t>
+      </w:r>
+      <w:r>
+        <w:t xml:space="preserve">(2023) Food webs reveal coexistence mechanisms and community organization in carnivores.</w:t>
+      </w:r>
+      <w:r>
+        <w:t xml:space="preserve"> </w:t>
+      </w:r>
+      <w:r>
+        <w:rPr>
+          <w:i/>
+          <w:iCs/>
+        </w:rPr>
+        <w:t xml:space="preserve">Current Biology</w:t>
+      </w:r>
+      <w:r>
+        <w:t xml:space="preserve"> </w:t>
+      </w:r>
+      <w:r>
+        <w:t xml:space="preserve">33, 647–659</w:t>
+      </w:r>
+    </w:p>
+    <w:bookmarkEnd w:id="50"/>
+    <w:bookmarkStart w:id="51" w:name="ref-carrara2015inferring"/>
+    <w:p>
+      <w:pPr>
+        <w:pStyle w:val="Bibliography"/>
+      </w:pPr>
+      <w:r>
+        <w:t xml:space="preserve">16.</w:t>
+      </w:r>
+      <w:r>
+        <w:t xml:space="preserve"> </w:t>
+      </w:r>
+      <w:r>
+        <w:t xml:space="preserve">	</w:t>
+      </w:r>
+      <w:r>
+        <w:t xml:space="preserve">Carrara, F.</w:t>
+      </w:r>
+      <w:r>
+        <w:t xml:space="preserve"> </w:t>
+      </w:r>
+      <w:r>
+        <w:rPr>
+          <w:i/>
+          <w:iCs/>
+        </w:rPr>
+        <w:t xml:space="preserve">et al.</w:t>
+      </w:r>
+      <w:r>
+        <w:t xml:space="preserve"> </w:t>
+      </w:r>
+      <w:r>
+        <w:t xml:space="preserve">(2015) Inferring species interactions in ecological communities: A comparison of methods at different levels of complexity.</w:t>
+      </w:r>
+      <w:r>
+        <w:t xml:space="preserve"> </w:t>
+      </w:r>
+      <w:r>
+        <w:rPr>
+          <w:i/>
+          <w:iCs/>
+        </w:rPr>
+        <w:t xml:space="preserve">Methods in Ecology and Evolution</w:t>
+      </w:r>
+      <w:r>
+        <w:t xml:space="preserve"> </w:t>
+      </w:r>
+      <w:r>
+        <w:t xml:space="preserve">6, 895–906</w:t>
+      </w:r>
+    </w:p>
+    <w:bookmarkEnd w:id="51"/>
+    <w:bookmarkStart w:id="52" w:name="ref-vitali2022disruption"/>
+    <w:p>
+      <w:pPr>
+        <w:pStyle w:val="Bibliography"/>
+      </w:pPr>
+      <w:r>
+        <w:t xml:space="preserve">17.</w:t>
+      </w:r>
+      <w:r>
+        <w:t xml:space="preserve"> </w:t>
+      </w:r>
+      <w:r>
+        <w:t xml:space="preserve">	</w:t>
+      </w:r>
+      <w:r>
+        <w:t xml:space="preserve">Vitali, A.</w:t>
+      </w:r>
+      <w:r>
+        <w:t xml:space="preserve"> </w:t>
+      </w:r>
+      <w:r>
+        <w:rPr>
+          <w:i/>
+          <w:iCs/>
+        </w:rPr>
+        <w:t xml:space="preserve">et al.</w:t>
+      </w:r>
+      <w:r>
+        <w:t xml:space="preserve"> </w:t>
+      </w:r>
+      <w:r>
+        <w:t xml:space="preserve">(2022) The disruption of a keystone interaction erodes pollination and seed dispersal networks.</w:t>
+      </w:r>
+      <w:r>
+        <w:t xml:space="preserve"> </w:t>
+      </w:r>
+      <w:r>
+        <w:rPr>
+          <w:i/>
+          <w:iCs/>
+        </w:rPr>
+        <w:t xml:space="preserve">Ecology</w:t>
+      </w:r>
+      <w:r>
+        <w:t xml:space="preserve"> </w:t>
+      </w:r>
+      <w:r>
+        <w:t xml:space="preserve">103, e03547</w:t>
+      </w:r>
+    </w:p>
+    <w:bookmarkEnd w:id="52"/>
+    <w:bookmarkStart w:id="53" w:name="ref-riva2023toward"/>
+    <w:p>
+      <w:pPr>
+        <w:pStyle w:val="Bibliography"/>
+      </w:pPr>
+      <w:r>
+        <w:t xml:space="preserve">18.</w:t>
+      </w:r>
+      <w:r>
+        <w:t xml:space="preserve"> </w:t>
+      </w:r>
+      <w:r>
+        <w:t xml:space="preserve">	</w:t>
+      </w:r>
+      <w:r>
+        <w:t xml:space="preserve">Riva, F.</w:t>
+      </w:r>
+      <w:r>
+        <w:t xml:space="preserve"> </w:t>
+      </w:r>
+      <w:r>
+        <w:rPr>
+          <w:i/>
+          <w:iCs/>
+        </w:rPr>
+        <w:t xml:space="preserve">et al.</w:t>
+      </w:r>
+      <w:r>
+        <w:t xml:space="preserve"> </w:t>
+      </w:r>
+      <w:r>
+        <w:t xml:space="preserve">(2023) Toward a cohesive understanding of ecological complexity.</w:t>
+      </w:r>
+      <w:r>
+        <w:t xml:space="preserve"> </w:t>
+      </w:r>
+      <w:r>
+        <w:rPr>
+          <w:i/>
+          <w:iCs/>
+        </w:rPr>
+        <w:t xml:space="preserve">Science Advances</w:t>
+      </w:r>
+      <w:r>
+        <w:t xml:space="preserve"> </w:t>
+      </w:r>
+      <w:r>
+        <w:t xml:space="preserve">9, eabq4207</w:t>
+      </w:r>
+    </w:p>
+    <w:bookmarkEnd w:id="53"/>
+    <w:bookmarkStart w:id="54" w:name="ref-terry2020finding"/>
+    <w:p>
+      <w:pPr>
+        <w:pStyle w:val="Bibliography"/>
+      </w:pPr>
+      <w:r>
+        <w:t xml:space="preserve">19.</w:t>
+      </w:r>
+      <w:r>
+        <w:t xml:space="preserve"> </w:t>
+      </w:r>
+      <w:r>
+        <w:t xml:space="preserve">	</w:t>
+      </w:r>
+      <w:r>
+        <w:t xml:space="preserve">Terry, J.C.D. and Lewis, O.T. (2020) Finding missing links in interaction networks.</w:t>
+      </w:r>
+      <w:r>
+        <w:t xml:space="preserve"> </w:t>
+      </w:r>
+      <w:r>
+        <w:rPr>
+          <w:i/>
+          <w:iCs/>
+        </w:rPr>
+        <w:t xml:space="preserve">Ecology</w:t>
+      </w:r>
+      <w:r>
+        <w:t xml:space="preserve"> </w:t>
+      </w:r>
+      <w:r>
+        <w:t xml:space="preserve">101, e03047</w:t>
+      </w:r>
+    </w:p>
+    <w:bookmarkEnd w:id="54"/>
+    <w:bookmarkStart w:id="55" w:name="ref-marquez2007virus"/>
+    <w:p>
+      <w:pPr>
+        <w:pStyle w:val="Bibliography"/>
+      </w:pPr>
+      <w:r>
+        <w:t xml:space="preserve">20.</w:t>
+      </w:r>
+      <w:r>
+        <w:t xml:space="preserve"> </w:t>
+      </w:r>
+      <w:r>
+        <w:t xml:space="preserve">	</w:t>
+      </w:r>
+      <w:r>
+        <w:t xml:space="preserve">Márquez, L.M.</w:t>
+      </w:r>
+      <w:r>
+        <w:t xml:space="preserve"> </w:t>
+      </w:r>
+      <w:r>
+        <w:rPr>
+          <w:i/>
+          <w:iCs/>
+        </w:rPr>
+        <w:t xml:space="preserve">et al.</w:t>
+      </w:r>
+      <w:r>
+        <w:t xml:space="preserve"> </w:t>
+      </w:r>
+      <w:r>
+        <w:t xml:space="preserve">(2007) A virus in a fungus in a plant: Three-way symbiosis required for thermal tolerance.</w:t>
+      </w:r>
+      <w:r>
+        <w:t xml:space="preserve"> </w:t>
+      </w:r>
+      <w:r>
+        <w:rPr>
+          <w:i/>
+          <w:iCs/>
+        </w:rPr>
+        <w:t xml:space="preserve">Science</w:t>
+      </w:r>
+      <w:r>
+        <w:t xml:space="preserve"> </w:t>
+      </w:r>
+      <w:r>
+        <w:t xml:space="preserve">315, 513–515</w:t>
+      </w:r>
+    </w:p>
+    <w:bookmarkEnd w:id="55"/>
+    <w:bookmarkStart w:id="56" w:name="ref-zou2024time"/>
+    <w:p>
+      <w:pPr>
+        <w:pStyle w:val="Bibliography"/>
+      </w:pPr>
+      <w:r>
+        <w:t xml:space="preserve">21.</w:t>
+      </w:r>
+      <w:r>
+        <w:t xml:space="preserve"> </w:t>
+      </w:r>
+      <w:r>
+        <w:t xml:space="preserve">	</w:t>
+      </w:r>
+      <w:r>
+        <w:t xml:space="preserve">Zou, H.-X.</w:t>
+      </w:r>
+      <w:r>
+        <w:t xml:space="preserve"> </w:t>
+      </w:r>
+      <w:r>
+        <w:rPr>
+          <w:i/>
+          <w:iCs/>
+        </w:rPr>
+        <w:t xml:space="preserve">et al.</w:t>
+      </w:r>
+      <w:r>
+        <w:t xml:space="preserve"> </w:t>
+      </w:r>
+      <w:r>
+        <w:t xml:space="preserve">(2024) Time-dependent interaction modification generated from plant–soil feedback.</w:t>
+      </w:r>
+      <w:r>
+        <w:t xml:space="preserve"> </w:t>
+      </w:r>
+      <w:r>
+        <w:rPr>
+          <w:i/>
+          <w:iCs/>
+        </w:rPr>
+        <w:t xml:space="preserve">Ecology Letters</w:t>
+      </w:r>
+      <w:r>
+        <w:t xml:space="preserve"> </w:t>
+      </w:r>
+      <w:r>
+        <w:t xml:space="preserve">27, e14432</w:t>
+      </w:r>
+    </w:p>
+    <w:bookmarkEnd w:id="56"/>
+    <w:bookmarkStart w:id="57" w:name="ref-li2023interspecific"/>
+    <w:p>
+      <w:pPr>
+        <w:pStyle w:val="Bibliography"/>
+      </w:pPr>
+      <w:r>
+        <w:t xml:space="preserve">22.</w:t>
+      </w:r>
+      <w:r>
+        <w:t xml:space="preserve"> </w:t>
+      </w:r>
+      <w:r>
+        <w:t xml:space="preserve">	</w:t>
+      </w:r>
+      <w:r>
         <w:t xml:space="preserve">Li, Y.-J.</w:t>
       </w:r>
       <w:r>
@@ -1013,685 +2150,9 @@
         <w:t xml:space="preserve">114, 103583</w:t>
       </w:r>
     </w:p>
-    <w:bookmarkEnd w:id="34"/>
-    <w:bookmarkStart w:id="35" w:name="ref-marquez2007virus"/>
-    <w:p>
-      <w:pPr>
-        <w:pStyle w:val="Bibliography"/>
-      </w:pPr>
-      <w:r>
-        <w:t xml:space="preserve">8.</w:t>
-      </w:r>
-      <w:r>
-        <w:t xml:space="preserve"> </w:t>
-      </w:r>
-      <w:r>
-        <w:t xml:space="preserve">	</w:t>
-      </w:r>
-      <w:r>
-        <w:t xml:space="preserve">Márquez, L.M.</w:t>
-      </w:r>
-      <w:r>
-        <w:t xml:space="preserve"> </w:t>
-      </w:r>
-      <w:r>
-        <w:rPr>
-          <w:i/>
-          <w:iCs/>
-        </w:rPr>
-        <w:t xml:space="preserve">et al.</w:t>
-      </w:r>
-      <w:r>
-        <w:t xml:space="preserve"> </w:t>
-      </w:r>
-      <w:r>
-        <w:t xml:space="preserve">(2007) A virus in a fungus in a plant: Three-way symbiosis required for thermal tolerance.</w:t>
-      </w:r>
-      <w:r>
-        <w:t xml:space="preserve"> </w:t>
-      </w:r>
-      <w:r>
-        <w:rPr>
-          <w:i/>
-          <w:iCs/>
-        </w:rPr>
-        <w:t xml:space="preserve">Science</w:t>
-      </w:r>
-      <w:r>
-        <w:t xml:space="preserve"> </w:t>
-      </w:r>
-      <w:r>
-        <w:t xml:space="preserve">315, 513–515</w:t>
-      </w:r>
-    </w:p>
-    <w:bookmarkEnd w:id="35"/>
-    <w:bookmarkStart w:id="36" w:name="ref-zou2024time"/>
-    <w:p>
-      <w:pPr>
-        <w:pStyle w:val="Bibliography"/>
-      </w:pPr>
-      <w:r>
-        <w:t xml:space="preserve">9.</w:t>
-      </w:r>
-      <w:r>
-        <w:t xml:space="preserve"> </w:t>
-      </w:r>
-      <w:r>
-        <w:t xml:space="preserve">	</w:t>
-      </w:r>
-      <w:r>
-        <w:t xml:space="preserve">Zou, H.-X.</w:t>
-      </w:r>
-      <w:r>
-        <w:t xml:space="preserve"> </w:t>
-      </w:r>
-      <w:r>
-        <w:rPr>
-          <w:i/>
-          <w:iCs/>
-        </w:rPr>
-        <w:t xml:space="preserve">et al.</w:t>
-      </w:r>
-      <w:r>
-        <w:t xml:space="preserve"> </w:t>
-      </w:r>
-      <w:r>
-        <w:t xml:space="preserve">(2024) Time-dependent interaction modification generated from plant–soil feedback.</w:t>
-      </w:r>
-      <w:r>
-        <w:t xml:space="preserve"> </w:t>
-      </w:r>
-      <w:r>
-        <w:rPr>
-          <w:i/>
-          <w:iCs/>
-        </w:rPr>
-        <w:t xml:space="preserve">Ecology Letters</w:t>
-      </w:r>
-      <w:r>
-        <w:t xml:space="preserve"> </w:t>
-      </w:r>
-      <w:r>
-        <w:t xml:space="preserve">27, e14432</w:t>
-      </w:r>
-    </w:p>
-    <w:bookmarkEnd w:id="36"/>
-    <w:bookmarkStart w:id="37" w:name="ref-delmas2019analysing"/>
-    <w:p>
-      <w:pPr>
-        <w:pStyle w:val="Bibliography"/>
-      </w:pPr>
-      <w:r>
-        <w:t xml:space="preserve">10.</w:t>
-      </w:r>
-      <w:r>
-        <w:t xml:space="preserve"> </w:t>
-      </w:r>
-      <w:r>
-        <w:t xml:space="preserve">	</w:t>
-      </w:r>
-      <w:r>
-        <w:t xml:space="preserve">Delmas, E.</w:t>
-      </w:r>
-      <w:r>
-        <w:t xml:space="preserve"> </w:t>
-      </w:r>
-      <w:r>
-        <w:rPr>
-          <w:i/>
-          <w:iCs/>
-        </w:rPr>
-        <w:t xml:space="preserve">et al.</w:t>
-      </w:r>
-      <w:r>
-        <w:t xml:space="preserve"> </w:t>
-      </w:r>
-      <w:r>
-        <w:t xml:space="preserve">(2019) Analysing ecological networks of species interactions.</w:t>
-      </w:r>
-      <w:r>
-        <w:t xml:space="preserve"> </w:t>
-      </w:r>
-      <w:r>
-        <w:rPr>
-          <w:i/>
-          <w:iCs/>
-        </w:rPr>
-        <w:t xml:space="preserve">Biological Reviews</w:t>
-      </w:r>
-      <w:r>
-        <w:t xml:space="preserve"> </w:t>
-      </w:r>
-      <w:r>
-        <w:t xml:space="preserve">94, 16–36</w:t>
-      </w:r>
-    </w:p>
-    <w:bookmarkEnd w:id="37"/>
-    <w:bookmarkStart w:id="38" w:name="ref-godoy2019coexistence"/>
-    <w:p>
-      <w:pPr>
-        <w:pStyle w:val="Bibliography"/>
-      </w:pPr>
-      <w:r>
-        <w:t xml:space="preserve">11.</w:t>
-      </w:r>
-      <w:r>
-        <w:t xml:space="preserve"> </w:t>
-      </w:r>
-      <w:r>
-        <w:t xml:space="preserve">	</w:t>
-      </w:r>
-      <w:r>
-        <w:t xml:space="preserve">Godoy, O. (2019) Coexistence theory as a tool to understand biological invasions in species interaction networks: Implications for the study of novel ecosystems.</w:t>
-      </w:r>
-      <w:r>
-        <w:t xml:space="preserve"> </w:t>
-      </w:r>
-      <w:r>
-        <w:rPr>
-          <w:i/>
-          <w:iCs/>
-        </w:rPr>
-        <w:t xml:space="preserve">Functional Ecology</w:t>
-      </w:r>
-      <w:r>
-        <w:t xml:space="preserve"> </w:t>
-      </w:r>
-      <w:r>
-        <w:t xml:space="preserve">33, 1190–1201</w:t>
-      </w:r>
-    </w:p>
-    <w:bookmarkEnd w:id="38"/>
-    <w:bookmarkStart w:id="39" w:name="ref-poisot2021global"/>
-    <w:p>
-      <w:pPr>
-        <w:pStyle w:val="Bibliography"/>
-      </w:pPr>
-      <w:r>
-        <w:t xml:space="preserve">12.</w:t>
-      </w:r>
-      <w:r>
-        <w:t xml:space="preserve"> </w:t>
-      </w:r>
-      <w:r>
-        <w:t xml:space="preserve">	</w:t>
-      </w:r>
-      <w:r>
-        <w:t xml:space="preserve">Poisot, T.</w:t>
-      </w:r>
-      <w:r>
-        <w:t xml:space="preserve"> </w:t>
-      </w:r>
-      <w:r>
-        <w:rPr>
-          <w:i/>
-          <w:iCs/>
-        </w:rPr>
-        <w:t xml:space="preserve">et al.</w:t>
-      </w:r>
-      <w:r>
-        <w:t xml:space="preserve"> </w:t>
-      </w:r>
-      <w:r>
-        <w:t xml:space="preserve">(2021) Global knowledge gaps in species interaction networks data.</w:t>
-      </w:r>
-      <w:r>
-        <w:t xml:space="preserve"> </w:t>
-      </w:r>
-      <w:r>
-        <w:rPr>
-          <w:i/>
-          <w:iCs/>
-        </w:rPr>
-        <w:t xml:space="preserve">Journal of Biogeography</w:t>
-      </w:r>
-      <w:r>
-        <w:t xml:space="preserve"> </w:t>
-      </w:r>
-      <w:r>
-        <w:t xml:space="preserve">48, 1552–1563</w:t>
-      </w:r>
-    </w:p>
-    <w:bookmarkEnd w:id="39"/>
-    <w:bookmarkStart w:id="40" w:name="ref-hui2019invade"/>
-    <w:p>
-      <w:pPr>
-        <w:pStyle w:val="Bibliography"/>
-      </w:pPr>
-      <w:r>
-        <w:t xml:space="preserve">13.</w:t>
-      </w:r>
-      <w:r>
-        <w:t xml:space="preserve"> </w:t>
-      </w:r>
-      <w:r>
-        <w:t xml:space="preserve">	</w:t>
-      </w:r>
-      <w:r>
-        <w:t xml:space="preserve">Hui, C. and Richardson, D.M. (2019) How to invade an ecological network.</w:t>
-      </w:r>
-      <w:r>
-        <w:t xml:space="preserve"> </w:t>
-      </w:r>
-      <w:r>
-        <w:rPr>
-          <w:i/>
-          <w:iCs/>
-        </w:rPr>
-        <w:t xml:space="preserve">Trends in ecology &amp; evolution</w:t>
-      </w:r>
-      <w:r>
-        <w:t xml:space="preserve"> </w:t>
-      </w:r>
-      <w:r>
-        <w:t xml:space="preserve">34, 121–131</w:t>
-      </w:r>
-    </w:p>
-    <w:bookmarkEnd w:id="40"/>
-    <w:bookmarkStart w:id="41" w:name="ref-gomez2023role"/>
-    <w:p>
-      <w:pPr>
-        <w:pStyle w:val="Bibliography"/>
-      </w:pPr>
-      <w:r>
-        <w:t xml:space="preserve">14.</w:t>
-      </w:r>
-      <w:r>
-        <w:t xml:space="preserve"> </w:t>
-      </w:r>
-      <w:r>
-        <w:t xml:space="preserve">	</w:t>
-      </w:r>
-      <w:r>
-        <w:t xml:space="preserve">Gómez, J.M.</w:t>
-      </w:r>
-      <w:r>
-        <w:t xml:space="preserve"> </w:t>
-      </w:r>
-      <w:r>
-        <w:rPr>
-          <w:i/>
-          <w:iCs/>
-        </w:rPr>
-        <w:t xml:space="preserve">et al.</w:t>
-      </w:r>
-      <w:r>
-        <w:t xml:space="preserve"> </w:t>
-      </w:r>
-      <w:r>
-        <w:t xml:space="preserve">(2023) The role of phenotypic plasticity in shaping ecological networks.</w:t>
-      </w:r>
-      <w:r>
-        <w:t xml:space="preserve"> </w:t>
-      </w:r>
-      <w:r>
-        <w:rPr>
-          <w:i/>
-          <w:iCs/>
-        </w:rPr>
-        <w:t xml:space="preserve">Ecology Letters</w:t>
-      </w:r>
-      <w:r>
-        <w:t xml:space="preserve"> </w:t>
-      </w:r>
-      <w:r>
-        <w:t xml:space="preserve">26, S47–S61</w:t>
-      </w:r>
-    </w:p>
-    <w:bookmarkEnd w:id="41"/>
-    <w:bookmarkStart w:id="42" w:name="ref-lytle2023matrix"/>
-    <w:p>
-      <w:pPr>
-        <w:pStyle w:val="Bibliography"/>
-      </w:pPr>
-      <w:r>
-        <w:t xml:space="preserve">15.</w:t>
-      </w:r>
-      <w:r>
-        <w:t xml:space="preserve"> </w:t>
-      </w:r>
-      <w:r>
-        <w:t xml:space="preserve">	</w:t>
-      </w:r>
-      <w:r>
-        <w:t xml:space="preserve">Lytle, D.A. and Tonkin, J.D. (2023) Matrix community models for ecology and evolution.</w:t>
-      </w:r>
-      <w:r>
-        <w:t xml:space="preserve"> </w:t>
-      </w:r>
-      <w:r>
-        <w:rPr>
-          <w:i/>
-          <w:iCs/>
-        </w:rPr>
-        <w:t xml:space="preserve">npj Biodiversity</w:t>
-      </w:r>
-      <w:r>
-        <w:t xml:space="preserve"> </w:t>
-      </w:r>
-      <w:r>
-        <w:t xml:space="preserve">2, 26</w:t>
-      </w:r>
-    </w:p>
-    <w:bookmarkEnd w:id="42"/>
-    <w:bookmarkStart w:id="43" w:name="ref-petsopoulos2021using"/>
-    <w:p>
-      <w:pPr>
-        <w:pStyle w:val="Bibliography"/>
-      </w:pPr>
-      <w:r>
-        <w:t xml:space="preserve">16.</w:t>
-      </w:r>
-      <w:r>
-        <w:t xml:space="preserve"> </w:t>
-      </w:r>
-      <w:r>
-        <w:t xml:space="preserve">	</w:t>
-      </w:r>
-      <w:r>
-        <w:t xml:space="preserve">Petsopoulos, D.</w:t>
-      </w:r>
-      <w:r>
-        <w:t xml:space="preserve"> </w:t>
-      </w:r>
-      <w:r>
-        <w:rPr>
-          <w:i/>
-          <w:iCs/>
-        </w:rPr>
-        <w:t xml:space="preserve">et al.</w:t>
-      </w:r>
-      <w:r>
-        <w:t xml:space="preserve"> </w:t>
-      </w:r>
-      <w:r>
-        <w:t xml:space="preserve">(2021) Using network ecology to understand and mitigate long-term insect declines.</w:t>
-      </w:r>
-      <w:r>
-        <w:t xml:space="preserve"> </w:t>
-      </w:r>
-      <w:r>
-        <w:rPr>
-          <w:i/>
-          <w:iCs/>
-        </w:rPr>
-        <w:t xml:space="preserve">Ecological Entomology</w:t>
-      </w:r>
-    </w:p>
-    <w:bookmarkEnd w:id="43"/>
-    <w:bookmarkStart w:id="44" w:name="ref-dale2021quantitative"/>
-    <w:p>
-      <w:pPr>
-        <w:pStyle w:val="Bibliography"/>
-      </w:pPr>
-      <w:r>
-        <w:t xml:space="preserve">17.</w:t>
-      </w:r>
-      <w:r>
-        <w:t xml:space="preserve"> </w:t>
-      </w:r>
-      <w:r>
-        <w:t xml:space="preserve">	</w:t>
-      </w:r>
-      <w:r>
-        <w:t xml:space="preserve">Dale, M.R. and Fortin, M.-J. (2021)</w:t>
-      </w:r>
-      <w:r>
-        <w:t xml:space="preserve"> </w:t>
-      </w:r>
-      <w:r>
-        <w:rPr>
-          <w:i/>
-          <w:iCs/>
-        </w:rPr>
-        <w:t xml:space="preserve">Quantitative analysis of ecological networks</w:t>
-      </w:r>
-      <w:r>
-        <w:t xml:space="preserve">, Cambridge University Press</w:t>
-      </w:r>
-    </w:p>
-    <w:bookmarkEnd w:id="44"/>
-    <w:bookmarkStart w:id="45" w:name="ref-vitali2022disruption"/>
-    <w:p>
-      <w:pPr>
-        <w:pStyle w:val="Bibliography"/>
-      </w:pPr>
-      <w:r>
-        <w:t xml:space="preserve">18.</w:t>
-      </w:r>
-      <w:r>
-        <w:t xml:space="preserve"> </w:t>
-      </w:r>
-      <w:r>
-        <w:t xml:space="preserve">	</w:t>
-      </w:r>
-      <w:r>
-        <w:t xml:space="preserve">Vitali, A.</w:t>
-      </w:r>
-      <w:r>
-        <w:t xml:space="preserve"> </w:t>
-      </w:r>
-      <w:r>
-        <w:rPr>
-          <w:i/>
-          <w:iCs/>
-        </w:rPr>
-        <w:t xml:space="preserve">et al.</w:t>
-      </w:r>
-      <w:r>
-        <w:t xml:space="preserve"> </w:t>
-      </w:r>
-      <w:r>
-        <w:t xml:space="preserve">(2022) The disruption of a keystone interaction erodes pollination and seed dispersal networks.</w:t>
-      </w:r>
-      <w:r>
-        <w:t xml:space="preserve"> </w:t>
-      </w:r>
-      <w:r>
-        <w:rPr>
-          <w:i/>
-          <w:iCs/>
-        </w:rPr>
-        <w:t xml:space="preserve">Ecology</w:t>
-      </w:r>
-      <w:r>
-        <w:t xml:space="preserve"> </w:t>
-      </w:r>
-      <w:r>
-        <w:t xml:space="preserve">103, e03547</w:t>
-      </w:r>
-    </w:p>
-    <w:bookmarkEnd w:id="45"/>
-    <w:bookmarkStart w:id="46" w:name="ref-riva2023toward"/>
-    <w:p>
-      <w:pPr>
-        <w:pStyle w:val="Bibliography"/>
-      </w:pPr>
-      <w:r>
-        <w:t xml:space="preserve">19.</w:t>
-      </w:r>
-      <w:r>
-        <w:t xml:space="preserve"> </w:t>
-      </w:r>
-      <w:r>
-        <w:t xml:space="preserve">	</w:t>
-      </w:r>
-      <w:r>
-        <w:t xml:space="preserve">Riva, F.</w:t>
-      </w:r>
-      <w:r>
-        <w:t xml:space="preserve"> </w:t>
-      </w:r>
-      <w:r>
-        <w:rPr>
-          <w:i/>
-          <w:iCs/>
-        </w:rPr>
-        <w:t xml:space="preserve">et al.</w:t>
-      </w:r>
-      <w:r>
-        <w:t xml:space="preserve"> </w:t>
-      </w:r>
-      <w:r>
-        <w:t xml:space="preserve">(2023) Toward a cohesive understanding of ecological complexity.</w:t>
-      </w:r>
-      <w:r>
-        <w:t xml:space="preserve"> </w:t>
-      </w:r>
-      <w:r>
-        <w:rPr>
-          <w:i/>
-          <w:iCs/>
-        </w:rPr>
-        <w:t xml:space="preserve">Science Advances</w:t>
-      </w:r>
-      <w:r>
-        <w:t xml:space="preserve"> </w:t>
-      </w:r>
-      <w:r>
-        <w:t xml:space="preserve">9, eabq4207</w:t>
-      </w:r>
-    </w:p>
-    <w:bookmarkEnd w:id="46"/>
-    <w:bookmarkStart w:id="47" w:name="ref-terry2020finding"/>
-    <w:p>
-      <w:pPr>
-        <w:pStyle w:val="Bibliography"/>
-      </w:pPr>
-      <w:r>
-        <w:t xml:space="preserve">20.</w:t>
-      </w:r>
-      <w:r>
-        <w:t xml:space="preserve"> </w:t>
-      </w:r>
-      <w:r>
-        <w:t xml:space="preserve">	</w:t>
-      </w:r>
-      <w:r>
-        <w:t xml:space="preserve">Terry, J.C.D. and Lewis, O.T. (2020) Finding missing links in interaction networks.</w:t>
-      </w:r>
-      <w:r>
-        <w:t xml:space="preserve"> </w:t>
-      </w:r>
-      <w:r>
-        <w:rPr>
-          <w:i/>
-          <w:iCs/>
-        </w:rPr>
-        <w:t xml:space="preserve">Ecology</w:t>
-      </w:r>
-      <w:r>
-        <w:t xml:space="preserve"> </w:t>
-      </w:r>
-      <w:r>
-        <w:t xml:space="preserve">101, e03047</w:t>
-      </w:r>
-    </w:p>
-    <w:bookmarkEnd w:id="47"/>
-    <w:bookmarkStart w:id="48" w:name="ref-lu2023food"/>
-    <w:p>
-      <w:pPr>
-        <w:pStyle w:val="Bibliography"/>
-      </w:pPr>
-      <w:r>
-        <w:t xml:space="preserve">21.</w:t>
-      </w:r>
-      <w:r>
-        <w:t xml:space="preserve"> </w:t>
-      </w:r>
-      <w:r>
-        <w:t xml:space="preserve">	</w:t>
-      </w:r>
-      <w:r>
-        <w:t xml:space="preserve">Lu, Q.</w:t>
-      </w:r>
-      <w:r>
-        <w:t xml:space="preserve"> </w:t>
-      </w:r>
-      <w:r>
-        <w:rPr>
-          <w:i/>
-          <w:iCs/>
-        </w:rPr>
-        <w:t xml:space="preserve">et al.</w:t>
-      </w:r>
-      <w:r>
-        <w:t xml:space="preserve"> </w:t>
-      </w:r>
-      <w:r>
-        <w:t xml:space="preserve">(2023) Food webs reveal coexistence mechanisms and community organization in carnivores.</w:t>
-      </w:r>
-      <w:r>
-        <w:t xml:space="preserve"> </w:t>
-      </w:r>
-      <w:r>
-        <w:rPr>
-          <w:i/>
-          <w:iCs/>
-        </w:rPr>
-        <w:t xml:space="preserve">Current Biology</w:t>
-      </w:r>
-      <w:r>
-        <w:t xml:space="preserve"> </w:t>
-      </w:r>
-      <w:r>
-        <w:t xml:space="preserve">33, 647–659</w:t>
-      </w:r>
-    </w:p>
-    <w:bookmarkEnd w:id="48"/>
-    <w:bookmarkStart w:id="49" w:name="ref-carrara2015inferring"/>
-    <w:p>
-      <w:pPr>
-        <w:pStyle w:val="Bibliography"/>
-      </w:pPr>
-      <w:r>
-        <w:t xml:space="preserve">22.</w:t>
-      </w:r>
-      <w:r>
-        <w:t xml:space="preserve"> </w:t>
-      </w:r>
-      <w:r>
-        <w:t xml:space="preserve">	</w:t>
-      </w:r>
-      <w:r>
-        <w:t xml:space="preserve">Carrara, F.</w:t>
-      </w:r>
-      <w:r>
-        <w:t xml:space="preserve"> </w:t>
-      </w:r>
-      <w:r>
-        <w:rPr>
-          <w:i/>
-          <w:iCs/>
-        </w:rPr>
-        <w:t xml:space="preserve">et al.</w:t>
-      </w:r>
-      <w:r>
-        <w:t xml:space="preserve"> </w:t>
-      </w:r>
-      <w:r>
-        <w:t xml:space="preserve">(2015) Inferring species interactions in ecological communities: A comparison of methods at different levels of complexity.</w:t>
-      </w:r>
-      <w:r>
-        <w:t xml:space="preserve"> </w:t>
-      </w:r>
-      <w:r>
-        <w:rPr>
-          <w:i/>
-          <w:iCs/>
-        </w:rPr>
-        <w:t xml:space="preserve">Methods in Ecology and Evolution</w:t>
-      </w:r>
-      <w:r>
-        <w:t xml:space="preserve"> </w:t>
-      </w:r>
-      <w:r>
-        <w:t xml:space="preserve">6, 895–906</w:t>
-      </w:r>
-    </w:p>
-    <w:bookmarkEnd w:id="49"/>
-    <w:bookmarkEnd w:id="50"/>
-    <w:bookmarkEnd w:id="51"/>
+    <w:bookmarkEnd w:id="57"/>
+    <w:bookmarkEnd w:id="58"/>
+    <w:bookmarkEnd w:id="59"/>
     <w:sectPr>
       <w:pgSz w:h="15840" w:w="12240"/>
       <w:pgMar w:bottom="851" w:footer="720" w:gutter="0" w:header="720" w:left="851" w:right="851" w:top="851"/>
@@ -2596,6 +3057,27 @@
     <w:abstractNumId w:val="991"/>
   </w:num>
   <w:num w:numId="1003">
+    <w:abstractNumId w:val="991"/>
+  </w:num>
+  <w:num w:numId="1004">
+    <w:abstractNumId w:val="991"/>
+  </w:num>
+  <w:num w:numId="1005">
+    <w:abstractNumId w:val="991"/>
+  </w:num>
+  <w:num w:numId="1006">
+    <w:abstractNumId w:val="991"/>
+  </w:num>
+  <w:num w:numId="1007">
+    <w:abstractNumId w:val="991"/>
+  </w:num>
+  <w:num w:numId="1008">
+    <w:abstractNumId w:val="991"/>
+  </w:num>
+  <w:num w:numId="1009">
+    <w:abstractNumId w:val="991"/>
+  </w:num>
+  <w:num w:numId="1010">
     <w:abstractNumId w:val="991"/>
   </w:num>
 </w:numbering>

</xml_diff>

<commit_message>
UPdated MS with agreed title
</commit_message>
<xml_diff>
--- a/ms/ms.docx
+++ b/ms/ms.docx
@@ -7,25 +7,19 @@
         <w:pStyle w:val="Title"/>
       </w:pPr>
       <w:r>
-        <w:t xml:space="preserve">An</w:t>
-      </w:r>
-      <w:r>
-        <w:t xml:space="preserve"> </w:t>
-      </w:r>
-      <w:r>
-        <w:t xml:space="preserve">integrated</w:t>
-      </w:r>
-      <w:r>
-        <w:t xml:space="preserve"> </w:t>
-      </w:r>
-      <w:r>
-        <w:t xml:space="preserve">modelling</w:t>
-      </w:r>
-      <w:r>
-        <w:t xml:space="preserve"> </w:t>
-      </w:r>
-      <w:r>
-        <w:t xml:space="preserve">approach</w:t>
+        <w:t xml:space="preserve">Connecting</w:t>
+      </w:r>
+      <w:r>
+        <w:t xml:space="preserve"> </w:t>
+      </w:r>
+      <w:r>
+        <w:t xml:space="preserve">our</w:t>
+      </w:r>
+      <w:r>
+        <w:t xml:space="preserve"> </w:t>
+      </w:r>
+      <w:r>
+        <w:t xml:space="preserve">models</w:t>
       </w:r>
       <w:r>
         <w:t xml:space="preserve"> </w:t>
@@ -37,25 +31,25 @@
         <w:t xml:space="preserve"> </w:t>
       </w:r>
       <w:r>
-        <w:t xml:space="preserve">predicting</w:t>
-      </w:r>
-      <w:r>
-        <w:t xml:space="preserve"> </w:t>
-      </w:r>
-      <w:r>
-        <w:t xml:space="preserve">the</w:t>
-      </w:r>
-      <w:r>
-        <w:t xml:space="preserve"> </w:t>
-      </w:r>
-      <w:r>
-        <w:t xml:space="preserve">impacts</w:t>
-      </w:r>
-      <w:r>
-        <w:t xml:space="preserve"> </w:t>
-      </w:r>
-      <w:r>
-        <w:t xml:space="preserve">of</w:t>
+        <w:t xml:space="preserve">calculated</w:t>
+      </w:r>
+      <w:r>
+        <w:t xml:space="preserve"> </w:t>
+      </w:r>
+      <w:r>
+        <w:t xml:space="preserve">biological</w:t>
+      </w:r>
+      <w:r>
+        <w:t xml:space="preserve"> </w:t>
+      </w:r>
+      <w:r>
+        <w:t xml:space="preserve">responses</w:t>
+      </w:r>
+      <w:r>
+        <w:t xml:space="preserve"> </w:t>
+      </w:r>
+      <w:r>
+        <w:t xml:space="preserve">to</w:t>
       </w:r>
       <w:r>
         <w:t xml:space="preserve"> </w:t>
@@ -68,18 +62,6 @@
       </w:r>
       <w:r>
         <w:t xml:space="preserve">heat</w:t>
-      </w:r>
-      <w:r>
-        <w:t xml:space="preserve"> </w:t>
-      </w:r>
-      <w:r>
-        <w:t xml:space="preserve">on</w:t>
-      </w:r>
-      <w:r>
-        <w:t xml:space="preserve"> </w:t>
-      </w:r>
-      <w:r>
-        <w:t xml:space="preserve">communities</w:t>
       </w:r>
     </w:p>
     <w:p>
@@ -95,6 +77,545 @@
       </w:r>
       <w:r>
         <w:t xml:space="preserve">: (just brainstorming)</w:t>
+      </w:r>
+      <w:r>
+        <w:t xml:space="preserve"> </w:t>
+      </w:r>
+      <w:r>
+        <w:t xml:space="preserve">- Integrated modeling approaches for predicting the impacts of extreme heat on communities</w:t>
+      </w:r>
+      <w:r>
+        <w:t xml:space="preserve"> </w:t>
+      </w:r>
+      <w:r>
+        <w:t xml:space="preserve">- Thermal tolerance landscapes for populations and communities: applications in a changing world</w:t>
+      </w:r>
+      <w:r>
+        <w:t xml:space="preserve"> </w:t>
+      </w:r>
+      <w:r>
+        <w:t xml:space="preserve">- An integrated modelling approach for predicting the impacts of extreme heat on communities</w:t>
+      </w:r>
+      <w:r>
+        <w:t xml:space="preserve"> </w:t>
+      </w:r>
+      <w:r>
+        <w:t xml:space="preserve">- Predicting the resilience of species interactions under extreme heat now and into the future</w:t>
+      </w:r>
+      <w:r>
+        <w:t xml:space="preserve"> </w:t>
+      </w:r>
+      <w:r>
+        <w:t xml:space="preserve">- Calculated responses to the biological impacts of extreme heat: the need to connect our models (Mike) (Dan likes this one as well)</w:t>
+      </w:r>
+      <w:r>
+        <w:t xml:space="preserve"> </w:t>
+      </w:r>
+      <w:r>
+        <w:t xml:space="preserve">- Predicting the resilience of species interactions under extreme heat</w:t>
+      </w:r>
+    </w:p>
+    <w:p>
+      <w:pPr>
+        <w:pStyle w:val="BodyText"/>
+      </w:pPr>
+      <w:r>
+        <w:rPr>
+          <w:b/>
+          <w:bCs/>
+        </w:rPr>
+        <w:t xml:space="preserve">Target Journal</w:t>
+      </w:r>
+      <w:r>
+        <w:t xml:space="preserve">:</w:t>
+      </w:r>
+      <w:r>
+        <w:t xml:space="preserve"> </w:t>
+      </w:r>
+      <w:r>
+        <w:rPr>
+          <w:i/>
+          <w:iCs/>
+        </w:rPr>
+        <w:t xml:space="preserve">Trends in Ecology and Evolution</w:t>
+      </w:r>
+      <w:r>
+        <w:t xml:space="preserve">, Opinion</w:t>
+      </w:r>
+      <w:r>
+        <w:t xml:space="preserve"> </w:t>
+      </w:r>
+      <w:r>
+        <w:t xml:space="preserve">https://www.cell.com/trends/ecology-evolution/authors</w:t>
+      </w:r>
+    </w:p>
+    <w:p>
+      <w:pPr>
+        <w:pStyle w:val="BodyText"/>
+      </w:pPr>
+      <w:r>
+        <w:t xml:space="preserve">Abstract: 100-120 words</w:t>
+      </w:r>
+      <w:r>
+        <w:br/>
+      </w:r>
+      <w:r>
+        <w:t xml:space="preserve">Highlights: Provide a short collection of 3-5 statements that concisely convey to the reader the recent advances in the field, including emerging concepts and/or distinctions, that constitute a main motivation for the discussion developed in the article. This summary is prominently featured on the first page of the article, thus allowing readers to immediately get a sense of the current status of the field.</w:t>
+      </w:r>
+      <w:r>
+        <w:br/>
+      </w:r>
+      <w:r>
+        <w:t xml:space="preserve">Word Count: 3500 words (this limit does not include text in the boxes, glossary, abstract, references, tables or figure legends)</w:t>
+      </w:r>
+      <w:r>
+        <w:br/>
+      </w:r>
+      <w:r>
+        <w:t xml:space="preserve">References: 80-100</w:t>
+      </w:r>
+      <w:r>
+        <w:br/>
+      </w:r>
+      <w:r>
+        <w:t xml:space="preserve">Outstanding Questions: 350 words</w:t>
+      </w:r>
+      <w:r>
+        <w:br/>
+      </w:r>
+      <w:r>
+        <w:t xml:space="preserve">Glossary: 500 words</w:t>
+      </w:r>
+      <w:r>
+        <w:br/>
+      </w:r>
+    </w:p>
+    <w:p>
+      <w:pPr>
+        <w:pStyle w:val="BodyText"/>
+      </w:pPr>
+      <w:r>
+        <w:rPr>
+          <w:b/>
+          <w:bCs/>
+        </w:rPr>
+        <w:t xml:space="preserve">Alternative homes</w:t>
+      </w:r>
+      <w:r>
+        <w:t xml:space="preserve">:</w:t>
+      </w:r>
+    </w:p>
+    <w:p>
+      <w:pPr>
+        <w:pStyle w:val="BodyText"/>
+      </w:pPr>
+      <w:r>
+        <w:rPr>
+          <w:i/>
+          <w:iCs/>
+        </w:rPr>
+        <w:t xml:space="preserve">Nature Ecology and Evolution</w:t>
+      </w:r>
+      <w:r>
+        <w:t xml:space="preserve"> </w:t>
+      </w:r>
+      <w:r>
+        <w:t xml:space="preserve">(Perspective) - 3000-4000 words, 4-6 display items: https://www.nature.com/natecolevol/content</w:t>
+      </w:r>
+      <w:r>
+        <w:br/>
+      </w:r>
+      <w:r>
+        <w:rPr>
+          <w:i/>
+          <w:iCs/>
+        </w:rPr>
+        <w:t xml:space="preserve">Global Change Biology</w:t>
+      </w:r>
+      <w:r>
+        <w:t xml:space="preserve"> </w:t>
+      </w:r>
+      <w:r>
+        <w:t xml:space="preserve">- 3000 (Mini Review)-5000 (Opinion) words (https://onlinelibrary.wiley.com/page/journal/13652486/homepage/forauthors.html)</w:t>
+      </w:r>
+      <w:r>
+        <w:br/>
+      </w:r>
+      <w:r>
+        <w:rPr>
+          <w:i/>
+          <w:iCs/>
+        </w:rPr>
+        <w:t xml:space="preserve">Ecology Letters</w:t>
+      </w:r>
+      <w:r>
+        <w:t xml:space="preserve"> </w:t>
+      </w:r>
+      <w:r>
+        <w:t xml:space="preserve">(Perspective) - up to 7500 words if needed.</w:t>
+      </w:r>
+    </w:p>
+    <w:p>
+      <w:pPr>
+        <w:pStyle w:val="BodyText"/>
+      </w:pPr>
+      <w:r>
+        <w:rPr>
+          <w:b/>
+          <w:bCs/>
+        </w:rPr>
+        <w:t xml:space="preserve">Structure Overview - Sections</w:t>
+      </w:r>
+      <w:r>
+        <w:t xml:space="preserve">:</w:t>
+      </w:r>
+      <w:r>
+        <w:br/>
+      </w:r>
+      <w:r>
+        <w:t xml:space="preserve">- Abstract (Dan) (~120 words - First Draft Done)</w:t>
+      </w:r>
+      <w:r>
+        <w:br/>
+      </w:r>
+      <w:r>
+        <w:t xml:space="preserve">- A need for a mechanistically informed modelling framework for predicting the effects of extreme heat on community assemblages (Dan) (~ 500 words - First Draft Done)</w:t>
+      </w:r>
+      <w:r>
+        <w:br/>
+      </w:r>
+      <w:r>
+        <w:t xml:space="preserve">- The next wave of climate models (Mike, Belinda)</w:t>
+      </w:r>
+      <w:r>
+        <w:br/>
+      </w:r>
+      <w:r>
+        <w:t xml:space="preserve">- Building thermal biology into biosphere/interaction models</w:t>
+      </w:r>
+      <w:r>
+        <w:br/>
+      </w:r>
+      <w:r>
+        <w:t xml:space="preserve">- Capturing the balance between physiological</w:t>
+      </w:r>
+      <w:r>
+        <w:t xml:space="preserve"> </w:t>
+      </w:r>
+      <w:r>
+        <w:rPr>
+          <w:i/>
+          <w:iCs/>
+        </w:rPr>
+        <w:t xml:space="preserve">damage</w:t>
+      </w:r>
+      <w:r>
+        <w:t xml:space="preserve"> </w:t>
+      </w:r>
+      <w:r>
+        <w:t xml:space="preserve">and</w:t>
+      </w:r>
+      <w:r>
+        <w:t xml:space="preserve"> </w:t>
+      </w:r>
+      <w:r>
+        <w:rPr>
+          <w:i/>
+          <w:iCs/>
+        </w:rPr>
+        <w:t xml:space="preserve">repair</w:t>
+      </w:r>
+      <w:r>
+        <w:t xml:space="preserve"> </w:t>
+      </w:r>
+      <w:r>
+        <w:t xml:space="preserve">to predict multi-species thermal sensitivity (Dan, Adrienne) (~300-500 words)</w:t>
+      </w:r>
+      <w:r>
+        <w:br/>
+      </w:r>
+      <w:r>
+        <w:t xml:space="preserve">- Biophysics to the rescue: realistic community wide</w:t>
+      </w:r>
+      <w:r>
+        <w:t xml:space="preserve"> </w:t>
+      </w:r>
+      <w:r>
+        <w:rPr>
+          <w:i/>
+          <w:iCs/>
+        </w:rPr>
+        <w:t xml:space="preserve">exposure</w:t>
+      </w:r>
+      <w:r>
+        <w:t xml:space="preserve"> </w:t>
+      </w:r>
+      <w:r>
+        <w:t xml:space="preserve">to extreme heat and Dynamic Energy Budget models (Mike, Belinda) (~300-500 word)</w:t>
+      </w:r>
+      <w:r>
+        <w:br/>
+      </w:r>
+      <w:r>
+        <w:t xml:space="preserve">- Mechanistic approaches that</w:t>
+      </w:r>
+      <w:r>
+        <w:t xml:space="preserve"> </w:t>
+      </w:r>
+      <w:r>
+        <w:t xml:space="preserve">‘</w:t>
+      </w:r>
+      <w:r>
+        <w:t xml:space="preserve">speak</w:t>
+      </w:r>
+      <w:r>
+        <w:t xml:space="preserve">’</w:t>
+      </w:r>
+      <w:r>
+        <w:t xml:space="preserve"> </w:t>
+      </w:r>
+      <w:r>
+        <w:t xml:space="preserve">to population and community ecology under extreme heat (Margie) (~300-500 words)</w:t>
+      </w:r>
+      <w:r>
+        <w:br/>
+      </w:r>
+      <w:r>
+        <w:t xml:space="preserve">- Incorporating context-dependent environmental feedback to evaluate resilience to extreme heat (Brajesh, Brendan, James, Everyone else who wants to contribute) (~500 words)</w:t>
+      </w:r>
+      <w:r>
+        <w:br/>
+      </w:r>
+      <w:r>
+        <w:t xml:space="preserve">-</w:t>
+      </w:r>
+      <w:r>
+        <w:t xml:space="preserve"> </w:t>
+      </w:r>
+      <w:r>
+        <w:t xml:space="preserve">‘</w:t>
+      </w:r>
+      <w:r>
+        <w:t xml:space="preserve">Hot</w:t>
+      </w:r>
+      <w:r>
+        <w:t xml:space="preserve">’</w:t>
+      </w:r>
+      <w:r>
+        <w:t xml:space="preserve"> </w:t>
+      </w:r>
+      <w:r>
+        <w:t xml:space="preserve">solutions for a changing world (Alison, Owen and Belinda, Mike, Anyone else!) (~500 words)</w:t>
+      </w:r>
+      <w:r>
+        <w:br/>
+      </w:r>
+      <w:r>
+        <w:t xml:space="preserve">- Future directions: modelling challenges, gaps and possible solutions (Mike, Belinda, Dan, Ary, Braj, Everyone) (~300-500 words)</w:t>
+      </w:r>
+    </w:p>
+    <w:p>
+      <w:pPr>
+        <w:pStyle w:val="BodyText"/>
+      </w:pPr>
+      <w:r>
+        <w:t xml:space="preserve">Please see more detailed guidance for each section below and some names who might lead these.</w:t>
+      </w:r>
+    </w:p>
+    <w:bookmarkStart w:id="20" w:name="abstract-dan"/>
+    <w:p>
+      <w:pPr>
+        <w:pStyle w:val="Heading1"/>
+      </w:pPr>
+      <w:r>
+        <w:t xml:space="preserve">Abstract (Dan)</w:t>
+      </w:r>
+    </w:p>
+    <w:p>
+      <w:pPr>
+        <w:pStyle w:val="FirstParagraph"/>
+      </w:pPr>
+      <w:r>
+        <w:t xml:space="preserve">Anthropogenic climate change is leading to more frequent and extreme heat waves. These short-term but large-scale events are radically re-shaping interactions among organisms, impacting biodiversity, community composition and ecosystem services crucial to natural systems and food security. Predicting heat wave impacts on interacting species requires an understanding of the processes driving differential exposure and sensitivity of organisms to extreme heat events in a life-cycle context. But this, in turn, requires a modelling framework that can capture species-specific responses via habitat-mediated microclimates, biophysics of body temperature, physiological sensitivity, and its effects on vital rates across ontogeny and thermal history. We show how existing models in disparate fields can be linked to achieve this level of understanding to allow calculated responses to extreme heat now and into the future. </w:t>
+      </w:r>
+    </w:p>
+    <w:bookmarkEnd w:id="20"/>
+    <w:bookmarkStart w:id="21" w:name="Xebe326ccf6438bb59b06b215a72d468ba832b0f"/>
+    <w:p>
+      <w:pPr>
+        <w:pStyle w:val="Heading1"/>
+      </w:pPr>
+      <w:r>
+        <w:t xml:space="preserve">A need for a mechanistically informed modelling framework for predicting the effects of extreme heat on community assemblages (Dan)</w:t>
+      </w:r>
+    </w:p>
+    <w:p>
+      <w:pPr>
+        <w:pStyle w:val="FirstParagraph"/>
+      </w:pPr>
+      <w:r>
+        <w:t xml:space="preserve">Climate change is leading to warmer and more variable thermal environments globally</w:t>
+      </w:r>
+      <w:r>
+        <w:t xml:space="preserve"> </w:t>
+      </w:r>
+      <w:r>
+        <w:t xml:space="preserve">[1,2]</w:t>
+      </w:r>
+      <w:r>
+        <w:t xml:space="preserve">. Greater thermal variability will result in organisms experiencing extreme heat waves that result in thermal stress that impacts organismal growth, survival and reproduction with cascading effects on population dynamics, community composition and ecosystem structure and function. Climate variability has already been linked to dramatic declines in pollinator abundance</w:t>
+      </w:r>
+      <w:r>
+        <w:t xml:space="preserve"> </w:t>
+      </w:r>
+      <w:r>
+        <w:t xml:space="preserve">[3]</w:t>
+      </w:r>
+      <w:r>
+        <w:t xml:space="preserve"> </w:t>
+      </w:r>
+      <w:r>
+        <w:t xml:space="preserve">and in crop yields globally</w:t>
+      </w:r>
+      <w:r>
+        <w:t xml:space="preserve"> </w:t>
+      </w:r>
+      <w:r>
+        <w:t xml:space="preserve">[4,5]</w:t>
+      </w:r>
+      <w:r>
+        <w:t xml:space="preserve">, but the causes underlying such declines, and their ramifications through communities, are not fully understood. The impacts of extreme heat on species and communities are driven by a combination of direct effects of heat stress on organism physiology and fitness</w:t>
+      </w:r>
+      <w:r>
+        <w:t xml:space="preserve"> </w:t>
+      </w:r>
+      <w:r>
+        <w:t xml:space="preserve">[6–9]</w:t>
+      </w:r>
+      <w:r>
+        <w:t xml:space="preserve"> </w:t>
+      </w:r>
+      <w:r>
+        <w:t xml:space="preserve">and indirect effects on interactions (both positive and negative) among species</w:t>
+      </w:r>
+      <w:r>
+        <w:t xml:space="preserve"> </w:t>
+      </w:r>
+      <w:r>
+        <w:t xml:space="preserve">[e.g., 10,11]</w:t>
+      </w:r>
+      <w:r>
+        <w:t xml:space="preserve"> </w:t>
+      </w:r>
+      <w:r>
+        <w:t xml:space="preserve">– including the microbial communities many species rely upon</w:t>
+      </w:r>
+      <w:r>
+        <w:t xml:space="preserve"> </w:t>
+      </w:r>
+      <w:r>
+        <w:t xml:space="preserve">[12]</w:t>
+      </w:r>
+      <w:r>
+        <w:t xml:space="preserve">. Understanding the dynamic interplay between direct and indirect interactions, and how these are mediated by environmental factors, has been hampered by the complexity of community interactions and the lack of an integrated modelling framework that can translate short-term physiological damage into changes in fitness and population growth across species</w:t>
+      </w:r>
+      <w:r>
+        <w:t xml:space="preserve"> </w:t>
+      </w:r>
+      <w:r>
+        <w:t xml:space="preserve">[12]</w:t>
+      </w:r>
+      <w:r>
+        <w:t xml:space="preserve">.</w:t>
+      </w:r>
+    </w:p>
+    <w:p>
+      <w:pPr>
+        <w:pStyle w:val="BodyText"/>
+      </w:pPr>
+      <w:r>
+        <w:t xml:space="preserve">Predicting how extreme heat impacts population dynamics and community interactions requires the coupling of physiological, biophysical and population ecology models. We argue that such a feat is becoming increasingly more tangible and will provide powerful new ways of predicting how extreme heat shapes community dynamics. Dynamic Energy Budget (DEB) theory can now be seamlessly integrated with biophysical models of heat and mass exchange to characterise organismal body temperatures and simulate the effects of extreme heat events on the entire life cycle of species within communities</w:t>
+      </w:r>
+      <w:r>
+        <w:t xml:space="preserve"> </w:t>
+      </w:r>
+      <w:r>
+        <w:t xml:space="preserve">[13–17]</w:t>
+      </w:r>
+      <w:r>
+        <w:t xml:space="preserve">. Dynamic Energy Budgets that incorporate estimates of thermal sensitivity across species can capture the delicate balance between damage and repair in physiological systems</w:t>
+      </w:r>
+      <w:r>
+        <w:t xml:space="preserve"> </w:t>
+      </w:r>
+      <w:r>
+        <w:t xml:space="preserve">[8,9,18]</w:t>
+      </w:r>
+      <w:r>
+        <w:t xml:space="preserve"> </w:t>
+      </w:r>
+      <w:r>
+        <w:t xml:space="preserve">to translate the immediate and cumulative impacts of extreme heat on growth, survival and reproduction. Importantly, mechanistic physiological models provide common currencies that can then be integrated into population and community ecology models to capture how extreme heat events perturb interactions among species [</w:t>
+      </w:r>
+      <w:r>
+        <w:rPr>
+          <w:b/>
+          <w:bCs/>
+        </w:rPr>
+        <w:t xml:space="preserve">Margie</w:t>
+      </w:r>
+      <w:r>
+        <w:t xml:space="preserve">, some refs here you think would be good?].</w:t>
+      </w:r>
+    </w:p>
+    <w:p>
+      <w:pPr>
+        <w:pStyle w:val="BodyText"/>
+      </w:pPr>
+      <w:r>
+        <w:t xml:space="preserve">Here, we bring together modelling approaches across diverse fields to establish a bridge for thinking about how we might begin integrating them to predict how extreme heat will affect communities. We focus our discussion on plant, insect and microbial communities given the strong interconnections between them, the ease with which they can be studied and their significance to natural and agricultural productivity. Nonetheless, our framework can be extended to incorporate other, diverse interactions. We highlight the immense opportunities such an integration may provide through a greater understanding of the ways in which extreme heat stress manifests across species and by elucidating more clearly how and why interactions among species can change with implications for natural and agricultural systems, food security and ecosystem services. We discuss the challenges of applying such an integrated modelling framework moving forward and how it can be extended to include other critical features that capture evolutionary change and plasticity in response to extreme heat.</w:t>
+      </w:r>
+    </w:p>
+    <w:bookmarkEnd w:id="21"/>
+    <w:bookmarkStart w:id="22" w:name="Xd22b977f88f0add426f49399196084251b1e16e"/>
+    <w:p>
+      <w:pPr>
+        <w:pStyle w:val="Heading1"/>
+      </w:pPr>
+      <w:r>
+        <w:t xml:space="preserve">Capturing the balance between physiological</w:t>
+      </w:r>
+      <w:r>
+        <w:t xml:space="preserve"> </w:t>
+      </w:r>
+      <w:r>
+        <w:rPr>
+          <w:i/>
+          <w:iCs/>
+        </w:rPr>
+        <w:t xml:space="preserve">damage</w:t>
+      </w:r>
+      <w:r>
+        <w:t xml:space="preserve"> </w:t>
+      </w:r>
+      <w:r>
+        <w:t xml:space="preserve">and</w:t>
+      </w:r>
+      <w:r>
+        <w:t xml:space="preserve"> </w:t>
+      </w:r>
+      <w:r>
+        <w:rPr>
+          <w:i/>
+          <w:iCs/>
+        </w:rPr>
+        <w:t xml:space="preserve">repair</w:t>
+      </w:r>
+      <w:r>
+        <w:t xml:space="preserve"> </w:t>
+      </w:r>
+      <w:r>
+        <w:t xml:space="preserve">to predict multi-species thermal sensitivity (Dan, Adrienne)</w:t>
       </w:r>
     </w:p>
     <w:p>
@@ -106,7 +627,191 @@
         </w:numPr>
       </w:pPr>
       <w:r>
-        <w:t xml:space="preserve">Predicting the resilience of species interactions under extreme heat (I like this one best maybe?)</w:t>
+        <w:t xml:space="preserve">Introduce thermal load sensitivity theory</w:t>
+      </w:r>
+    </w:p>
+    <w:p>
+      <w:pPr>
+        <w:pStyle w:val="Compact"/>
+        <w:numPr>
+          <w:ilvl w:val="1"/>
+          <w:numId w:val="1002"/>
+        </w:numPr>
+      </w:pPr>
+      <w:r>
+        <w:t xml:space="preserve">Heat effects depend on the</w:t>
+      </w:r>
+      <w:r>
+        <w:t xml:space="preserve"> </w:t>
+      </w:r>
+      <w:r>
+        <w:rPr>
+          <w:i/>
+          <w:iCs/>
+        </w:rPr>
+        <w:t xml:space="preserve">exposure</w:t>
+      </w:r>
+      <w:r>
+        <w:t xml:space="preserve"> </w:t>
+      </w:r>
+      <w:r>
+        <w:t xml:space="preserve">and</w:t>
+      </w:r>
+      <w:r>
+        <w:t xml:space="preserve"> </w:t>
+      </w:r>
+      <w:r>
+        <w:rPr>
+          <w:i/>
+          <w:iCs/>
+        </w:rPr>
+        <w:t xml:space="preserve">sensitivity</w:t>
+      </w:r>
+    </w:p>
+    <w:p>
+      <w:pPr>
+        <w:pStyle w:val="Compact"/>
+        <w:numPr>
+          <w:ilvl w:val="1"/>
+          <w:numId w:val="1002"/>
+        </w:numPr>
+      </w:pPr>
+      <w:r>
+        <w:t xml:space="preserve">Mechanistically involves the accumulation of damage and repair over time in response to a temperature stressor</w:t>
+      </w:r>
+    </w:p>
+    <w:p>
+      <w:pPr>
+        <w:pStyle w:val="Compact"/>
+        <w:numPr>
+          <w:ilvl w:val="1"/>
+          <w:numId w:val="1002"/>
+        </w:numPr>
+      </w:pPr>
+      <w:r>
+        <w:t xml:space="preserve">We know different species will be exposed to extreme heat at different life stages</w:t>
+      </w:r>
+    </w:p>
+    <w:p>
+      <w:pPr>
+        <w:pStyle w:val="Compact"/>
+        <w:numPr>
+          <w:ilvl w:val="1"/>
+          <w:numId w:val="1002"/>
+        </w:numPr>
+      </w:pPr>
+      <w:r>
+        <w:t xml:space="preserve">We know sensitivity will vary across species and life stages</w:t>
+      </w:r>
+    </w:p>
+    <w:p>
+      <w:pPr>
+        <w:pStyle w:val="Compact"/>
+        <w:numPr>
+          <w:ilvl w:val="1"/>
+          <w:numId w:val="1002"/>
+        </w:numPr>
+      </w:pPr>
+      <w:r>
+        <w:t xml:space="preserve">We can make predictions about impacts of heat on: 1) survival and 2) reproduction across life stages and even tissues</w:t>
+      </w:r>
+    </w:p>
+    <w:p>
+      <w:pPr>
+        <w:pStyle w:val="Compact"/>
+        <w:numPr>
+          <w:ilvl w:val="1"/>
+          <w:numId w:val="1002"/>
+        </w:numPr>
+      </w:pPr>
+      <w:r>
+        <w:t xml:space="preserve">Can be applied to both plants and animals- allows for lagged effects of heat stress on survival and reproduction in response to short term heat stress events</w:t>
+      </w:r>
+    </w:p>
+    <w:p>
+      <w:pPr>
+        <w:pStyle w:val="Compact"/>
+        <w:numPr>
+          <w:ilvl w:val="1"/>
+          <w:numId w:val="1002"/>
+        </w:numPr>
+      </w:pPr>
+      <w:r>
+        <w:t xml:space="preserve">Captured by modelling thermal effects of the severity of temperature and the amount of time an organism is exposed to that temperature on survival and reproduction of given life stages</w:t>
+      </w:r>
+    </w:p>
+    <w:p>
+      <w:pPr>
+        <w:pStyle w:val="Compact"/>
+        <w:numPr>
+          <w:ilvl w:val="1"/>
+          <w:numId w:val="1002"/>
+        </w:numPr>
+      </w:pPr>
+      <w:r>
+        <w:t xml:space="preserve">Concepts can be applied to both plants and animals, and targeted to key tissues</w:t>
+      </w:r>
+    </w:p>
+    <w:p>
+      <w:pPr>
+        <w:pStyle w:val="Compact"/>
+        <w:numPr>
+          <w:ilvl w:val="1"/>
+          <w:numId w:val="1002"/>
+        </w:numPr>
+      </w:pPr>
+      <w:r>
+        <w:t xml:space="preserve">Critical to TLS is the idea of damage accumulation and repair over time in response to a temperature stressor</w:t>
+      </w:r>
+    </w:p>
+    <w:p>
+      <w:pPr>
+        <w:pStyle w:val="Compact"/>
+        <w:numPr>
+          <w:ilvl w:val="1"/>
+          <w:numId w:val="1002"/>
+        </w:numPr>
+      </w:pPr>
+      <w:r>
+        <w:t xml:space="preserve">End discussing the need to have realistic exposure to extreme temperatures. links to next section</w:t>
+      </w:r>
+    </w:p>
+    <w:p>
+      <w:pPr>
+        <w:pStyle w:val="Compact"/>
+        <w:numPr>
+          <w:ilvl w:val="1"/>
+          <w:numId w:val="1002"/>
+        </w:numPr>
+      </w:pPr>
+      <w:r>
+        <w:t xml:space="preserve">Figure 1: demonstrating how thermal load sensitivity can be used to predict heat stress impacts on plants and animals, survival, reproductive tissue. Simplified.</w:t>
+      </w:r>
+    </w:p>
+    <w:bookmarkEnd w:id="22"/>
+    <w:bookmarkStart w:id="23" w:name="X9603b7f4f6c0a7e1a88ed7695370fa5e8944a74"/>
+    <w:p>
+      <w:pPr>
+        <w:pStyle w:val="Heading1"/>
+      </w:pPr>
+      <w:r>
+        <w:t xml:space="preserve">Biophysics to the rescue: realistic community wide</w:t>
+      </w:r>
+      <w:r>
+        <w:t xml:space="preserve"> </w:t>
+      </w:r>
+      <w:r>
+        <w:rPr>
+          <w:i/>
+          <w:iCs/>
+        </w:rPr>
+        <w:t xml:space="preserve">exposure</w:t>
+      </w:r>
+      <w:r>
+        <w:t xml:space="preserve"> </w:t>
+      </w:r>
+      <w:r>
+        <w:t xml:space="preserve">to extreme heat and Dynamic Energy Budget models (Mike, Belinda, Dan)</w:t>
       </w:r>
     </w:p>
     <w:p>
@@ -114,508 +819,11 @@
         <w:pStyle w:val="Compact"/>
         <w:numPr>
           <w:ilvl w:val="0"/>
-          <w:numId w:val="1001"/>
+          <w:numId w:val="1003"/>
         </w:numPr>
       </w:pPr>
       <w:r>
-        <w:t xml:space="preserve">Integrated modeling approaches for predicting the impacts of extreme heat on communities</w:t>
-      </w:r>
-      <w:r>
-        <w:t xml:space="preserve"> </w:t>
-      </w:r>
-      <w:r>
-        <w:t xml:space="preserve">-Thermal tolerance landscapes for populations and communities: applications in a changing world</w:t>
-      </w:r>
-    </w:p>
-    <w:p>
-      <w:pPr>
-        <w:pStyle w:val="FirstParagraph"/>
-      </w:pPr>
-      <w:r>
-        <w:rPr>
-          <w:b/>
-          <w:bCs/>
-        </w:rPr>
-        <w:t xml:space="preserve">Target Journal</w:t>
-      </w:r>
-      <w:r>
-        <w:t xml:space="preserve">:</w:t>
-      </w:r>
-      <w:r>
-        <w:t xml:space="preserve"> </w:t>
-      </w:r>
-      <w:r>
-        <w:rPr>
-          <w:i/>
-          <w:iCs/>
-        </w:rPr>
-        <w:t xml:space="preserve">Trends in Ecology and Evolution</w:t>
-      </w:r>
-      <w:r>
-        <w:t xml:space="preserve">, Opinion</w:t>
-      </w:r>
-      <w:r>
-        <w:t xml:space="preserve"> </w:t>
-      </w:r>
-      <w:r>
-        <w:t xml:space="preserve">https://www.cell.com/trends/ecology-evolution/authors</w:t>
-      </w:r>
-    </w:p>
-    <w:p>
-      <w:pPr>
-        <w:pStyle w:val="BodyText"/>
-      </w:pPr>
-      <w:r>
-        <w:t xml:space="preserve">Abstract: 100-120 words</w:t>
-      </w:r>
-      <w:r>
-        <w:br/>
-      </w:r>
-      <w:r>
-        <w:t xml:space="preserve">Highlights: Provide a short collection of 3-5 statements that concisely convey to the reader the recent advances in the field, including emerging concepts and/or distinctions, that constitute a main motivation for the discussion developed in the article. This summary is prominently featured on the first page of the article, thus allowing readers to immediately get a sense of the current status of the field.</w:t>
-      </w:r>
-      <w:r>
-        <w:br/>
-      </w:r>
-      <w:r>
-        <w:t xml:space="preserve">Word Count: 3500 words (this limit does not include text in the boxes, glossary, abstract, references, tables or figure legends)</w:t>
-      </w:r>
-      <w:r>
-        <w:br/>
-      </w:r>
-      <w:r>
-        <w:t xml:space="preserve">References: 80-100</w:t>
-      </w:r>
-      <w:r>
-        <w:br/>
-      </w:r>
-      <w:r>
-        <w:t xml:space="preserve">Outstanding Questions: 350 words</w:t>
-      </w:r>
-      <w:r>
-        <w:br/>
-      </w:r>
-      <w:r>
-        <w:t xml:space="preserve">Glossary: 500 words</w:t>
-      </w:r>
-      <w:r>
-        <w:br/>
-      </w:r>
-    </w:p>
-    <w:p>
-      <w:pPr>
-        <w:pStyle w:val="BodyText"/>
-      </w:pPr>
-      <w:r>
-        <w:rPr>
-          <w:b/>
-          <w:bCs/>
-        </w:rPr>
-        <w:t xml:space="preserve">Alternative homes</w:t>
-      </w:r>
-      <w:r>
-        <w:t xml:space="preserve">:</w:t>
-      </w:r>
-    </w:p>
-    <w:p>
-      <w:pPr>
-        <w:pStyle w:val="BodyText"/>
-      </w:pPr>
-      <w:r>
-        <w:rPr>
-          <w:i/>
-          <w:iCs/>
-        </w:rPr>
-        <w:t xml:space="preserve">Nature Ecology and Evolution</w:t>
-      </w:r>
-      <w:r>
-        <w:t xml:space="preserve"> </w:t>
-      </w:r>
-      <w:r>
-        <w:t xml:space="preserve">(Perspective) - 3000-4000 words, 4-6 display items: https://www.nature.com/natecolevol/content</w:t>
-      </w:r>
-      <w:r>
-        <w:br/>
-      </w:r>
-      <w:r>
-        <w:rPr>
-          <w:i/>
-          <w:iCs/>
-        </w:rPr>
-        <w:t xml:space="preserve">Global Change Biology</w:t>
-      </w:r>
-      <w:r>
-        <w:t xml:space="preserve"> </w:t>
-      </w:r>
-      <w:r>
-        <w:t xml:space="preserve">- 3000 (Mini Review)-5000 (Opinion) words (https://onlinelibrary.wiley.com/page/journal/13652486/homepage/forauthors.html)</w:t>
-      </w:r>
-      <w:r>
-        <w:br/>
-      </w:r>
-      <w:r>
-        <w:rPr>
-          <w:i/>
-          <w:iCs/>
-        </w:rPr>
-        <w:t xml:space="preserve">Ecology Letters</w:t>
-      </w:r>
-      <w:r>
-        <w:t xml:space="preserve"> </w:t>
-      </w:r>
-      <w:r>
-        <w:t xml:space="preserve">(Perspective) - up to 7500 words if needed.</w:t>
-      </w:r>
-    </w:p>
-    <w:p>
-      <w:pPr>
-        <w:pStyle w:val="BodyText"/>
-      </w:pPr>
-      <w:r>
-        <w:rPr>
-          <w:b/>
-          <w:bCs/>
-        </w:rPr>
-        <w:t xml:space="preserve">Structure Overview - Sections</w:t>
-      </w:r>
-      <w:r>
-        <w:t xml:space="preserve">:</w:t>
-      </w:r>
-      <w:r>
-        <w:br/>
-      </w:r>
-      <w:r>
-        <w:t xml:space="preserve">- Abstract (Dan) (~120 words - First Draft Done)</w:t>
-      </w:r>
-      <w:r>
-        <w:br/>
-      </w:r>
-      <w:r>
-        <w:t xml:space="preserve">- A need for a mechanistically informed modelling framework for predicting the effects of extreme heat on community assemblages (Dan) (~ 500 words - First Draft Done)</w:t>
-      </w:r>
-      <w:r>
-        <w:br/>
-      </w:r>
-      <w:r>
-        <w:t xml:space="preserve">- Capturing the balance between physiological</w:t>
-      </w:r>
-      <w:r>
-        <w:t xml:space="preserve"> </w:t>
-      </w:r>
-      <w:r>
-        <w:rPr>
-          <w:i/>
-          <w:iCs/>
-        </w:rPr>
-        <w:t xml:space="preserve">damage</w:t>
-      </w:r>
-      <w:r>
-        <w:t xml:space="preserve"> </w:t>
-      </w:r>
-      <w:r>
-        <w:t xml:space="preserve">and</w:t>
-      </w:r>
-      <w:r>
-        <w:t xml:space="preserve"> </w:t>
-      </w:r>
-      <w:r>
-        <w:rPr>
-          <w:i/>
-          <w:iCs/>
-        </w:rPr>
-        <w:t xml:space="preserve">repair</w:t>
-      </w:r>
-      <w:r>
-        <w:t xml:space="preserve"> </w:t>
-      </w:r>
-      <w:r>
-        <w:t xml:space="preserve">to predict multi-species thermal sensitivity (Dan, Adrienne) (~300-500 words)</w:t>
-      </w:r>
-      <w:r>
-        <w:br/>
-      </w:r>
-      <w:r>
-        <w:t xml:space="preserve">- Biophysics to the rescue: realistic community wide</w:t>
-      </w:r>
-      <w:r>
-        <w:t xml:space="preserve"> </w:t>
-      </w:r>
-      <w:r>
-        <w:rPr>
-          <w:i/>
-          <w:iCs/>
-        </w:rPr>
-        <w:t xml:space="preserve">exposure</w:t>
-      </w:r>
-      <w:r>
-        <w:t xml:space="preserve"> </w:t>
-      </w:r>
-      <w:r>
-        <w:t xml:space="preserve">to extreme heat and Dynamic Energy Budget models (Mike, Belinda) (~300-500 word)</w:t>
-      </w:r>
-      <w:r>
-        <w:br/>
-      </w:r>
-      <w:r>
-        <w:t xml:space="preserve">- Mechanistic approaches that</w:t>
-      </w:r>
-      <w:r>
-        <w:t xml:space="preserve"> </w:t>
-      </w:r>
-      <w:r>
-        <w:t xml:space="preserve">‘</w:t>
-      </w:r>
-      <w:r>
-        <w:t xml:space="preserve">speak</w:t>
-      </w:r>
-      <w:r>
-        <w:t xml:space="preserve">’</w:t>
-      </w:r>
-      <w:r>
-        <w:t xml:space="preserve"> </w:t>
-      </w:r>
-      <w:r>
-        <w:t xml:space="preserve">to population and community ecology under extreme heat (Margie) (~300-500 words)</w:t>
-      </w:r>
-      <w:r>
-        <w:br/>
-      </w:r>
-      <w:r>
-        <w:t xml:space="preserve">- Incorporating context-dependent environmental feedback to evaluate resilience to extreme heat (Brajesh, Brendan, James, Everyone else who wants to contribute) (~500 words)</w:t>
-      </w:r>
-      <w:r>
-        <w:br/>
-      </w:r>
-      <w:r>
-        <w:t xml:space="preserve">-</w:t>
-      </w:r>
-      <w:r>
-        <w:t xml:space="preserve"> </w:t>
-      </w:r>
-      <w:r>
-        <w:t xml:space="preserve">‘</w:t>
-      </w:r>
-      <w:r>
-        <w:t xml:space="preserve">Hot</w:t>
-      </w:r>
-      <w:r>
-        <w:t xml:space="preserve">’</w:t>
-      </w:r>
-      <w:r>
-        <w:t xml:space="preserve"> </w:t>
-      </w:r>
-      <w:r>
-        <w:t xml:space="preserve">solutions for a changing world (Alison, Owen and Belinda, Mike, Anyone else!) (~500 words)</w:t>
-      </w:r>
-      <w:r>
-        <w:br/>
-      </w:r>
-      <w:r>
-        <w:t xml:space="preserve">- Future directions: modelling challenges, gaps and possible solutions (Mike, Belinda, Dan, Ary, Braj, Everyone) (~300-500 words)</w:t>
-      </w:r>
-    </w:p>
-    <w:p>
-      <w:pPr>
-        <w:pStyle w:val="BodyText"/>
-      </w:pPr>
-      <w:r>
-        <w:t xml:space="preserve">Please see more detailed guidance for each section below and some names who might lead these.</w:t>
-      </w:r>
-    </w:p>
-    <w:bookmarkStart w:id="20" w:name="abstract-dan"/>
-    <w:p>
-      <w:pPr>
-        <w:pStyle w:val="Heading1"/>
-      </w:pPr>
-      <w:r>
-        <w:t xml:space="preserve">Abstract (Dan)</w:t>
-      </w:r>
-    </w:p>
-    <w:p>
-      <w:pPr>
-        <w:pStyle w:val="FirstParagraph"/>
-      </w:pPr>
-      <w:r>
-        <w:t xml:space="preserve">Anthropogenic climate change is leading to more frequent and extreme heat waves. These short-term events will radically re-shape interactions among organisms, impacting biodiversity, community composition and ecosystem services that are crucial to agricultural productivity and food security. Predicting the short- and long-term impacts of heat waves on community assemblages requires a detailed mechanistic understanding of the exposure and sensitivity of organisms to extreme heat events. Such an understanding has been hampered by the lack of a holistic modelling framework that can simultaneously integrate physiological sensitivity, biophysical predictions of organism temperature and its effects on population fitness across species. We show how the integration of models in disparate fields may facilitate our understanding how extreme heat perturbs and shapes interactions among species providing novel pathways for making predictions and understanding the changes brought about by extreme heat.</w:t>
-      </w:r>
-    </w:p>
-    <w:bookmarkEnd w:id="20"/>
-    <w:bookmarkStart w:id="21" w:name="Xebe326ccf6438bb59b06b215a72d468ba832b0f"/>
-    <w:p>
-      <w:pPr>
-        <w:pStyle w:val="Heading1"/>
-      </w:pPr>
-      <w:r>
-        <w:t xml:space="preserve">A need for a mechanistically informed modelling framework for predicting the effects of extreme heat on community assemblages (Dan)</w:t>
-      </w:r>
-    </w:p>
-    <w:p>
-      <w:pPr>
-        <w:pStyle w:val="FirstParagraph"/>
-      </w:pPr>
-      <w:r>
-        <w:t xml:space="preserve">Climate change is leading to warmer and more variable thermal environments globally</w:t>
-      </w:r>
-      <w:r>
-        <w:t xml:space="preserve"> </w:t>
-      </w:r>
-      <w:r>
-        <w:t xml:space="preserve">[1,2]</w:t>
-      </w:r>
-      <w:r>
-        <w:t xml:space="preserve">. Greater thermal variability will result in organisms experiencing extreme heat waves that result in thermal stress that impacts organismal growth, survival and reproduction with cascading effects on population dynamics, community composition and ecosystem structure and function. Climate variability has already been linked to dramatic declines in pollinator abundance</w:t>
-      </w:r>
-      <w:r>
-        <w:t xml:space="preserve"> </w:t>
-      </w:r>
-      <w:r>
-        <w:t xml:space="preserve">[3]</w:t>
-      </w:r>
-      <w:r>
-        <w:t xml:space="preserve"> </w:t>
-      </w:r>
-      <w:r>
-        <w:t xml:space="preserve">and in crop yields globally</w:t>
-      </w:r>
-      <w:r>
-        <w:t xml:space="preserve"> </w:t>
-      </w:r>
-      <w:r>
-        <w:t xml:space="preserve">[4,5]</w:t>
-      </w:r>
-      <w:r>
-        <w:t xml:space="preserve">, but the causes underlying such declines, and their ramifications through communities, are not fully understood. The impacts of extreme heat on species and communities are driven by a combination of direct effects of heat stress on organism physiology and fitness</w:t>
-      </w:r>
-      <w:r>
-        <w:t xml:space="preserve"> </w:t>
-      </w:r>
-      <w:r>
-        <w:t xml:space="preserve">[6–9]</w:t>
-      </w:r>
-      <w:r>
-        <w:t xml:space="preserve"> </w:t>
-      </w:r>
-      <w:r>
-        <w:t xml:space="preserve">and indirect effects on interactions (both positive and negative) among species</w:t>
-      </w:r>
-      <w:r>
-        <w:t xml:space="preserve"> </w:t>
-      </w:r>
-      <w:r>
-        <w:t xml:space="preserve">[e.g., 10,11]</w:t>
-      </w:r>
-      <w:r>
-        <w:t xml:space="preserve"> </w:t>
-      </w:r>
-      <w:r>
-        <w:t xml:space="preserve">– including the microbial communities many species rely upon</w:t>
-      </w:r>
-      <w:r>
-        <w:t xml:space="preserve"> </w:t>
-      </w:r>
-      <w:r>
-        <w:t xml:space="preserve">[12]</w:t>
-      </w:r>
-      <w:r>
-        <w:t xml:space="preserve">. Understanding the dynamic interplay between direct and indirect interactions, and how these are mediated by environmental factors, has been hampered by the complexity of community interactions and the lack of an integrated modelling framework that can translate short-term physiological damage into changes in fitness and population growth across species</w:t>
-      </w:r>
-      <w:r>
-        <w:t xml:space="preserve"> </w:t>
-      </w:r>
-      <w:r>
-        <w:t xml:space="preserve">[12]</w:t>
-      </w:r>
-      <w:r>
-        <w:t xml:space="preserve">.</w:t>
-      </w:r>
-    </w:p>
-    <w:p>
-      <w:pPr>
-        <w:pStyle w:val="BodyText"/>
-      </w:pPr>
-      <w:r>
-        <w:t xml:space="preserve">Predicting how extreme heat impacts population dynamics and community interactions requires the coupling of physiological, biophysical and population ecology models. We argue that such a feat is becoming increasingly more tangible and will provide powerful new ways of predicting how extreme heat shapes community dynamics. Dynamic Energy Budget (DEB) theory can now be seamlessly integrated with biophysical models of heat and mass exchange to characterise organismal body temperatures and simulate the effects of extreme heat events on the entire life cycle of species within communities</w:t>
-      </w:r>
-      <w:r>
-        <w:t xml:space="preserve"> </w:t>
-      </w:r>
-      <w:r>
-        <w:t xml:space="preserve">[13–17]</w:t>
-      </w:r>
-      <w:r>
-        <w:t xml:space="preserve">. Dynamic Energy Budgets that incorporate estimates of thermal sensitivity across species can capture the delicate balance between damage and repair in physiological systems</w:t>
-      </w:r>
-      <w:r>
-        <w:t xml:space="preserve"> </w:t>
-      </w:r>
-      <w:r>
-        <w:t xml:space="preserve">[8,9,18]</w:t>
-      </w:r>
-      <w:r>
-        <w:t xml:space="preserve"> </w:t>
-      </w:r>
-      <w:r>
-        <w:t xml:space="preserve">to translate the immediate and cumulative impacts of extreme heat on growth, survival and reproduction. Importantly, mechanistic physiological models provide common currencies that can then be integrated into population and community ecology models to capture how extreme heat events perturb interactions among species [</w:t>
-      </w:r>
-      <w:r>
-        <w:rPr>
-          <w:b/>
-          <w:bCs/>
-        </w:rPr>
-        <w:t xml:space="preserve">Margie</w:t>
-      </w:r>
-      <w:r>
-        <w:t xml:space="preserve">, some refs here you think would be good?].</w:t>
-      </w:r>
-    </w:p>
-    <w:p>
-      <w:pPr>
-        <w:pStyle w:val="BodyText"/>
-      </w:pPr>
-      <w:r>
-        <w:t xml:space="preserve">Here, we bring together modelling approaches across diverse fields to establish a bridge for thinking about how we might begin integrating them to predict how extreme heat will affect communities. We focus our discussion on plant, insect and microbial communities given the strong interconnections between them, the ease with which they can be studied and their significance to natural and agricultural productivity. Nonetheless, our framework can be extended to incorporate other, diverse interactions. We highlight the immense opportunities such an integration may provide through a greater understanding of the ways in which extreme heat stress manifests across species and by elucidating more clearly how and why interactions among species can change with implications for natural and agricultural systems, food security and ecosystem services. We discuss the challenges of applying such an integrated modelling framework moving forward and how it can be extended to include other critical features that capture evolutionary change and plasticity in response to extreme heat.</w:t>
-      </w:r>
-    </w:p>
-    <w:bookmarkEnd w:id="21"/>
-    <w:bookmarkStart w:id="22" w:name="Xd22b977f88f0add426f49399196084251b1e16e"/>
-    <w:p>
-      <w:pPr>
-        <w:pStyle w:val="Heading1"/>
-      </w:pPr>
-      <w:r>
-        <w:t xml:space="preserve">Capturing the balance between physiological</w:t>
-      </w:r>
-      <w:r>
-        <w:t xml:space="preserve"> </w:t>
-      </w:r>
-      <w:r>
-        <w:rPr>
-          <w:i/>
-          <w:iCs/>
-        </w:rPr>
-        <w:t xml:space="preserve">damage</w:t>
-      </w:r>
-      <w:r>
-        <w:t xml:space="preserve"> </w:t>
-      </w:r>
-      <w:r>
-        <w:t xml:space="preserve">and</w:t>
-      </w:r>
-      <w:r>
-        <w:t xml:space="preserve"> </w:t>
-      </w:r>
-      <w:r>
-        <w:rPr>
-          <w:i/>
-          <w:iCs/>
-        </w:rPr>
-        <w:t xml:space="preserve">repair</w:t>
-      </w:r>
-      <w:r>
-        <w:t xml:space="preserve"> </w:t>
-      </w:r>
-      <w:r>
-        <w:t xml:space="preserve">to predict multi-species thermal sensitivity (Dan, Adrienne)</w:t>
+        <w:t xml:space="preserve">Combining TLS with biophysical and dynamic energy budget models</w:t>
       </w:r>
     </w:p>
     <w:p>
@@ -623,11 +831,11 @@
         <w:pStyle w:val="Compact"/>
         <w:numPr>
           <w:ilvl w:val="0"/>
-          <w:numId w:val="1002"/>
+          <w:numId w:val="1003"/>
         </w:numPr>
       </w:pPr>
       <w:r>
-        <w:t xml:space="preserve">Introduce thermal load sensitivity theory</w:t>
+        <w:t xml:space="preserve">Introduce biophysical and dynamic energy budget models</w:t>
       </w:r>
     </w:p>
     <w:p>
@@ -635,37 +843,11 @@
         <w:pStyle w:val="Compact"/>
         <w:numPr>
           <w:ilvl w:val="1"/>
-          <w:numId w:val="1003"/>
+          <w:numId w:val="1004"/>
         </w:numPr>
       </w:pPr>
       <w:r>
-        <w:t xml:space="preserve">Heat effects depend on the</w:t>
-      </w:r>
-      <w:r>
-        <w:t xml:space="preserve"> </w:t>
-      </w:r>
-      <w:r>
-        <w:rPr>
-          <w:i/>
-          <w:iCs/>
-        </w:rPr>
-        <w:t xml:space="preserve">exposure</w:t>
-      </w:r>
-      <w:r>
-        <w:t xml:space="preserve"> </w:t>
-      </w:r>
-      <w:r>
-        <w:t xml:space="preserve">and</w:t>
-      </w:r>
-      <w:r>
-        <w:t xml:space="preserve"> </w:t>
-      </w:r>
-      <w:r>
-        <w:rPr>
-          <w:i/>
-          <w:iCs/>
-        </w:rPr>
-        <w:t xml:space="preserve">sensitivity</w:t>
+        <w:t xml:space="preserve">Biophysical models are used to predict how temperature affects the energy balance of an organism</w:t>
       </w:r>
     </w:p>
     <w:p>
@@ -673,11 +855,11 @@
         <w:pStyle w:val="Compact"/>
         <w:numPr>
           <w:ilvl w:val="1"/>
-          <w:numId w:val="1003"/>
+          <w:numId w:val="1004"/>
         </w:numPr>
       </w:pPr>
       <w:r>
-        <w:t xml:space="preserve">Mechanistically involves the accumulation of damage and repair over time in response to a temperature stressor</w:t>
+        <w:t xml:space="preserve">DEB models are used to predict how temperature affects the energy budget of an organism</w:t>
       </w:r>
     </w:p>
     <w:p>
@@ -685,11 +867,11 @@
         <w:pStyle w:val="Compact"/>
         <w:numPr>
           <w:ilvl w:val="1"/>
-          <w:numId w:val="1003"/>
+          <w:numId w:val="1004"/>
         </w:numPr>
       </w:pPr>
       <w:r>
-        <w:t xml:space="preserve">We know different species will be exposed to extreme heat at different life stages</w:t>
+        <w:t xml:space="preserve">Both models can be used to predict how temperature affects the growth, reproduction and survival of an organism</w:t>
       </w:r>
     </w:p>
     <w:p>
@@ -697,121 +879,39 @@
         <w:pStyle w:val="Compact"/>
         <w:numPr>
           <w:ilvl w:val="1"/>
-          <w:numId w:val="1003"/>
+          <w:numId w:val="1004"/>
         </w:numPr>
       </w:pPr>
       <w:r>
-        <w:t xml:space="preserve">We know sensitivity will vary across species and life stages</w:t>
-      </w:r>
-    </w:p>
-    <w:p>
-      <w:pPr>
-        <w:pStyle w:val="Compact"/>
-        <w:numPr>
-          <w:ilvl w:val="1"/>
-          <w:numId w:val="1003"/>
-        </w:numPr>
-      </w:pPr>
-      <w:r>
-        <w:t xml:space="preserve">We can make predictions about impacts of heat on: 1) survival and 2) reproduction across life stages and even tissues</w:t>
-      </w:r>
-    </w:p>
-    <w:p>
-      <w:pPr>
-        <w:pStyle w:val="Compact"/>
-        <w:numPr>
-          <w:ilvl w:val="1"/>
-          <w:numId w:val="1003"/>
-        </w:numPr>
-      </w:pPr>
-      <w:r>
-        <w:t xml:space="preserve">Can be applied to both plants and animals- allows for lagged effects of heat stress on survival and reproduction in response to short term heat stress events</w:t>
-      </w:r>
-    </w:p>
-    <w:p>
-      <w:pPr>
-        <w:pStyle w:val="Compact"/>
-        <w:numPr>
-          <w:ilvl w:val="1"/>
-          <w:numId w:val="1003"/>
-        </w:numPr>
-      </w:pPr>
-      <w:r>
-        <w:t xml:space="preserve">Captured by modelling thermal effects of the severity of temperature and the amount of time an organism is exposed to that temperature on survival and reproduction of given life stages</w:t>
-      </w:r>
-    </w:p>
-    <w:p>
-      <w:pPr>
-        <w:pStyle w:val="Compact"/>
-        <w:numPr>
-          <w:ilvl w:val="1"/>
-          <w:numId w:val="1003"/>
-        </w:numPr>
-      </w:pPr>
-      <w:r>
-        <w:t xml:space="preserve">Concepts can be applied to both plants and animals, and targeted to key tissues</w:t>
-      </w:r>
-    </w:p>
-    <w:p>
-      <w:pPr>
-        <w:pStyle w:val="Compact"/>
-        <w:numPr>
-          <w:ilvl w:val="1"/>
-          <w:numId w:val="1003"/>
-        </w:numPr>
-      </w:pPr>
-      <w:r>
-        <w:t xml:space="preserve">Critical to TLS is the idea of damage accumulation and repair over time in response to a temperature stressor</w:t>
-      </w:r>
-    </w:p>
-    <w:p>
-      <w:pPr>
-        <w:pStyle w:val="Compact"/>
-        <w:numPr>
-          <w:ilvl w:val="1"/>
-          <w:numId w:val="1003"/>
-        </w:numPr>
-      </w:pPr>
-      <w:r>
-        <w:t xml:space="preserve">End discussing the need to have realistic exposure to extreme temperatures. links to next section</w:t>
-      </w:r>
-    </w:p>
-    <w:p>
-      <w:pPr>
-        <w:pStyle w:val="Compact"/>
-        <w:numPr>
-          <w:ilvl w:val="1"/>
-          <w:numId w:val="1003"/>
-        </w:numPr>
-      </w:pPr>
-      <w:r>
-        <w:t xml:space="preserve">Figure 1: demonstrating how thermal load sensitivity can be used to predict heat stress impacts on plants and animals, survival, reproductive tissue. Simplified.</w:t>
-      </w:r>
-    </w:p>
-    <w:bookmarkEnd w:id="22"/>
-    <w:bookmarkStart w:id="23" w:name="X9603b7f4f6c0a7e1a88ed7695370fa5e8944a74"/>
+        <w:t xml:space="preserve">Combining these models with TLS can help predict how temperature affects the survival and reproduction of a focal species in a community</w:t>
+      </w:r>
+    </w:p>
+    <w:bookmarkEnd w:id="23"/>
+    <w:bookmarkStart w:id="24" w:name="Xbdb3df2871e98d114a1e4e74a52caa28253dc0c"/>
     <w:p>
       <w:pPr>
         <w:pStyle w:val="Heading1"/>
       </w:pPr>
       <w:r>
-        <w:t xml:space="preserve">Biophysics to the rescue: realistic community wide</w:t>
-      </w:r>
-      <w:r>
-        <w:t xml:space="preserve"> </w:t>
-      </w:r>
-      <w:r>
-        <w:rPr>
-          <w:i/>
-          <w:iCs/>
-        </w:rPr>
-        <w:t xml:space="preserve">exposure</w:t>
-      </w:r>
-      <w:r>
-        <w:t xml:space="preserve"> </w:t>
-      </w:r>
-      <w:r>
-        <w:t xml:space="preserve">to extreme heat and Dynamic Energy Budget models (Mike, Belinda, Dan)</w:t>
+        <w:t xml:space="preserve">Mechanistic approaches that</w:t>
+      </w:r>
+      <w:r>
+        <w:t xml:space="preserve"> </w:t>
+      </w:r>
+      <w:r>
+        <w:t xml:space="preserve">‘</w:t>
+      </w:r>
+      <w:r>
+        <w:t xml:space="preserve">speak</w:t>
+      </w:r>
+      <w:r>
+        <w:t xml:space="preserve">’</w:t>
+      </w:r>
+      <w:r>
+        <w:t xml:space="preserve"> </w:t>
+      </w:r>
+      <w:r>
+        <w:t xml:space="preserve">to population and community ecology under extreme heat (Margie)</w:t>
       </w:r>
     </w:p>
     <w:p>
@@ -819,11 +919,11 @@
         <w:pStyle w:val="Compact"/>
         <w:numPr>
           <w:ilvl w:val="0"/>
-          <w:numId w:val="1004"/>
+          <w:numId w:val="1005"/>
         </w:numPr>
       </w:pPr>
       <w:r>
-        <w:t xml:space="preserve">Combining TLS with biophysical and dynamic energy budget models</w:t>
+        <w:t xml:space="preserve">How can we link mechanistic physiological models with population and community ecology theory?</w:t>
       </w:r>
     </w:p>
     <w:p>
@@ -831,87 +931,189 @@
         <w:pStyle w:val="Compact"/>
         <w:numPr>
           <w:ilvl w:val="0"/>
-          <w:numId w:val="1004"/>
+          <w:numId w:val="1005"/>
         </w:numPr>
       </w:pPr>
       <w:r>
-        <w:t xml:space="preserve">Introduce biophysical and dynamic energy budget models</w:t>
+        <w:t xml:space="preserve">Introducing population and network models to link outputs from DEB (survival, reproduction, abundance) to population growth.</w:t>
       </w:r>
     </w:p>
     <w:p>
       <w:pPr>
         <w:pStyle w:val="Compact"/>
         <w:numPr>
-          <w:ilvl w:val="1"/>
+          <w:ilvl w:val="0"/>
           <w:numId w:val="1005"/>
         </w:numPr>
       </w:pPr>
       <w:r>
-        <w:t xml:space="preserve">Biophysical models are used to predict how temperature affects the energy balance of an organism</w:t>
+        <w:t xml:space="preserve">How people are analysing communities with network theory. Some important papers</w:t>
+      </w:r>
+      <w:r>
+        <w:t xml:space="preserve"> </w:t>
+      </w:r>
+      <w:r>
+        <w:t xml:space="preserve">[19]</w:t>
+      </w:r>
+      <w:r>
+        <w:t xml:space="preserve"> </w:t>
+      </w:r>
+      <w:r>
+        <w:t xml:space="preserve">[20]</w:t>
+      </w:r>
+      <w:r>
+        <w:t xml:space="preserve"> </w:t>
+      </w:r>
+      <w:r>
+        <w:t xml:space="preserve">[21]</w:t>
+      </w:r>
+      <w:r>
+        <w:t xml:space="preserve"> </w:t>
+      </w:r>
+      <w:r>
+        <w:t xml:space="preserve">[22]</w:t>
+      </w:r>
+      <w:r>
+        <w:t xml:space="preserve"> </w:t>
+      </w:r>
+      <w:r>
+        <w:t xml:space="preserve">[23]</w:t>
+      </w:r>
+      <w:r>
+        <w:t xml:space="preserve"> </w:t>
+      </w:r>
+      <w:r>
+        <w:t xml:space="preserve">[24]</w:t>
+      </w:r>
+      <w:r>
+        <w:t xml:space="preserve"> </w:t>
+      </w:r>
+      <w:r>
+        <w:t xml:space="preserve">[25]</w:t>
+      </w:r>
+      <w:r>
+        <w:t xml:space="preserve"> </w:t>
+      </w:r>
+      <w:r>
+        <w:t xml:space="preserve">Should also look at this book</w:t>
+      </w:r>
+      <w:r>
+        <w:t xml:space="preserve"> </w:t>
+      </w:r>
+      <w:r>
+        <w:t xml:space="preserve">[26]</w:t>
       </w:r>
     </w:p>
     <w:p>
       <w:pPr>
         <w:pStyle w:val="Compact"/>
         <w:numPr>
-          <w:ilvl w:val="1"/>
+          <w:ilvl w:val="0"/>
           <w:numId w:val="1005"/>
         </w:numPr>
       </w:pPr>
       <w:r>
-        <w:t xml:space="preserve">DEB models are used to predict how temperature affects the energy budget of an organism</w:t>
+        <w:t xml:space="preserve">How can we capture interactions among species within the community to predict how heat stress will affect community structure?</w:t>
       </w:r>
     </w:p>
     <w:p>
       <w:pPr>
         <w:pStyle w:val="Compact"/>
         <w:numPr>
-          <w:ilvl w:val="1"/>
+          <w:ilvl w:val="0"/>
           <w:numId w:val="1005"/>
         </w:numPr>
       </w:pPr>
       <w:r>
-        <w:t xml:space="preserve">Both models can be used to predict how temperature affects the growth, reproduction and survival of an organism</w:t>
+        <w:t xml:space="preserve">Figure 2: demonstrating how TLS, biophysical and DEB models can be used to predict heat stress impacts on plants and animals, growth, reproduction, survival. (Dan, Margie)</w:t>
       </w:r>
     </w:p>
     <w:p>
       <w:pPr>
         <w:pStyle w:val="Compact"/>
         <w:numPr>
-          <w:ilvl w:val="1"/>
+          <w:ilvl w:val="0"/>
           <w:numId w:val="1005"/>
         </w:numPr>
       </w:pPr>
       <w:r>
-        <w:t xml:space="preserve">Combining these models with TLS can help predict how temperature affects the survival and reproduction of a focal species in a community</w:t>
-      </w:r>
-    </w:p>
-    <w:bookmarkEnd w:id="23"/>
-    <w:bookmarkStart w:id="24" w:name="Xbdb3df2871e98d114a1e4e74a52caa28253dc0c"/>
+        <w:t xml:space="preserve">Also this is a cool paper</w:t>
+      </w:r>
+      <w:r>
+        <w:t xml:space="preserve"> </w:t>
+      </w:r>
+      <w:r>
+        <w:t xml:space="preserve">[27]</w:t>
+      </w:r>
+      <w:r>
+        <w:t xml:space="preserve"> </w:t>
+      </w:r>
+      <w:r>
+        <w:t xml:space="preserve">on carnivores diets by DNA sequencing fecal data</w:t>
+      </w:r>
+      <w:r>
+        <w:t xml:space="preserve"> </w:t>
+      </w:r>
+      <w:r>
+        <w:t xml:space="preserve">-The other way to model interactions us using foundational community ecology/ species abundance models see</w:t>
+      </w:r>
+      <w:r>
+        <w:t xml:space="preserve"> </w:t>
+      </w:r>
+      <w:r>
+        <w:t xml:space="preserve">[28]</w:t>
+      </w:r>
+      <w:r>
+        <w:t xml:space="preserve">. We can here model the actual abundance of a given species and it would seem more flexible to incorporate thermal tolerance infor into these models.</w:t>
+      </w:r>
+    </w:p>
+    <w:p>
+      <w:pPr>
+        <w:pStyle w:val="Compact"/>
+        <w:numPr>
+          <w:ilvl w:val="0"/>
+          <w:numId w:val="1005"/>
+        </w:numPr>
+      </w:pPr>
+      <w:r>
+        <w:t xml:space="preserve">have a close look at</w:t>
+      </w:r>
+      <w:r>
+        <w:t xml:space="preserve"> </w:t>
+      </w:r>
+      <w:r>
+        <w:t xml:space="preserve">[29]</w:t>
+      </w:r>
+      <w:r>
+        <w:t xml:space="preserve"> </w:t>
+      </w:r>
+      <w:r>
+        <w:t xml:space="preserve">and</w:t>
+      </w:r>
+      <w:r>
+        <w:t xml:space="preserve"> </w:t>
+      </w:r>
+      <w:r>
+        <w:t xml:space="preserve">[30]</w:t>
+      </w:r>
+      <w:r>
+        <w:t xml:space="preserve">, limitations</w:t>
+      </w:r>
+      <w:r>
+        <w:t xml:space="preserve"> </w:t>
+      </w:r>
+      <w:r>
+        <w:t xml:space="preserve">[31]</w:t>
+      </w:r>
+    </w:p>
+    <w:bookmarkEnd w:id="24"/>
+    <w:bookmarkStart w:id="30" w:name="Xe7540e51cb84d29e47d083817996607ca5f8009"/>
     <w:p>
       <w:pPr>
         <w:pStyle w:val="Heading1"/>
       </w:pPr>
       <w:r>
-        <w:t xml:space="preserve">Mechanistic approaches that</w:t>
-      </w:r>
-      <w:r>
-        <w:t xml:space="preserve"> </w:t>
-      </w:r>
-      <w:r>
-        <w:t xml:space="preserve">‘</w:t>
-      </w:r>
-      <w:r>
-        <w:t xml:space="preserve">speak</w:t>
-      </w:r>
-      <w:r>
-        <w:t xml:space="preserve">’</w:t>
-      </w:r>
-      <w:r>
-        <w:t xml:space="preserve"> </w:t>
-      </w:r>
-      <w:r>
-        <w:t xml:space="preserve">to population and community ecology under extreme heat (Margie)</w:t>
+        <w:t xml:space="preserve">Incorporating context-dependent environmental feedback to evaluate resilience to extreme heat (Brajesh, Brendan, James, Everyone else who wants to contribute)</w:t>
       </w:r>
     </w:p>
     <w:p>
@@ -923,7 +1125,7 @@
         </w:numPr>
       </w:pPr>
       <w:r>
-        <w:t xml:space="preserve">How can we link mechanistic physiological models with population and community ecology theory?</w:t>
+        <w:t xml:space="preserve">Goal of this section is to briefly focus on the BIOLOGY that will shift thermal exposure and sensitivity in plants and animals.</w:t>
       </w:r>
     </w:p>
     <w:p>
@@ -935,7 +1137,32 @@
         </w:numPr>
       </w:pPr>
       <w:r>
-        <w:t xml:space="preserve">Introducing population and network models to link outputs from DEB (survival, reproduction, abundance) to population growth.</w:t>
+        <w:t xml:space="preserve">I</w:t>
+      </w:r>
+      <w:r>
+        <w:t xml:space="preserve"> </w:t>
+      </w:r>
+      <w:r>
+        <w:rPr>
+          <w:b/>
+          <w:bCs/>
+        </w:rPr>
+        <w:t xml:space="preserve">just</w:t>
+      </w:r>
+      <w:r>
+        <w:t xml:space="preserve"> </w:t>
+      </w:r>
+      <w:r>
+        <w:t xml:space="preserve">found this important paper for which a lot can be gleaned upon. Many of the important things we have been discussing are discussed in here:</w:t>
+      </w:r>
+      <w:r>
+        <w:t xml:space="preserve"> </w:t>
+      </w:r>
+      <w:r>
+        <w:t xml:space="preserve">[7]</w:t>
+      </w:r>
+      <w:r>
+        <w:t xml:space="preserve">, so we should be careful to make our narrative distinct. The limitation of this study is it lacks the focus on modelling frameworks, so I think us distinguishing how we link these concepts back into the model would be quite novel and distinguish ourselves from them..</w:t>
       </w:r>
     </w:p>
     <w:p>
@@ -947,61 +1174,7 @@
         </w:numPr>
       </w:pPr>
       <w:r>
-        <w:t xml:space="preserve">How people are analysing communities with network theory. Some important papers</w:t>
-      </w:r>
-      <w:r>
-        <w:t xml:space="preserve"> </w:t>
-      </w:r>
-      <w:r>
-        <w:t xml:space="preserve">[19]</w:t>
-      </w:r>
-      <w:r>
-        <w:t xml:space="preserve"> </w:t>
-      </w:r>
-      <w:r>
-        <w:t xml:space="preserve">[20]</w:t>
-      </w:r>
-      <w:r>
-        <w:t xml:space="preserve"> </w:t>
-      </w:r>
-      <w:r>
-        <w:t xml:space="preserve">[21]</w:t>
-      </w:r>
-      <w:r>
-        <w:t xml:space="preserve"> </w:t>
-      </w:r>
-      <w:r>
-        <w:t xml:space="preserve">[22]</w:t>
-      </w:r>
-      <w:r>
-        <w:t xml:space="preserve"> </w:t>
-      </w:r>
-      <w:r>
-        <w:t xml:space="preserve">[23]</w:t>
-      </w:r>
-      <w:r>
-        <w:t xml:space="preserve"> </w:t>
-      </w:r>
-      <w:r>
-        <w:t xml:space="preserve">[24]</w:t>
-      </w:r>
-      <w:r>
-        <w:t xml:space="preserve"> </w:t>
-      </w:r>
-      <w:r>
-        <w:t xml:space="preserve">[25]</w:t>
-      </w:r>
-      <w:r>
-        <w:t xml:space="preserve"> </w:t>
-      </w:r>
-      <w:r>
-        <w:t xml:space="preserve">Should also look at this book</w:t>
-      </w:r>
-      <w:r>
-        <w:t xml:space="preserve"> </w:t>
-      </w:r>
-      <w:r>
-        <w:t xml:space="preserve">[26]</w:t>
+        <w:t xml:space="preserve">Then, we overlay briefly how we might capture that in the modelling framework we setup above. For example, you all write the biology and we then need to think about how we can adjust models to capture these nuances.</w:t>
       </w:r>
     </w:p>
     <w:p>
@@ -1013,107 +1186,16 @@
         </w:numPr>
       </w:pPr>
       <w:r>
-        <w:t xml:space="preserve">How can we capture interactions among species within the community to predict how heat stress will affect community structure?</w:t>
-      </w:r>
-    </w:p>
-    <w:p>
-      <w:pPr>
-        <w:pStyle w:val="Compact"/>
-        <w:numPr>
-          <w:ilvl w:val="0"/>
-          <w:numId w:val="1006"/>
-        </w:numPr>
-      </w:pPr>
-      <w:r>
-        <w:t xml:space="preserve">Figure 2: demonstrating how TLS, biophysical and DEB models can be used to predict heat stress impacts on plants and animals, growth, reproduction, survival. (Dan, Margie)</w:t>
-      </w:r>
-    </w:p>
-    <w:p>
-      <w:pPr>
-        <w:pStyle w:val="Compact"/>
-        <w:numPr>
-          <w:ilvl w:val="0"/>
-          <w:numId w:val="1006"/>
-        </w:numPr>
-      </w:pPr>
-      <w:r>
-        <w:t xml:space="preserve">Also this is a cool paper</w:t>
-      </w:r>
-      <w:r>
-        <w:t xml:space="preserve"> </w:t>
-      </w:r>
-      <w:r>
-        <w:t xml:space="preserve">[27]</w:t>
-      </w:r>
-      <w:r>
-        <w:t xml:space="preserve"> </w:t>
-      </w:r>
-      <w:r>
-        <w:t xml:space="preserve">on carnivores diets by DNA sequencing fecal data</w:t>
-      </w:r>
-      <w:r>
-        <w:t xml:space="preserve"> </w:t>
-      </w:r>
-      <w:r>
-        <w:t xml:space="preserve">-The other way to model interactions us using foundational community ecology/ species abundance models see</w:t>
-      </w:r>
-      <w:r>
-        <w:t xml:space="preserve"> </w:t>
-      </w:r>
-      <w:r>
-        <w:t xml:space="preserve">[28]</w:t>
-      </w:r>
-      <w:r>
-        <w:t xml:space="preserve">. We can here model the actual abundance of a given species and it would seem more flexible to incorporate thermal tolerance infor into these models.</w:t>
-      </w:r>
-    </w:p>
-    <w:p>
-      <w:pPr>
-        <w:pStyle w:val="Compact"/>
-        <w:numPr>
-          <w:ilvl w:val="0"/>
-          <w:numId w:val="1006"/>
-        </w:numPr>
-      </w:pPr>
-      <w:r>
-        <w:t xml:space="preserve">have a close look at</w:t>
-      </w:r>
-      <w:r>
-        <w:t xml:space="preserve"> </w:t>
-      </w:r>
-      <w:r>
-        <w:t xml:space="preserve">[29]</w:t>
-      </w:r>
-      <w:r>
-        <w:t xml:space="preserve"> </w:t>
-      </w:r>
-      <w:r>
-        <w:t xml:space="preserve">and</w:t>
-      </w:r>
-      <w:r>
-        <w:t xml:space="preserve"> </w:t>
-      </w:r>
-      <w:r>
-        <w:t xml:space="preserve">[30]</w:t>
-      </w:r>
-      <w:r>
-        <w:t xml:space="preserve">, limitations</w:t>
-      </w:r>
-      <w:r>
-        <w:t xml:space="preserve"> </w:t>
-      </w:r>
-      <w:r>
-        <w:t xml:space="preserve">[31]</w:t>
-      </w:r>
-    </w:p>
-    <w:bookmarkEnd w:id="24"/>
-    <w:bookmarkStart w:id="30" w:name="Xe7540e51cb84d29e47d083817996607ca5f8009"/>
-    <w:p>
-      <w:pPr>
-        <w:pStyle w:val="Heading1"/>
-      </w:pPr>
-      <w:r>
-        <w:t xml:space="preserve">Incorporating context-dependent environmental feedback to evaluate resilience to extreme heat (Brajesh, Brendan, James, Everyone else who wants to contribute)</w:t>
+        <w:t xml:space="preserve">If uncertain about adding a sentence to the link to the models above, that’s ok, Dan, Mike, Margie and Belinda can add.</w:t>
+      </w:r>
+    </w:p>
+    <w:bookmarkStart w:id="25" w:name="X1b136e3eae891c477bc728d2597e572ca649eaa"/>
+    <w:p>
+      <w:pPr>
+        <w:pStyle w:val="Heading3"/>
+      </w:pPr>
+      <w:r>
+        <w:t xml:space="preserve">Microbial communities can impact thermal sensitivity in plants and animals (Brajesh)</w:t>
       </w:r>
     </w:p>
     <w:p>
@@ -1122,88 +1204,6 @@
         <w:numPr>
           <w:ilvl w:val="0"/>
           <w:numId w:val="1007"/>
-        </w:numPr>
-      </w:pPr>
-      <w:r>
-        <w:t xml:space="preserve">Goal of this section is to briefly focus on the BIOLOGY that will shift thermal exposure and sensitivity in plants and animals.</w:t>
-      </w:r>
-    </w:p>
-    <w:p>
-      <w:pPr>
-        <w:pStyle w:val="Compact"/>
-        <w:numPr>
-          <w:ilvl w:val="0"/>
-          <w:numId w:val="1007"/>
-        </w:numPr>
-      </w:pPr>
-      <w:r>
-        <w:t xml:space="preserve">I</w:t>
-      </w:r>
-      <w:r>
-        <w:t xml:space="preserve"> </w:t>
-      </w:r>
-      <w:r>
-        <w:rPr>
-          <w:b/>
-          <w:bCs/>
-        </w:rPr>
-        <w:t xml:space="preserve">just</w:t>
-      </w:r>
-      <w:r>
-        <w:t xml:space="preserve"> </w:t>
-      </w:r>
-      <w:r>
-        <w:t xml:space="preserve">found this important paper for which a lot can be gleaned upon. Many of the important things we have been discussing are discussed in here:</w:t>
-      </w:r>
-      <w:r>
-        <w:t xml:space="preserve"> </w:t>
-      </w:r>
-      <w:r>
-        <w:t xml:space="preserve">[7]</w:t>
-      </w:r>
-      <w:r>
-        <w:t xml:space="preserve">, so we should be careful to make our narrative distinct. The limitation of this study is it lacks the focus on modelling frameworks, so I think us distinguishing how we link these concepts back into the model would be quite novel and distinguish ourselves from them..</w:t>
-      </w:r>
-    </w:p>
-    <w:p>
-      <w:pPr>
-        <w:pStyle w:val="Compact"/>
-        <w:numPr>
-          <w:ilvl w:val="0"/>
-          <w:numId w:val="1007"/>
-        </w:numPr>
-      </w:pPr>
-      <w:r>
-        <w:t xml:space="preserve">Then, we overlay briefly how we might capture that in the modelling framework we setup above. For example, you all write the biology and we then need to think about how we can adjust models to capture these nuances.</w:t>
-      </w:r>
-    </w:p>
-    <w:p>
-      <w:pPr>
-        <w:pStyle w:val="Compact"/>
-        <w:numPr>
-          <w:ilvl w:val="0"/>
-          <w:numId w:val="1007"/>
-        </w:numPr>
-      </w:pPr>
-      <w:r>
-        <w:t xml:space="preserve">If uncertain about adding a sentence to the link to the models above, that’s ok, Dan, Mike, Margie and Belinda can add.</w:t>
-      </w:r>
-    </w:p>
-    <w:bookmarkStart w:id="25" w:name="X1b136e3eae891c477bc728d2597e572ca649eaa"/>
-    <w:p>
-      <w:pPr>
-        <w:pStyle w:val="Heading3"/>
-      </w:pPr>
-      <w:r>
-        <w:t xml:space="preserve">Microbial communities can impact thermal sensitivity in plants and animals (Brajesh)</w:t>
-      </w:r>
-    </w:p>
-    <w:p>
-      <w:pPr>
-        <w:pStyle w:val="Compact"/>
-        <w:numPr>
-          <w:ilvl w:val="0"/>
-          <w:numId w:val="1008"/>
         </w:numPr>
       </w:pPr>
       <w:r>
@@ -1312,40 +1312,166 @@
         <w:pStyle w:val="Compact"/>
         <w:numPr>
           <w:ilvl w:val="0"/>
+          <w:numId w:val="1007"/>
+        </w:numPr>
+      </w:pPr>
+      <w:r>
+        <w:t xml:space="preserve">See</w:t>
+      </w:r>
+      <w:r>
+        <w:t xml:space="preserve"> </w:t>
+      </w:r>
+      <w:r>
+        <w:t xml:space="preserve">[33]</w:t>
+      </w:r>
+      <w:r>
+        <w:t xml:space="preserve">. The paper provides a framework for modelling soil plant interactions</w:t>
+      </w:r>
+    </w:p>
+    <w:bookmarkEnd w:id="25"/>
+    <w:bookmarkStart w:id="26" w:name="X24738ef4513767bb724ce8804ac017259eaf2ee"/>
+    <w:p>
+      <w:pPr>
+        <w:pStyle w:val="Heading3"/>
+      </w:pPr>
+      <w:r>
+        <w:t xml:space="preserve">Water availability can impact thermal sensitivity of plants and animals (Brendan)</w:t>
+      </w:r>
+    </w:p>
+    <w:bookmarkEnd w:id="26"/>
+    <w:bookmarkStart w:id="27" w:name="X1934a01dca617640c62902cb6b54ad742133dfc"/>
+    <w:p>
+      <w:pPr>
+        <w:pStyle w:val="Heading3"/>
+      </w:pPr>
+      <w:r>
+        <w:t xml:space="preserve">Competition can impact thermal sensitivity of plants and animals (James? Feel free to add a different section title here.)</w:t>
+      </w:r>
+    </w:p>
+    <w:p>
+      <w:pPr>
+        <w:pStyle w:val="Compact"/>
+        <w:numPr>
+          <w:ilvl w:val="0"/>
           <w:numId w:val="1008"/>
         </w:numPr>
       </w:pPr>
       <w:r>
-        <w:t xml:space="preserve">See</w:t>
-      </w:r>
-      <w:r>
-        <w:t xml:space="preserve"> </w:t>
-      </w:r>
-      <w:r>
-        <w:t xml:space="preserve">[33]</w:t>
-      </w:r>
-      <w:r>
-        <w:t xml:space="preserve">. The paper provides a framework for modelling soil plant interactions</w:t>
-      </w:r>
-    </w:p>
-    <w:bookmarkEnd w:id="25"/>
-    <w:bookmarkStart w:id="26" w:name="X24738ef4513767bb724ce8804ac017259eaf2ee"/>
+        <w:t xml:space="preserve">James. Added some text around a few examples below. Feel fre eto use/integrate or completely throw away. Or, we can move some of this into other sections.</w:t>
+      </w:r>
+      <w:r>
+        <w:t xml:space="preserve"> </w:t>
+      </w:r>
+      <w:r>
+        <w:t xml:space="preserve">Competition among species within a community can influence a focal species’ tolerance to heat stress. Competition can influence microhabitat selection and the availability of thermal refugia which can protect against thermal extremes, the diet of a focal species that can indirectly influence physiological tolerance of temperature stress, and the availability of resources that can help buffer against heat stress. For example, Li</w:t>
+      </w:r>
+      <w:r>
+        <w:t xml:space="preserve"> </w:t>
+      </w:r>
+      <w:r>
+        <w:rPr>
+          <w:i/>
+          <w:iCs/>
+        </w:rPr>
+        <w:t xml:space="preserve">et al.</w:t>
+      </w:r>
+      <w:r>
+        <w:t xml:space="preserve"> </w:t>
+      </w:r>
+      <w:r>
+        <w:t xml:space="preserve">[34]</w:t>
+      </w:r>
+      <w:r>
+        <w:t xml:space="preserve"> </w:t>
+      </w:r>
+      <w:r>
+        <w:t xml:space="preserve">measured the thermal tolerance landscape for three aphid species that are pests for cereal crops globally to understand whether they could predict changes in community abundance. Using a thermal death time (TDT) approach to estimate the cumulative impacts of heat stress on survival they found that one species,</w:t>
+      </w:r>
+      <w:r>
+        <w:t xml:space="preserve"> </w:t>
+      </w:r>
+      <w:r>
+        <w:rPr>
+          <w:i/>
+          <w:iCs/>
+        </w:rPr>
+        <w:t xml:space="preserve">Rhopalosiphum padi</w:t>
+      </w:r>
+      <w:r>
+        <w:t xml:space="preserve">, showed high heat tolerance and accumulated less injury over natural temperature fluctuations. The ability to maintain high relative abundance in the face of extreme heat may allow this species to outcompete other aphids explaining why it dominates in southern parts of its range.</w:t>
+      </w:r>
+    </w:p>
+    <w:p>
+      <w:pPr>
+        <w:pStyle w:val="FirstParagraph"/>
+      </w:pPr>
+      <w:r>
+        <w:t xml:space="preserve">Li</w:t>
+      </w:r>
+      <w:r>
+        <w:t xml:space="preserve"> </w:t>
+      </w:r>
+      <w:r>
+        <w:rPr>
+          <w:i/>
+          <w:iCs/>
+        </w:rPr>
+        <w:t xml:space="preserve">et al.</w:t>
+      </w:r>
+      <w:r>
+        <w:t xml:space="preserve"> </w:t>
+      </w:r>
+      <w:r>
+        <w:t xml:space="preserve">[34]</w:t>
+      </w:r>
+      <w:r>
+        <w:t xml:space="preserve"> </w:t>
+      </w:r>
+      <w:r>
+        <w:t xml:space="preserve">also found that different life-stages were affected differently by heat stress, with adults being more thermally tolerant than early developmental stages emphasising the need for models to capture such variation. However, such findings do not incorporate acclimation to heat stress or different microhabitat choice by the different species, which are both likely to be important for predicting the impacts of heat stress on community structure. It also ignores how interspecific interactions between competing aphid species will also likely mediate species abundance. It would be worth while integrating thermal tolerance landscapes with ecological models that capture interspecific interactions to better predict how heat stress will affect community structure.</w:t>
+      </w:r>
+    </w:p>
+    <w:bookmarkEnd w:id="27"/>
+    <w:bookmarkStart w:id="28" w:name="Xdbc91e02dcd505372e716f3d2147fb46ffba4bf"/>
     <w:p>
       <w:pPr>
         <w:pStyle w:val="Heading3"/>
       </w:pPr>
       <w:r>
-        <w:t xml:space="preserve">Water availability can impact thermal sensitivity of plants and animals (Brendan)</w:t>
-      </w:r>
-    </w:p>
-    <w:bookmarkEnd w:id="26"/>
-    <w:bookmarkStart w:id="27" w:name="X1934a01dca617640c62902cb6b54ad742133dfc"/>
+        <w:t xml:space="preserve">Acclimation can impact thermal sensitivity of plants and animals (Everyone)</w:t>
+      </w:r>
+    </w:p>
+    <w:bookmarkEnd w:id="28"/>
+    <w:bookmarkStart w:id="29" w:name="X1f820984f57b727edc20965138ee13069f96c01"/>
     <w:p>
       <w:pPr>
         <w:pStyle w:val="Heading3"/>
       </w:pPr>
       <w:r>
-        <w:t xml:space="preserve">Competition can impact thermal sensitivity of plants and animals (James? Feel free to add a different section title here.)</w:t>
+        <w:t xml:space="preserve">Phenology and activity pattern shifts mediating interactions (James?)</w:t>
+      </w:r>
+    </w:p>
+    <w:bookmarkEnd w:id="29"/>
+    <w:bookmarkEnd w:id="30"/>
+    <w:bookmarkStart w:id="31" w:name="X42ca7aa69937316dee7b1e100d4320aa777518f"/>
+    <w:p>
+      <w:pPr>
+        <w:pStyle w:val="Heading1"/>
+      </w:pPr>
+      <w:r>
+        <w:t xml:space="preserve">‘</w:t>
+      </w:r>
+      <w:r>
+        <w:t xml:space="preserve">Hot</w:t>
+      </w:r>
+      <w:r>
+        <w:t xml:space="preserve">’</w:t>
+      </w:r>
+      <w:r>
+        <w:t xml:space="preserve"> </w:t>
+      </w:r>
+      <w:r>
+        <w:t xml:space="preserve">solutions for a changing world (Alison, Owen and Belinda, Mike)</w:t>
       </w:r>
     </w:p>
     <w:p>
@@ -1357,121 +1483,7 @@
         </w:numPr>
       </w:pPr>
       <w:r>
-        <w:t xml:space="preserve">James. Added some text around a few examples below. Feel fre eto use/integrate or completely throw away. Or, we can move some of this into other sections.</w:t>
-      </w:r>
-      <w:r>
-        <w:t xml:space="preserve"> </w:t>
-      </w:r>
-      <w:r>
-        <w:t xml:space="preserve">Competition among species within a community can influence a focal species’ tolerance to heat stress. Competition can influence microhabitat selection and the availability of thermal refugia which can protect against thermal extremes, the diet of a focal species that can indirectly influence physiological tolerance of temperature stress, and the availability of resources that can help buffer against heat stress. For example, Li</w:t>
-      </w:r>
-      <w:r>
-        <w:t xml:space="preserve"> </w:t>
-      </w:r>
-      <w:r>
-        <w:rPr>
-          <w:i/>
-          <w:iCs/>
-        </w:rPr>
-        <w:t xml:space="preserve">et al.</w:t>
-      </w:r>
-      <w:r>
-        <w:t xml:space="preserve"> </w:t>
-      </w:r>
-      <w:r>
-        <w:t xml:space="preserve">[34]</w:t>
-      </w:r>
-      <w:r>
-        <w:t xml:space="preserve"> </w:t>
-      </w:r>
-      <w:r>
-        <w:t xml:space="preserve">measured the thermal tolerance landscape for three aphid species that are pests for cereal crops globally to understand whether they could predict changes in community abundance. Using a thermal death time (TDT) approach to estimate the cumulative impacts of heat stress on survival they found that one species,</w:t>
-      </w:r>
-      <w:r>
-        <w:t xml:space="preserve"> </w:t>
-      </w:r>
-      <w:r>
-        <w:rPr>
-          <w:i/>
-          <w:iCs/>
-        </w:rPr>
-        <w:t xml:space="preserve">Rhopalosiphum padi</w:t>
-      </w:r>
-      <w:r>
-        <w:t xml:space="preserve">, showed high heat tolerance and accumulated less injury over natural temperature fluctuations. The ability to maintain high relative abundance in the face of extreme heat may allow this species to outcompete other aphids explaining why it dominates in southern parts of its range.</w:t>
-      </w:r>
-    </w:p>
-    <w:p>
-      <w:pPr>
-        <w:pStyle w:val="FirstParagraph"/>
-      </w:pPr>
-      <w:r>
-        <w:t xml:space="preserve">Li</w:t>
-      </w:r>
-      <w:r>
-        <w:t xml:space="preserve"> </w:t>
-      </w:r>
-      <w:r>
-        <w:rPr>
-          <w:i/>
-          <w:iCs/>
-        </w:rPr>
-        <w:t xml:space="preserve">et al.</w:t>
-      </w:r>
-      <w:r>
-        <w:t xml:space="preserve"> </w:t>
-      </w:r>
-      <w:r>
-        <w:t xml:space="preserve">[34]</w:t>
-      </w:r>
-      <w:r>
-        <w:t xml:space="preserve"> </w:t>
-      </w:r>
-      <w:r>
-        <w:t xml:space="preserve">also found that different life-stages were affected differently by heat stress, with adults being more thermally tolerant than early developmental stages emphasising the need for models to capture such variation. However, such findings do not incorporate acclimation to heat stress or different microhabitat choice by the different species, which are both likely to be important for predicting the impacts of heat stress on community structure. It also ignores how interspecific interactions between competing aphid species will also likely mediate species abundance. It would be worth while integrating thermal tolerance landscapes with ecological models that capture interspecific interactions to better predict how heat stress will affect community structure.</w:t>
-      </w:r>
-    </w:p>
-    <w:bookmarkEnd w:id="27"/>
-    <w:bookmarkStart w:id="28" w:name="Xdbc91e02dcd505372e716f3d2147fb46ffba4bf"/>
-    <w:p>
-      <w:pPr>
-        <w:pStyle w:val="Heading3"/>
-      </w:pPr>
-      <w:r>
-        <w:t xml:space="preserve">Acclimation can impact thermal sensitivity of plants and animals (Everyone)</w:t>
-      </w:r>
-    </w:p>
-    <w:bookmarkEnd w:id="28"/>
-    <w:bookmarkStart w:id="29" w:name="X1f820984f57b727edc20965138ee13069f96c01"/>
-    <w:p>
-      <w:pPr>
-        <w:pStyle w:val="Heading3"/>
-      </w:pPr>
-      <w:r>
-        <w:t xml:space="preserve">Phenology and activity pattern shifts mediating interactions (James?)</w:t>
-      </w:r>
-    </w:p>
-    <w:bookmarkEnd w:id="29"/>
-    <w:bookmarkEnd w:id="30"/>
-    <w:bookmarkStart w:id="31" w:name="X42ca7aa69937316dee7b1e100d4320aa777518f"/>
-    <w:p>
-      <w:pPr>
-        <w:pStyle w:val="Heading1"/>
-      </w:pPr>
-      <w:r>
-        <w:t xml:space="preserve">‘</w:t>
-      </w:r>
-      <w:r>
-        <w:t xml:space="preserve">Hot</w:t>
-      </w:r>
-      <w:r>
-        <w:t xml:space="preserve">’</w:t>
-      </w:r>
-      <w:r>
-        <w:t xml:space="preserve"> </w:t>
-      </w:r>
-      <w:r>
-        <w:t xml:space="preserve">solutions for a changing world (Alison, Owen and Belinda, Mike)</w:t>
+        <w:t xml:space="preserve">Here, we bring in what we can do with these models, I think we highlight some of the key elements of the solutions strand ideas where we can apply the models in the agricultural and natural space.</w:t>
       </w:r>
     </w:p>
     <w:p>
@@ -1479,11 +1491,51 @@
         <w:pStyle w:val="Compact"/>
         <w:numPr>
           <w:ilvl w:val="0"/>
+          <w:numId w:val="1009"/>
+        </w:numPr>
+      </w:pPr>
+      <w:r>
+        <w:t xml:space="preserve">Enhancing resilience</w:t>
+      </w:r>
+      <w:r>
+        <w:t xml:space="preserve"> </w:t>
+      </w:r>
+      <w:r>
+        <w:t xml:space="preserve">-</w:t>
+      </w:r>
+      <w:r>
+        <w:rPr>
+          <w:i/>
+          <w:iCs/>
+        </w:rPr>
+        <w:t xml:space="preserve">Selective breeding</w:t>
+      </w:r>
+      <w:r>
+        <w:t xml:space="preserve">: Artificial selection will be a useful avenue for both plants and animals to enhance thermal tolerance. Models can help evaluate how changes in sensitivity can cascade to influence community structure and function (Alison, Owen, Dani, Others)</w:t>
+      </w:r>
+    </w:p>
+    <w:p>
+      <w:pPr>
+        <w:pStyle w:val="Compact"/>
+        <w:numPr>
+          <w:ilvl w:val="1"/>
           <w:numId w:val="1010"/>
         </w:numPr>
       </w:pPr>
       <w:r>
-        <w:t xml:space="preserve">Here, we bring in what we can do with these models, I think we highlight some of the key elements of the solutions strand ideas where we can apply the models in the agricultural and natural space.</w:t>
+        <w:t xml:space="preserve">Microbial recruitment (Braj)</w:t>
+      </w:r>
+    </w:p>
+    <w:p>
+      <w:pPr>
+        <w:pStyle w:val="Compact"/>
+        <w:numPr>
+          <w:ilvl w:val="1"/>
+          <w:numId w:val="1010"/>
+        </w:numPr>
+      </w:pPr>
+      <w:r>
+        <w:t xml:space="preserve">Pollinator services (James, Margie)</w:t>
       </w:r>
     </w:p>
     <w:p>
@@ -1491,27 +1543,11 @@
         <w:pStyle w:val="Compact"/>
         <w:numPr>
           <w:ilvl w:val="0"/>
-          <w:numId w:val="1010"/>
+          <w:numId w:val="1009"/>
         </w:numPr>
       </w:pPr>
       <w:r>
-        <w:t xml:space="preserve">Enhancing resilience</w:t>
-      </w:r>
-      <w:r>
-        <w:t xml:space="preserve"> </w:t>
-      </w:r>
-      <w:r>
-        <w:t xml:space="preserve">-</w:t>
-      </w:r>
-      <w:r>
-        <w:rPr>
-          <w:i/>
-          <w:iCs/>
-        </w:rPr>
-        <w:t xml:space="preserve">Selective breeding</w:t>
-      </w:r>
-      <w:r>
-        <w:t xml:space="preserve">: Artificial selection will be a useful avenue for both plants and animals to enhance thermal tolerance. Models can help evaluate how changes in sensitivity can cascade to influence community structure and function (Alison, Owen, Dani, Others)</w:t>
+        <w:t xml:space="preserve">Cooler landscapes</w:t>
       </w:r>
     </w:p>
     <w:p>
@@ -1523,19 +1559,14 @@
         </w:numPr>
       </w:pPr>
       <w:r>
-        <w:t xml:space="preserve">Microbial recruitment (Braj)</w:t>
-      </w:r>
-    </w:p>
-    <w:p>
-      <w:pPr>
-        <w:pStyle w:val="Compact"/>
-        <w:numPr>
-          <w:ilvl w:val="1"/>
-          <w:numId w:val="1011"/>
-        </w:numPr>
-      </w:pPr>
-      <w:r>
-        <w:t xml:space="preserve">Pollinator services (James, Margie)</w:t>
+        <w:rPr>
+          <w:i/>
+          <w:iCs/>
+        </w:rPr>
+        <w:t xml:space="preserve">Cooler landscapes</w:t>
+      </w:r>
+      <w:r>
+        <w:t xml:space="preserve">: Landscapes can be designed to provide thermal refugia for plants and animals. For example, planting trees in urban areas can provide shade and reduce the urban heat island effect. Similarly, planting hedgerows in agricultural landscapes can provide thermal refugia for beneficial insects and pollinators. (Mike, Belinda)</w:t>
       </w:r>
     </w:p>
     <w:p>
@@ -1543,30 +1574,11 @@
         <w:pStyle w:val="Compact"/>
         <w:numPr>
           <w:ilvl w:val="0"/>
-          <w:numId w:val="1010"/>
+          <w:numId w:val="1009"/>
         </w:numPr>
       </w:pPr>
       <w:r>
-        <w:t xml:space="preserve">Cooler landscapes</w:t>
-      </w:r>
-    </w:p>
-    <w:p>
-      <w:pPr>
-        <w:pStyle w:val="Compact"/>
-        <w:numPr>
-          <w:ilvl w:val="1"/>
-          <w:numId w:val="1012"/>
-        </w:numPr>
-      </w:pPr>
-      <w:r>
-        <w:rPr>
-          <w:i/>
-          <w:iCs/>
-        </w:rPr>
-        <w:t xml:space="preserve">Cooler landscapes</w:t>
-      </w:r>
-      <w:r>
-        <w:t xml:space="preserve">: Landscapes can be designed to provide thermal refugia for plants and animals. For example, planting trees in urban areas can provide shade and reduce the urban heat island effect. Similarly, planting hedgerows in agricultural landscapes can provide thermal refugia for beneficial insects and pollinators. (Mike, Belinda)</w:t>
+        <w:t xml:space="preserve">Pest and disease prediction and control. (Ary)</w:t>
       </w:r>
     </w:p>
     <w:p>
@@ -1574,19 +1586,7 @@
         <w:pStyle w:val="Compact"/>
         <w:numPr>
           <w:ilvl w:val="0"/>
-          <w:numId w:val="1010"/>
-        </w:numPr>
-      </w:pPr>
-      <w:r>
-        <w:t xml:space="preserve">Pest and disease prediction and control. (Ary)</w:t>
-      </w:r>
-    </w:p>
-    <w:p>
-      <w:pPr>
-        <w:pStyle w:val="Compact"/>
-        <w:numPr>
-          <w:ilvl w:val="0"/>
-          <w:numId w:val="1010"/>
+          <w:numId w:val="1009"/>
         </w:numPr>
       </w:pPr>
       <w:r>
@@ -4205,9 +4205,6 @@
     <w:abstractNumId w:val="991"/>
   </w:num>
   <w:num w:numId="1011">
-    <w:abstractNumId w:val="991"/>
-  </w:num>
-  <w:num w:numId="1012">
     <w:abstractNumId w:val="991"/>
   </w:num>
 </w:numbering>

</xml_diff>

<commit_message>
Adding some refs in useful places and also makes them formatted for proposal
</commit_message>
<xml_diff>
--- a/ms/ms.docx
+++ b/ms/ms.docx
@@ -85,34 +85,37 @@
         <w:t xml:space="preserve">- Integrated modeling approaches for predicting the impacts of extreme heat on communities</w:t>
       </w:r>
       <w:r>
-        <w:t xml:space="preserve"> </w:t>
+        <w:br/>
       </w:r>
       <w:r>
         <w:t xml:space="preserve">- Thermal tolerance landscapes for populations and communities: applications in a changing world</w:t>
       </w:r>
       <w:r>
-        <w:t xml:space="preserve"> </w:t>
+        <w:br/>
       </w:r>
       <w:r>
         <w:t xml:space="preserve">- An integrated modelling approach for predicting the impacts of extreme heat on communities</w:t>
       </w:r>
       <w:r>
-        <w:t xml:space="preserve"> </w:t>
+        <w:br/>
       </w:r>
       <w:r>
         <w:t xml:space="preserve">- Predicting the resilience of species interactions under extreme heat now and into the future</w:t>
       </w:r>
       <w:r>
-        <w:t xml:space="preserve"> </w:t>
-      </w:r>
-      <w:r>
-        <w:t xml:space="preserve">- Calculated responses to the biological impacts of extreme heat: the need to connect our models (Mike) (Dan likes this one as well)</w:t>
+        <w:br/>
+      </w:r>
+      <w:r>
+        <w:t xml:space="preserve">- Calculated responses to the biological impacts of extreme heat: the need to connect our models (Mike) (Dan likes this one as well) </w:t>
       </w:r>
       <w:r>
         <w:t xml:space="preserve"> </w:t>
       </w:r>
       <w:r>
         <w:t xml:space="preserve">- Predicting the resilience of species interactions under extreme heat</w:t>
+      </w:r>
+      <w:r>
+        <w:br/>
       </w:r>
     </w:p>
     <w:p>
@@ -412,210 +415,6 @@
       </w:r>
       <w:r>
         <w:t xml:space="preserve">- Future directions: modelling challenges, gaps and possible solutions (Mike, Belinda, Dan, Ary, Braj, Everyone) (~300-500 words)</w:t>
-      </w:r>
-    </w:p>
-    <w:p>
-      <w:pPr>
-        <w:pStyle w:val="BodyText"/>
-      </w:pPr>
-      <w:r>
-        <w:t xml:space="preserve">Please see more detailed guidance for each section below and some names who might lead these.</w:t>
-      </w:r>
-    </w:p>
-    <w:bookmarkStart w:id="20" w:name="abstract-dan"/>
-    <w:p>
-      <w:pPr>
-        <w:pStyle w:val="Heading1"/>
-      </w:pPr>
-      <w:r>
-        <w:t xml:space="preserve">Abstract (Dan)</w:t>
-      </w:r>
-    </w:p>
-    <w:p>
-      <w:pPr>
-        <w:pStyle w:val="FirstParagraph"/>
-      </w:pPr>
-      <w:r>
-        <w:t xml:space="preserve">Anthropogenic climate change is leading to more frequent and extreme heat waves. These short-term but large-scale events are radically re-shaping interactions among organisms, impacting biodiversity, community composition and ecosystem services crucial to natural systems and food security. Predicting heat wave impacts on interacting species requires an understanding of the processes driving differential exposure and sensitivity of organisms to extreme heat events in a life-cycle context. But this, in turn, requires a modelling framework that can capture species-specific responses via habitat-mediated microclimates, biophysics of body temperature, physiological sensitivity, and its effects on vital rates across ontogeny and thermal history. We show how existing models in disparate fields can be linked to achieve this level of understanding to allow calculated responses to extreme heat now and into the future. </w:t>
-      </w:r>
-    </w:p>
-    <w:bookmarkEnd w:id="20"/>
-    <w:bookmarkStart w:id="21" w:name="Xebe326ccf6438bb59b06b215a72d468ba832b0f"/>
-    <w:p>
-      <w:pPr>
-        <w:pStyle w:val="Heading1"/>
-      </w:pPr>
-      <w:r>
-        <w:t xml:space="preserve">A need for a mechanistically informed modelling framework for predicting the effects of extreme heat on community assemblages (Dan)</w:t>
-      </w:r>
-    </w:p>
-    <w:p>
-      <w:pPr>
-        <w:pStyle w:val="FirstParagraph"/>
-      </w:pPr>
-      <w:r>
-        <w:t xml:space="preserve">Climate change is leading to warmer and more variable thermal environments globally</w:t>
-      </w:r>
-      <w:r>
-        <w:t xml:space="preserve"> </w:t>
-      </w:r>
-      <w:r>
-        <w:t xml:space="preserve">[1,2]</w:t>
-      </w:r>
-      <w:r>
-        <w:t xml:space="preserve">. Greater thermal variability will result in organisms experiencing extreme heat waves that result in thermal stress that impacts organismal growth, survival and reproduction with cascading effects on population dynamics, community composition and ecosystem structure and function. Climate variability has already been linked to dramatic declines in pollinator abundance</w:t>
-      </w:r>
-      <w:r>
-        <w:t xml:space="preserve"> </w:t>
-      </w:r>
-      <w:r>
-        <w:t xml:space="preserve">[3]</w:t>
-      </w:r>
-      <w:r>
-        <w:t xml:space="preserve"> </w:t>
-      </w:r>
-      <w:r>
-        <w:t xml:space="preserve">and in crop yields globally</w:t>
-      </w:r>
-      <w:r>
-        <w:t xml:space="preserve"> </w:t>
-      </w:r>
-      <w:r>
-        <w:t xml:space="preserve">[4,5]</w:t>
-      </w:r>
-      <w:r>
-        <w:t xml:space="preserve">, but the causes underlying such declines, and their ramifications through communities, are not fully understood. The impacts of extreme heat on species and communities are driven by a combination of direct effects of heat stress on organism physiology and fitness</w:t>
-      </w:r>
-      <w:r>
-        <w:t xml:space="preserve"> </w:t>
-      </w:r>
-      <w:r>
-        <w:t xml:space="preserve">[6–9]</w:t>
-      </w:r>
-      <w:r>
-        <w:t xml:space="preserve"> </w:t>
-      </w:r>
-      <w:r>
-        <w:t xml:space="preserve">and indirect effects on interactions (both positive and negative) among species</w:t>
-      </w:r>
-      <w:r>
-        <w:t xml:space="preserve"> </w:t>
-      </w:r>
-      <w:r>
-        <w:t xml:space="preserve">[e.g., 10,11]</w:t>
-      </w:r>
-      <w:r>
-        <w:t xml:space="preserve"> </w:t>
-      </w:r>
-      <w:r>
-        <w:t xml:space="preserve">– including the microbial communities many species rely upon</w:t>
-      </w:r>
-      <w:r>
-        <w:t xml:space="preserve"> </w:t>
-      </w:r>
-      <w:r>
-        <w:t xml:space="preserve">[12]</w:t>
-      </w:r>
-      <w:r>
-        <w:t xml:space="preserve">. Understanding the dynamic interplay between direct and indirect interactions, and how these are mediated by environmental factors, has been hampered by the complexity of community interactions and the lack of an integrated modelling framework that can translate short-term physiological damage into changes in fitness and population growth across species</w:t>
-      </w:r>
-      <w:r>
-        <w:t xml:space="preserve"> </w:t>
-      </w:r>
-      <w:r>
-        <w:t xml:space="preserve">[12]</w:t>
-      </w:r>
-      <w:r>
-        <w:t xml:space="preserve">.</w:t>
-      </w:r>
-    </w:p>
-    <w:p>
-      <w:pPr>
-        <w:pStyle w:val="BodyText"/>
-      </w:pPr>
-      <w:r>
-        <w:t xml:space="preserve">Predicting how extreme heat impacts population dynamics and community interactions requires the coupling of physiological, biophysical and population ecology models. We argue that such a feat is becoming increasingly more tangible and will provide powerful new ways of predicting how extreme heat shapes community dynamics. Dynamic Energy Budget (DEB) theory can now be seamlessly integrated with biophysical models of heat and mass exchange to characterise organismal body temperatures and simulate the effects of extreme heat events on the entire life cycle of species within communities</w:t>
-      </w:r>
-      <w:r>
-        <w:t xml:space="preserve"> </w:t>
-      </w:r>
-      <w:r>
-        <w:t xml:space="preserve">[13–17]</w:t>
-      </w:r>
-      <w:r>
-        <w:t xml:space="preserve">. Dynamic Energy Budgets that incorporate estimates of thermal sensitivity across species can capture the delicate balance between damage and repair in physiological systems</w:t>
-      </w:r>
-      <w:r>
-        <w:t xml:space="preserve"> </w:t>
-      </w:r>
-      <w:r>
-        <w:t xml:space="preserve">[8,9,18]</w:t>
-      </w:r>
-      <w:r>
-        <w:t xml:space="preserve"> </w:t>
-      </w:r>
-      <w:r>
-        <w:t xml:space="preserve">to translate the immediate and cumulative impacts of extreme heat on growth, survival and reproduction. Importantly, mechanistic physiological models provide common currencies that can then be integrated into population and community ecology models to capture how extreme heat events perturb interactions among species [</w:t>
-      </w:r>
-      <w:r>
-        <w:rPr>
-          <w:b/>
-          <w:bCs/>
-        </w:rPr>
-        <w:t xml:space="preserve">Margie</w:t>
-      </w:r>
-      <w:r>
-        <w:t xml:space="preserve">, some refs here you think would be good?].</w:t>
-      </w:r>
-    </w:p>
-    <w:p>
-      <w:pPr>
-        <w:pStyle w:val="BodyText"/>
-      </w:pPr>
-      <w:r>
-        <w:t xml:space="preserve">Here, we bring together modelling approaches across diverse fields to establish a bridge for thinking about how we might begin integrating them to predict how extreme heat will affect communities. We focus our discussion on plant, insect and microbial communities given the strong interconnections between them, the ease with which they can be studied and their significance to natural and agricultural productivity. Nonetheless, our framework can be extended to incorporate other, diverse interactions. We highlight the immense opportunities such an integration may provide through a greater understanding of the ways in which extreme heat stress manifests across species and by elucidating more clearly how and why interactions among species can change with implications for natural and agricultural systems, food security and ecosystem services. We discuss the challenges of applying such an integrated modelling framework moving forward and how it can be extended to include other critical features that capture evolutionary change and plasticity in response to extreme heat.</w:t>
-      </w:r>
-    </w:p>
-    <w:bookmarkEnd w:id="21"/>
-    <w:bookmarkStart w:id="22" w:name="Xd22b977f88f0add426f49399196084251b1e16e"/>
-    <w:p>
-      <w:pPr>
-        <w:pStyle w:val="Heading1"/>
-      </w:pPr>
-      <w:r>
-        <w:t xml:space="preserve">Capturing the balance between physiological</w:t>
-      </w:r>
-      <w:r>
-        <w:t xml:space="preserve"> </w:t>
-      </w:r>
-      <w:r>
-        <w:rPr>
-          <w:i/>
-          <w:iCs/>
-        </w:rPr>
-        <w:t xml:space="preserve">damage</w:t>
-      </w:r>
-      <w:r>
-        <w:t xml:space="preserve"> </w:t>
-      </w:r>
-      <w:r>
-        <w:t xml:space="preserve">and</w:t>
-      </w:r>
-      <w:r>
-        <w:t xml:space="preserve"> </w:t>
-      </w:r>
-      <w:r>
-        <w:rPr>
-          <w:i/>
-          <w:iCs/>
-        </w:rPr>
-        <w:t xml:space="preserve">repair</w:t>
-      </w:r>
-      <w:r>
-        <w:t xml:space="preserve"> </w:t>
-      </w:r>
-      <w:r>
-        <w:t xml:space="preserve">to predict multi-species thermal sensitivity (Dan, Adrienne)</w:t>
       </w:r>
     </w:p>
     <w:p>
@@ -627,6 +426,255 @@
         </w:numPr>
       </w:pPr>
       <w:r>
+        <w:t xml:space="preserve">add bios to proposal</w:t>
+      </w:r>
+    </w:p>
+    <w:p>
+      <w:pPr>
+        <w:pStyle w:val="Compact"/>
+        <w:numPr>
+          <w:ilvl w:val="0"/>
+          <w:numId w:val="1001"/>
+        </w:numPr>
+      </w:pPr>
+      <w:r>
+        <w:t xml:space="preserve">add cell modelling</w:t>
+      </w:r>
+    </w:p>
+    <w:p>
+      <w:pPr>
+        <w:pStyle w:val="Compact"/>
+        <w:numPr>
+          <w:ilvl w:val="0"/>
+          <w:numId w:val="1001"/>
+        </w:numPr>
+      </w:pPr>
+      <w:r>
+        <w:t xml:space="preserve">organise weekly writing catchups to push forward. Agree it won’t be done by end of year</w:t>
+      </w:r>
+    </w:p>
+    <w:p>
+      <w:pPr>
+        <w:pStyle w:val="FirstParagraph"/>
+      </w:pPr>
+      <w:r>
+        <w:t xml:space="preserve">Please see more detailed guidance for each section below and some names who might lead these.</w:t>
+      </w:r>
+    </w:p>
+    <w:bookmarkStart w:id="20" w:name="abstract-dan"/>
+    <w:p>
+      <w:pPr>
+        <w:pStyle w:val="Heading1"/>
+      </w:pPr>
+      <w:r>
+        <w:t xml:space="preserve">Abstract (Dan)</w:t>
+      </w:r>
+    </w:p>
+    <w:p>
+      <w:pPr>
+        <w:pStyle w:val="FirstParagraph"/>
+      </w:pPr>
+      <w:r>
+        <w:t xml:space="preserve">Anthropogenic climate change is leading to more frequent and extreme heat waves. These short-term but large-scale events are radically re-shaping interactions among organisms, impacting biodiversity, community composition and ecosystem services crucial to natural systems and food security. Predicting heat wave impacts on interacting species requires an understanding of the processes driving differential exposure and sensitivity of organisms to extreme heat events in a life-cycle context. But this, in turn, requires a modelling framework that can capture species-specific responses via habitat-mediated microclimates, biophysics of body temperature, physiological sensitivity, and its effects on vital rates across ontogeny and thermal history. We show how existing models in disparate fields can be linked to achieve this level of understanding to allow calculated responses to extreme heat now and into the future. </w:t>
+      </w:r>
+    </w:p>
+    <w:bookmarkEnd w:id="20"/>
+    <w:bookmarkStart w:id="21" w:name="Xebe326ccf6438bb59b06b215a72d468ba832b0f"/>
+    <w:p>
+      <w:pPr>
+        <w:pStyle w:val="Heading1"/>
+      </w:pPr>
+      <w:r>
+        <w:t xml:space="preserve">A need for a mechanistically informed modelling framework for predicting the effects of extreme heat on community assemblages (Dan)</w:t>
+      </w:r>
+    </w:p>
+    <w:p>
+      <w:pPr>
+        <w:pStyle w:val="FirstParagraph"/>
+      </w:pPr>
+      <w:r>
+        <w:t xml:space="preserve">Climate change is leading to warmer and more variable thermal environments globally</w:t>
+      </w:r>
+      <w:r>
+        <w:t xml:space="preserve"> </w:t>
+      </w:r>
+      <w:r>
+        <w:t xml:space="preserve">[1,2]</w:t>
+      </w:r>
+      <w:r>
+        <w:t xml:space="preserve">. Greater thermal variability will result in organisms experiencing extreme heat waves that result in thermal stress that impacts organismal growth, survival and reproduction with cascading effects on population dynamics, community composition and ecosystem structure and function</w:t>
+      </w:r>
+      <w:r>
+        <w:t xml:space="preserve"> </w:t>
+      </w:r>
+      <w:r>
+        <w:t xml:space="preserve">[3,4]</w:t>
+      </w:r>
+      <w:r>
+        <w:t xml:space="preserve">. Climate variability has already been linked to dramatic declines in pollinator abundance</w:t>
+      </w:r>
+      <w:r>
+        <w:t xml:space="preserve"> </w:t>
+      </w:r>
+      <w:r>
+        <w:t xml:space="preserve">[5]</w:t>
+      </w:r>
+      <w:r>
+        <w:t xml:space="preserve"> </w:t>
+      </w:r>
+      <w:r>
+        <w:t xml:space="preserve">and in crop yields globally</w:t>
+      </w:r>
+      <w:r>
+        <w:t xml:space="preserve"> </w:t>
+      </w:r>
+      <w:r>
+        <w:t xml:space="preserve">[6–8]</w:t>
+      </w:r>
+      <w:r>
+        <w:t xml:space="preserve">, but the causes underlying such declines, and their ramifications through communities, are not fully understood. The impacts of extreme heat on species and communities are driven by a combination of direct effects of heat stress on organism physiology and fitness</w:t>
+      </w:r>
+      <w:r>
+        <w:t xml:space="preserve"> </w:t>
+      </w:r>
+      <w:r>
+        <w:t xml:space="preserve">[9–12]</w:t>
+      </w:r>
+      <w:r>
+        <w:t xml:space="preserve"> </w:t>
+      </w:r>
+      <w:r>
+        <w:t xml:space="preserve">and indirect effects on interactions (both positive and negative) among species</w:t>
+      </w:r>
+      <w:r>
+        <w:t xml:space="preserve"> </w:t>
+      </w:r>
+      <w:r>
+        <w:t xml:space="preserve">[e.g., 13,14]</w:t>
+      </w:r>
+      <w:r>
+        <w:t xml:space="preserve"> </w:t>
+      </w:r>
+      <w:r>
+        <w:t xml:space="preserve">– including the microbial communities many species rely upon</w:t>
+      </w:r>
+      <w:r>
+        <w:t xml:space="preserve"> </w:t>
+      </w:r>
+      <w:r>
+        <w:t xml:space="preserve">[15]</w:t>
+      </w:r>
+      <w:r>
+        <w:t xml:space="preserve">. Understanding the dynamic interplay between direct and indirect interactions, and how these are mediated by environmental factors, has been hampered by the complexity of community interactions and the lack of an integrated modelling framework that can translate short-term physiological damage into changes in fitness and population growth across species</w:t>
+      </w:r>
+      <w:r>
+        <w:t xml:space="preserve"> </w:t>
+      </w:r>
+      <w:r>
+        <w:t xml:space="preserve">[15]</w:t>
+      </w:r>
+      <w:r>
+        <w:t xml:space="preserve">.</w:t>
+      </w:r>
+    </w:p>
+    <w:p>
+      <w:pPr>
+        <w:pStyle w:val="BodyText"/>
+      </w:pPr>
+      <w:r>
+        <w:t xml:space="preserve">Predicting how extreme heat impacts population dynamics and community interactions requires the coupling of physiological, biophysical and population ecology models. We argue that such a feat is becoming increasingly more tangible and will provide powerful new ways of predicting how extreme heat shapes community dynamics. Dynamic Energy Budget (DEB) theory can now be seamlessly integrated with biophysical models of heat and mass exchange to characterise organismal body temperatures and simulate the effects of extreme heat events on the entire life cycle of species within communities</w:t>
+      </w:r>
+      <w:r>
+        <w:t xml:space="preserve"> </w:t>
+      </w:r>
+      <w:r>
+        <w:t xml:space="preserve">[16–20]</w:t>
+      </w:r>
+      <w:r>
+        <w:t xml:space="preserve">. Dynamic Energy Budgets that incorporate estimates of thermal sensitivity across species can capture the delicate balance between damage and repair in physiological systems</w:t>
+      </w:r>
+      <w:r>
+        <w:t xml:space="preserve"> </w:t>
+      </w:r>
+      <w:r>
+        <w:t xml:space="preserve">[11,12,21]</w:t>
+      </w:r>
+      <w:r>
+        <w:t xml:space="preserve"> </w:t>
+      </w:r>
+      <w:r>
+        <w:t xml:space="preserve">to translate the immediate and cumulative impacts of extreme heat on growth, survival and reproduction. Importantly, mechanistic physiological models provide common currencies that can then be integrated into population and community ecology models to capture how extreme heat events perturb interactions among species [</w:t>
+      </w:r>
+      <w:r>
+        <w:rPr>
+          <w:b/>
+          <w:bCs/>
+        </w:rPr>
+        <w:t xml:space="preserve">Margie</w:t>
+      </w:r>
+      <w:r>
+        <w:t xml:space="preserve">, some refs here you think would be good?].</w:t>
+      </w:r>
+    </w:p>
+    <w:p>
+      <w:pPr>
+        <w:pStyle w:val="BodyText"/>
+      </w:pPr>
+      <w:r>
+        <w:t xml:space="preserve">Here, we bring together modelling approaches across diverse fields to establish a bridge for thinking about how we might begin integrating them to predict how extreme heat will affect communities. We focus our discussion on plant, insect and microbial communities given the strong interconnections between them, the ease with which they can be studied and their significance to natural and agricultural productivity. Nonetheless, our framework can be extended to incorporate other, diverse interactions. We highlight the immense opportunities such an integration may provide through a greater understanding of the ways in which extreme heat stress manifests across species and by elucidating more clearly how and why interactions among species can change with implications for natural and agricultural systems, food security and ecosystem services. We discuss the challenges of applying such an integrated modelling framework moving forward and how it can be extended to include other critical features that capture evolutionary change and plasticity in response to extreme heat.</w:t>
+      </w:r>
+    </w:p>
+    <w:bookmarkEnd w:id="21"/>
+    <w:bookmarkStart w:id="22" w:name="Xd22b977f88f0add426f49399196084251b1e16e"/>
+    <w:p>
+      <w:pPr>
+        <w:pStyle w:val="Heading1"/>
+      </w:pPr>
+      <w:r>
+        <w:t xml:space="preserve">Capturing the balance between physiological</w:t>
+      </w:r>
+      <w:r>
+        <w:t xml:space="preserve"> </w:t>
+      </w:r>
+      <w:r>
+        <w:rPr>
+          <w:i/>
+          <w:iCs/>
+        </w:rPr>
+        <w:t xml:space="preserve">damage</w:t>
+      </w:r>
+      <w:r>
+        <w:t xml:space="preserve"> </w:t>
+      </w:r>
+      <w:r>
+        <w:t xml:space="preserve">and</w:t>
+      </w:r>
+      <w:r>
+        <w:t xml:space="preserve"> </w:t>
+      </w:r>
+      <w:r>
+        <w:rPr>
+          <w:i/>
+          <w:iCs/>
+        </w:rPr>
+        <w:t xml:space="preserve">repair</w:t>
+      </w:r>
+      <w:r>
+        <w:t xml:space="preserve"> </w:t>
+      </w:r>
+      <w:r>
+        <w:t xml:space="preserve">to predict multi-species thermal sensitivity (Dan, Adrienne)</w:t>
+      </w:r>
+    </w:p>
+    <w:p>
+      <w:pPr>
+        <w:pStyle w:val="Compact"/>
+        <w:numPr>
+          <w:ilvl w:val="0"/>
+          <w:numId w:val="1002"/>
+        </w:numPr>
+      </w:pPr>
+      <w:r>
         <w:t xml:space="preserve">Introduce thermal load sensitivity theory</w:t>
       </w:r>
     </w:p>
@@ -635,7 +683,7 @@
         <w:pStyle w:val="Compact"/>
         <w:numPr>
           <w:ilvl w:val="1"/>
-          <w:numId w:val="1002"/>
+          <w:numId w:val="1003"/>
         </w:numPr>
       </w:pPr>
       <w:r>
@@ -673,7 +721,7 @@
         <w:pStyle w:val="Compact"/>
         <w:numPr>
           <w:ilvl w:val="1"/>
-          <w:numId w:val="1002"/>
+          <w:numId w:val="1003"/>
         </w:numPr>
       </w:pPr>
       <w:r>
@@ -685,7 +733,7 @@
         <w:pStyle w:val="Compact"/>
         <w:numPr>
           <w:ilvl w:val="1"/>
-          <w:numId w:val="1002"/>
+          <w:numId w:val="1003"/>
         </w:numPr>
       </w:pPr>
       <w:r>
@@ -697,7 +745,7 @@
         <w:pStyle w:val="Compact"/>
         <w:numPr>
           <w:ilvl w:val="1"/>
-          <w:numId w:val="1002"/>
+          <w:numId w:val="1003"/>
         </w:numPr>
       </w:pPr>
       <w:r>
@@ -709,7 +757,7 @@
         <w:pStyle w:val="Compact"/>
         <w:numPr>
           <w:ilvl w:val="1"/>
-          <w:numId w:val="1002"/>
+          <w:numId w:val="1003"/>
         </w:numPr>
       </w:pPr>
       <w:r>
@@ -721,7 +769,7 @@
         <w:pStyle w:val="Compact"/>
         <w:numPr>
           <w:ilvl w:val="1"/>
-          <w:numId w:val="1002"/>
+          <w:numId w:val="1003"/>
         </w:numPr>
       </w:pPr>
       <w:r>
@@ -733,7 +781,7 @@
         <w:pStyle w:val="Compact"/>
         <w:numPr>
           <w:ilvl w:val="1"/>
-          <w:numId w:val="1002"/>
+          <w:numId w:val="1003"/>
         </w:numPr>
       </w:pPr>
       <w:r>
@@ -745,7 +793,7 @@
         <w:pStyle w:val="Compact"/>
         <w:numPr>
           <w:ilvl w:val="1"/>
-          <w:numId w:val="1002"/>
+          <w:numId w:val="1003"/>
         </w:numPr>
       </w:pPr>
       <w:r>
@@ -757,7 +805,7 @@
         <w:pStyle w:val="Compact"/>
         <w:numPr>
           <w:ilvl w:val="1"/>
-          <w:numId w:val="1002"/>
+          <w:numId w:val="1003"/>
         </w:numPr>
       </w:pPr>
       <w:r>
@@ -769,7 +817,7 @@
         <w:pStyle w:val="Compact"/>
         <w:numPr>
           <w:ilvl w:val="1"/>
-          <w:numId w:val="1002"/>
+          <w:numId w:val="1003"/>
         </w:numPr>
       </w:pPr>
       <w:r>
@@ -781,7 +829,7 @@
         <w:pStyle w:val="Compact"/>
         <w:numPr>
           <w:ilvl w:val="1"/>
-          <w:numId w:val="1002"/>
+          <w:numId w:val="1003"/>
         </w:numPr>
       </w:pPr>
       <w:r>
@@ -819,7 +867,7 @@
         <w:pStyle w:val="Compact"/>
         <w:numPr>
           <w:ilvl w:val="0"/>
-          <w:numId w:val="1003"/>
+          <w:numId w:val="1004"/>
         </w:numPr>
       </w:pPr>
       <w:r>
@@ -831,7 +879,7 @@
         <w:pStyle w:val="Compact"/>
         <w:numPr>
           <w:ilvl w:val="0"/>
-          <w:numId w:val="1003"/>
+          <w:numId w:val="1004"/>
         </w:numPr>
       </w:pPr>
       <w:r>
@@ -843,7 +891,7 @@
         <w:pStyle w:val="Compact"/>
         <w:numPr>
           <w:ilvl w:val="1"/>
-          <w:numId w:val="1004"/>
+          <w:numId w:val="1005"/>
         </w:numPr>
       </w:pPr>
       <w:r>
@@ -855,7 +903,7 @@
         <w:pStyle w:val="Compact"/>
         <w:numPr>
           <w:ilvl w:val="1"/>
-          <w:numId w:val="1004"/>
+          <w:numId w:val="1005"/>
         </w:numPr>
       </w:pPr>
       <w:r>
@@ -867,7 +915,7 @@
         <w:pStyle w:val="Compact"/>
         <w:numPr>
           <w:ilvl w:val="1"/>
-          <w:numId w:val="1004"/>
+          <w:numId w:val="1005"/>
         </w:numPr>
       </w:pPr>
       <w:r>
@@ -879,7 +927,7 @@
         <w:pStyle w:val="Compact"/>
         <w:numPr>
           <w:ilvl w:val="1"/>
-          <w:numId w:val="1004"/>
+          <w:numId w:val="1005"/>
         </w:numPr>
       </w:pPr>
       <w:r>
@@ -912,208 +960,6 @@
       </w:r>
       <w:r>
         <w:t xml:space="preserve">to population and community ecology under extreme heat (Margie)</w:t>
-      </w:r>
-    </w:p>
-    <w:p>
-      <w:pPr>
-        <w:pStyle w:val="Compact"/>
-        <w:numPr>
-          <w:ilvl w:val="0"/>
-          <w:numId w:val="1005"/>
-        </w:numPr>
-      </w:pPr>
-      <w:r>
-        <w:t xml:space="preserve">How can we link mechanistic physiological models with population and community ecology theory?</w:t>
-      </w:r>
-    </w:p>
-    <w:p>
-      <w:pPr>
-        <w:pStyle w:val="Compact"/>
-        <w:numPr>
-          <w:ilvl w:val="0"/>
-          <w:numId w:val="1005"/>
-        </w:numPr>
-      </w:pPr>
-      <w:r>
-        <w:t xml:space="preserve">Introducing population and network models to link outputs from DEB (survival, reproduction, abundance) to population growth.</w:t>
-      </w:r>
-    </w:p>
-    <w:p>
-      <w:pPr>
-        <w:pStyle w:val="Compact"/>
-        <w:numPr>
-          <w:ilvl w:val="0"/>
-          <w:numId w:val="1005"/>
-        </w:numPr>
-      </w:pPr>
-      <w:r>
-        <w:t xml:space="preserve">How people are analysing communities with network theory. Some important papers</w:t>
-      </w:r>
-      <w:r>
-        <w:t xml:space="preserve"> </w:t>
-      </w:r>
-      <w:r>
-        <w:t xml:space="preserve">[19]</w:t>
-      </w:r>
-      <w:r>
-        <w:t xml:space="preserve"> </w:t>
-      </w:r>
-      <w:r>
-        <w:t xml:space="preserve">[20]</w:t>
-      </w:r>
-      <w:r>
-        <w:t xml:space="preserve"> </w:t>
-      </w:r>
-      <w:r>
-        <w:t xml:space="preserve">[21]</w:t>
-      </w:r>
-      <w:r>
-        <w:t xml:space="preserve"> </w:t>
-      </w:r>
-      <w:r>
-        <w:t xml:space="preserve">[22]</w:t>
-      </w:r>
-      <w:r>
-        <w:t xml:space="preserve"> </w:t>
-      </w:r>
-      <w:r>
-        <w:t xml:space="preserve">[23]</w:t>
-      </w:r>
-      <w:r>
-        <w:t xml:space="preserve"> </w:t>
-      </w:r>
-      <w:r>
-        <w:t xml:space="preserve">[24]</w:t>
-      </w:r>
-      <w:r>
-        <w:t xml:space="preserve"> </w:t>
-      </w:r>
-      <w:r>
-        <w:t xml:space="preserve">[25]</w:t>
-      </w:r>
-      <w:r>
-        <w:t xml:space="preserve"> </w:t>
-      </w:r>
-      <w:r>
-        <w:t xml:space="preserve">Should also look at this book</w:t>
-      </w:r>
-      <w:r>
-        <w:t xml:space="preserve"> </w:t>
-      </w:r>
-      <w:r>
-        <w:t xml:space="preserve">[26]</w:t>
-      </w:r>
-    </w:p>
-    <w:p>
-      <w:pPr>
-        <w:pStyle w:val="Compact"/>
-        <w:numPr>
-          <w:ilvl w:val="0"/>
-          <w:numId w:val="1005"/>
-        </w:numPr>
-      </w:pPr>
-      <w:r>
-        <w:t xml:space="preserve">How can we capture interactions among species within the community to predict how heat stress will affect community structure?</w:t>
-      </w:r>
-    </w:p>
-    <w:p>
-      <w:pPr>
-        <w:pStyle w:val="Compact"/>
-        <w:numPr>
-          <w:ilvl w:val="0"/>
-          <w:numId w:val="1005"/>
-        </w:numPr>
-      </w:pPr>
-      <w:r>
-        <w:t xml:space="preserve">Figure 2: demonstrating how TLS, biophysical and DEB models can be used to predict heat stress impacts on plants and animals, growth, reproduction, survival. (Dan, Margie)</w:t>
-      </w:r>
-    </w:p>
-    <w:p>
-      <w:pPr>
-        <w:pStyle w:val="Compact"/>
-        <w:numPr>
-          <w:ilvl w:val="0"/>
-          <w:numId w:val="1005"/>
-        </w:numPr>
-      </w:pPr>
-      <w:r>
-        <w:t xml:space="preserve">Also this is a cool paper</w:t>
-      </w:r>
-      <w:r>
-        <w:t xml:space="preserve"> </w:t>
-      </w:r>
-      <w:r>
-        <w:t xml:space="preserve">[27]</w:t>
-      </w:r>
-      <w:r>
-        <w:t xml:space="preserve"> </w:t>
-      </w:r>
-      <w:r>
-        <w:t xml:space="preserve">on carnivores diets by DNA sequencing fecal data</w:t>
-      </w:r>
-      <w:r>
-        <w:t xml:space="preserve"> </w:t>
-      </w:r>
-      <w:r>
-        <w:t xml:space="preserve">-The other way to model interactions us using foundational community ecology/ species abundance models see</w:t>
-      </w:r>
-      <w:r>
-        <w:t xml:space="preserve"> </w:t>
-      </w:r>
-      <w:r>
-        <w:t xml:space="preserve">[28]</w:t>
-      </w:r>
-      <w:r>
-        <w:t xml:space="preserve">. We can here model the actual abundance of a given species and it would seem more flexible to incorporate thermal tolerance infor into these models.</w:t>
-      </w:r>
-    </w:p>
-    <w:p>
-      <w:pPr>
-        <w:pStyle w:val="Compact"/>
-        <w:numPr>
-          <w:ilvl w:val="0"/>
-          <w:numId w:val="1005"/>
-        </w:numPr>
-      </w:pPr>
-      <w:r>
-        <w:t xml:space="preserve">have a close look at</w:t>
-      </w:r>
-      <w:r>
-        <w:t xml:space="preserve"> </w:t>
-      </w:r>
-      <w:r>
-        <w:t xml:space="preserve">[29]</w:t>
-      </w:r>
-      <w:r>
-        <w:t xml:space="preserve"> </w:t>
-      </w:r>
-      <w:r>
-        <w:t xml:space="preserve">and</w:t>
-      </w:r>
-      <w:r>
-        <w:t xml:space="preserve"> </w:t>
-      </w:r>
-      <w:r>
-        <w:t xml:space="preserve">[30]</w:t>
-      </w:r>
-      <w:r>
-        <w:t xml:space="preserve">, limitations</w:t>
-      </w:r>
-      <w:r>
-        <w:t xml:space="preserve"> </w:t>
-      </w:r>
-      <w:r>
-        <w:t xml:space="preserve">[31]</w:t>
-      </w:r>
-    </w:p>
-    <w:bookmarkEnd w:id="24"/>
-    <w:bookmarkStart w:id="30" w:name="Xe7540e51cb84d29e47d083817996607ca5f8009"/>
-    <w:p>
-      <w:pPr>
-        <w:pStyle w:val="Heading1"/>
-      </w:pPr>
-      <w:r>
-        <w:t xml:space="preserve">Incorporating context-dependent environmental feedback to evaluate resilience to extreme heat (Brajesh, Brendan, James, Everyone else who wants to contribute)</w:t>
       </w:r>
     </w:p>
     <w:p>
@@ -1125,7 +971,7 @@
         </w:numPr>
       </w:pPr>
       <w:r>
-        <w:t xml:space="preserve">Goal of this section is to briefly focus on the BIOLOGY that will shift thermal exposure and sensitivity in plants and animals.</w:t>
+        <w:t xml:space="preserve">How can we link mechanistic physiological models with population and community ecology theory?</w:t>
       </w:r>
     </w:p>
     <w:p>
@@ -1137,32 +983,7 @@
         </w:numPr>
       </w:pPr>
       <w:r>
-        <w:t xml:space="preserve">I</w:t>
-      </w:r>
-      <w:r>
-        <w:t xml:space="preserve"> </w:t>
-      </w:r>
-      <w:r>
-        <w:rPr>
-          <w:b/>
-          <w:bCs/>
-        </w:rPr>
-        <w:t xml:space="preserve">just</w:t>
-      </w:r>
-      <w:r>
-        <w:t xml:space="preserve"> </w:t>
-      </w:r>
-      <w:r>
-        <w:t xml:space="preserve">found this important paper for which a lot can be gleaned upon. Many of the important things we have been discussing are discussed in here:</w:t>
-      </w:r>
-      <w:r>
-        <w:t xml:space="preserve"> </w:t>
-      </w:r>
-      <w:r>
-        <w:t xml:space="preserve">[7]</w:t>
-      </w:r>
-      <w:r>
-        <w:t xml:space="preserve">, so we should be careful to make our narrative distinct. The limitation of this study is it lacks the focus on modelling frameworks, so I think us distinguishing how we link these concepts back into the model would be quite novel and distinguish ourselves from them..</w:t>
+        <w:t xml:space="preserve">Introducing population and network models to link outputs from DEB (survival, reproduction, abundance) to population growth.</w:t>
       </w:r>
     </w:p>
     <w:p>
@@ -1174,7 +995,61 @@
         </w:numPr>
       </w:pPr>
       <w:r>
-        <w:t xml:space="preserve">Then, we overlay briefly how we might capture that in the modelling framework we setup above. For example, you all write the biology and we then need to think about how we can adjust models to capture these nuances.</w:t>
+        <w:t xml:space="preserve">How people are analysing communities with network theory. Some important papers</w:t>
+      </w:r>
+      <w:r>
+        <w:t xml:space="preserve"> </w:t>
+      </w:r>
+      <w:r>
+        <w:t xml:space="preserve">[22]</w:t>
+      </w:r>
+      <w:r>
+        <w:t xml:space="preserve"> </w:t>
+      </w:r>
+      <w:r>
+        <w:t xml:space="preserve">[23]</w:t>
+      </w:r>
+      <w:r>
+        <w:t xml:space="preserve"> </w:t>
+      </w:r>
+      <w:r>
+        <w:t xml:space="preserve">[24]</w:t>
+      </w:r>
+      <w:r>
+        <w:t xml:space="preserve"> </w:t>
+      </w:r>
+      <w:r>
+        <w:t xml:space="preserve">[25]</w:t>
+      </w:r>
+      <w:r>
+        <w:t xml:space="preserve"> </w:t>
+      </w:r>
+      <w:r>
+        <w:t xml:space="preserve">[26]</w:t>
+      </w:r>
+      <w:r>
+        <w:t xml:space="preserve"> </w:t>
+      </w:r>
+      <w:r>
+        <w:t xml:space="preserve">[27]</w:t>
+      </w:r>
+      <w:r>
+        <w:t xml:space="preserve"> </w:t>
+      </w:r>
+      <w:r>
+        <w:t xml:space="preserve">[28]</w:t>
+      </w:r>
+      <w:r>
+        <w:t xml:space="preserve"> </w:t>
+      </w:r>
+      <w:r>
+        <w:t xml:space="preserve">Should also look at this book</w:t>
+      </w:r>
+      <w:r>
+        <w:t xml:space="preserve"> </w:t>
+      </w:r>
+      <w:r>
+        <w:t xml:space="preserve">[29]</w:t>
       </w:r>
     </w:p>
     <w:p>
@@ -1186,16 +1061,107 @@
         </w:numPr>
       </w:pPr>
       <w:r>
-        <w:t xml:space="preserve">If uncertain about adding a sentence to the link to the models above, that’s ok, Dan, Mike, Margie and Belinda can add.</w:t>
-      </w:r>
-    </w:p>
-    <w:bookmarkStart w:id="25" w:name="X1b136e3eae891c477bc728d2597e572ca649eaa"/>
-    <w:p>
-      <w:pPr>
-        <w:pStyle w:val="Heading3"/>
-      </w:pPr>
-      <w:r>
-        <w:t xml:space="preserve">Microbial communities can impact thermal sensitivity in plants and animals (Brajesh)</w:t>
+        <w:t xml:space="preserve">How can we capture interactions among species within the community to predict how heat stress will affect community structure?</w:t>
+      </w:r>
+    </w:p>
+    <w:p>
+      <w:pPr>
+        <w:pStyle w:val="Compact"/>
+        <w:numPr>
+          <w:ilvl w:val="0"/>
+          <w:numId w:val="1006"/>
+        </w:numPr>
+      </w:pPr>
+      <w:r>
+        <w:t xml:space="preserve">Figure 2: demonstrating how TLS, biophysical and DEB models can be used to predict heat stress impacts on plants and animals, growth, reproduction, survival. (Dan, Margie)</w:t>
+      </w:r>
+    </w:p>
+    <w:p>
+      <w:pPr>
+        <w:pStyle w:val="Compact"/>
+        <w:numPr>
+          <w:ilvl w:val="0"/>
+          <w:numId w:val="1006"/>
+        </w:numPr>
+      </w:pPr>
+      <w:r>
+        <w:t xml:space="preserve">Also this is a cool paper</w:t>
+      </w:r>
+      <w:r>
+        <w:t xml:space="preserve"> </w:t>
+      </w:r>
+      <w:r>
+        <w:t xml:space="preserve">[30]</w:t>
+      </w:r>
+      <w:r>
+        <w:t xml:space="preserve"> </w:t>
+      </w:r>
+      <w:r>
+        <w:t xml:space="preserve">on carnivores diets by DNA sequencing fecal data</w:t>
+      </w:r>
+      <w:r>
+        <w:t xml:space="preserve"> </w:t>
+      </w:r>
+      <w:r>
+        <w:t xml:space="preserve">-The other way to model interactions us using foundational community ecology/ species abundance models see</w:t>
+      </w:r>
+      <w:r>
+        <w:t xml:space="preserve"> </w:t>
+      </w:r>
+      <w:r>
+        <w:t xml:space="preserve">[31]</w:t>
+      </w:r>
+      <w:r>
+        <w:t xml:space="preserve">. We can here model the actual abundance of a given species and it would seem more flexible to incorporate thermal tolerance infor into these models.</w:t>
+      </w:r>
+    </w:p>
+    <w:p>
+      <w:pPr>
+        <w:pStyle w:val="Compact"/>
+        <w:numPr>
+          <w:ilvl w:val="0"/>
+          <w:numId w:val="1006"/>
+        </w:numPr>
+      </w:pPr>
+      <w:r>
+        <w:t xml:space="preserve">have a close look at</w:t>
+      </w:r>
+      <w:r>
+        <w:t xml:space="preserve"> </w:t>
+      </w:r>
+      <w:r>
+        <w:t xml:space="preserve">[32]</w:t>
+      </w:r>
+      <w:r>
+        <w:t xml:space="preserve"> </w:t>
+      </w:r>
+      <w:r>
+        <w:t xml:space="preserve">and</w:t>
+      </w:r>
+      <w:r>
+        <w:t xml:space="preserve"> </w:t>
+      </w:r>
+      <w:r>
+        <w:t xml:space="preserve">[33]</w:t>
+      </w:r>
+      <w:r>
+        <w:t xml:space="preserve">, limitations</w:t>
+      </w:r>
+      <w:r>
+        <w:t xml:space="preserve"> </w:t>
+      </w:r>
+      <w:r>
+        <w:t xml:space="preserve">[34]</w:t>
+      </w:r>
+    </w:p>
+    <w:bookmarkEnd w:id="24"/>
+    <w:bookmarkStart w:id="30" w:name="Xe7540e51cb84d29e47d083817996607ca5f8009"/>
+    <w:p>
+      <w:pPr>
+        <w:pStyle w:val="Heading1"/>
+      </w:pPr>
+      <w:r>
+        <w:t xml:space="preserve">Incorporating context-dependent environmental feedback to evaluate resilience to extreme heat (Brajesh, Brendan, James, Everyone else who wants to contribute)</w:t>
       </w:r>
     </w:p>
     <w:p>
@@ -1207,6 +1173,88 @@
         </w:numPr>
       </w:pPr>
       <w:r>
+        <w:t xml:space="preserve">Goal of this section is to briefly focus on the BIOLOGY that will shift thermal exposure and sensitivity in plants and animals.</w:t>
+      </w:r>
+    </w:p>
+    <w:p>
+      <w:pPr>
+        <w:pStyle w:val="Compact"/>
+        <w:numPr>
+          <w:ilvl w:val="0"/>
+          <w:numId w:val="1007"/>
+        </w:numPr>
+      </w:pPr>
+      <w:r>
+        <w:t xml:space="preserve">I</w:t>
+      </w:r>
+      <w:r>
+        <w:t xml:space="preserve"> </w:t>
+      </w:r>
+      <w:r>
+        <w:rPr>
+          <w:b/>
+          <w:bCs/>
+        </w:rPr>
+        <w:t xml:space="preserve">just</w:t>
+      </w:r>
+      <w:r>
+        <w:t xml:space="preserve"> </w:t>
+      </w:r>
+      <w:r>
+        <w:t xml:space="preserve">found this important paper for which a lot can be gleaned upon. Many of the important things we have been discussing are discussed in here:</w:t>
+      </w:r>
+      <w:r>
+        <w:t xml:space="preserve"> </w:t>
+      </w:r>
+      <w:r>
+        <w:t xml:space="preserve">[10]</w:t>
+      </w:r>
+      <w:r>
+        <w:t xml:space="preserve">, so we should be careful to make our narrative distinct. The limitation of this study is it lacks the focus on modelling frameworks, so I think us distinguishing how we link these concepts back into the model would be quite novel and distinguish ourselves from them..</w:t>
+      </w:r>
+    </w:p>
+    <w:p>
+      <w:pPr>
+        <w:pStyle w:val="Compact"/>
+        <w:numPr>
+          <w:ilvl w:val="0"/>
+          <w:numId w:val="1007"/>
+        </w:numPr>
+      </w:pPr>
+      <w:r>
+        <w:t xml:space="preserve">Then, we overlay briefly how we might capture that in the modelling framework we setup above. For example, you all write the biology and we then need to think about how we can adjust models to capture these nuances.</w:t>
+      </w:r>
+    </w:p>
+    <w:p>
+      <w:pPr>
+        <w:pStyle w:val="Compact"/>
+        <w:numPr>
+          <w:ilvl w:val="0"/>
+          <w:numId w:val="1007"/>
+        </w:numPr>
+      </w:pPr>
+      <w:r>
+        <w:t xml:space="preserve">If uncertain about adding a sentence to the link to the models above, that’s ok, Dan, Mike, Margie and Belinda can add.</w:t>
+      </w:r>
+    </w:p>
+    <w:bookmarkStart w:id="25" w:name="X1b136e3eae891c477bc728d2597e572ca649eaa"/>
+    <w:p>
+      <w:pPr>
+        <w:pStyle w:val="Heading3"/>
+      </w:pPr>
+      <w:r>
+        <w:t xml:space="preserve">Microbial communities can impact thermal sensitivity in plants and animals (Brajesh)</w:t>
+      </w:r>
+    </w:p>
+    <w:p>
+      <w:pPr>
+        <w:pStyle w:val="Compact"/>
+        <w:numPr>
+          <w:ilvl w:val="0"/>
+          <w:numId w:val="1008"/>
+        </w:numPr>
+      </w:pPr>
+      <w:r>
         <w:t xml:space="preserve">Here’s some text of a cool example I had written up. Feel free to use Braj or shift completely if you’d like.</w:t>
       </w:r>
       <w:r>
@@ -1229,7 +1277,7 @@
         <w:t xml:space="preserve"> </w:t>
       </w:r>
       <w:r>
-        <w:t xml:space="preserve">[32]</w:t>
+        <w:t xml:space="preserve">[35]</w:t>
       </w:r>
       <w:r>
         <w:t xml:space="preserve"> </w:t>
@@ -1312,7 +1360,7 @@
         <w:pStyle w:val="Compact"/>
         <w:numPr>
           <w:ilvl w:val="0"/>
-          <w:numId w:val="1007"/>
+          <w:numId w:val="1008"/>
         </w:numPr>
       </w:pPr>
       <w:r>
@@ -1322,7 +1370,7 @@
         <w:t xml:space="preserve"> </w:t>
       </w:r>
       <w:r>
-        <w:t xml:space="preserve">[33]</w:t>
+        <w:t xml:space="preserve">[36]</w:t>
       </w:r>
       <w:r>
         <w:t xml:space="preserve">. The paper provides a framework for modelling soil plant interactions</w:t>
@@ -1346,132 +1394,6 @@
       </w:pPr>
       <w:r>
         <w:t xml:space="preserve">Competition can impact thermal sensitivity of plants and animals (James? Feel free to add a different section title here.)</w:t>
-      </w:r>
-    </w:p>
-    <w:p>
-      <w:pPr>
-        <w:pStyle w:val="Compact"/>
-        <w:numPr>
-          <w:ilvl w:val="0"/>
-          <w:numId w:val="1008"/>
-        </w:numPr>
-      </w:pPr>
-      <w:r>
-        <w:t xml:space="preserve">James. Added some text around a few examples below. Feel fre eto use/integrate or completely throw away. Or, we can move some of this into other sections.</w:t>
-      </w:r>
-      <w:r>
-        <w:t xml:space="preserve"> </w:t>
-      </w:r>
-      <w:r>
-        <w:t xml:space="preserve">Competition among species within a community can influence a focal species’ tolerance to heat stress. Competition can influence microhabitat selection and the availability of thermal refugia which can protect against thermal extremes, the diet of a focal species that can indirectly influence physiological tolerance of temperature stress, and the availability of resources that can help buffer against heat stress. For example, Li</w:t>
-      </w:r>
-      <w:r>
-        <w:t xml:space="preserve"> </w:t>
-      </w:r>
-      <w:r>
-        <w:rPr>
-          <w:i/>
-          <w:iCs/>
-        </w:rPr>
-        <w:t xml:space="preserve">et al.</w:t>
-      </w:r>
-      <w:r>
-        <w:t xml:space="preserve"> </w:t>
-      </w:r>
-      <w:r>
-        <w:t xml:space="preserve">[34]</w:t>
-      </w:r>
-      <w:r>
-        <w:t xml:space="preserve"> </w:t>
-      </w:r>
-      <w:r>
-        <w:t xml:space="preserve">measured the thermal tolerance landscape for three aphid species that are pests for cereal crops globally to understand whether they could predict changes in community abundance. Using a thermal death time (TDT) approach to estimate the cumulative impacts of heat stress on survival they found that one species,</w:t>
-      </w:r>
-      <w:r>
-        <w:t xml:space="preserve"> </w:t>
-      </w:r>
-      <w:r>
-        <w:rPr>
-          <w:i/>
-          <w:iCs/>
-        </w:rPr>
-        <w:t xml:space="preserve">Rhopalosiphum padi</w:t>
-      </w:r>
-      <w:r>
-        <w:t xml:space="preserve">, showed high heat tolerance and accumulated less injury over natural temperature fluctuations. The ability to maintain high relative abundance in the face of extreme heat may allow this species to outcompete other aphids explaining why it dominates in southern parts of its range.</w:t>
-      </w:r>
-    </w:p>
-    <w:p>
-      <w:pPr>
-        <w:pStyle w:val="FirstParagraph"/>
-      </w:pPr>
-      <w:r>
-        <w:t xml:space="preserve">Li</w:t>
-      </w:r>
-      <w:r>
-        <w:t xml:space="preserve"> </w:t>
-      </w:r>
-      <w:r>
-        <w:rPr>
-          <w:i/>
-          <w:iCs/>
-        </w:rPr>
-        <w:t xml:space="preserve">et al.</w:t>
-      </w:r>
-      <w:r>
-        <w:t xml:space="preserve"> </w:t>
-      </w:r>
-      <w:r>
-        <w:t xml:space="preserve">[34]</w:t>
-      </w:r>
-      <w:r>
-        <w:t xml:space="preserve"> </w:t>
-      </w:r>
-      <w:r>
-        <w:t xml:space="preserve">also found that different life-stages were affected differently by heat stress, with adults being more thermally tolerant than early developmental stages emphasising the need for models to capture such variation. However, such findings do not incorporate acclimation to heat stress or different microhabitat choice by the different species, which are both likely to be important for predicting the impacts of heat stress on community structure. It also ignores how interspecific interactions between competing aphid species will also likely mediate species abundance. It would be worth while integrating thermal tolerance landscapes with ecological models that capture interspecific interactions to better predict how heat stress will affect community structure.</w:t>
-      </w:r>
-    </w:p>
-    <w:bookmarkEnd w:id="27"/>
-    <w:bookmarkStart w:id="28" w:name="Xdbc91e02dcd505372e716f3d2147fb46ffba4bf"/>
-    <w:p>
-      <w:pPr>
-        <w:pStyle w:val="Heading3"/>
-      </w:pPr>
-      <w:r>
-        <w:t xml:space="preserve">Acclimation can impact thermal sensitivity of plants and animals (Everyone)</w:t>
-      </w:r>
-    </w:p>
-    <w:bookmarkEnd w:id="28"/>
-    <w:bookmarkStart w:id="29" w:name="X1f820984f57b727edc20965138ee13069f96c01"/>
-    <w:p>
-      <w:pPr>
-        <w:pStyle w:val="Heading3"/>
-      </w:pPr>
-      <w:r>
-        <w:t xml:space="preserve">Phenology and activity pattern shifts mediating interactions (James?)</w:t>
-      </w:r>
-    </w:p>
-    <w:bookmarkEnd w:id="29"/>
-    <w:bookmarkEnd w:id="30"/>
-    <w:bookmarkStart w:id="31" w:name="X42ca7aa69937316dee7b1e100d4320aa777518f"/>
-    <w:p>
-      <w:pPr>
-        <w:pStyle w:val="Heading1"/>
-      </w:pPr>
-      <w:r>
-        <w:t xml:space="preserve">‘</w:t>
-      </w:r>
-      <w:r>
-        <w:t xml:space="preserve">Hot</w:t>
-      </w:r>
-      <w:r>
-        <w:t xml:space="preserve">’</w:t>
-      </w:r>
-      <w:r>
-        <w:t xml:space="preserve"> </w:t>
-      </w:r>
-      <w:r>
-        <w:t xml:space="preserve">solutions for a changing world (Alison, Owen and Belinda, Mike)</w:t>
       </w:r>
     </w:p>
     <w:p>
@@ -1483,7 +1405,121 @@
         </w:numPr>
       </w:pPr>
       <w:r>
-        <w:t xml:space="preserve">Here, we bring in what we can do with these models, I think we highlight some of the key elements of the solutions strand ideas where we can apply the models in the agricultural and natural space.</w:t>
+        <w:t xml:space="preserve">James. Added some text around a few examples below. Feel fre eto use/integrate or completely throw away. Or, we can move some of this into other sections.</w:t>
+      </w:r>
+      <w:r>
+        <w:t xml:space="preserve"> </w:t>
+      </w:r>
+      <w:r>
+        <w:t xml:space="preserve">Competition among species within a community can influence a focal species’ tolerance to heat stress. Competition can influence microhabitat selection and the availability of thermal refugia which can protect against thermal extremes, the diet of a focal species that can indirectly influence physiological tolerance of temperature stress, and the availability of resources that can help buffer against heat stress. For example, Li</w:t>
+      </w:r>
+      <w:r>
+        <w:t xml:space="preserve"> </w:t>
+      </w:r>
+      <w:r>
+        <w:rPr>
+          <w:i/>
+          <w:iCs/>
+        </w:rPr>
+        <w:t xml:space="preserve">et al.</w:t>
+      </w:r>
+      <w:r>
+        <w:t xml:space="preserve"> </w:t>
+      </w:r>
+      <w:r>
+        <w:t xml:space="preserve">[37]</w:t>
+      </w:r>
+      <w:r>
+        <w:t xml:space="preserve"> </w:t>
+      </w:r>
+      <w:r>
+        <w:t xml:space="preserve">measured the thermal tolerance landscape for three aphid species that are pests for cereal crops globally to understand whether they could predict changes in community abundance. Using a thermal death time (TDT) approach to estimate the cumulative impacts of heat stress on survival they found that one species,</w:t>
+      </w:r>
+      <w:r>
+        <w:t xml:space="preserve"> </w:t>
+      </w:r>
+      <w:r>
+        <w:rPr>
+          <w:i/>
+          <w:iCs/>
+        </w:rPr>
+        <w:t xml:space="preserve">Rhopalosiphum padi</w:t>
+      </w:r>
+      <w:r>
+        <w:t xml:space="preserve">, showed high heat tolerance and accumulated less injury over natural temperature fluctuations. The ability to maintain high relative abundance in the face of extreme heat may allow this species to outcompete other aphids explaining why it dominates in southern parts of its range.</w:t>
+      </w:r>
+    </w:p>
+    <w:p>
+      <w:pPr>
+        <w:pStyle w:val="FirstParagraph"/>
+      </w:pPr>
+      <w:r>
+        <w:t xml:space="preserve">Li</w:t>
+      </w:r>
+      <w:r>
+        <w:t xml:space="preserve"> </w:t>
+      </w:r>
+      <w:r>
+        <w:rPr>
+          <w:i/>
+          <w:iCs/>
+        </w:rPr>
+        <w:t xml:space="preserve">et al.</w:t>
+      </w:r>
+      <w:r>
+        <w:t xml:space="preserve"> </w:t>
+      </w:r>
+      <w:r>
+        <w:t xml:space="preserve">[37]</w:t>
+      </w:r>
+      <w:r>
+        <w:t xml:space="preserve"> </w:t>
+      </w:r>
+      <w:r>
+        <w:t xml:space="preserve">also found that different life-stages were affected differently by heat stress, with adults being more thermally tolerant than early developmental stages emphasising the need for models to capture such variation. However, such findings do not incorporate acclimation to heat stress or different microhabitat choice by the different species, which are both likely to be important for predicting the impacts of heat stress on community structure. It also ignores how interspecific interactions between competing aphid species will also likely mediate species abundance. It would be worth while integrating thermal tolerance landscapes with ecological models that capture interspecific interactions to better predict how heat stress will affect community structure.</w:t>
+      </w:r>
+    </w:p>
+    <w:bookmarkEnd w:id="27"/>
+    <w:bookmarkStart w:id="28" w:name="Xdbc91e02dcd505372e716f3d2147fb46ffba4bf"/>
+    <w:p>
+      <w:pPr>
+        <w:pStyle w:val="Heading3"/>
+      </w:pPr>
+      <w:r>
+        <w:t xml:space="preserve">Acclimation can impact thermal sensitivity of plants and animals (Everyone)</w:t>
+      </w:r>
+    </w:p>
+    <w:bookmarkEnd w:id="28"/>
+    <w:bookmarkStart w:id="29" w:name="X1f820984f57b727edc20965138ee13069f96c01"/>
+    <w:p>
+      <w:pPr>
+        <w:pStyle w:val="Heading3"/>
+      </w:pPr>
+      <w:r>
+        <w:t xml:space="preserve">Phenology and activity pattern shifts mediating interactions (James?)</w:t>
+      </w:r>
+    </w:p>
+    <w:bookmarkEnd w:id="29"/>
+    <w:bookmarkEnd w:id="30"/>
+    <w:bookmarkStart w:id="31" w:name="X42ca7aa69937316dee7b1e100d4320aa777518f"/>
+    <w:p>
+      <w:pPr>
+        <w:pStyle w:val="Heading1"/>
+      </w:pPr>
+      <w:r>
+        <w:t xml:space="preserve">‘</w:t>
+      </w:r>
+      <w:r>
+        <w:t xml:space="preserve">Hot</w:t>
+      </w:r>
+      <w:r>
+        <w:t xml:space="preserve">’</w:t>
+      </w:r>
+      <w:r>
+        <w:t xml:space="preserve"> </w:t>
+      </w:r>
+      <w:r>
+        <w:t xml:space="preserve">solutions for a changing world (Alison, Owen and Belinda, Mike)</w:t>
       </w:r>
     </w:p>
     <w:p>
@@ -1491,51 +1527,11 @@
         <w:pStyle w:val="Compact"/>
         <w:numPr>
           <w:ilvl w:val="0"/>
-          <w:numId w:val="1009"/>
-        </w:numPr>
-      </w:pPr>
-      <w:r>
-        <w:t xml:space="preserve">Enhancing resilience</w:t>
-      </w:r>
-      <w:r>
-        <w:t xml:space="preserve"> </w:t>
-      </w:r>
-      <w:r>
-        <w:t xml:space="preserve">-</w:t>
-      </w:r>
-      <w:r>
-        <w:rPr>
-          <w:i/>
-          <w:iCs/>
-        </w:rPr>
-        <w:t xml:space="preserve">Selective breeding</w:t>
-      </w:r>
-      <w:r>
-        <w:t xml:space="preserve">: Artificial selection will be a useful avenue for both plants and animals to enhance thermal tolerance. Models can help evaluate how changes in sensitivity can cascade to influence community structure and function (Alison, Owen, Dani, Others)</w:t>
-      </w:r>
-    </w:p>
-    <w:p>
-      <w:pPr>
-        <w:pStyle w:val="Compact"/>
-        <w:numPr>
-          <w:ilvl w:val="1"/>
           <w:numId w:val="1010"/>
         </w:numPr>
       </w:pPr>
       <w:r>
-        <w:t xml:space="preserve">Microbial recruitment (Braj)</w:t>
-      </w:r>
-    </w:p>
-    <w:p>
-      <w:pPr>
-        <w:pStyle w:val="Compact"/>
-        <w:numPr>
-          <w:ilvl w:val="1"/>
-          <w:numId w:val="1010"/>
-        </w:numPr>
-      </w:pPr>
-      <w:r>
-        <w:t xml:space="preserve">Pollinator services (James, Margie)</w:t>
+        <w:t xml:space="preserve">Here, we bring in what we can do with these models, I think we highlight some of the key elements of the solutions strand ideas where we can apply the models in the agricultural and natural space.</w:t>
       </w:r>
     </w:p>
     <w:p>
@@ -1543,11 +1539,27 @@
         <w:pStyle w:val="Compact"/>
         <w:numPr>
           <w:ilvl w:val="0"/>
-          <w:numId w:val="1009"/>
+          <w:numId w:val="1010"/>
         </w:numPr>
       </w:pPr>
       <w:r>
-        <w:t xml:space="preserve">Cooler landscapes</w:t>
+        <w:t xml:space="preserve">Enhancing resilience</w:t>
+      </w:r>
+      <w:r>
+        <w:t xml:space="preserve"> </w:t>
+      </w:r>
+      <w:r>
+        <w:t xml:space="preserve">-</w:t>
+      </w:r>
+      <w:r>
+        <w:rPr>
+          <w:i/>
+          <w:iCs/>
+        </w:rPr>
+        <w:t xml:space="preserve">Selective breeding</w:t>
+      </w:r>
+      <w:r>
+        <w:t xml:space="preserve">: Artificial selection will be a useful avenue for both plants and animals to enhance thermal tolerance. Models can help evaluate how changes in sensitivity can cascade to influence community structure and function (Alison, Owen, Dani, Others)</w:t>
       </w:r>
     </w:p>
     <w:p>
@@ -1559,14 +1571,19 @@
         </w:numPr>
       </w:pPr>
       <w:r>
-        <w:rPr>
-          <w:i/>
-          <w:iCs/>
-        </w:rPr>
-        <w:t xml:space="preserve">Cooler landscapes</w:t>
-      </w:r>
-      <w:r>
-        <w:t xml:space="preserve">: Landscapes can be designed to provide thermal refugia for plants and animals. For example, planting trees in urban areas can provide shade and reduce the urban heat island effect. Similarly, planting hedgerows in agricultural landscapes can provide thermal refugia for beneficial insects and pollinators. (Mike, Belinda)</w:t>
+        <w:t xml:space="preserve">Microbial recruitment (Braj)</w:t>
+      </w:r>
+    </w:p>
+    <w:p>
+      <w:pPr>
+        <w:pStyle w:val="Compact"/>
+        <w:numPr>
+          <w:ilvl w:val="1"/>
+          <w:numId w:val="1011"/>
+        </w:numPr>
+      </w:pPr>
+      <w:r>
+        <w:t xml:space="preserve">Pollinator services (James, Margie)</w:t>
       </w:r>
     </w:p>
     <w:p>
@@ -1574,11 +1591,30 @@
         <w:pStyle w:val="Compact"/>
         <w:numPr>
           <w:ilvl w:val="0"/>
-          <w:numId w:val="1009"/>
+          <w:numId w:val="1010"/>
         </w:numPr>
       </w:pPr>
       <w:r>
-        <w:t xml:space="preserve">Pest and disease prediction and control. (Ary)</w:t>
+        <w:t xml:space="preserve">Cooler landscapes</w:t>
+      </w:r>
+    </w:p>
+    <w:p>
+      <w:pPr>
+        <w:pStyle w:val="Compact"/>
+        <w:numPr>
+          <w:ilvl w:val="1"/>
+          <w:numId w:val="1012"/>
+        </w:numPr>
+      </w:pPr>
+      <w:r>
+        <w:rPr>
+          <w:i/>
+          <w:iCs/>
+        </w:rPr>
+        <w:t xml:space="preserve">Cooler landscapes</w:t>
+      </w:r>
+      <w:r>
+        <w:t xml:space="preserve">: Landscapes can be designed to provide thermal refugia for plants and animals. For example, planting trees in urban areas can provide shade and reduce the urban heat island effect. Similarly, planting hedgerows in agricultural landscapes can provide thermal refugia for beneficial insects and pollinators. (Mike, Belinda)</w:t>
       </w:r>
     </w:p>
     <w:p>
@@ -1586,7 +1622,19 @@
         <w:pStyle w:val="Compact"/>
         <w:numPr>
           <w:ilvl w:val="0"/>
-          <w:numId w:val="1009"/>
+          <w:numId w:val="1010"/>
+        </w:numPr>
+      </w:pPr>
+      <w:r>
+        <w:t xml:space="preserve">Pest and disease prediction and control. (Ary)</w:t>
+      </w:r>
+    </w:p>
+    <w:p>
+      <w:pPr>
+        <w:pStyle w:val="Compact"/>
+        <w:numPr>
+          <w:ilvl w:val="0"/>
+          <w:numId w:val="1010"/>
         </w:numPr>
       </w:pPr>
       <w:r>
@@ -1673,7 +1721,7 @@
         <w:t xml:space="preserve"> </w:t>
       </w:r>
       <w:r>
-        <w:t xml:space="preserve">[35]</w:t>
+        <w:t xml:space="preserve">[38]</w:t>
       </w:r>
       <w:r>
         <w:t xml:space="preserve"> </w:t>
@@ -1701,7 +1749,7 @@
     </w:p>
     <w:bookmarkEnd w:id="36"/>
     <w:bookmarkEnd w:id="37"/>
-    <w:bookmarkStart w:id="74" w:name="references"/>
+    <w:bookmarkStart w:id="77" w:name="references"/>
     <w:p>
       <w:pPr>
         <w:pStyle w:val="Heading1"/>
@@ -1710,7 +1758,7 @@
         <w:t xml:space="preserve">References</w:t>
       </w:r>
     </w:p>
-    <w:bookmarkStart w:id="73" w:name="refs"/>
+    <w:bookmarkStart w:id="76" w:name="refs"/>
     <w:bookmarkStart w:id="38" w:name="ref-barriopedro2023heat"/>
     <w:p>
       <w:pPr>
@@ -1810,7 +1858,7 @@
       </w:r>
     </w:p>
     <w:bookmarkEnd w:id="39"/>
-    <w:bookmarkStart w:id="40" w:name="ref-kazenel2024heat"/>
+    <w:bookmarkStart w:id="40" w:name="ref-reichstein2007reduction"/>
     <w:p>
       <w:pPr>
         <w:pStyle w:val="Bibliography"/>
@@ -1825,6 +1873,108 @@
         <w:t xml:space="preserve">	</w:t>
       </w:r>
       <w:r>
+        <w:t xml:space="preserve">Reichstein, M.</w:t>
+      </w:r>
+      <w:r>
+        <w:t xml:space="preserve"> </w:t>
+      </w:r>
+      <w:r>
+        <w:rPr>
+          <w:i/>
+          <w:iCs/>
+        </w:rPr>
+        <w:t xml:space="preserve">et al.</w:t>
+      </w:r>
+      <w:r>
+        <w:t xml:space="preserve"> </w:t>
+      </w:r>
+      <w:r>
+        <w:t xml:space="preserve">(2007) Reduction of ecosystem productivity and respiration during the european summer 2003 climate anomaly: A joint flux tower, remote sensing and modelling analysis.</w:t>
+      </w:r>
+      <w:r>
+        <w:t xml:space="preserve"> </w:t>
+      </w:r>
+      <w:r>
+        <w:rPr>
+          <w:i/>
+          <w:iCs/>
+        </w:rPr>
+        <w:t xml:space="preserve">Global Change Biology</w:t>
+      </w:r>
+      <w:r>
+        <w:t xml:space="preserve"> </w:t>
+      </w:r>
+      <w:r>
+        <w:t xml:space="preserve">13, 634–651</w:t>
+      </w:r>
+    </w:p>
+    <w:bookmarkEnd w:id="40"/>
+    <w:bookmarkStart w:id="41" w:name="ref-margalef2020relationship"/>
+    <w:p>
+      <w:pPr>
+        <w:pStyle w:val="Bibliography"/>
+      </w:pPr>
+      <w:r>
+        <w:t xml:space="preserve">4.</w:t>
+      </w:r>
+      <w:r>
+        <w:t xml:space="preserve"> </w:t>
+      </w:r>
+      <w:r>
+        <w:t xml:space="preserve">	</w:t>
+      </w:r>
+      <w:r>
+        <w:t xml:space="preserve">Margalef-Marrase, J.</w:t>
+      </w:r>
+      <w:r>
+        <w:t xml:space="preserve"> </w:t>
+      </w:r>
+      <w:r>
+        <w:rPr>
+          <w:i/>
+          <w:iCs/>
+        </w:rPr>
+        <w:t xml:space="preserve">et al.</w:t>
+      </w:r>
+      <w:r>
+        <w:t xml:space="preserve"> </w:t>
+      </w:r>
+      <w:r>
+        <w:t xml:space="preserve">(2020) Relationship between heatwave-induced forest die-off and climatic suitability in multiple tree species.</w:t>
+      </w:r>
+      <w:r>
+        <w:t xml:space="preserve"> </w:t>
+      </w:r>
+      <w:r>
+        <w:rPr>
+          <w:i/>
+          <w:iCs/>
+        </w:rPr>
+        <w:t xml:space="preserve">Global Change Biology</w:t>
+      </w:r>
+      <w:r>
+        <w:t xml:space="preserve"> </w:t>
+      </w:r>
+      <w:r>
+        <w:t xml:space="preserve">26, 3134–3146</w:t>
+      </w:r>
+    </w:p>
+    <w:bookmarkEnd w:id="41"/>
+    <w:bookmarkStart w:id="42" w:name="ref-kazenel2024heat"/>
+    <w:p>
+      <w:pPr>
+        <w:pStyle w:val="Bibliography"/>
+      </w:pPr>
+      <w:r>
+        <w:t xml:space="preserve">5.</w:t>
+      </w:r>
+      <w:r>
+        <w:t xml:space="preserve"> </w:t>
+      </w:r>
+      <w:r>
+        <w:t xml:space="preserve">	</w:t>
+      </w:r>
+      <w:r>
         <w:t xml:space="preserve">Kazenel, M.R.</w:t>
       </w:r>
       <w:r>
@@ -1854,14 +2004,14 @@
         <w:t xml:space="preserve">Nature</w:t>
       </w:r>
     </w:p>
-    <w:bookmarkEnd w:id="40"/>
-    <w:bookmarkStart w:id="41" w:name="ref-zhao2017temperature"/>
+    <w:bookmarkEnd w:id="42"/>
+    <w:bookmarkStart w:id="43" w:name="ref-zhao2017temperature"/>
     <w:p>
       <w:pPr>
         <w:pStyle w:val="Bibliography"/>
       </w:pPr>
       <w:r>
-        <w:t xml:space="preserve">4.</w:t>
+        <w:t xml:space="preserve">6.</w:t>
       </w:r>
       <w:r>
         <w:t xml:space="preserve"> </w:t>
@@ -1905,14 +2055,14 @@
         <w:t xml:space="preserve">114, 9326–9331</w:t>
       </w:r>
     </w:p>
-    <w:bookmarkEnd w:id="41"/>
-    <w:bookmarkStart w:id="42" w:name="ref-tito2018global"/>
+    <w:bookmarkEnd w:id="43"/>
+    <w:bookmarkStart w:id="44" w:name="ref-tito2018global"/>
     <w:p>
       <w:pPr>
         <w:pStyle w:val="Bibliography"/>
       </w:pPr>
       <w:r>
-        <w:t xml:space="preserve">5.</w:t>
+        <w:t xml:space="preserve">7.</w:t>
       </w:r>
       <w:r>
         <w:t xml:space="preserve"> </w:t>
@@ -1956,14 +2106,14 @@
         <w:t xml:space="preserve">24, e592–e602</w:t>
       </w:r>
     </w:p>
-    <w:bookmarkEnd w:id="42"/>
-    <w:bookmarkStart w:id="43" w:name="ref-hesketh2023extreme"/>
+    <w:bookmarkEnd w:id="44"/>
+    <w:bookmarkStart w:id="45" w:name="ref-bastos2014analysing"/>
     <w:p>
       <w:pPr>
         <w:pStyle w:val="Bibliography"/>
       </w:pPr>
       <w:r>
-        <w:t xml:space="preserve">6.</w:t>
+        <w:t xml:space="preserve">8.</w:t>
       </w:r>
       <w:r>
         <w:t xml:space="preserve"> </w:t>
@@ -1972,6 +2122,57 @@
         <w:t xml:space="preserve">	</w:t>
       </w:r>
       <w:r>
+        <w:t xml:space="preserve">Bastos, A.</w:t>
+      </w:r>
+      <w:r>
+        <w:t xml:space="preserve"> </w:t>
+      </w:r>
+      <w:r>
+        <w:rPr>
+          <w:i/>
+          <w:iCs/>
+        </w:rPr>
+        <w:t xml:space="preserve">et al.</w:t>
+      </w:r>
+      <w:r>
+        <w:t xml:space="preserve"> </w:t>
+      </w:r>
+      <w:r>
+        <w:t xml:space="preserve">(2014) Analysing the spatio-temporal impacts of the 2003 and 2010 extreme heatwaves on plant productivity in europe.</w:t>
+      </w:r>
+      <w:r>
+        <w:t xml:space="preserve"> </w:t>
+      </w:r>
+      <w:r>
+        <w:rPr>
+          <w:i/>
+          <w:iCs/>
+        </w:rPr>
+        <w:t xml:space="preserve">Biogeosciences</w:t>
+      </w:r>
+      <w:r>
+        <w:t xml:space="preserve"> </w:t>
+      </w:r>
+      <w:r>
+        <w:t xml:space="preserve">11, 3421–3435</w:t>
+      </w:r>
+    </w:p>
+    <w:bookmarkEnd w:id="45"/>
+    <w:bookmarkStart w:id="46" w:name="ref-hesketh2023extreme"/>
+    <w:p>
+      <w:pPr>
+        <w:pStyle w:val="Bibliography"/>
+      </w:pPr>
+      <w:r>
+        <w:t xml:space="preserve">9.</w:t>
+      </w:r>
+      <w:r>
+        <w:t xml:space="preserve"> </w:t>
+      </w:r>
+      <w:r>
+        <w:t xml:space="preserve">	</w:t>
+      </w:r>
+      <w:r>
         <w:t xml:space="preserve">Hesketh, A.V. and Harley, C.D. (2023) Extreme heatwave drives topography-dependent patterns of mortality in a bed-forming intertidal barnacle, with implications for associated community structure.</w:t>
       </w:r>
       <w:r>
@@ -1991,14 +2192,14 @@
         <w:t xml:space="preserve">29, 165–178</w:t>
       </w:r>
     </w:p>
-    <w:bookmarkEnd w:id="43"/>
-    <w:bookmarkStart w:id="44" w:name="ref-martinez2024ecological"/>
+    <w:bookmarkEnd w:id="46"/>
+    <w:bookmarkStart w:id="47" w:name="ref-martinez2024ecological"/>
     <w:p>
       <w:pPr>
         <w:pStyle w:val="Bibliography"/>
       </w:pPr>
       <w:r>
-        <w:t xml:space="preserve">7.</w:t>
+        <w:t xml:space="preserve">10.</w:t>
       </w:r>
       <w:r>
         <w:t xml:space="preserve"> </w:t>
@@ -2020,14 +2221,14 @@
         <w:t xml:space="preserve">Trends in Ecology &amp; Evolution</w:t>
       </w:r>
     </w:p>
-    <w:bookmarkEnd w:id="44"/>
-    <w:bookmarkStart w:id="45" w:name="ref-rezende2020predicting"/>
+    <w:bookmarkEnd w:id="47"/>
+    <w:bookmarkStart w:id="48" w:name="ref-rezende2020predicting"/>
     <w:p>
       <w:pPr>
         <w:pStyle w:val="Bibliography"/>
       </w:pPr>
       <w:r>
-        <w:t xml:space="preserve">8.</w:t>
+        <w:t xml:space="preserve">11.</w:t>
       </w:r>
       <w:r>
         <w:t xml:space="preserve"> </w:t>
@@ -2071,14 +2272,14 @@
         <w:t xml:space="preserve">369, 1242–1245</w:t>
       </w:r>
     </w:p>
-    <w:bookmarkEnd w:id="45"/>
-    <w:bookmarkStart w:id="46" w:name="ref-orsted2024thermal"/>
+    <w:bookmarkEnd w:id="48"/>
+    <w:bookmarkStart w:id="49" w:name="ref-orsted2024thermal"/>
     <w:p>
       <w:pPr>
         <w:pStyle w:val="Bibliography"/>
       </w:pPr>
       <w:r>
-        <w:t xml:space="preserve">9.</w:t>
+        <w:t xml:space="preserve">12.</w:t>
       </w:r>
       <w:r>
         <w:t xml:space="preserve"> </w:t>
@@ -2122,14 +2323,14 @@
         <w:t xml:space="preserve">27, e14421</w:t>
       </w:r>
     </w:p>
-    <w:bookmarkEnd w:id="46"/>
-    <w:bookmarkStart w:id="47" w:name="ref-lopez2024heat"/>
+    <w:bookmarkEnd w:id="49"/>
+    <w:bookmarkStart w:id="50" w:name="ref-lopez2024heat"/>
     <w:p>
       <w:pPr>
         <w:pStyle w:val="Bibliography"/>
       </w:pPr>
       <w:r>
-        <w:t xml:space="preserve">10.</w:t>
+        <w:t xml:space="preserve">13.</w:t>
       </w:r>
       <w:r>
         <w:t xml:space="preserve"> </w:t>
@@ -2167,14 +2368,14 @@
         <w:t xml:space="preserve">Plant, Cell &amp; Environment</w:t>
       </w:r>
     </w:p>
-    <w:bookmarkEnd w:id="47"/>
-    <w:bookmarkStart w:id="48" w:name="ref-huỳnh2024heatwave"/>
+    <w:bookmarkEnd w:id="50"/>
+    <w:bookmarkStart w:id="51" w:name="ref-huỳnh2024heatwave"/>
     <w:p>
       <w:pPr>
         <w:pStyle w:val="Bibliography"/>
       </w:pPr>
       <w:r>
-        <w:t xml:space="preserve">11.</w:t>
+        <w:t xml:space="preserve">14.</w:t>
       </w:r>
       <w:r>
         <w:t xml:space="preserve"> </w:t>
@@ -2218,14 +2419,14 @@
         <w:t xml:space="preserve">14, e70096</w:t>
       </w:r>
     </w:p>
-    <w:bookmarkEnd w:id="48"/>
-    <w:bookmarkStart w:id="49" w:name="ref-trivedi2022plant"/>
+    <w:bookmarkEnd w:id="51"/>
+    <w:bookmarkStart w:id="52" w:name="ref-trivedi2022plant"/>
     <w:p>
       <w:pPr>
         <w:pStyle w:val="Bibliography"/>
       </w:pPr>
       <w:r>
-        <w:t xml:space="preserve">12.</w:t>
+        <w:t xml:space="preserve">15.</w:t>
       </w:r>
       <w:r>
         <w:t xml:space="preserve"> </w:t>
@@ -2269,14 +2470,14 @@
         <w:t xml:space="preserve">234, 1951–1959</w:t>
       </w:r>
     </w:p>
-    <w:bookmarkEnd w:id="49"/>
-    <w:bookmarkStart w:id="50" w:name="ref-kooijman2010dynamic"/>
+    <w:bookmarkEnd w:id="52"/>
+    <w:bookmarkStart w:id="53" w:name="ref-kooijman2010dynamic"/>
     <w:p>
       <w:pPr>
         <w:pStyle w:val="Bibliography"/>
       </w:pPr>
       <w:r>
-        <w:t xml:space="preserve">13.</w:t>
+        <w:t xml:space="preserve">16.</w:t>
       </w:r>
       <w:r>
         <w:t xml:space="preserve"> </w:t>
@@ -2301,14 +2502,14 @@
         <w:t xml:space="preserve">, Cambridge university press</w:t>
       </w:r>
     </w:p>
-    <w:bookmarkEnd w:id="50"/>
-    <w:bookmarkStart w:id="51" w:name="ref-kearney2009mechanistic"/>
+    <w:bookmarkEnd w:id="53"/>
+    <w:bookmarkStart w:id="54" w:name="ref-kearney2009mechanistic"/>
     <w:p>
       <w:pPr>
         <w:pStyle w:val="Bibliography"/>
       </w:pPr>
       <w:r>
-        <w:t xml:space="preserve">14.</w:t>
+        <w:t xml:space="preserve">17.</w:t>
       </w:r>
       <w:r>
         <w:t xml:space="preserve"> </w:t>
@@ -2336,14 +2537,14 @@
         <w:t xml:space="preserve">12, 334–350</w:t>
       </w:r>
     </w:p>
-    <w:bookmarkEnd w:id="51"/>
-    <w:bookmarkStart w:id="52" w:name="ref-jusup2024untapped"/>
+    <w:bookmarkEnd w:id="54"/>
+    <w:bookmarkStart w:id="55" w:name="ref-jusup2024untapped"/>
     <w:p>
       <w:pPr>
         <w:pStyle w:val="Bibliography"/>
       </w:pPr>
       <w:r>
-        <w:t xml:space="preserve">15.</w:t>
+        <w:t xml:space="preserve">18.</w:t>
       </w:r>
       <w:r>
         <w:t xml:space="preserve"> </w:t>
@@ -2365,14 +2566,14 @@
         <w:t xml:space="preserve">arXiv preprint arXiv:2408.13998</w:t>
       </w:r>
     </w:p>
-    <w:bookmarkEnd w:id="52"/>
-    <w:bookmarkStart w:id="53" w:name="ref-kearney2024fast"/>
+    <w:bookmarkEnd w:id="55"/>
+    <w:bookmarkStart w:id="56" w:name="ref-kearney2024fast"/>
     <w:p>
       <w:pPr>
         <w:pStyle w:val="Bibliography"/>
       </w:pPr>
       <w:r>
-        <w:t xml:space="preserve">16.</w:t>
+        <w:t xml:space="preserve">19.</w:t>
       </w:r>
       <w:r>
         <w:t xml:space="preserve"> </w:t>
@@ -2394,14 +2595,14 @@
         <w:t xml:space="preserve">Methods in Ecology and Evolution</w:t>
       </w:r>
     </w:p>
-    <w:bookmarkEnd w:id="53"/>
-    <w:bookmarkStart w:id="54" w:name="ref-briscoe2023mechanistic"/>
+    <w:bookmarkEnd w:id="56"/>
+    <w:bookmarkStart w:id="57" w:name="ref-briscoe2023mechanistic"/>
     <w:p>
       <w:pPr>
         <w:pStyle w:val="Bibliography"/>
       </w:pPr>
       <w:r>
-        <w:t xml:space="preserve">17.</w:t>
+        <w:t xml:space="preserve">20.</w:t>
       </w:r>
       <w:r>
         <w:t xml:space="preserve"> </w:t>
@@ -2445,14 +2646,14 @@
         <w:t xml:space="preserve">29, 1451–1470</w:t>
       </w:r>
     </w:p>
-    <w:bookmarkEnd w:id="54"/>
-    <w:bookmarkStart w:id="55" w:name="ref-rezende2014tolerance"/>
+    <w:bookmarkEnd w:id="57"/>
+    <w:bookmarkStart w:id="58" w:name="ref-rezende2014tolerance"/>
     <w:p>
       <w:pPr>
         <w:pStyle w:val="Bibliography"/>
       </w:pPr>
       <w:r>
-        <w:t xml:space="preserve">18.</w:t>
+        <w:t xml:space="preserve">21.</w:t>
       </w:r>
       <w:r>
         <w:t xml:space="preserve"> </w:t>
@@ -2496,14 +2697,14 @@
         <w:t xml:space="preserve">28, 799–809</w:t>
       </w:r>
     </w:p>
-    <w:bookmarkEnd w:id="55"/>
-    <w:bookmarkStart w:id="56" w:name="ref-delmas2019analysing"/>
+    <w:bookmarkEnd w:id="58"/>
+    <w:bookmarkStart w:id="59" w:name="ref-delmas2019analysing"/>
     <w:p>
       <w:pPr>
         <w:pStyle w:val="Bibliography"/>
       </w:pPr>
       <w:r>
-        <w:t xml:space="preserve">19.</w:t>
+        <w:t xml:space="preserve">22.</w:t>
       </w:r>
       <w:r>
         <w:t xml:space="preserve"> </w:t>
@@ -2547,14 +2748,14 @@
         <w:t xml:space="preserve">94, 16–36</w:t>
       </w:r>
     </w:p>
-    <w:bookmarkEnd w:id="56"/>
-    <w:bookmarkStart w:id="57" w:name="ref-godoy2019coexistence"/>
+    <w:bookmarkEnd w:id="59"/>
+    <w:bookmarkStart w:id="60" w:name="ref-godoy2019coexistence"/>
     <w:p>
       <w:pPr>
         <w:pStyle w:val="Bibliography"/>
       </w:pPr>
       <w:r>
-        <w:t xml:space="preserve">20.</w:t>
+        <w:t xml:space="preserve">23.</w:t>
       </w:r>
       <w:r>
         <w:t xml:space="preserve"> </w:t>
@@ -2582,14 +2783,14 @@
         <w:t xml:space="preserve">33, 1190–1201</w:t>
       </w:r>
     </w:p>
-    <w:bookmarkEnd w:id="57"/>
-    <w:bookmarkStart w:id="58" w:name="ref-poisot2021global"/>
+    <w:bookmarkEnd w:id="60"/>
+    <w:bookmarkStart w:id="61" w:name="ref-poisot2021global"/>
     <w:p>
       <w:pPr>
         <w:pStyle w:val="Bibliography"/>
       </w:pPr>
       <w:r>
-        <w:t xml:space="preserve">21.</w:t>
+        <w:t xml:space="preserve">24.</w:t>
       </w:r>
       <w:r>
         <w:t xml:space="preserve"> </w:t>
@@ -2633,14 +2834,14 @@
         <w:t xml:space="preserve">48, 1552–1563</w:t>
       </w:r>
     </w:p>
-    <w:bookmarkEnd w:id="58"/>
-    <w:bookmarkStart w:id="59" w:name="ref-hui2019invade"/>
+    <w:bookmarkEnd w:id="61"/>
+    <w:bookmarkStart w:id="62" w:name="ref-hui2019invade"/>
     <w:p>
       <w:pPr>
         <w:pStyle w:val="Bibliography"/>
       </w:pPr>
       <w:r>
-        <w:t xml:space="preserve">22.</w:t>
+        <w:t xml:space="preserve">25.</w:t>
       </w:r>
       <w:r>
         <w:t xml:space="preserve"> </w:t>
@@ -2668,14 +2869,14 @@
         <w:t xml:space="preserve">34, 121–131</w:t>
       </w:r>
     </w:p>
-    <w:bookmarkEnd w:id="59"/>
-    <w:bookmarkStart w:id="60" w:name="ref-gomez2023role"/>
+    <w:bookmarkEnd w:id="62"/>
+    <w:bookmarkStart w:id="63" w:name="ref-gomez2023role"/>
     <w:p>
       <w:pPr>
         <w:pStyle w:val="Bibliography"/>
       </w:pPr>
       <w:r>
-        <w:t xml:space="preserve">23.</w:t>
+        <w:t xml:space="preserve">26.</w:t>
       </w:r>
       <w:r>
         <w:t xml:space="preserve"> </w:t>
@@ -2719,14 +2920,14 @@
         <w:t xml:space="preserve">26, S47–S61</w:t>
       </w:r>
     </w:p>
-    <w:bookmarkEnd w:id="60"/>
-    <w:bookmarkStart w:id="61" w:name="ref-lytle2023matrix"/>
+    <w:bookmarkEnd w:id="63"/>
+    <w:bookmarkStart w:id="64" w:name="ref-lytle2023matrix"/>
     <w:p>
       <w:pPr>
         <w:pStyle w:val="Bibliography"/>
       </w:pPr>
       <w:r>
-        <w:t xml:space="preserve">24.</w:t>
+        <w:t xml:space="preserve">27.</w:t>
       </w:r>
       <w:r>
         <w:t xml:space="preserve"> </w:t>
@@ -2754,14 +2955,14 @@
         <w:t xml:space="preserve">2, 26</w:t>
       </w:r>
     </w:p>
-    <w:bookmarkEnd w:id="61"/>
-    <w:bookmarkStart w:id="62" w:name="ref-petsopoulos2021using"/>
+    <w:bookmarkEnd w:id="64"/>
+    <w:bookmarkStart w:id="65" w:name="ref-petsopoulos2021using"/>
     <w:p>
       <w:pPr>
         <w:pStyle w:val="Bibliography"/>
       </w:pPr>
       <w:r>
-        <w:t xml:space="preserve">25.</w:t>
+        <w:t xml:space="preserve">28.</w:t>
       </w:r>
       <w:r>
         <w:t xml:space="preserve"> </w:t>
@@ -2799,14 +3000,14 @@
         <w:t xml:space="preserve">Ecological Entomology</w:t>
       </w:r>
     </w:p>
-    <w:bookmarkEnd w:id="62"/>
-    <w:bookmarkStart w:id="63" w:name="ref-dale2021quantitative"/>
+    <w:bookmarkEnd w:id="65"/>
+    <w:bookmarkStart w:id="66" w:name="ref-dale2021quantitative"/>
     <w:p>
       <w:pPr>
         <w:pStyle w:val="Bibliography"/>
       </w:pPr>
       <w:r>
-        <w:t xml:space="preserve">26.</w:t>
+        <w:t xml:space="preserve">29.</w:t>
       </w:r>
       <w:r>
         <w:t xml:space="preserve"> </w:t>
@@ -2831,14 +3032,14 @@
         <w:t xml:space="preserve">, Cambridge University Press</w:t>
       </w:r>
     </w:p>
-    <w:bookmarkEnd w:id="63"/>
-    <w:bookmarkStart w:id="64" w:name="ref-lu2023food"/>
+    <w:bookmarkEnd w:id="66"/>
+    <w:bookmarkStart w:id="67" w:name="ref-lu2023food"/>
     <w:p>
       <w:pPr>
         <w:pStyle w:val="Bibliography"/>
       </w:pPr>
       <w:r>
-        <w:t xml:space="preserve">27.</w:t>
+        <w:t xml:space="preserve">30.</w:t>
       </w:r>
       <w:r>
         <w:t xml:space="preserve"> </w:t>
@@ -2882,14 +3083,14 @@
         <w:t xml:space="preserve">33, 647–659</w:t>
       </w:r>
     </w:p>
-    <w:bookmarkEnd w:id="64"/>
-    <w:bookmarkStart w:id="65" w:name="ref-carrara2015inferring"/>
+    <w:bookmarkEnd w:id="67"/>
+    <w:bookmarkStart w:id="68" w:name="ref-carrara2015inferring"/>
     <w:p>
       <w:pPr>
         <w:pStyle w:val="Bibliography"/>
       </w:pPr>
       <w:r>
-        <w:t xml:space="preserve">28.</w:t>
+        <w:t xml:space="preserve">31.</w:t>
       </w:r>
       <w:r>
         <w:t xml:space="preserve"> </w:t>
@@ -2933,14 +3134,14 @@
         <w:t xml:space="preserve">6, 895–906</w:t>
       </w:r>
     </w:p>
-    <w:bookmarkEnd w:id="65"/>
-    <w:bookmarkStart w:id="66" w:name="ref-vitali2022disruption"/>
+    <w:bookmarkEnd w:id="68"/>
+    <w:bookmarkStart w:id="69" w:name="ref-vitali2022disruption"/>
     <w:p>
       <w:pPr>
         <w:pStyle w:val="Bibliography"/>
       </w:pPr>
       <w:r>
-        <w:t xml:space="preserve">29.</w:t>
+        <w:t xml:space="preserve">32.</w:t>
       </w:r>
       <w:r>
         <w:t xml:space="preserve"> </w:t>
@@ -2984,14 +3185,14 @@
         <w:t xml:space="preserve">103, e03547</w:t>
       </w:r>
     </w:p>
-    <w:bookmarkEnd w:id="66"/>
-    <w:bookmarkStart w:id="67" w:name="ref-riva2023toward"/>
+    <w:bookmarkEnd w:id="69"/>
+    <w:bookmarkStart w:id="70" w:name="ref-riva2023toward"/>
     <w:p>
       <w:pPr>
         <w:pStyle w:val="Bibliography"/>
       </w:pPr>
       <w:r>
-        <w:t xml:space="preserve">30.</w:t>
+        <w:t xml:space="preserve">33.</w:t>
       </w:r>
       <w:r>
         <w:t xml:space="preserve"> </w:t>
@@ -3035,14 +3236,14 @@
         <w:t xml:space="preserve">9, eabq4207</w:t>
       </w:r>
     </w:p>
-    <w:bookmarkEnd w:id="67"/>
-    <w:bookmarkStart w:id="68" w:name="ref-terry2020finding"/>
+    <w:bookmarkEnd w:id="70"/>
+    <w:bookmarkStart w:id="71" w:name="ref-terry2020finding"/>
     <w:p>
       <w:pPr>
         <w:pStyle w:val="Bibliography"/>
       </w:pPr>
       <w:r>
-        <w:t xml:space="preserve">31.</w:t>
+        <w:t xml:space="preserve">34.</w:t>
       </w:r>
       <w:r>
         <w:t xml:space="preserve"> </w:t>
@@ -3070,14 +3271,14 @@
         <w:t xml:space="preserve">101, e03047</w:t>
       </w:r>
     </w:p>
-    <w:bookmarkEnd w:id="68"/>
-    <w:bookmarkStart w:id="69" w:name="ref-marquez2007virus"/>
+    <w:bookmarkEnd w:id="71"/>
+    <w:bookmarkStart w:id="72" w:name="ref-marquez2007virus"/>
     <w:p>
       <w:pPr>
         <w:pStyle w:val="Bibliography"/>
       </w:pPr>
       <w:r>
-        <w:t xml:space="preserve">32.</w:t>
+        <w:t xml:space="preserve">35.</w:t>
       </w:r>
       <w:r>
         <w:t xml:space="preserve"> </w:t>
@@ -3121,14 +3322,14 @@
         <w:t xml:space="preserve">315, 513–515</w:t>
       </w:r>
     </w:p>
-    <w:bookmarkEnd w:id="69"/>
-    <w:bookmarkStart w:id="70" w:name="ref-zou2024time"/>
+    <w:bookmarkEnd w:id="72"/>
+    <w:bookmarkStart w:id="73" w:name="ref-zou2024time"/>
     <w:p>
       <w:pPr>
         <w:pStyle w:val="Bibliography"/>
       </w:pPr>
       <w:r>
-        <w:t xml:space="preserve">33.</w:t>
+        <w:t xml:space="preserve">36.</w:t>
       </w:r>
       <w:r>
         <w:t xml:space="preserve"> </w:t>
@@ -3172,14 +3373,14 @@
         <w:t xml:space="preserve">27, e14432</w:t>
       </w:r>
     </w:p>
-    <w:bookmarkEnd w:id="70"/>
-    <w:bookmarkStart w:id="71" w:name="ref-li2023interspecific"/>
+    <w:bookmarkEnd w:id="73"/>
+    <w:bookmarkStart w:id="74" w:name="ref-li2023interspecific"/>
     <w:p>
       <w:pPr>
         <w:pStyle w:val="Bibliography"/>
       </w:pPr>
       <w:r>
-        <w:t xml:space="preserve">34.</w:t>
+        <w:t xml:space="preserve">37.</w:t>
       </w:r>
       <w:r>
         <w:t xml:space="preserve"> </w:t>
@@ -3223,14 +3424,14 @@
         <w:t xml:space="preserve">114, 103583</w:t>
       </w:r>
     </w:p>
-    <w:bookmarkEnd w:id="71"/>
-    <w:bookmarkStart w:id="72" w:name="ref-kearney2009integrating"/>
+    <w:bookmarkEnd w:id="74"/>
+    <w:bookmarkStart w:id="75" w:name="ref-kearney2009integrating"/>
     <w:p>
       <w:pPr>
         <w:pStyle w:val="Bibliography"/>
       </w:pPr>
       <w:r>
-        <w:t xml:space="preserve">35.</w:t>
+        <w:t xml:space="preserve">38.</w:t>
       </w:r>
       <w:r>
         <w:t xml:space="preserve"> </w:t>
@@ -3274,9 +3475,9 @@
         <w:t xml:space="preserve">23, 528–538</w:t>
       </w:r>
     </w:p>
-    <w:bookmarkEnd w:id="72"/>
-    <w:bookmarkEnd w:id="73"/>
-    <w:bookmarkEnd w:id="74"/>
+    <w:bookmarkEnd w:id="75"/>
+    <w:bookmarkEnd w:id="76"/>
+    <w:bookmarkEnd w:id="77"/>
     <w:sectPr>
       <w:pgSz w:h="15840" w:w="12240"/>
       <w:pgMar w:bottom="851" w:footer="720" w:gutter="0" w:header="720" w:left="851" w:right="851" w:top="851"/>
@@ -4205,6 +4406,9 @@
     <w:abstractNumId w:val="991"/>
   </w:num>
   <w:num w:numId="1011">
+    <w:abstractNumId w:val="991"/>
+  </w:num>
+  <w:num w:numId="1012">
     <w:abstractNumId w:val="991"/>
   </w:num>
 </w:numbering>

</xml_diff>

<commit_message>
New refs for interactiins
</commit_message>
<xml_diff>
--- a/ms/ms.docx
+++ b/ms/ms.docx
@@ -935,7 +935,7 @@
       </w:r>
     </w:p>
     <w:bookmarkEnd w:id="23"/>
-    <w:bookmarkStart w:id="24" w:name="Xbdb3df2871e98d114a1e4e74a52caa28253dc0c"/>
+    <w:bookmarkStart w:id="29" w:name="Xbdb3df2871e98d114a1e4e74a52caa28253dc0c"/>
     <w:p>
       <w:pPr>
         <w:pStyle w:val="Heading1"/>
@@ -1153,15 +1153,99 @@
       <w:r>
         <w:t xml:space="preserve">[34]</w:t>
       </w:r>
-    </w:p>
-    <w:bookmarkEnd w:id="24"/>
-    <w:bookmarkStart w:id="30" w:name="Xe7540e51cb84d29e47d083817996607ca5f8009"/>
-    <w:p>
-      <w:pPr>
-        <w:pStyle w:val="Heading1"/>
-      </w:pPr>
-      <w:r>
-        <w:t xml:space="preserve">Incorporating context-dependent environmental feedback to evaluate resilience to extreme heat (Brajesh, Brendan, James, Everyone else who wants to contribute)</w:t>
+      <w:r>
+        <w:t xml:space="preserve"> </w:t>
+      </w:r>
+      <w:r>
+        <w:t xml:space="preserve">[35]</w:t>
+      </w:r>
+      <w:r>
+        <w:t xml:space="preserve"> </w:t>
+      </w:r>
+      <w:r>
+        <w:t xml:space="preserve"># Incorporating context-dependent environmental feedback to evaluate resilience to extreme heat (Brajesh, Brendan, James, Everyone else who wants to contribute)</w:t>
+      </w:r>
+    </w:p>
+    <w:p>
+      <w:pPr>
+        <w:pStyle w:val="Compact"/>
+        <w:numPr>
+          <w:ilvl w:val="0"/>
+          <w:numId w:val="1006"/>
+        </w:numPr>
+      </w:pPr>
+      <w:r>
+        <w:t xml:space="preserve">Goal of this section is to briefly focus on the BIOLOGY that will shift thermal exposure and sensitivity in plants and animals.</w:t>
+      </w:r>
+    </w:p>
+    <w:p>
+      <w:pPr>
+        <w:pStyle w:val="Compact"/>
+        <w:numPr>
+          <w:ilvl w:val="0"/>
+          <w:numId w:val="1006"/>
+        </w:numPr>
+      </w:pPr>
+      <w:r>
+        <w:t xml:space="preserve">I</w:t>
+      </w:r>
+      <w:r>
+        <w:t xml:space="preserve"> </w:t>
+      </w:r>
+      <w:r>
+        <w:rPr>
+          <w:b/>
+          <w:bCs/>
+        </w:rPr>
+        <w:t xml:space="preserve">just</w:t>
+      </w:r>
+      <w:r>
+        <w:t xml:space="preserve"> </w:t>
+      </w:r>
+      <w:r>
+        <w:t xml:space="preserve">found this important paper for which a lot can be gleaned upon. Many of the important things we have been discussing are discussed in here:</w:t>
+      </w:r>
+      <w:r>
+        <w:t xml:space="preserve"> </w:t>
+      </w:r>
+      <w:r>
+        <w:t xml:space="preserve">[10]</w:t>
+      </w:r>
+      <w:r>
+        <w:t xml:space="preserve">, so we should be careful to make our narrative distinct. The limitation of this study is it lacks the focus on modelling frameworks, so I think us distinguishing how we link these concepts back into the model would be quite novel and distinguish ourselves from them..</w:t>
+      </w:r>
+    </w:p>
+    <w:p>
+      <w:pPr>
+        <w:pStyle w:val="Compact"/>
+        <w:numPr>
+          <w:ilvl w:val="0"/>
+          <w:numId w:val="1006"/>
+        </w:numPr>
+      </w:pPr>
+      <w:r>
+        <w:t xml:space="preserve">Then, we overlay briefly how we might capture that in the modelling framework we setup above. For example, you all write the biology and we then need to think about how we can adjust models to capture these nuances.</w:t>
+      </w:r>
+    </w:p>
+    <w:p>
+      <w:pPr>
+        <w:pStyle w:val="Compact"/>
+        <w:numPr>
+          <w:ilvl w:val="0"/>
+          <w:numId w:val="1006"/>
+        </w:numPr>
+      </w:pPr>
+      <w:r>
+        <w:t xml:space="preserve">If uncertain about adding a sentence to the link to the models above, that’s ok, Dan, Mike, Margie and Belinda can add.</w:t>
+      </w:r>
+    </w:p>
+    <w:bookmarkStart w:id="24" w:name="X1b136e3eae891c477bc728d2597e572ca649eaa"/>
+    <w:p>
+      <w:pPr>
+        <w:pStyle w:val="Heading3"/>
+      </w:pPr>
+      <w:r>
+        <w:t xml:space="preserve">Microbial communities can impact thermal sensitivity in plants and animals (Brajesh)</w:t>
       </w:r>
     </w:p>
     <w:p>
@@ -1173,88 +1257,6 @@
         </w:numPr>
       </w:pPr>
       <w:r>
-        <w:t xml:space="preserve">Goal of this section is to briefly focus on the BIOLOGY that will shift thermal exposure and sensitivity in plants and animals.</w:t>
-      </w:r>
-    </w:p>
-    <w:p>
-      <w:pPr>
-        <w:pStyle w:val="Compact"/>
-        <w:numPr>
-          <w:ilvl w:val="0"/>
-          <w:numId w:val="1007"/>
-        </w:numPr>
-      </w:pPr>
-      <w:r>
-        <w:t xml:space="preserve">I</w:t>
-      </w:r>
-      <w:r>
-        <w:t xml:space="preserve"> </w:t>
-      </w:r>
-      <w:r>
-        <w:rPr>
-          <w:b/>
-          <w:bCs/>
-        </w:rPr>
-        <w:t xml:space="preserve">just</w:t>
-      </w:r>
-      <w:r>
-        <w:t xml:space="preserve"> </w:t>
-      </w:r>
-      <w:r>
-        <w:t xml:space="preserve">found this important paper for which a lot can be gleaned upon. Many of the important things we have been discussing are discussed in here:</w:t>
-      </w:r>
-      <w:r>
-        <w:t xml:space="preserve"> </w:t>
-      </w:r>
-      <w:r>
-        <w:t xml:space="preserve">[10]</w:t>
-      </w:r>
-      <w:r>
-        <w:t xml:space="preserve">, so we should be careful to make our narrative distinct. The limitation of this study is it lacks the focus on modelling frameworks, so I think us distinguishing how we link these concepts back into the model would be quite novel and distinguish ourselves from them..</w:t>
-      </w:r>
-    </w:p>
-    <w:p>
-      <w:pPr>
-        <w:pStyle w:val="Compact"/>
-        <w:numPr>
-          <w:ilvl w:val="0"/>
-          <w:numId w:val="1007"/>
-        </w:numPr>
-      </w:pPr>
-      <w:r>
-        <w:t xml:space="preserve">Then, we overlay briefly how we might capture that in the modelling framework we setup above. For example, you all write the biology and we then need to think about how we can adjust models to capture these nuances.</w:t>
-      </w:r>
-    </w:p>
-    <w:p>
-      <w:pPr>
-        <w:pStyle w:val="Compact"/>
-        <w:numPr>
-          <w:ilvl w:val="0"/>
-          <w:numId w:val="1007"/>
-        </w:numPr>
-      </w:pPr>
-      <w:r>
-        <w:t xml:space="preserve">If uncertain about adding a sentence to the link to the models above, that’s ok, Dan, Mike, Margie and Belinda can add.</w:t>
-      </w:r>
-    </w:p>
-    <w:bookmarkStart w:id="25" w:name="X1b136e3eae891c477bc728d2597e572ca649eaa"/>
-    <w:p>
-      <w:pPr>
-        <w:pStyle w:val="Heading3"/>
-      </w:pPr>
-      <w:r>
-        <w:t xml:space="preserve">Microbial communities can impact thermal sensitivity in plants and animals (Brajesh)</w:t>
-      </w:r>
-    </w:p>
-    <w:p>
-      <w:pPr>
-        <w:pStyle w:val="Compact"/>
-        <w:numPr>
-          <w:ilvl w:val="0"/>
-          <w:numId w:val="1008"/>
-        </w:numPr>
-      </w:pPr>
-      <w:r>
         <w:t xml:space="preserve">Here’s some text of a cool example I had written up. Feel free to use Braj or shift completely if you’d like.</w:t>
       </w:r>
       <w:r>
@@ -1277,7 +1279,7 @@
         <w:t xml:space="preserve"> </w:t>
       </w:r>
       <w:r>
-        <w:t xml:space="preserve">[35]</w:t>
+        <w:t xml:space="preserve">[36]</w:t>
       </w:r>
       <w:r>
         <w:t xml:space="preserve"> </w:t>
@@ -1360,40 +1362,166 @@
         <w:pStyle w:val="Compact"/>
         <w:numPr>
           <w:ilvl w:val="0"/>
+          <w:numId w:val="1007"/>
+        </w:numPr>
+      </w:pPr>
+      <w:r>
+        <w:t xml:space="preserve">See</w:t>
+      </w:r>
+      <w:r>
+        <w:t xml:space="preserve"> </w:t>
+      </w:r>
+      <w:r>
+        <w:t xml:space="preserve">[37]</w:t>
+      </w:r>
+      <w:r>
+        <w:t xml:space="preserve">. The paper provides a framework for modelling soil plant interactions</w:t>
+      </w:r>
+    </w:p>
+    <w:bookmarkEnd w:id="24"/>
+    <w:bookmarkStart w:id="25" w:name="X24738ef4513767bb724ce8804ac017259eaf2ee"/>
+    <w:p>
+      <w:pPr>
+        <w:pStyle w:val="Heading3"/>
+      </w:pPr>
+      <w:r>
+        <w:t xml:space="preserve">Water availability can impact thermal sensitivity of plants and animals (Brendan)</w:t>
+      </w:r>
+    </w:p>
+    <w:bookmarkEnd w:id="25"/>
+    <w:bookmarkStart w:id="26" w:name="X1934a01dca617640c62902cb6b54ad742133dfc"/>
+    <w:p>
+      <w:pPr>
+        <w:pStyle w:val="Heading3"/>
+      </w:pPr>
+      <w:r>
+        <w:t xml:space="preserve">Competition can impact thermal sensitivity of plants and animals (James? Feel free to add a different section title here.)</w:t>
+      </w:r>
+    </w:p>
+    <w:p>
+      <w:pPr>
+        <w:pStyle w:val="Compact"/>
+        <w:numPr>
+          <w:ilvl w:val="0"/>
           <w:numId w:val="1008"/>
         </w:numPr>
       </w:pPr>
       <w:r>
-        <w:t xml:space="preserve">See</w:t>
-      </w:r>
-      <w:r>
-        <w:t xml:space="preserve"> </w:t>
-      </w:r>
-      <w:r>
-        <w:t xml:space="preserve">[36]</w:t>
-      </w:r>
-      <w:r>
-        <w:t xml:space="preserve">. The paper provides a framework for modelling soil plant interactions</w:t>
-      </w:r>
-    </w:p>
-    <w:bookmarkEnd w:id="25"/>
-    <w:bookmarkStart w:id="26" w:name="X24738ef4513767bb724ce8804ac017259eaf2ee"/>
+        <w:t xml:space="preserve">James. Added some text around a few examples below. Feel fre eto use/integrate or completely throw away. Or, we can move some of this into other sections.</w:t>
+      </w:r>
+      <w:r>
+        <w:t xml:space="preserve"> </w:t>
+      </w:r>
+      <w:r>
+        <w:t xml:space="preserve">Competition among species within a community can influence a focal species’ tolerance to heat stress. Competition can influence microhabitat selection and the availability of thermal refugia which can protect against thermal extremes, the diet of a focal species that can indirectly influence physiological tolerance of temperature stress, and the availability of resources that can help buffer against heat stress. For example, Li</w:t>
+      </w:r>
+      <w:r>
+        <w:t xml:space="preserve"> </w:t>
+      </w:r>
+      <w:r>
+        <w:rPr>
+          <w:i/>
+          <w:iCs/>
+        </w:rPr>
+        <w:t xml:space="preserve">et al.</w:t>
+      </w:r>
+      <w:r>
+        <w:t xml:space="preserve"> </w:t>
+      </w:r>
+      <w:r>
+        <w:t xml:space="preserve">[38]</w:t>
+      </w:r>
+      <w:r>
+        <w:t xml:space="preserve"> </w:t>
+      </w:r>
+      <w:r>
+        <w:t xml:space="preserve">measured the thermal tolerance landscape for three aphid species that are pests for cereal crops globally to understand whether they could predict changes in community abundance. Using a thermal death time (TDT) approach to estimate the cumulative impacts of heat stress on survival they found that one species,</w:t>
+      </w:r>
+      <w:r>
+        <w:t xml:space="preserve"> </w:t>
+      </w:r>
+      <w:r>
+        <w:rPr>
+          <w:i/>
+          <w:iCs/>
+        </w:rPr>
+        <w:t xml:space="preserve">Rhopalosiphum padi</w:t>
+      </w:r>
+      <w:r>
+        <w:t xml:space="preserve">, showed high heat tolerance and accumulated less injury over natural temperature fluctuations. The ability to maintain high relative abundance in the face of extreme heat may allow this species to outcompete other aphids explaining why it dominates in southern parts of its range.</w:t>
+      </w:r>
+    </w:p>
+    <w:p>
+      <w:pPr>
+        <w:pStyle w:val="FirstParagraph"/>
+      </w:pPr>
+      <w:r>
+        <w:t xml:space="preserve">Li</w:t>
+      </w:r>
+      <w:r>
+        <w:t xml:space="preserve"> </w:t>
+      </w:r>
+      <w:r>
+        <w:rPr>
+          <w:i/>
+          <w:iCs/>
+        </w:rPr>
+        <w:t xml:space="preserve">et al.</w:t>
+      </w:r>
+      <w:r>
+        <w:t xml:space="preserve"> </w:t>
+      </w:r>
+      <w:r>
+        <w:t xml:space="preserve">[38]</w:t>
+      </w:r>
+      <w:r>
+        <w:t xml:space="preserve"> </w:t>
+      </w:r>
+      <w:r>
+        <w:t xml:space="preserve">also found that different life-stages were affected differently by heat stress, with adults being more thermally tolerant than early developmental stages emphasising the need for models to capture such variation. However, such findings do not incorporate acclimation to heat stress or different microhabitat choice by the different species, which are both likely to be important for predicting the impacts of heat stress on community structure. It also ignores how interspecific interactions between competing aphid species will also likely mediate species abundance. It would be worth while integrating thermal tolerance landscapes with ecological models that capture interspecific interactions to better predict how heat stress will affect community structure.</w:t>
+      </w:r>
+    </w:p>
+    <w:bookmarkEnd w:id="26"/>
+    <w:bookmarkStart w:id="27" w:name="Xdbc91e02dcd505372e716f3d2147fb46ffba4bf"/>
     <w:p>
       <w:pPr>
         <w:pStyle w:val="Heading3"/>
       </w:pPr>
       <w:r>
-        <w:t xml:space="preserve">Water availability can impact thermal sensitivity of plants and animals (Brendan)</w:t>
-      </w:r>
-    </w:p>
-    <w:bookmarkEnd w:id="26"/>
-    <w:bookmarkStart w:id="27" w:name="X1934a01dca617640c62902cb6b54ad742133dfc"/>
+        <w:t xml:space="preserve">Acclimation can impact thermal sensitivity of plants and animals (Everyone)</w:t>
+      </w:r>
+    </w:p>
+    <w:bookmarkEnd w:id="27"/>
+    <w:bookmarkStart w:id="28" w:name="X1f820984f57b727edc20965138ee13069f96c01"/>
     <w:p>
       <w:pPr>
         <w:pStyle w:val="Heading3"/>
       </w:pPr>
       <w:r>
-        <w:t xml:space="preserve">Competition can impact thermal sensitivity of plants and animals (James? Feel free to add a different section title here.)</w:t>
+        <w:t xml:space="preserve">Phenology and activity pattern shifts mediating interactions (James?)</w:t>
+      </w:r>
+    </w:p>
+    <w:bookmarkEnd w:id="28"/>
+    <w:bookmarkEnd w:id="29"/>
+    <w:bookmarkStart w:id="30" w:name="X42ca7aa69937316dee7b1e100d4320aa777518f"/>
+    <w:p>
+      <w:pPr>
+        <w:pStyle w:val="Heading1"/>
+      </w:pPr>
+      <w:r>
+        <w:t xml:space="preserve">‘</w:t>
+      </w:r>
+      <w:r>
+        <w:t xml:space="preserve">Hot</w:t>
+      </w:r>
+      <w:r>
+        <w:t xml:space="preserve">’</w:t>
+      </w:r>
+      <w:r>
+        <w:t xml:space="preserve"> </w:t>
+      </w:r>
+      <w:r>
+        <w:t xml:space="preserve">solutions for a changing world (Alison, Owen and Belinda, Mike)</w:t>
       </w:r>
     </w:p>
     <w:p>
@@ -1405,121 +1533,7 @@
         </w:numPr>
       </w:pPr>
       <w:r>
-        <w:t xml:space="preserve">James. Added some text around a few examples below. Feel fre eto use/integrate or completely throw away. Or, we can move some of this into other sections.</w:t>
-      </w:r>
-      <w:r>
-        <w:t xml:space="preserve"> </w:t>
-      </w:r>
-      <w:r>
-        <w:t xml:space="preserve">Competition among species within a community can influence a focal species’ tolerance to heat stress. Competition can influence microhabitat selection and the availability of thermal refugia which can protect against thermal extremes, the diet of a focal species that can indirectly influence physiological tolerance of temperature stress, and the availability of resources that can help buffer against heat stress. For example, Li</w:t>
-      </w:r>
-      <w:r>
-        <w:t xml:space="preserve"> </w:t>
-      </w:r>
-      <w:r>
-        <w:rPr>
-          <w:i/>
-          <w:iCs/>
-        </w:rPr>
-        <w:t xml:space="preserve">et al.</w:t>
-      </w:r>
-      <w:r>
-        <w:t xml:space="preserve"> </w:t>
-      </w:r>
-      <w:r>
-        <w:t xml:space="preserve">[37]</w:t>
-      </w:r>
-      <w:r>
-        <w:t xml:space="preserve"> </w:t>
-      </w:r>
-      <w:r>
-        <w:t xml:space="preserve">measured the thermal tolerance landscape for three aphid species that are pests for cereal crops globally to understand whether they could predict changes in community abundance. Using a thermal death time (TDT) approach to estimate the cumulative impacts of heat stress on survival they found that one species,</w:t>
-      </w:r>
-      <w:r>
-        <w:t xml:space="preserve"> </w:t>
-      </w:r>
-      <w:r>
-        <w:rPr>
-          <w:i/>
-          <w:iCs/>
-        </w:rPr>
-        <w:t xml:space="preserve">Rhopalosiphum padi</w:t>
-      </w:r>
-      <w:r>
-        <w:t xml:space="preserve">, showed high heat tolerance and accumulated less injury over natural temperature fluctuations. The ability to maintain high relative abundance in the face of extreme heat may allow this species to outcompete other aphids explaining why it dominates in southern parts of its range.</w:t>
-      </w:r>
-    </w:p>
-    <w:p>
-      <w:pPr>
-        <w:pStyle w:val="FirstParagraph"/>
-      </w:pPr>
-      <w:r>
-        <w:t xml:space="preserve">Li</w:t>
-      </w:r>
-      <w:r>
-        <w:t xml:space="preserve"> </w:t>
-      </w:r>
-      <w:r>
-        <w:rPr>
-          <w:i/>
-          <w:iCs/>
-        </w:rPr>
-        <w:t xml:space="preserve">et al.</w:t>
-      </w:r>
-      <w:r>
-        <w:t xml:space="preserve"> </w:t>
-      </w:r>
-      <w:r>
-        <w:t xml:space="preserve">[37]</w:t>
-      </w:r>
-      <w:r>
-        <w:t xml:space="preserve"> </w:t>
-      </w:r>
-      <w:r>
-        <w:t xml:space="preserve">also found that different life-stages were affected differently by heat stress, with adults being more thermally tolerant than early developmental stages emphasising the need for models to capture such variation. However, such findings do not incorporate acclimation to heat stress or different microhabitat choice by the different species, which are both likely to be important for predicting the impacts of heat stress on community structure. It also ignores how interspecific interactions between competing aphid species will also likely mediate species abundance. It would be worth while integrating thermal tolerance landscapes with ecological models that capture interspecific interactions to better predict how heat stress will affect community structure.</w:t>
-      </w:r>
-    </w:p>
-    <w:bookmarkEnd w:id="27"/>
-    <w:bookmarkStart w:id="28" w:name="Xdbc91e02dcd505372e716f3d2147fb46ffba4bf"/>
-    <w:p>
-      <w:pPr>
-        <w:pStyle w:val="Heading3"/>
-      </w:pPr>
-      <w:r>
-        <w:t xml:space="preserve">Acclimation can impact thermal sensitivity of plants and animals (Everyone)</w:t>
-      </w:r>
-    </w:p>
-    <w:bookmarkEnd w:id="28"/>
-    <w:bookmarkStart w:id="29" w:name="X1f820984f57b727edc20965138ee13069f96c01"/>
-    <w:p>
-      <w:pPr>
-        <w:pStyle w:val="Heading3"/>
-      </w:pPr>
-      <w:r>
-        <w:t xml:space="preserve">Phenology and activity pattern shifts mediating interactions (James?)</w:t>
-      </w:r>
-    </w:p>
-    <w:bookmarkEnd w:id="29"/>
-    <w:bookmarkEnd w:id="30"/>
-    <w:bookmarkStart w:id="31" w:name="X42ca7aa69937316dee7b1e100d4320aa777518f"/>
-    <w:p>
-      <w:pPr>
-        <w:pStyle w:val="Heading1"/>
-      </w:pPr>
-      <w:r>
-        <w:t xml:space="preserve">‘</w:t>
-      </w:r>
-      <w:r>
-        <w:t xml:space="preserve">Hot</w:t>
-      </w:r>
-      <w:r>
-        <w:t xml:space="preserve">’</w:t>
-      </w:r>
-      <w:r>
-        <w:t xml:space="preserve"> </w:t>
-      </w:r>
-      <w:r>
-        <w:t xml:space="preserve">solutions for a changing world (Alison, Owen and Belinda, Mike)</w:t>
+        <w:t xml:space="preserve">Here, we bring in what we can do with these models, I think we highlight some of the key elements of the solutions strand ideas where we can apply the models in the agricultural and natural space.</w:t>
       </w:r>
     </w:p>
     <w:p>
@@ -1527,11 +1541,51 @@
         <w:pStyle w:val="Compact"/>
         <w:numPr>
           <w:ilvl w:val="0"/>
+          <w:numId w:val="1009"/>
+        </w:numPr>
+      </w:pPr>
+      <w:r>
+        <w:t xml:space="preserve">Enhancing resilience</w:t>
+      </w:r>
+      <w:r>
+        <w:t xml:space="preserve"> </w:t>
+      </w:r>
+      <w:r>
+        <w:t xml:space="preserve">-</w:t>
+      </w:r>
+      <w:r>
+        <w:rPr>
+          <w:i/>
+          <w:iCs/>
+        </w:rPr>
+        <w:t xml:space="preserve">Selective breeding</w:t>
+      </w:r>
+      <w:r>
+        <w:t xml:space="preserve">: Artificial selection will be a useful avenue for both plants and animals to enhance thermal tolerance. Models can help evaluate how changes in sensitivity can cascade to influence community structure and function (Alison, Owen, Dani, Others)</w:t>
+      </w:r>
+    </w:p>
+    <w:p>
+      <w:pPr>
+        <w:pStyle w:val="Compact"/>
+        <w:numPr>
+          <w:ilvl w:val="1"/>
           <w:numId w:val="1010"/>
         </w:numPr>
       </w:pPr>
       <w:r>
-        <w:t xml:space="preserve">Here, we bring in what we can do with these models, I think we highlight some of the key elements of the solutions strand ideas where we can apply the models in the agricultural and natural space.</w:t>
+        <w:t xml:space="preserve">Microbial recruitment (Braj)</w:t>
+      </w:r>
+    </w:p>
+    <w:p>
+      <w:pPr>
+        <w:pStyle w:val="Compact"/>
+        <w:numPr>
+          <w:ilvl w:val="1"/>
+          <w:numId w:val="1010"/>
+        </w:numPr>
+      </w:pPr>
+      <w:r>
+        <w:t xml:space="preserve">Pollinator services (James, Margie)</w:t>
       </w:r>
     </w:p>
     <w:p>
@@ -1539,27 +1593,11 @@
         <w:pStyle w:val="Compact"/>
         <w:numPr>
           <w:ilvl w:val="0"/>
-          <w:numId w:val="1010"/>
+          <w:numId w:val="1009"/>
         </w:numPr>
       </w:pPr>
       <w:r>
-        <w:t xml:space="preserve">Enhancing resilience</w:t>
-      </w:r>
-      <w:r>
-        <w:t xml:space="preserve"> </w:t>
-      </w:r>
-      <w:r>
-        <w:t xml:space="preserve">-</w:t>
-      </w:r>
-      <w:r>
-        <w:rPr>
-          <w:i/>
-          <w:iCs/>
-        </w:rPr>
-        <w:t xml:space="preserve">Selective breeding</w:t>
-      </w:r>
-      <w:r>
-        <w:t xml:space="preserve">: Artificial selection will be a useful avenue for both plants and animals to enhance thermal tolerance. Models can help evaluate how changes in sensitivity can cascade to influence community structure and function (Alison, Owen, Dani, Others)</w:t>
+        <w:t xml:space="preserve">Cooler landscapes</w:t>
       </w:r>
     </w:p>
     <w:p>
@@ -1571,19 +1609,14 @@
         </w:numPr>
       </w:pPr>
       <w:r>
-        <w:t xml:space="preserve">Microbial recruitment (Braj)</w:t>
-      </w:r>
-    </w:p>
-    <w:p>
-      <w:pPr>
-        <w:pStyle w:val="Compact"/>
-        <w:numPr>
-          <w:ilvl w:val="1"/>
-          <w:numId w:val="1011"/>
-        </w:numPr>
-      </w:pPr>
-      <w:r>
-        <w:t xml:space="preserve">Pollinator services (James, Margie)</w:t>
+        <w:rPr>
+          <w:i/>
+          <w:iCs/>
+        </w:rPr>
+        <w:t xml:space="preserve">Cooler landscapes</w:t>
+      </w:r>
+      <w:r>
+        <w:t xml:space="preserve">: Landscapes can be designed to provide thermal refugia for plants and animals. For example, planting trees in urban areas can provide shade and reduce the urban heat island effect. Similarly, planting hedgerows in agricultural landscapes can provide thermal refugia for beneficial insects and pollinators. (Mike, Belinda)</w:t>
       </w:r>
     </w:p>
     <w:p>
@@ -1591,30 +1624,11 @@
         <w:pStyle w:val="Compact"/>
         <w:numPr>
           <w:ilvl w:val="0"/>
-          <w:numId w:val="1010"/>
+          <w:numId w:val="1009"/>
         </w:numPr>
       </w:pPr>
       <w:r>
-        <w:t xml:space="preserve">Cooler landscapes</w:t>
-      </w:r>
-    </w:p>
-    <w:p>
-      <w:pPr>
-        <w:pStyle w:val="Compact"/>
-        <w:numPr>
-          <w:ilvl w:val="1"/>
-          <w:numId w:val="1012"/>
-        </w:numPr>
-      </w:pPr>
-      <w:r>
-        <w:rPr>
-          <w:i/>
-          <w:iCs/>
-        </w:rPr>
-        <w:t xml:space="preserve">Cooler landscapes</w:t>
-      </w:r>
-      <w:r>
-        <w:t xml:space="preserve">: Landscapes can be designed to provide thermal refugia for plants and animals. For example, planting trees in urban areas can provide shade and reduce the urban heat island effect. Similarly, planting hedgerows in agricultural landscapes can provide thermal refugia for beneficial insects and pollinators. (Mike, Belinda)</w:t>
+        <w:t xml:space="preserve">Pest and disease prediction and control. (Ary)</w:t>
       </w:r>
     </w:p>
     <w:p>
@@ -1622,150 +1636,189 @@
         <w:pStyle w:val="Compact"/>
         <w:numPr>
           <w:ilvl w:val="0"/>
-          <w:numId w:val="1010"/>
+          <w:numId w:val="1009"/>
         </w:numPr>
       </w:pPr>
       <w:r>
-        <w:t xml:space="preserve">Pest and disease prediction and control. (Ary)</w:t>
-      </w:r>
-    </w:p>
-    <w:p>
-      <w:pPr>
-        <w:pStyle w:val="Compact"/>
-        <w:numPr>
-          <w:ilvl w:val="0"/>
-          <w:numId w:val="1010"/>
-        </w:numPr>
-      </w:pPr>
-      <w:r>
         <w:t xml:space="preserve">Conservation (Adrienne?)</w:t>
       </w:r>
     </w:p>
+    <w:bookmarkEnd w:id="30"/>
+    <w:bookmarkStart w:id="36" w:name="X78b08fde953bb9dcb9bb22555137d822070b4a9"/>
+    <w:p>
+      <w:pPr>
+        <w:pStyle w:val="Heading1"/>
+      </w:pPr>
+      <w:r>
+        <w:t xml:space="preserve">Future directions: modelling challenges, gaps and possible solutions</w:t>
+      </w:r>
+    </w:p>
+    <w:bookmarkStart w:id="31" w:name="Xfdf6778d6c1a7f88e581fd361ab93058637952f"/>
+    <w:p>
+      <w:pPr>
+        <w:pStyle w:val="Heading4"/>
+      </w:pPr>
+      <w:r>
+        <w:rPr>
+          <w:i/>
+          <w:iCs/>
+        </w:rPr>
+        <w:t xml:space="preserve">Data Limitations for Applying DEB Theory</w:t>
+      </w:r>
+      <w:r>
+        <w:t xml:space="preserve">: (Mike) Requires lots of information on a given species to model life-cycles, challenges in applying stage-structured populations (metamorphosis) others….Solutions?</w:t>
+      </w:r>
+    </w:p>
     <w:bookmarkEnd w:id="31"/>
-    <w:bookmarkStart w:id="37" w:name="X78b08fde953bb9dcb9bb22555137d822070b4a9"/>
+    <w:bookmarkStart w:id="32" w:name="X31af800422944976d7563c55da852b974856f47"/>
+    <w:p>
+      <w:pPr>
+        <w:pStyle w:val="Heading4"/>
+      </w:pPr>
+      <w:r>
+        <w:rPr>
+          <w:i/>
+          <w:iCs/>
+        </w:rPr>
+        <w:t xml:space="preserve">Better understanding of the mechanisms enhancing thermal tolerance in plants and animals</w:t>
+      </w:r>
+      <w:r>
+        <w:t xml:space="preserve">: We need to understand the genomic, cellular and physiological processes that confer greater thermal tolerance and help prepare organisms for future heat stress events.</w:t>
+      </w:r>
+    </w:p>
+    <w:bookmarkEnd w:id="32"/>
+    <w:bookmarkStart w:id="33" w:name="Xbb6a1781224964eec5409b3879f03550788dea1"/>
+    <w:p>
+      <w:pPr>
+        <w:pStyle w:val="Heading4"/>
+      </w:pPr>
+      <w:r>
+        <w:rPr>
+          <w:i/>
+          <w:iCs/>
+        </w:rPr>
+        <w:t xml:space="preserve">Behavioural responses to heat stress</w:t>
+      </w:r>
+      <w:r>
+        <w:t xml:space="preserve">: Animals behave. We need to model that. How do changes in behaviour impact interactions with other species and the environment. How might this impact plant productivity (Mike, Dan, DEB models)</w:t>
+      </w:r>
+    </w:p>
+    <w:bookmarkEnd w:id="33"/>
+    <w:bookmarkStart w:id="34" w:name="X013a5c9faa6938751e83865a615a83e4f32a47b"/>
+    <w:p>
+      <w:pPr>
+        <w:pStyle w:val="Heading4"/>
+      </w:pPr>
+      <w:r>
+        <w:rPr>
+          <w:i/>
+          <w:iCs/>
+        </w:rPr>
+        <w:t xml:space="preserve">Evolutionary dynamics leading to changes in thermal sensitivity and exposure</w:t>
+      </w:r>
+      <w:r>
+        <w:t xml:space="preserve">: We need to understand how thermal sensitivity and exposure will evolve in response to climate change. Probably could cite</w:t>
+      </w:r>
+      <w:r>
+        <w:t xml:space="preserve"> </w:t>
+      </w:r>
+      <w:r>
+        <w:t xml:space="preserve">[39]</w:t>
+      </w:r>
+      <w:r>
+        <w:t xml:space="preserve"> </w:t>
+      </w:r>
+      <w:r>
+        <w:t xml:space="preserve">(Ary)</w:t>
+      </w:r>
+    </w:p>
+    <w:bookmarkEnd w:id="34"/>
+    <w:bookmarkStart w:id="35" w:name="Xf716fb10002f9360210b8203424711763374548"/>
+    <w:p>
+      <w:pPr>
+        <w:pStyle w:val="Heading4"/>
+      </w:pPr>
+      <w:r>
+        <w:rPr>
+          <w:i/>
+          <w:iCs/>
+        </w:rPr>
+        <w:t xml:space="preserve">Trade-offs between thermal tolerance and other traits</w:t>
+      </w:r>
+      <w:r>
+        <w:t xml:space="preserve">: We need to understand the trade-offs between thermal tolerance and other traits such as growth rate, reproduction, and competitive ability. It is fine to confer greater thermal tolerance resistance but if this comes at a cost to reproduction, growth or biomass accumulation, then it may not be beneficial. (Dani, James, Brendan)</w:t>
+      </w:r>
+    </w:p>
+    <w:bookmarkEnd w:id="35"/>
+    <w:bookmarkEnd w:id="36"/>
+    <w:bookmarkStart w:id="77" w:name="references"/>
     <w:p>
       <w:pPr>
         <w:pStyle w:val="Heading1"/>
       </w:pPr>
       <w:r>
-        <w:t xml:space="preserve">Future directions: modelling challenges, gaps and possible solutions</w:t>
-      </w:r>
-    </w:p>
-    <w:bookmarkStart w:id="32" w:name="Xfdf6778d6c1a7f88e581fd361ab93058637952f"/>
-    <w:p>
-      <w:pPr>
-        <w:pStyle w:val="Heading4"/>
-      </w:pPr>
-      <w:r>
-        <w:rPr>
-          <w:i/>
-          <w:iCs/>
-        </w:rPr>
-        <w:t xml:space="preserve">Data Limitations for Applying DEB Theory</w:t>
-      </w:r>
-      <w:r>
-        <w:t xml:space="preserve">: (Mike) Requires lots of information on a given species to model life-cycles, challenges in applying stage-structured populations (metamorphosis) others….Solutions?</w:t>
-      </w:r>
-    </w:p>
-    <w:bookmarkEnd w:id="32"/>
-    <w:bookmarkStart w:id="33" w:name="X31af800422944976d7563c55da852b974856f47"/>
-    <w:p>
-      <w:pPr>
-        <w:pStyle w:val="Heading4"/>
-      </w:pPr>
-      <w:r>
-        <w:rPr>
-          <w:i/>
-          <w:iCs/>
-        </w:rPr>
-        <w:t xml:space="preserve">Better understanding of the mechanisms enhancing thermal tolerance in plants and animals</w:t>
-      </w:r>
-      <w:r>
-        <w:t xml:space="preserve">: We need to understand the genomic, cellular and physiological processes that confer greater thermal tolerance and help prepare organisms for future heat stress events.</w:t>
-      </w:r>
-    </w:p>
-    <w:bookmarkEnd w:id="33"/>
-    <w:bookmarkStart w:id="34" w:name="Xbb6a1781224964eec5409b3879f03550788dea1"/>
-    <w:p>
-      <w:pPr>
-        <w:pStyle w:val="Heading4"/>
-      </w:pPr>
-      <w:r>
-        <w:rPr>
-          <w:i/>
-          <w:iCs/>
-        </w:rPr>
-        <w:t xml:space="preserve">Behavioural responses to heat stress</w:t>
-      </w:r>
-      <w:r>
-        <w:t xml:space="preserve">: Animals behave. We need to model that. How do changes in behaviour impact interactions with other species and the environment. How might this impact plant productivity (Mike, Dan, DEB models)</w:t>
-      </w:r>
-    </w:p>
-    <w:bookmarkEnd w:id="34"/>
-    <w:bookmarkStart w:id="35" w:name="X013a5c9faa6938751e83865a615a83e4f32a47b"/>
-    <w:p>
-      <w:pPr>
-        <w:pStyle w:val="Heading4"/>
-      </w:pPr>
-      <w:r>
-        <w:rPr>
-          <w:i/>
-          <w:iCs/>
-        </w:rPr>
-        <w:t xml:space="preserve">Evolutionary dynamics leading to changes in thermal sensitivity and exposure</w:t>
-      </w:r>
-      <w:r>
-        <w:t xml:space="preserve">: We need to understand how thermal sensitivity and exposure will evolve in response to climate change. Probably could cite</w:t>
-      </w:r>
-      <w:r>
-        <w:t xml:space="preserve"> </w:t>
-      </w:r>
-      <w:r>
-        <w:t xml:space="preserve">[38]</w:t>
-      </w:r>
-      <w:r>
-        <w:t xml:space="preserve"> </w:t>
-      </w:r>
-      <w:r>
-        <w:t xml:space="preserve">(Ary)</w:t>
-      </w:r>
-    </w:p>
-    <w:bookmarkEnd w:id="35"/>
-    <w:bookmarkStart w:id="36" w:name="Xf716fb10002f9360210b8203424711763374548"/>
-    <w:p>
-      <w:pPr>
-        <w:pStyle w:val="Heading4"/>
-      </w:pPr>
-      <w:r>
-        <w:rPr>
-          <w:i/>
-          <w:iCs/>
-        </w:rPr>
-        <w:t xml:space="preserve">Trade-offs between thermal tolerance and other traits</w:t>
-      </w:r>
-      <w:r>
-        <w:t xml:space="preserve">: We need to understand the trade-offs between thermal tolerance and other traits such as growth rate, reproduction, and competitive ability. It is fine to confer greater thermal tolerance resistance but if this comes at a cost to reproduction, growth or biomass accumulation, then it may not be beneficial. (Dani, James, Brendan)</w:t>
-      </w:r>
-    </w:p>
-    <w:bookmarkEnd w:id="36"/>
+        <w:t xml:space="preserve">References</w:t>
+      </w:r>
+    </w:p>
+    <w:bookmarkStart w:id="76" w:name="refs"/>
+    <w:bookmarkStart w:id="37" w:name="ref-barriopedro2023heat"/>
+    <w:p>
+      <w:pPr>
+        <w:pStyle w:val="Bibliography"/>
+      </w:pPr>
+      <w:r>
+        <w:t xml:space="preserve">1.</w:t>
+      </w:r>
+      <w:r>
+        <w:t xml:space="preserve"> </w:t>
+      </w:r>
+      <w:r>
+        <w:t xml:space="preserve">	</w:t>
+      </w:r>
+      <w:r>
+        <w:t xml:space="preserve">Barriopedro, D.</w:t>
+      </w:r>
+      <w:r>
+        <w:t xml:space="preserve"> </w:t>
+      </w:r>
+      <w:r>
+        <w:rPr>
+          <w:i/>
+          <w:iCs/>
+        </w:rPr>
+        <w:t xml:space="preserve">et al.</w:t>
+      </w:r>
+      <w:r>
+        <w:t xml:space="preserve"> </w:t>
+      </w:r>
+      <w:r>
+        <w:t xml:space="preserve">(2023) Heat waves: Physical understanding and scientific challenges.</w:t>
+      </w:r>
+      <w:r>
+        <w:t xml:space="preserve"> </w:t>
+      </w:r>
+      <w:r>
+        <w:rPr>
+          <w:i/>
+          <w:iCs/>
+        </w:rPr>
+        <w:t xml:space="preserve">Reviews of Geophysics</w:t>
+      </w:r>
+      <w:r>
+        <w:t xml:space="preserve"> </w:t>
+      </w:r>
+      <w:r>
+        <w:t xml:space="preserve">61, e2022RG000780</w:t>
+      </w:r>
+    </w:p>
     <w:bookmarkEnd w:id="37"/>
-    <w:bookmarkStart w:id="77" w:name="references"/>
-    <w:p>
-      <w:pPr>
-        <w:pStyle w:val="Heading1"/>
-      </w:pPr>
-      <w:r>
-        <w:t xml:space="preserve">References</w:t>
-      </w:r>
-    </w:p>
-    <w:bookmarkStart w:id="76" w:name="refs"/>
-    <w:bookmarkStart w:id="38" w:name="ref-barriopedro2023heat"/>
+    <w:bookmarkStart w:id="38" w:name="ref-aglas2024recent"/>
     <w:p>
       <w:pPr>
         <w:pStyle w:val="Bibliography"/>
       </w:pPr>
       <w:r>
-        <w:t xml:space="preserve">1.</w:t>
+        <w:t xml:space="preserve">2.</w:t>
       </w:r>
       <w:r>
         <w:t xml:space="preserve"> </w:t>
@@ -1774,7 +1827,7 @@
         <w:t xml:space="preserve">	</w:t>
       </w:r>
       <w:r>
-        <w:t xml:space="preserve">Barriopedro, D.</w:t>
+        <w:t xml:space="preserve">Aglas-Leitner, P.</w:t>
       </w:r>
       <w:r>
         <w:t xml:space="preserve"> </w:t>
@@ -1790,33 +1843,30 @@
         <w:t xml:space="preserve"> </w:t>
       </w:r>
       <w:r>
-        <w:t xml:space="preserve">(2023) Heat waves: Physical understanding and scientific challenges.</w:t>
-      </w:r>
-      <w:r>
-        <w:t xml:space="preserve"> </w:t>
-      </w:r>
-      <w:r>
-        <w:rPr>
-          <w:i/>
-          <w:iCs/>
-        </w:rPr>
-        <w:t xml:space="preserve">Reviews of Geophysics</w:t>
-      </w:r>
-      <w:r>
-        <w:t xml:space="preserve"> </w:t>
-      </w:r>
-      <w:r>
-        <w:t xml:space="preserve">61, e2022RG000780</w:t>
+        <w:t xml:space="preserve">(2024)</w:t>
+      </w:r>
+      <w:r>
+        <w:t xml:space="preserve"> </w:t>
+      </w:r>
+      <w:r>
+        <w:rPr>
+          <w:i/>
+          <w:iCs/>
+        </w:rPr>
+        <w:t xml:space="preserve">Recent extreme heatwaves dwarfed by projected future events</w:t>
+      </w:r>
+      <w:r>
+        <w:t xml:space="preserve">, Copernicus Meetings</w:t>
       </w:r>
     </w:p>
     <w:bookmarkEnd w:id="38"/>
-    <w:bookmarkStart w:id="39" w:name="ref-aglas2024recent"/>
+    <w:bookmarkStart w:id="39" w:name="ref-reichstein2007reduction"/>
     <w:p>
       <w:pPr>
         <w:pStyle w:val="Bibliography"/>
       </w:pPr>
       <w:r>
-        <w:t xml:space="preserve">2.</w:t>
+        <w:t xml:space="preserve">3.</w:t>
       </w:r>
       <w:r>
         <w:t xml:space="preserve"> </w:t>
@@ -1825,7 +1875,7 @@
         <w:t xml:space="preserve">	</w:t>
       </w:r>
       <w:r>
-        <w:t xml:space="preserve">Aglas-Leitner, P.</w:t>
+        <w:t xml:space="preserve">Reichstein, M.</w:t>
       </w:r>
       <w:r>
         <w:t xml:space="preserve"> </w:t>
@@ -1841,30 +1891,33 @@
         <w:t xml:space="preserve"> </w:t>
       </w:r>
       <w:r>
-        <w:t xml:space="preserve">(2024)</w:t>
-      </w:r>
-      <w:r>
-        <w:t xml:space="preserve"> </w:t>
-      </w:r>
-      <w:r>
-        <w:rPr>
-          <w:i/>
-          <w:iCs/>
-        </w:rPr>
-        <w:t xml:space="preserve">Recent extreme heatwaves dwarfed by projected future events</w:t>
-      </w:r>
-      <w:r>
-        <w:t xml:space="preserve">, Copernicus Meetings</w:t>
+        <w:t xml:space="preserve">(2007) Reduction of ecosystem productivity and respiration during the european summer 2003 climate anomaly: A joint flux tower, remote sensing and modelling analysis.</w:t>
+      </w:r>
+      <w:r>
+        <w:t xml:space="preserve"> </w:t>
+      </w:r>
+      <w:r>
+        <w:rPr>
+          <w:i/>
+          <w:iCs/>
+        </w:rPr>
+        <w:t xml:space="preserve">Global Change Biology</w:t>
+      </w:r>
+      <w:r>
+        <w:t xml:space="preserve"> </w:t>
+      </w:r>
+      <w:r>
+        <w:t xml:space="preserve">13, 634–651</w:t>
       </w:r>
     </w:p>
     <w:bookmarkEnd w:id="39"/>
-    <w:bookmarkStart w:id="40" w:name="ref-reichstein2007reduction"/>
+    <w:bookmarkStart w:id="40" w:name="ref-margalef2020relationship"/>
     <w:p>
       <w:pPr>
         <w:pStyle w:val="Bibliography"/>
       </w:pPr>
       <w:r>
-        <w:t xml:space="preserve">3.</w:t>
+        <w:t xml:space="preserve">4.</w:t>
       </w:r>
       <w:r>
         <w:t xml:space="preserve"> </w:t>
@@ -1873,7 +1926,7 @@
         <w:t xml:space="preserve">	</w:t>
       </w:r>
       <w:r>
-        <w:t xml:space="preserve">Reichstein, M.</w:t>
+        <w:t xml:space="preserve">Margalef-Marrase, J.</w:t>
       </w:r>
       <w:r>
         <w:t xml:space="preserve"> </w:t>
@@ -1889,7 +1942,7 @@
         <w:t xml:space="preserve"> </w:t>
       </w:r>
       <w:r>
-        <w:t xml:space="preserve">(2007) Reduction of ecosystem productivity and respiration during the european summer 2003 climate anomaly: A joint flux tower, remote sensing and modelling analysis.</w:t>
+        <w:t xml:space="preserve">(2020) Relationship between heatwave-induced forest die-off and climatic suitability in multiple tree species.</w:t>
       </w:r>
       <w:r>
         <w:t xml:space="preserve"> </w:t>
@@ -1905,17 +1958,17 @@
         <w:t xml:space="preserve"> </w:t>
       </w:r>
       <w:r>
-        <w:t xml:space="preserve">13, 634–651</w:t>
+        <w:t xml:space="preserve">26, 3134–3146</w:t>
       </w:r>
     </w:p>
     <w:bookmarkEnd w:id="40"/>
-    <w:bookmarkStart w:id="41" w:name="ref-margalef2020relationship"/>
+    <w:bookmarkStart w:id="41" w:name="ref-kazenel2024heat"/>
     <w:p>
       <w:pPr>
         <w:pStyle w:val="Bibliography"/>
       </w:pPr>
       <w:r>
-        <w:t xml:space="preserve">4.</w:t>
+        <w:t xml:space="preserve">5.</w:t>
       </w:r>
       <w:r>
         <w:t xml:space="preserve"> </w:t>
@@ -1924,7 +1977,7 @@
         <w:t xml:space="preserve">	</w:t>
       </w:r>
       <w:r>
-        <w:t xml:space="preserve">Margalef-Marrase, J.</w:t>
+        <w:t xml:space="preserve">Kazenel, M.R.</w:t>
       </w:r>
       <w:r>
         <w:t xml:space="preserve"> </w:t>
@@ -1940,7 +1993,189 @@
         <w:t xml:space="preserve"> </w:t>
       </w:r>
       <w:r>
-        <w:t xml:space="preserve">(2020) Relationship between heatwave-induced forest die-off and climatic suitability in multiple tree species.</w:t>
+        <w:t xml:space="preserve">(2024) Heat and desiccation tolerances predict bee abundance under climate change.</w:t>
+      </w:r>
+      <w:r>
+        <w:t xml:space="preserve"> </w:t>
+      </w:r>
+      <w:r>
+        <w:rPr>
+          <w:i/>
+          <w:iCs/>
+        </w:rPr>
+        <w:t xml:space="preserve">Nature</w:t>
+      </w:r>
+    </w:p>
+    <w:bookmarkEnd w:id="41"/>
+    <w:bookmarkStart w:id="42" w:name="ref-zhao2017temperature"/>
+    <w:p>
+      <w:pPr>
+        <w:pStyle w:val="Bibliography"/>
+      </w:pPr>
+      <w:r>
+        <w:t xml:space="preserve">6.</w:t>
+      </w:r>
+      <w:r>
+        <w:t xml:space="preserve"> </w:t>
+      </w:r>
+      <w:r>
+        <w:t xml:space="preserve">	</w:t>
+      </w:r>
+      <w:r>
+        <w:t xml:space="preserve">Zhao, C.</w:t>
+      </w:r>
+      <w:r>
+        <w:t xml:space="preserve"> </w:t>
+      </w:r>
+      <w:r>
+        <w:rPr>
+          <w:i/>
+          <w:iCs/>
+        </w:rPr>
+        <w:t xml:space="preserve">et al.</w:t>
+      </w:r>
+      <w:r>
+        <w:t xml:space="preserve"> </w:t>
+      </w:r>
+      <w:r>
+        <w:t xml:space="preserve">(2017) Temperature increase reduces global yields of major crops in four independent estimates.</w:t>
+      </w:r>
+      <w:r>
+        <w:t xml:space="preserve"> </w:t>
+      </w:r>
+      <w:r>
+        <w:rPr>
+          <w:i/>
+          <w:iCs/>
+        </w:rPr>
+        <w:t xml:space="preserve">Proceedings of the National Academy of sciences</w:t>
+      </w:r>
+      <w:r>
+        <w:t xml:space="preserve"> </w:t>
+      </w:r>
+      <w:r>
+        <w:t xml:space="preserve">114, 9326–9331</w:t>
+      </w:r>
+    </w:p>
+    <w:bookmarkEnd w:id="42"/>
+    <w:bookmarkStart w:id="43" w:name="ref-tito2018global"/>
+    <w:p>
+      <w:pPr>
+        <w:pStyle w:val="Bibliography"/>
+      </w:pPr>
+      <w:r>
+        <w:t xml:space="preserve">7.</w:t>
+      </w:r>
+      <w:r>
+        <w:t xml:space="preserve"> </w:t>
+      </w:r>
+      <w:r>
+        <w:t xml:space="preserve">	</w:t>
+      </w:r>
+      <w:r>
+        <w:t xml:space="preserve">Tito, R.</w:t>
+      </w:r>
+      <w:r>
+        <w:t xml:space="preserve"> </w:t>
+      </w:r>
+      <w:r>
+        <w:rPr>
+          <w:i/>
+          <w:iCs/>
+        </w:rPr>
+        <w:t xml:space="preserve">et al.</w:t>
+      </w:r>
+      <w:r>
+        <w:t xml:space="preserve"> </w:t>
+      </w:r>
+      <w:r>
+        <w:t xml:space="preserve">(2018) Global climate change increases risk of crop yield losses and food insecurity in the tropical andes.</w:t>
+      </w:r>
+      <w:r>
+        <w:t xml:space="preserve"> </w:t>
+      </w:r>
+      <w:r>
+        <w:rPr>
+          <w:i/>
+          <w:iCs/>
+        </w:rPr>
+        <w:t xml:space="preserve">Global change biology</w:t>
+      </w:r>
+      <w:r>
+        <w:t xml:space="preserve"> </w:t>
+      </w:r>
+      <w:r>
+        <w:t xml:space="preserve">24, e592–e602</w:t>
+      </w:r>
+    </w:p>
+    <w:bookmarkEnd w:id="43"/>
+    <w:bookmarkStart w:id="44" w:name="ref-bastos2014analysing"/>
+    <w:p>
+      <w:pPr>
+        <w:pStyle w:val="Bibliography"/>
+      </w:pPr>
+      <w:r>
+        <w:t xml:space="preserve">8.</w:t>
+      </w:r>
+      <w:r>
+        <w:t xml:space="preserve"> </w:t>
+      </w:r>
+      <w:r>
+        <w:t xml:space="preserve">	</w:t>
+      </w:r>
+      <w:r>
+        <w:t xml:space="preserve">Bastos, A.</w:t>
+      </w:r>
+      <w:r>
+        <w:t xml:space="preserve"> </w:t>
+      </w:r>
+      <w:r>
+        <w:rPr>
+          <w:i/>
+          <w:iCs/>
+        </w:rPr>
+        <w:t xml:space="preserve">et al.</w:t>
+      </w:r>
+      <w:r>
+        <w:t xml:space="preserve"> </w:t>
+      </w:r>
+      <w:r>
+        <w:t xml:space="preserve">(2014) Analysing the spatio-temporal impacts of the 2003 and 2010 extreme heatwaves on plant productivity in europe.</w:t>
+      </w:r>
+      <w:r>
+        <w:t xml:space="preserve"> </w:t>
+      </w:r>
+      <w:r>
+        <w:rPr>
+          <w:i/>
+          <w:iCs/>
+        </w:rPr>
+        <w:t xml:space="preserve">Biogeosciences</w:t>
+      </w:r>
+      <w:r>
+        <w:t xml:space="preserve"> </w:t>
+      </w:r>
+      <w:r>
+        <w:t xml:space="preserve">11, 3421–3435</w:t>
+      </w:r>
+    </w:p>
+    <w:bookmarkEnd w:id="44"/>
+    <w:bookmarkStart w:id="45" w:name="ref-hesketh2023extreme"/>
+    <w:p>
+      <w:pPr>
+        <w:pStyle w:val="Bibliography"/>
+      </w:pPr>
+      <w:r>
+        <w:t xml:space="preserve">9.</w:t>
+      </w:r>
+      <w:r>
+        <w:t xml:space="preserve"> </w:t>
+      </w:r>
+      <w:r>
+        <w:t xml:space="preserve">	</w:t>
+      </w:r>
+      <w:r>
+        <w:t xml:space="preserve">Hesketh, A.V. and Harley, C.D. (2023) Extreme heatwave drives topography-dependent patterns of mortality in a bed-forming intertidal barnacle, with implications for associated community structure.</w:t>
       </w:r>
       <w:r>
         <w:t xml:space="preserve"> </w:t>
@@ -1956,17 +2191,17 @@
         <w:t xml:space="preserve"> </w:t>
       </w:r>
       <w:r>
-        <w:t xml:space="preserve">26, 3134–3146</w:t>
-      </w:r>
-    </w:p>
-    <w:bookmarkEnd w:id="41"/>
-    <w:bookmarkStart w:id="42" w:name="ref-kazenel2024heat"/>
+        <w:t xml:space="preserve">29, 165–178</w:t>
+      </w:r>
+    </w:p>
+    <w:bookmarkEnd w:id="45"/>
+    <w:bookmarkStart w:id="46" w:name="ref-martinez2024ecological"/>
     <w:p>
       <w:pPr>
         <w:pStyle w:val="Bibliography"/>
       </w:pPr>
       <w:r>
-        <w:t xml:space="preserve">5.</w:t>
+        <w:t xml:space="preserve">10.</w:t>
       </w:r>
       <w:r>
         <w:t xml:space="preserve"> </w:t>
@@ -1975,7 +2210,36 @@
         <w:t xml:space="preserve">	</w:t>
       </w:r>
       <w:r>
-        <w:t xml:space="preserve">Kazenel, M.R.</w:t>
+        <w:t xml:space="preserve">Martı́nez-De León, G. and Thakur, M.P. (2024) Ecological debts induced by heat extremes.</w:t>
+      </w:r>
+      <w:r>
+        <w:t xml:space="preserve"> </w:t>
+      </w:r>
+      <w:r>
+        <w:rPr>
+          <w:i/>
+          <w:iCs/>
+        </w:rPr>
+        <w:t xml:space="preserve">Trends in Ecology &amp; Evolution</w:t>
+      </w:r>
+    </w:p>
+    <w:bookmarkEnd w:id="46"/>
+    <w:bookmarkStart w:id="47" w:name="ref-rezende2020predicting"/>
+    <w:p>
+      <w:pPr>
+        <w:pStyle w:val="Bibliography"/>
+      </w:pPr>
+      <w:r>
+        <w:t xml:space="preserve">11.</w:t>
+      </w:r>
+      <w:r>
+        <w:t xml:space="preserve"> </w:t>
+      </w:r>
+      <w:r>
+        <w:t xml:space="preserve">	</w:t>
+      </w:r>
+      <w:r>
+        <w:t xml:space="preserve">Rezende, E.L.</w:t>
       </w:r>
       <w:r>
         <w:t xml:space="preserve"> </w:t>
@@ -1991,27 +2255,33 @@
         <w:t xml:space="preserve"> </w:t>
       </w:r>
       <w:r>
-        <w:t xml:space="preserve">(2024) Heat and desiccation tolerances predict bee abundance under climate change.</w:t>
-      </w:r>
-      <w:r>
-        <w:t xml:space="preserve"> </w:t>
-      </w:r>
-      <w:r>
-        <w:rPr>
-          <w:i/>
-          <w:iCs/>
-        </w:rPr>
-        <w:t xml:space="preserve">Nature</w:t>
-      </w:r>
-    </w:p>
-    <w:bookmarkEnd w:id="42"/>
-    <w:bookmarkStart w:id="43" w:name="ref-zhao2017temperature"/>
+        <w:t xml:space="preserve">(2020) Predicting temperature mortality and selection in natural drosophila populations.</w:t>
+      </w:r>
+      <w:r>
+        <w:t xml:space="preserve"> </w:t>
+      </w:r>
+      <w:r>
+        <w:rPr>
+          <w:i/>
+          <w:iCs/>
+        </w:rPr>
+        <w:t xml:space="preserve">Science</w:t>
+      </w:r>
+      <w:r>
+        <w:t xml:space="preserve"> </w:t>
+      </w:r>
+      <w:r>
+        <w:t xml:space="preserve">369, 1242–1245</w:t>
+      </w:r>
+    </w:p>
+    <w:bookmarkEnd w:id="47"/>
+    <w:bookmarkStart w:id="48" w:name="ref-orsted2024thermal"/>
     <w:p>
       <w:pPr>
         <w:pStyle w:val="Bibliography"/>
       </w:pPr>
       <w:r>
-        <w:t xml:space="preserve">6.</w:t>
+        <w:t xml:space="preserve">12.</w:t>
       </w:r>
       <w:r>
         <w:t xml:space="preserve"> </w:t>
@@ -2020,7 +2290,7 @@
         <w:t xml:space="preserve">	</w:t>
       </w:r>
       <w:r>
-        <w:t xml:space="preserve">Zhao, C.</w:t>
+        <w:t xml:space="preserve">Ørsted, M.</w:t>
       </w:r>
       <w:r>
         <w:t xml:space="preserve"> </w:t>
@@ -2036,33 +2306,33 @@
         <w:t xml:space="preserve"> </w:t>
       </w:r>
       <w:r>
-        <w:t xml:space="preserve">(2017) Temperature increase reduces global yields of major crops in four independent estimates.</w:t>
-      </w:r>
-      <w:r>
-        <w:t xml:space="preserve"> </w:t>
-      </w:r>
-      <w:r>
-        <w:rPr>
-          <w:i/>
-          <w:iCs/>
-        </w:rPr>
-        <w:t xml:space="preserve">Proceedings of the National Academy of sciences</w:t>
-      </w:r>
-      <w:r>
-        <w:t xml:space="preserve"> </w:t>
-      </w:r>
-      <w:r>
-        <w:t xml:space="preserve">114, 9326–9331</w:t>
-      </w:r>
-    </w:p>
-    <w:bookmarkEnd w:id="43"/>
-    <w:bookmarkStart w:id="44" w:name="ref-tito2018global"/>
+        <w:t xml:space="preserve">(2024) Thermal limits of survival and reproduction depend on stress duration: A case study of drosophila suzukii.</w:t>
+      </w:r>
+      <w:r>
+        <w:t xml:space="preserve"> </w:t>
+      </w:r>
+      <w:r>
+        <w:rPr>
+          <w:i/>
+          <w:iCs/>
+        </w:rPr>
+        <w:t xml:space="preserve">Ecology Letters</w:t>
+      </w:r>
+      <w:r>
+        <w:t xml:space="preserve"> </w:t>
+      </w:r>
+      <w:r>
+        <w:t xml:space="preserve">27, e14421</w:t>
+      </w:r>
+    </w:p>
+    <w:bookmarkEnd w:id="48"/>
+    <w:bookmarkStart w:id="49" w:name="ref-lopez2024heat"/>
     <w:p>
       <w:pPr>
         <w:pStyle w:val="Bibliography"/>
       </w:pPr>
       <w:r>
-        <w:t xml:space="preserve">7.</w:t>
+        <w:t xml:space="preserve">13.</w:t>
       </w:r>
       <w:r>
         <w:t xml:space="preserve"> </w:t>
@@ -2071,7 +2341,7 @@
         <w:t xml:space="preserve">	</w:t>
       </w:r>
       <w:r>
-        <w:t xml:space="preserve">Tito, R.</w:t>
+        <w:t xml:space="preserve">López-Goldar, X.</w:t>
       </w:r>
       <w:r>
         <w:t xml:space="preserve"> </w:t>
@@ -2087,33 +2357,27 @@
         <w:t xml:space="preserve"> </w:t>
       </w:r>
       <w:r>
-        <w:t xml:space="preserve">(2018) Global climate change increases risk of crop yield losses and food insecurity in the tropical andes.</w:t>
-      </w:r>
-      <w:r>
-        <w:t xml:space="preserve"> </w:t>
-      </w:r>
-      <w:r>
-        <w:rPr>
-          <w:i/>
-          <w:iCs/>
-        </w:rPr>
-        <w:t xml:space="preserve">Global change biology</w:t>
-      </w:r>
-      <w:r>
-        <w:t xml:space="preserve"> </w:t>
-      </w:r>
-      <w:r>
-        <w:t xml:space="preserve">24, e592–e602</w:t>
-      </w:r>
-    </w:p>
-    <w:bookmarkEnd w:id="44"/>
-    <w:bookmarkStart w:id="45" w:name="ref-bastos2014analysing"/>
+        <w:t xml:space="preserve">(2024) Heat waves induce milkweed resistance to a specialist herbivore via increased toxicity and reduced nutrient content.</w:t>
+      </w:r>
+      <w:r>
+        <w:t xml:space="preserve"> </w:t>
+      </w:r>
+      <w:r>
+        <w:rPr>
+          <w:i/>
+          <w:iCs/>
+        </w:rPr>
+        <w:t xml:space="preserve">Plant, Cell &amp; Environment</w:t>
+      </w:r>
+    </w:p>
+    <w:bookmarkEnd w:id="49"/>
+    <w:bookmarkStart w:id="50" w:name="ref-huỳnh2024heatwave"/>
     <w:p>
       <w:pPr>
         <w:pStyle w:val="Bibliography"/>
       </w:pPr>
       <w:r>
-        <w:t xml:space="preserve">8.</w:t>
+        <w:t xml:space="preserve">14.</w:t>
       </w:r>
       <w:r>
         <w:t xml:space="preserve"> </w:t>
@@ -2122,7 +2386,7 @@
         <w:t xml:space="preserve">	</w:t>
       </w:r>
       <w:r>
-        <w:t xml:space="preserve">Bastos, A.</w:t>
+        <w:t xml:space="preserve">Huỳnh, T.-H.</w:t>
       </w:r>
       <w:r>
         <w:t xml:space="preserve"> </w:t>
@@ -2138,33 +2402,33 @@
         <w:t xml:space="preserve"> </w:t>
       </w:r>
       <w:r>
-        <w:t xml:space="preserve">(2014) Analysing the spatio-temporal impacts of the 2003 and 2010 extreme heatwaves on plant productivity in europe.</w:t>
-      </w:r>
-      <w:r>
-        <w:t xml:space="preserve"> </w:t>
-      </w:r>
-      <w:r>
-        <w:rPr>
-          <w:i/>
-          <w:iCs/>
-        </w:rPr>
-        <w:t xml:space="preserve">Biogeosciences</w:t>
-      </w:r>
-      <w:r>
-        <w:t xml:space="preserve"> </w:t>
-      </w:r>
-      <w:r>
-        <w:t xml:space="preserve">11, 3421–3435</w:t>
-      </w:r>
-    </w:p>
-    <w:bookmarkEnd w:id="45"/>
-    <w:bookmarkStart w:id="46" w:name="ref-hesketh2023extreme"/>
+        <w:t xml:space="preserve">(2024) Heatwave-induced functional shifts in zooplankton communities result in weaker top-down control on phytoplankton.</w:t>
+      </w:r>
+      <w:r>
+        <w:t xml:space="preserve"> </w:t>
+      </w:r>
+      <w:r>
+        <w:rPr>
+          <w:i/>
+          <w:iCs/>
+        </w:rPr>
+        <w:t xml:space="preserve">Ecology and Evolution</w:t>
+      </w:r>
+      <w:r>
+        <w:t xml:space="preserve"> </w:t>
+      </w:r>
+      <w:r>
+        <w:t xml:space="preserve">14, e70096</w:t>
+      </w:r>
+    </w:p>
+    <w:bookmarkEnd w:id="50"/>
+    <w:bookmarkStart w:id="51" w:name="ref-trivedi2022plant"/>
     <w:p>
       <w:pPr>
         <w:pStyle w:val="Bibliography"/>
       </w:pPr>
       <w:r>
-        <w:t xml:space="preserve">9.</w:t>
+        <w:t xml:space="preserve">15.</w:t>
       </w:r>
       <w:r>
         <w:t xml:space="preserve"> </w:t>
@@ -2173,7 +2437,199 @@
         <w:t xml:space="preserve">	</w:t>
       </w:r>
       <w:r>
-        <w:t xml:space="preserve">Hesketh, A.V. and Harley, C.D. (2023) Extreme heatwave drives topography-dependent patterns of mortality in a bed-forming intertidal barnacle, with implications for associated community structure.</w:t>
+        <w:t xml:space="preserve">Trivedi, P.</w:t>
+      </w:r>
+      <w:r>
+        <w:t xml:space="preserve"> </w:t>
+      </w:r>
+      <w:r>
+        <w:rPr>
+          <w:i/>
+          <w:iCs/>
+        </w:rPr>
+        <w:t xml:space="preserve">et al.</w:t>
+      </w:r>
+      <w:r>
+        <w:t xml:space="preserve"> </w:t>
+      </w:r>
+      <w:r>
+        <w:t xml:space="preserve">(2022) Plant–microbiome interactions under a changing world: Responses, consequences and perspectives.</w:t>
+      </w:r>
+      <w:r>
+        <w:t xml:space="preserve"> </w:t>
+      </w:r>
+      <w:r>
+        <w:rPr>
+          <w:i/>
+          <w:iCs/>
+        </w:rPr>
+        <w:t xml:space="preserve">New Phytologist</w:t>
+      </w:r>
+      <w:r>
+        <w:t xml:space="preserve"> </w:t>
+      </w:r>
+      <w:r>
+        <w:t xml:space="preserve">234, 1951–1959</w:t>
+      </w:r>
+    </w:p>
+    <w:bookmarkEnd w:id="51"/>
+    <w:bookmarkStart w:id="52" w:name="ref-kooijman2010dynamic"/>
+    <w:p>
+      <w:pPr>
+        <w:pStyle w:val="Bibliography"/>
+      </w:pPr>
+      <w:r>
+        <w:t xml:space="preserve">16.</w:t>
+      </w:r>
+      <w:r>
+        <w:t xml:space="preserve"> </w:t>
+      </w:r>
+      <w:r>
+        <w:t xml:space="preserve">	</w:t>
+      </w:r>
+      <w:r>
+        <w:t xml:space="preserve">Kooijman, S.A.L.M. (2010)</w:t>
+      </w:r>
+      <w:r>
+        <w:t xml:space="preserve"> </w:t>
+      </w:r>
+      <w:r>
+        <w:rPr>
+          <w:i/>
+          <w:iCs/>
+        </w:rPr>
+        <w:t xml:space="preserve">Dynamic energy budget theory for metabolic organisation</w:t>
+      </w:r>
+      <w:r>
+        <w:t xml:space="preserve">, Cambridge university press</w:t>
+      </w:r>
+    </w:p>
+    <w:bookmarkEnd w:id="52"/>
+    <w:bookmarkStart w:id="53" w:name="ref-kearney2009mechanistic"/>
+    <w:p>
+      <w:pPr>
+        <w:pStyle w:val="Bibliography"/>
+      </w:pPr>
+      <w:r>
+        <w:t xml:space="preserve">17.</w:t>
+      </w:r>
+      <w:r>
+        <w:t xml:space="preserve"> </w:t>
+      </w:r>
+      <w:r>
+        <w:t xml:space="preserve">	</w:t>
+      </w:r>
+      <w:r>
+        <w:t xml:space="preserve">Kearney, M. and Porter, W. (2009) Mechanistic niche modelling: Combining physiological and spatial data to predict species’ ranges.</w:t>
+      </w:r>
+      <w:r>
+        <w:t xml:space="preserve"> </w:t>
+      </w:r>
+      <w:r>
+        <w:rPr>
+          <w:i/>
+          <w:iCs/>
+        </w:rPr>
+        <w:t xml:space="preserve">Ecology letters</w:t>
+      </w:r>
+      <w:r>
+        <w:t xml:space="preserve"> </w:t>
+      </w:r>
+      <w:r>
+        <w:t xml:space="preserve">12, 334–350</w:t>
+      </w:r>
+    </w:p>
+    <w:bookmarkEnd w:id="53"/>
+    <w:bookmarkStart w:id="54" w:name="ref-jusup2024untapped"/>
+    <w:p>
+      <w:pPr>
+        <w:pStyle w:val="Bibliography"/>
+      </w:pPr>
+      <w:r>
+        <w:t xml:space="preserve">18.</w:t>
+      </w:r>
+      <w:r>
+        <w:t xml:space="preserve"> </w:t>
+      </w:r>
+      <w:r>
+        <w:t xml:space="preserve">	</w:t>
+      </w:r>
+      <w:r>
+        <w:t xml:space="preserve">Jusup, M. and Kearney, M.R. (2024) The untapped power of a general theory of organismal metabolism.</w:t>
+      </w:r>
+      <w:r>
+        <w:t xml:space="preserve"> </w:t>
+      </w:r>
+      <w:r>
+        <w:rPr>
+          <w:i/>
+          <w:iCs/>
+        </w:rPr>
+        <w:t xml:space="preserve">arXiv preprint arXiv:2408.13998</w:t>
+      </w:r>
+    </w:p>
+    <w:bookmarkEnd w:id="54"/>
+    <w:bookmarkStart w:id="55" w:name="ref-kearney2024fast"/>
+    <w:p>
+      <w:pPr>
+        <w:pStyle w:val="Bibliography"/>
+      </w:pPr>
+      <w:r>
+        <w:t xml:space="preserve">19.</w:t>
+      </w:r>
+      <w:r>
+        <w:t xml:space="preserve"> </w:t>
+      </w:r>
+      <w:r>
+        <w:t xml:space="preserve">	</w:t>
+      </w:r>
+      <w:r>
+        <w:t xml:space="preserve">Kearney, M.R. and Leigh, A. (2024) Fast, accurate and accessible calculations of leaf temperature and its physiological consequences with NicheMapR.</w:t>
+      </w:r>
+      <w:r>
+        <w:t xml:space="preserve"> </w:t>
+      </w:r>
+      <w:r>
+        <w:rPr>
+          <w:i/>
+          <w:iCs/>
+        </w:rPr>
+        <w:t xml:space="preserve">Methods in Ecology and Evolution</w:t>
+      </w:r>
+    </w:p>
+    <w:bookmarkEnd w:id="55"/>
+    <w:bookmarkStart w:id="56" w:name="ref-briscoe2023mechanistic"/>
+    <w:p>
+      <w:pPr>
+        <w:pStyle w:val="Bibliography"/>
+      </w:pPr>
+      <w:r>
+        <w:t xml:space="preserve">20.</w:t>
+      </w:r>
+      <w:r>
+        <w:t xml:space="preserve"> </w:t>
+      </w:r>
+      <w:r>
+        <w:t xml:space="preserve">	</w:t>
+      </w:r>
+      <w:r>
+        <w:t xml:space="preserve">Briscoe, N.J.</w:t>
+      </w:r>
+      <w:r>
+        <w:t xml:space="preserve"> </w:t>
+      </w:r>
+      <w:r>
+        <w:rPr>
+          <w:i/>
+          <w:iCs/>
+        </w:rPr>
+        <w:t xml:space="preserve">et al.</w:t>
+      </w:r>
+      <w:r>
+        <w:t xml:space="preserve"> </w:t>
+      </w:r>
+      <w:r>
+        <w:t xml:space="preserve">(2023) Mechanistic forecasts of species responses to climate change: The promise of biophysical ecology.</w:t>
       </w:r>
       <w:r>
         <w:t xml:space="preserve"> </w:t>
@@ -2189,17 +2645,17 @@
         <w:t xml:space="preserve"> </w:t>
       </w:r>
       <w:r>
-        <w:t xml:space="preserve">29, 165–178</w:t>
-      </w:r>
-    </w:p>
-    <w:bookmarkEnd w:id="46"/>
-    <w:bookmarkStart w:id="47" w:name="ref-martinez2024ecological"/>
+        <w:t xml:space="preserve">29, 1451–1470</w:t>
+      </w:r>
+    </w:p>
+    <w:bookmarkEnd w:id="56"/>
+    <w:bookmarkStart w:id="57" w:name="ref-rezende2014tolerance"/>
     <w:p>
       <w:pPr>
         <w:pStyle w:val="Bibliography"/>
       </w:pPr>
       <w:r>
-        <w:t xml:space="preserve">10.</w:t>
+        <w:t xml:space="preserve">21.</w:t>
       </w:r>
       <w:r>
         <w:t xml:space="preserve"> </w:t>
@@ -2208,27 +2664,49 @@
         <w:t xml:space="preserve">	</w:t>
       </w:r>
       <w:r>
-        <w:t xml:space="preserve">Martı́nez-De León, G. and Thakur, M.P. (2024) Ecological debts induced by heat extremes.</w:t>
-      </w:r>
-      <w:r>
-        <w:t xml:space="preserve"> </w:t>
-      </w:r>
-      <w:r>
-        <w:rPr>
-          <w:i/>
-          <w:iCs/>
-        </w:rPr>
-        <w:t xml:space="preserve">Trends in Ecology &amp; Evolution</w:t>
-      </w:r>
-    </w:p>
-    <w:bookmarkEnd w:id="47"/>
-    <w:bookmarkStart w:id="48" w:name="ref-rezende2020predicting"/>
+        <w:t xml:space="preserve">Rezende, E.L.</w:t>
+      </w:r>
+      <w:r>
+        <w:t xml:space="preserve"> </w:t>
+      </w:r>
+      <w:r>
+        <w:rPr>
+          <w:i/>
+          <w:iCs/>
+        </w:rPr>
+        <w:t xml:space="preserve">et al.</w:t>
+      </w:r>
+      <w:r>
+        <w:t xml:space="preserve"> </w:t>
+      </w:r>
+      <w:r>
+        <w:t xml:space="preserve">(2014) Tolerance landscapes in thermal ecology.</w:t>
+      </w:r>
+      <w:r>
+        <w:t xml:space="preserve"> </w:t>
+      </w:r>
+      <w:r>
+        <w:rPr>
+          <w:i/>
+          <w:iCs/>
+        </w:rPr>
+        <w:t xml:space="preserve">Functional Ecology</w:t>
+      </w:r>
+      <w:r>
+        <w:t xml:space="preserve"> </w:t>
+      </w:r>
+      <w:r>
+        <w:t xml:space="preserve">28, 799–809</w:t>
+      </w:r>
+    </w:p>
+    <w:bookmarkEnd w:id="57"/>
+    <w:bookmarkStart w:id="58" w:name="ref-delmas2019analysing"/>
     <w:p>
       <w:pPr>
         <w:pStyle w:val="Bibliography"/>
       </w:pPr>
       <w:r>
-        <w:t xml:space="preserve">11.</w:t>
+        <w:t xml:space="preserve">22.</w:t>
       </w:r>
       <w:r>
         <w:t xml:space="preserve"> </w:t>
@@ -2237,7 +2715,7 @@
         <w:t xml:space="preserve">	</w:t>
       </w:r>
       <w:r>
-        <w:t xml:space="preserve">Rezende, E.L.</w:t>
+        <w:t xml:space="preserve">Delmas, E.</w:t>
       </w:r>
       <w:r>
         <w:t xml:space="preserve"> </w:t>
@@ -2253,33 +2731,33 @@
         <w:t xml:space="preserve"> </w:t>
       </w:r>
       <w:r>
-        <w:t xml:space="preserve">(2020) Predicting temperature mortality and selection in natural drosophila populations.</w:t>
-      </w:r>
-      <w:r>
-        <w:t xml:space="preserve"> </w:t>
-      </w:r>
-      <w:r>
-        <w:rPr>
-          <w:i/>
-          <w:iCs/>
-        </w:rPr>
-        <w:t xml:space="preserve">Science</w:t>
-      </w:r>
-      <w:r>
-        <w:t xml:space="preserve"> </w:t>
-      </w:r>
-      <w:r>
-        <w:t xml:space="preserve">369, 1242–1245</w:t>
-      </w:r>
-    </w:p>
-    <w:bookmarkEnd w:id="48"/>
-    <w:bookmarkStart w:id="49" w:name="ref-orsted2024thermal"/>
+        <w:t xml:space="preserve">(2019) Analysing ecological networks of species interactions.</w:t>
+      </w:r>
+      <w:r>
+        <w:t xml:space="preserve"> </w:t>
+      </w:r>
+      <w:r>
+        <w:rPr>
+          <w:i/>
+          <w:iCs/>
+        </w:rPr>
+        <w:t xml:space="preserve">Biological Reviews</w:t>
+      </w:r>
+      <w:r>
+        <w:t xml:space="preserve"> </w:t>
+      </w:r>
+      <w:r>
+        <w:t xml:space="preserve">94, 16–36</w:t>
+      </w:r>
+    </w:p>
+    <w:bookmarkEnd w:id="58"/>
+    <w:bookmarkStart w:id="59" w:name="ref-godoy2019coexistence"/>
     <w:p>
       <w:pPr>
         <w:pStyle w:val="Bibliography"/>
       </w:pPr>
       <w:r>
-        <w:t xml:space="preserve">12.</w:t>
+        <w:t xml:space="preserve">23.</w:t>
       </w:r>
       <w:r>
         <w:t xml:space="preserve"> </w:t>
@@ -2288,7 +2766,42 @@
         <w:t xml:space="preserve">	</w:t>
       </w:r>
       <w:r>
-        <w:t xml:space="preserve">Ørsted, M.</w:t>
+        <w:t xml:space="preserve">Godoy, O. (2019) Coexistence theory as a tool to understand biological invasions in species interaction networks: Implications for the study of novel ecosystems.</w:t>
+      </w:r>
+      <w:r>
+        <w:t xml:space="preserve"> </w:t>
+      </w:r>
+      <w:r>
+        <w:rPr>
+          <w:i/>
+          <w:iCs/>
+        </w:rPr>
+        <w:t xml:space="preserve">Functional Ecology</w:t>
+      </w:r>
+      <w:r>
+        <w:t xml:space="preserve"> </w:t>
+      </w:r>
+      <w:r>
+        <w:t xml:space="preserve">33, 1190–1201</w:t>
+      </w:r>
+    </w:p>
+    <w:bookmarkEnd w:id="59"/>
+    <w:bookmarkStart w:id="60" w:name="ref-poisot2021global"/>
+    <w:p>
+      <w:pPr>
+        <w:pStyle w:val="Bibliography"/>
+      </w:pPr>
+      <w:r>
+        <w:t xml:space="preserve">24.</w:t>
+      </w:r>
+      <w:r>
+        <w:t xml:space="preserve"> </w:t>
+      </w:r>
+      <w:r>
+        <w:t xml:space="preserve">	</w:t>
+      </w:r>
+      <w:r>
+        <w:t xml:space="preserve">Poisot, T.</w:t>
       </w:r>
       <w:r>
         <w:t xml:space="preserve"> </w:t>
@@ -2304,7 +2817,93 @@
         <w:t xml:space="preserve"> </w:t>
       </w:r>
       <w:r>
-        <w:t xml:space="preserve">(2024) Thermal limits of survival and reproduction depend on stress duration: A case study of drosophila suzukii.</w:t>
+        <w:t xml:space="preserve">(2021) Global knowledge gaps in species interaction networks data.</w:t>
+      </w:r>
+      <w:r>
+        <w:t xml:space="preserve"> </w:t>
+      </w:r>
+      <w:r>
+        <w:rPr>
+          <w:i/>
+          <w:iCs/>
+        </w:rPr>
+        <w:t xml:space="preserve">Journal of Biogeography</w:t>
+      </w:r>
+      <w:r>
+        <w:t xml:space="preserve"> </w:t>
+      </w:r>
+      <w:r>
+        <w:t xml:space="preserve">48, 1552–1563</w:t>
+      </w:r>
+    </w:p>
+    <w:bookmarkEnd w:id="60"/>
+    <w:bookmarkStart w:id="61" w:name="ref-hui2019invade"/>
+    <w:p>
+      <w:pPr>
+        <w:pStyle w:val="Bibliography"/>
+      </w:pPr>
+      <w:r>
+        <w:t xml:space="preserve">25.</w:t>
+      </w:r>
+      <w:r>
+        <w:t xml:space="preserve"> </w:t>
+      </w:r>
+      <w:r>
+        <w:t xml:space="preserve">	</w:t>
+      </w:r>
+      <w:r>
+        <w:t xml:space="preserve">Hui, C. and Richardson, D.M. (2019) How to invade an ecological network.</w:t>
+      </w:r>
+      <w:r>
+        <w:t xml:space="preserve"> </w:t>
+      </w:r>
+      <w:r>
+        <w:rPr>
+          <w:i/>
+          <w:iCs/>
+        </w:rPr>
+        <w:t xml:space="preserve">Trends in ecology &amp; evolution</w:t>
+      </w:r>
+      <w:r>
+        <w:t xml:space="preserve"> </w:t>
+      </w:r>
+      <w:r>
+        <w:t xml:space="preserve">34, 121–131</w:t>
+      </w:r>
+    </w:p>
+    <w:bookmarkEnd w:id="61"/>
+    <w:bookmarkStart w:id="62" w:name="ref-gomez2023role"/>
+    <w:p>
+      <w:pPr>
+        <w:pStyle w:val="Bibliography"/>
+      </w:pPr>
+      <w:r>
+        <w:t xml:space="preserve">26.</w:t>
+      </w:r>
+      <w:r>
+        <w:t xml:space="preserve"> </w:t>
+      </w:r>
+      <w:r>
+        <w:t xml:space="preserve">	</w:t>
+      </w:r>
+      <w:r>
+        <w:t xml:space="preserve">Gómez, J.M.</w:t>
+      </w:r>
+      <w:r>
+        <w:t xml:space="preserve"> </w:t>
+      </w:r>
+      <w:r>
+        <w:rPr>
+          <w:i/>
+          <w:iCs/>
+        </w:rPr>
+        <w:t xml:space="preserve">et al.</w:t>
+      </w:r>
+      <w:r>
+        <w:t xml:space="preserve"> </w:t>
+      </w:r>
+      <w:r>
+        <w:t xml:space="preserve">(2023) The role of phenotypic plasticity in shaping ecological networks.</w:t>
       </w:r>
       <w:r>
         <w:t xml:space="preserve"> </w:t>
@@ -2320,17 +2919,17 @@
         <w:t xml:space="preserve"> </w:t>
       </w:r>
       <w:r>
-        <w:t xml:space="preserve">27, e14421</w:t>
-      </w:r>
-    </w:p>
-    <w:bookmarkEnd w:id="49"/>
-    <w:bookmarkStart w:id="50" w:name="ref-lopez2024heat"/>
+        <w:t xml:space="preserve">26, S47–S61</w:t>
+      </w:r>
+    </w:p>
+    <w:bookmarkEnd w:id="62"/>
+    <w:bookmarkStart w:id="63" w:name="ref-lytle2023matrix"/>
     <w:p>
       <w:pPr>
         <w:pStyle w:val="Bibliography"/>
       </w:pPr>
       <w:r>
-        <w:t xml:space="preserve">13.</w:t>
+        <w:t xml:space="preserve">27.</w:t>
       </w:r>
       <w:r>
         <w:t xml:space="preserve"> </w:t>
@@ -2339,7 +2938,42 @@
         <w:t xml:space="preserve">	</w:t>
       </w:r>
       <w:r>
-        <w:t xml:space="preserve">López-Goldar, X.</w:t>
+        <w:t xml:space="preserve">Lytle, D.A. and Tonkin, J.D. (2023) Matrix community models for ecology and evolution.</w:t>
+      </w:r>
+      <w:r>
+        <w:t xml:space="preserve"> </w:t>
+      </w:r>
+      <w:r>
+        <w:rPr>
+          <w:i/>
+          <w:iCs/>
+        </w:rPr>
+        <w:t xml:space="preserve">npj Biodiversity</w:t>
+      </w:r>
+      <w:r>
+        <w:t xml:space="preserve"> </w:t>
+      </w:r>
+      <w:r>
+        <w:t xml:space="preserve">2, 26</w:t>
+      </w:r>
+    </w:p>
+    <w:bookmarkEnd w:id="63"/>
+    <w:bookmarkStart w:id="64" w:name="ref-petsopoulos2021using"/>
+    <w:p>
+      <w:pPr>
+        <w:pStyle w:val="Bibliography"/>
+      </w:pPr>
+      <w:r>
+        <w:t xml:space="preserve">28.</w:t>
+      </w:r>
+      <w:r>
+        <w:t xml:space="preserve"> </w:t>
+      </w:r>
+      <w:r>
+        <w:t xml:space="preserve">	</w:t>
+      </w:r>
+      <w:r>
+        <w:t xml:space="preserve">Petsopoulos, D.</w:t>
       </w:r>
       <w:r>
         <w:t xml:space="preserve"> </w:t>
@@ -2355,27 +2989,27 @@
         <w:t xml:space="preserve"> </w:t>
       </w:r>
       <w:r>
-        <w:t xml:space="preserve">(2024) Heat waves induce milkweed resistance to a specialist herbivore via increased toxicity and reduced nutrient content.</w:t>
-      </w:r>
-      <w:r>
-        <w:t xml:space="preserve"> </w:t>
-      </w:r>
-      <w:r>
-        <w:rPr>
-          <w:i/>
-          <w:iCs/>
-        </w:rPr>
-        <w:t xml:space="preserve">Plant, Cell &amp; Environment</w:t>
-      </w:r>
-    </w:p>
-    <w:bookmarkEnd w:id="50"/>
-    <w:bookmarkStart w:id="51" w:name="ref-huỳnh2024heatwave"/>
+        <w:t xml:space="preserve">(2021) Using network ecology to understand and mitigate long-term insect declines.</w:t>
+      </w:r>
+      <w:r>
+        <w:t xml:space="preserve"> </w:t>
+      </w:r>
+      <w:r>
+        <w:rPr>
+          <w:i/>
+          <w:iCs/>
+        </w:rPr>
+        <w:t xml:space="preserve">Ecological Entomology</w:t>
+      </w:r>
+    </w:p>
+    <w:bookmarkEnd w:id="64"/>
+    <w:bookmarkStart w:id="65" w:name="ref-dale2021quantitative"/>
     <w:p>
       <w:pPr>
         <w:pStyle w:val="Bibliography"/>
       </w:pPr>
       <w:r>
-        <w:t xml:space="preserve">14.</w:t>
+        <w:t xml:space="preserve">29.</w:t>
       </w:r>
       <w:r>
         <w:t xml:space="preserve"> </w:t>
@@ -2384,7 +3018,39 @@
         <w:t xml:space="preserve">	</w:t>
       </w:r>
       <w:r>
-        <w:t xml:space="preserve">Huỳnh, T.-H.</w:t>
+        <w:t xml:space="preserve">Dale, M.R. and Fortin, M.-J. (2021)</w:t>
+      </w:r>
+      <w:r>
+        <w:t xml:space="preserve"> </w:t>
+      </w:r>
+      <w:r>
+        <w:rPr>
+          <w:i/>
+          <w:iCs/>
+        </w:rPr>
+        <w:t xml:space="preserve">Quantitative analysis of ecological networks</w:t>
+      </w:r>
+      <w:r>
+        <w:t xml:space="preserve">, Cambridge University Press</w:t>
+      </w:r>
+    </w:p>
+    <w:bookmarkEnd w:id="65"/>
+    <w:bookmarkStart w:id="66" w:name="ref-lu2023food"/>
+    <w:p>
+      <w:pPr>
+        <w:pStyle w:val="Bibliography"/>
+      </w:pPr>
+      <w:r>
+        <w:t xml:space="preserve">30.</w:t>
+      </w:r>
+      <w:r>
+        <w:t xml:space="preserve"> </w:t>
+      </w:r>
+      <w:r>
+        <w:t xml:space="preserve">	</w:t>
+      </w:r>
+      <w:r>
+        <w:t xml:space="preserve">Lu, Q.</w:t>
       </w:r>
       <w:r>
         <w:t xml:space="preserve"> </w:t>
@@ -2400,33 +3066,33 @@
         <w:t xml:space="preserve"> </w:t>
       </w:r>
       <w:r>
-        <w:t xml:space="preserve">(2024) Heatwave-induced functional shifts in zooplankton communities result in weaker top-down control on phytoplankton.</w:t>
-      </w:r>
-      <w:r>
-        <w:t xml:space="preserve"> </w:t>
-      </w:r>
-      <w:r>
-        <w:rPr>
-          <w:i/>
-          <w:iCs/>
-        </w:rPr>
-        <w:t xml:space="preserve">Ecology and Evolution</w:t>
-      </w:r>
-      <w:r>
-        <w:t xml:space="preserve"> </w:t>
-      </w:r>
-      <w:r>
-        <w:t xml:space="preserve">14, e70096</w:t>
-      </w:r>
-    </w:p>
-    <w:bookmarkEnd w:id="51"/>
-    <w:bookmarkStart w:id="52" w:name="ref-trivedi2022plant"/>
+        <w:t xml:space="preserve">(2023) Food webs reveal coexistence mechanisms and community organization in carnivores.</w:t>
+      </w:r>
+      <w:r>
+        <w:t xml:space="preserve"> </w:t>
+      </w:r>
+      <w:r>
+        <w:rPr>
+          <w:i/>
+          <w:iCs/>
+        </w:rPr>
+        <w:t xml:space="preserve">Current Biology</w:t>
+      </w:r>
+      <w:r>
+        <w:t xml:space="preserve"> </w:t>
+      </w:r>
+      <w:r>
+        <w:t xml:space="preserve">33, 647–659</w:t>
+      </w:r>
+    </w:p>
+    <w:bookmarkEnd w:id="66"/>
+    <w:bookmarkStart w:id="67" w:name="ref-carrara2015inferring"/>
     <w:p>
       <w:pPr>
         <w:pStyle w:val="Bibliography"/>
       </w:pPr>
       <w:r>
-        <w:t xml:space="preserve">15.</w:t>
+        <w:t xml:space="preserve">31.</w:t>
       </w:r>
       <w:r>
         <w:t xml:space="preserve"> </w:t>
@@ -2435,7 +3101,7 @@
         <w:t xml:space="preserve">	</w:t>
       </w:r>
       <w:r>
-        <w:t xml:space="preserve">Trivedi, P.</w:t>
+        <w:t xml:space="preserve">Carrara, F.</w:t>
       </w:r>
       <w:r>
         <w:t xml:space="preserve"> </w:t>
@@ -2451,33 +3117,33 @@
         <w:t xml:space="preserve"> </w:t>
       </w:r>
       <w:r>
-        <w:t xml:space="preserve">(2022) Plant–microbiome interactions under a changing world: Responses, consequences and perspectives.</w:t>
-      </w:r>
-      <w:r>
-        <w:t xml:space="preserve"> </w:t>
-      </w:r>
-      <w:r>
-        <w:rPr>
-          <w:i/>
-          <w:iCs/>
-        </w:rPr>
-        <w:t xml:space="preserve">New Phytologist</w:t>
-      </w:r>
-      <w:r>
-        <w:t xml:space="preserve"> </w:t>
-      </w:r>
-      <w:r>
-        <w:t xml:space="preserve">234, 1951–1959</w:t>
-      </w:r>
-    </w:p>
-    <w:bookmarkEnd w:id="52"/>
-    <w:bookmarkStart w:id="53" w:name="ref-kooijman2010dynamic"/>
+        <w:t xml:space="preserve">(2015) Inferring species interactions in ecological communities: A comparison of methods at different levels of complexity.</w:t>
+      </w:r>
+      <w:r>
+        <w:t xml:space="preserve"> </w:t>
+      </w:r>
+      <w:r>
+        <w:rPr>
+          <w:i/>
+          <w:iCs/>
+        </w:rPr>
+        <w:t xml:space="preserve">Methods in Ecology and Evolution</w:t>
+      </w:r>
+      <w:r>
+        <w:t xml:space="preserve"> </w:t>
+      </w:r>
+      <w:r>
+        <w:t xml:space="preserve">6, 895–906</w:t>
+      </w:r>
+    </w:p>
+    <w:bookmarkEnd w:id="67"/>
+    <w:bookmarkStart w:id="68" w:name="ref-vitali2022disruption"/>
     <w:p>
       <w:pPr>
         <w:pStyle w:val="Bibliography"/>
       </w:pPr>
       <w:r>
-        <w:t xml:space="preserve">16.</w:t>
+        <w:t xml:space="preserve">32.</w:t>
       </w:r>
       <w:r>
         <w:t xml:space="preserve"> </w:t>
@@ -2486,30 +3152,49 @@
         <w:t xml:space="preserve">	</w:t>
       </w:r>
       <w:r>
-        <w:t xml:space="preserve">Kooijman, S.A.L.M. (2010)</w:t>
-      </w:r>
-      <w:r>
-        <w:t xml:space="preserve"> </w:t>
-      </w:r>
-      <w:r>
-        <w:rPr>
-          <w:i/>
-          <w:iCs/>
-        </w:rPr>
-        <w:t xml:space="preserve">Dynamic energy budget theory for metabolic organisation</w:t>
-      </w:r>
-      <w:r>
-        <w:t xml:space="preserve">, Cambridge university press</w:t>
-      </w:r>
-    </w:p>
-    <w:bookmarkEnd w:id="53"/>
-    <w:bookmarkStart w:id="54" w:name="ref-kearney2009mechanistic"/>
+        <w:t xml:space="preserve">Vitali, A.</w:t>
+      </w:r>
+      <w:r>
+        <w:t xml:space="preserve"> </w:t>
+      </w:r>
+      <w:r>
+        <w:rPr>
+          <w:i/>
+          <w:iCs/>
+        </w:rPr>
+        <w:t xml:space="preserve">et al.</w:t>
+      </w:r>
+      <w:r>
+        <w:t xml:space="preserve"> </w:t>
+      </w:r>
+      <w:r>
+        <w:t xml:space="preserve">(2022) The disruption of a keystone interaction erodes pollination and seed dispersal networks.</w:t>
+      </w:r>
+      <w:r>
+        <w:t xml:space="preserve"> </w:t>
+      </w:r>
+      <w:r>
+        <w:rPr>
+          <w:i/>
+          <w:iCs/>
+        </w:rPr>
+        <w:t xml:space="preserve">Ecology</w:t>
+      </w:r>
+      <w:r>
+        <w:t xml:space="preserve"> </w:t>
+      </w:r>
+      <w:r>
+        <w:t xml:space="preserve">103, e03547</w:t>
+      </w:r>
+    </w:p>
+    <w:bookmarkEnd w:id="68"/>
+    <w:bookmarkStart w:id="69" w:name="ref-riva2023toward"/>
     <w:p>
       <w:pPr>
         <w:pStyle w:val="Bibliography"/>
       </w:pPr>
       <w:r>
-        <w:t xml:space="preserve">17.</w:t>
+        <w:t xml:space="preserve">33.</w:t>
       </w:r>
       <w:r>
         <w:t xml:space="preserve"> </w:t>
@@ -2518,33 +3203,49 @@
         <w:t xml:space="preserve">	</w:t>
       </w:r>
       <w:r>
-        <w:t xml:space="preserve">Kearney, M. and Porter, W. (2009) Mechanistic niche modelling: Combining physiological and spatial data to predict species’ ranges.</w:t>
-      </w:r>
-      <w:r>
-        <w:t xml:space="preserve"> </w:t>
-      </w:r>
-      <w:r>
-        <w:rPr>
-          <w:i/>
-          <w:iCs/>
-        </w:rPr>
-        <w:t xml:space="preserve">Ecology letters</w:t>
-      </w:r>
-      <w:r>
-        <w:t xml:space="preserve"> </w:t>
-      </w:r>
-      <w:r>
-        <w:t xml:space="preserve">12, 334–350</w:t>
-      </w:r>
-    </w:p>
-    <w:bookmarkEnd w:id="54"/>
-    <w:bookmarkStart w:id="55" w:name="ref-jusup2024untapped"/>
+        <w:t xml:space="preserve">Riva, F.</w:t>
+      </w:r>
+      <w:r>
+        <w:t xml:space="preserve"> </w:t>
+      </w:r>
+      <w:r>
+        <w:rPr>
+          <w:i/>
+          <w:iCs/>
+        </w:rPr>
+        <w:t xml:space="preserve">et al.</w:t>
+      </w:r>
+      <w:r>
+        <w:t xml:space="preserve"> </w:t>
+      </w:r>
+      <w:r>
+        <w:t xml:space="preserve">(2023) Toward a cohesive understanding of ecological complexity.</w:t>
+      </w:r>
+      <w:r>
+        <w:t xml:space="preserve"> </w:t>
+      </w:r>
+      <w:r>
+        <w:rPr>
+          <w:i/>
+          <w:iCs/>
+        </w:rPr>
+        <w:t xml:space="preserve">Science Advances</w:t>
+      </w:r>
+      <w:r>
+        <w:t xml:space="preserve"> </w:t>
+      </w:r>
+      <w:r>
+        <w:t xml:space="preserve">9, eabq4207</w:t>
+      </w:r>
+    </w:p>
+    <w:bookmarkEnd w:id="69"/>
+    <w:bookmarkStart w:id="70" w:name="ref-terry2020finding"/>
     <w:p>
       <w:pPr>
         <w:pStyle w:val="Bibliography"/>
       </w:pPr>
       <w:r>
-        <w:t xml:space="preserve">18.</w:t>
+        <w:t xml:space="preserve">34.</w:t>
       </w:r>
       <w:r>
         <w:t xml:space="preserve"> </w:t>
@@ -2553,27 +3254,33 @@
         <w:t xml:space="preserve">	</w:t>
       </w:r>
       <w:r>
-        <w:t xml:space="preserve">Jusup, M. and Kearney, M.R. (2024) The untapped power of a general theory of organismal metabolism.</w:t>
-      </w:r>
-      <w:r>
-        <w:t xml:space="preserve"> </w:t>
-      </w:r>
-      <w:r>
-        <w:rPr>
-          <w:i/>
-          <w:iCs/>
-        </w:rPr>
-        <w:t xml:space="preserve">arXiv preprint arXiv:2408.13998</w:t>
-      </w:r>
-    </w:p>
-    <w:bookmarkEnd w:id="55"/>
-    <w:bookmarkStart w:id="56" w:name="ref-kearney2024fast"/>
+        <w:t xml:space="preserve">Terry, J.C.D. and Lewis, O.T. (2020) Finding missing links in interaction networks.</w:t>
+      </w:r>
+      <w:r>
+        <w:t xml:space="preserve"> </w:t>
+      </w:r>
+      <w:r>
+        <w:rPr>
+          <w:i/>
+          <w:iCs/>
+        </w:rPr>
+        <w:t xml:space="preserve">Ecology</w:t>
+      </w:r>
+      <w:r>
+        <w:t xml:space="preserve"> </w:t>
+      </w:r>
+      <w:r>
+        <w:t xml:space="preserve">101, e03047</w:t>
+      </w:r>
+    </w:p>
+    <w:bookmarkEnd w:id="70"/>
+    <w:bookmarkStart w:id="71" w:name="ref-weiss2022disentangling"/>
     <w:p>
       <w:pPr>
         <w:pStyle w:val="Bibliography"/>
       </w:pPr>
       <w:r>
-        <w:t xml:space="preserve">19.</w:t>
+        <w:t xml:space="preserve">35.</w:t>
       </w:r>
       <w:r>
         <w:t xml:space="preserve"> </w:t>
@@ -2582,36 +3289,7 @@
         <w:t xml:space="preserve">	</w:t>
       </w:r>
       <w:r>
-        <w:t xml:space="preserve">Kearney, M.R. and Leigh, A. (2024) Fast, accurate and accessible calculations of leaf temperature and its physiological consequences with NicheMapR.</w:t>
-      </w:r>
-      <w:r>
-        <w:t xml:space="preserve"> </w:t>
-      </w:r>
-      <w:r>
-        <w:rPr>
-          <w:i/>
-          <w:iCs/>
-        </w:rPr>
-        <w:t xml:space="preserve">Methods in Ecology and Evolution</w:t>
-      </w:r>
-    </w:p>
-    <w:bookmarkEnd w:id="56"/>
-    <w:bookmarkStart w:id="57" w:name="ref-briscoe2023mechanistic"/>
-    <w:p>
-      <w:pPr>
-        <w:pStyle w:val="Bibliography"/>
-      </w:pPr>
-      <w:r>
-        <w:t xml:space="preserve">20.</w:t>
-      </w:r>
-      <w:r>
-        <w:t xml:space="preserve"> </w:t>
-      </w:r>
-      <w:r>
-        <w:t xml:space="preserve">	</w:t>
-      </w:r>
-      <w:r>
-        <w:t xml:space="preserve">Briscoe, N.J.</w:t>
+        <w:t xml:space="preserve">Weiss-Lehman, C.P.</w:t>
       </w:r>
       <w:r>
         <w:t xml:space="preserve"> </w:t>
@@ -2627,281 +3305,7 @@
         <w:t xml:space="preserve"> </w:t>
       </w:r>
       <w:r>
-        <w:t xml:space="preserve">(2023) Mechanistic forecasts of species responses to climate change: The promise of biophysical ecology.</w:t>
-      </w:r>
-      <w:r>
-        <w:t xml:space="preserve"> </w:t>
-      </w:r>
-      <w:r>
-        <w:rPr>
-          <w:i/>
-          <w:iCs/>
-        </w:rPr>
-        <w:t xml:space="preserve">Global Change Biology</w:t>
-      </w:r>
-      <w:r>
-        <w:t xml:space="preserve"> </w:t>
-      </w:r>
-      <w:r>
-        <w:t xml:space="preserve">29, 1451–1470</w:t>
-      </w:r>
-    </w:p>
-    <w:bookmarkEnd w:id="57"/>
-    <w:bookmarkStart w:id="58" w:name="ref-rezende2014tolerance"/>
-    <w:p>
-      <w:pPr>
-        <w:pStyle w:val="Bibliography"/>
-      </w:pPr>
-      <w:r>
-        <w:t xml:space="preserve">21.</w:t>
-      </w:r>
-      <w:r>
-        <w:t xml:space="preserve"> </w:t>
-      </w:r>
-      <w:r>
-        <w:t xml:space="preserve">	</w:t>
-      </w:r>
-      <w:r>
-        <w:t xml:space="preserve">Rezende, E.L.</w:t>
-      </w:r>
-      <w:r>
-        <w:t xml:space="preserve"> </w:t>
-      </w:r>
-      <w:r>
-        <w:rPr>
-          <w:i/>
-          <w:iCs/>
-        </w:rPr>
-        <w:t xml:space="preserve">et al.</w:t>
-      </w:r>
-      <w:r>
-        <w:t xml:space="preserve"> </w:t>
-      </w:r>
-      <w:r>
-        <w:t xml:space="preserve">(2014) Tolerance landscapes in thermal ecology.</w:t>
-      </w:r>
-      <w:r>
-        <w:t xml:space="preserve"> </w:t>
-      </w:r>
-      <w:r>
-        <w:rPr>
-          <w:i/>
-          <w:iCs/>
-        </w:rPr>
-        <w:t xml:space="preserve">Functional Ecology</w:t>
-      </w:r>
-      <w:r>
-        <w:t xml:space="preserve"> </w:t>
-      </w:r>
-      <w:r>
-        <w:t xml:space="preserve">28, 799–809</w:t>
-      </w:r>
-    </w:p>
-    <w:bookmarkEnd w:id="58"/>
-    <w:bookmarkStart w:id="59" w:name="ref-delmas2019analysing"/>
-    <w:p>
-      <w:pPr>
-        <w:pStyle w:val="Bibliography"/>
-      </w:pPr>
-      <w:r>
-        <w:t xml:space="preserve">22.</w:t>
-      </w:r>
-      <w:r>
-        <w:t xml:space="preserve"> </w:t>
-      </w:r>
-      <w:r>
-        <w:t xml:space="preserve">	</w:t>
-      </w:r>
-      <w:r>
-        <w:t xml:space="preserve">Delmas, E.</w:t>
-      </w:r>
-      <w:r>
-        <w:t xml:space="preserve"> </w:t>
-      </w:r>
-      <w:r>
-        <w:rPr>
-          <w:i/>
-          <w:iCs/>
-        </w:rPr>
-        <w:t xml:space="preserve">et al.</w:t>
-      </w:r>
-      <w:r>
-        <w:t xml:space="preserve"> </w:t>
-      </w:r>
-      <w:r>
-        <w:t xml:space="preserve">(2019) Analysing ecological networks of species interactions.</w:t>
-      </w:r>
-      <w:r>
-        <w:t xml:space="preserve"> </w:t>
-      </w:r>
-      <w:r>
-        <w:rPr>
-          <w:i/>
-          <w:iCs/>
-        </w:rPr>
-        <w:t xml:space="preserve">Biological Reviews</w:t>
-      </w:r>
-      <w:r>
-        <w:t xml:space="preserve"> </w:t>
-      </w:r>
-      <w:r>
-        <w:t xml:space="preserve">94, 16–36</w:t>
-      </w:r>
-    </w:p>
-    <w:bookmarkEnd w:id="59"/>
-    <w:bookmarkStart w:id="60" w:name="ref-godoy2019coexistence"/>
-    <w:p>
-      <w:pPr>
-        <w:pStyle w:val="Bibliography"/>
-      </w:pPr>
-      <w:r>
-        <w:t xml:space="preserve">23.</w:t>
-      </w:r>
-      <w:r>
-        <w:t xml:space="preserve"> </w:t>
-      </w:r>
-      <w:r>
-        <w:t xml:space="preserve">	</w:t>
-      </w:r>
-      <w:r>
-        <w:t xml:space="preserve">Godoy, O. (2019) Coexistence theory as a tool to understand biological invasions in species interaction networks: Implications for the study of novel ecosystems.</w:t>
-      </w:r>
-      <w:r>
-        <w:t xml:space="preserve"> </w:t>
-      </w:r>
-      <w:r>
-        <w:rPr>
-          <w:i/>
-          <w:iCs/>
-        </w:rPr>
-        <w:t xml:space="preserve">Functional Ecology</w:t>
-      </w:r>
-      <w:r>
-        <w:t xml:space="preserve"> </w:t>
-      </w:r>
-      <w:r>
-        <w:t xml:space="preserve">33, 1190–1201</w:t>
-      </w:r>
-    </w:p>
-    <w:bookmarkEnd w:id="60"/>
-    <w:bookmarkStart w:id="61" w:name="ref-poisot2021global"/>
-    <w:p>
-      <w:pPr>
-        <w:pStyle w:val="Bibliography"/>
-      </w:pPr>
-      <w:r>
-        <w:t xml:space="preserve">24.</w:t>
-      </w:r>
-      <w:r>
-        <w:t xml:space="preserve"> </w:t>
-      </w:r>
-      <w:r>
-        <w:t xml:space="preserve">	</w:t>
-      </w:r>
-      <w:r>
-        <w:t xml:space="preserve">Poisot, T.</w:t>
-      </w:r>
-      <w:r>
-        <w:t xml:space="preserve"> </w:t>
-      </w:r>
-      <w:r>
-        <w:rPr>
-          <w:i/>
-          <w:iCs/>
-        </w:rPr>
-        <w:t xml:space="preserve">et al.</w:t>
-      </w:r>
-      <w:r>
-        <w:t xml:space="preserve"> </w:t>
-      </w:r>
-      <w:r>
-        <w:t xml:space="preserve">(2021) Global knowledge gaps in species interaction networks data.</w:t>
-      </w:r>
-      <w:r>
-        <w:t xml:space="preserve"> </w:t>
-      </w:r>
-      <w:r>
-        <w:rPr>
-          <w:i/>
-          <w:iCs/>
-        </w:rPr>
-        <w:t xml:space="preserve">Journal of Biogeography</w:t>
-      </w:r>
-      <w:r>
-        <w:t xml:space="preserve"> </w:t>
-      </w:r>
-      <w:r>
-        <w:t xml:space="preserve">48, 1552–1563</w:t>
-      </w:r>
-    </w:p>
-    <w:bookmarkEnd w:id="61"/>
-    <w:bookmarkStart w:id="62" w:name="ref-hui2019invade"/>
-    <w:p>
-      <w:pPr>
-        <w:pStyle w:val="Bibliography"/>
-      </w:pPr>
-      <w:r>
-        <w:t xml:space="preserve">25.</w:t>
-      </w:r>
-      <w:r>
-        <w:t xml:space="preserve"> </w:t>
-      </w:r>
-      <w:r>
-        <w:t xml:space="preserve">	</w:t>
-      </w:r>
-      <w:r>
-        <w:t xml:space="preserve">Hui, C. and Richardson, D.M. (2019) How to invade an ecological network.</w:t>
-      </w:r>
-      <w:r>
-        <w:t xml:space="preserve"> </w:t>
-      </w:r>
-      <w:r>
-        <w:rPr>
-          <w:i/>
-          <w:iCs/>
-        </w:rPr>
-        <w:t xml:space="preserve">Trends in ecology &amp; evolution</w:t>
-      </w:r>
-      <w:r>
-        <w:t xml:space="preserve"> </w:t>
-      </w:r>
-      <w:r>
-        <w:t xml:space="preserve">34, 121–131</w:t>
-      </w:r>
-    </w:p>
-    <w:bookmarkEnd w:id="62"/>
-    <w:bookmarkStart w:id="63" w:name="ref-gomez2023role"/>
-    <w:p>
-      <w:pPr>
-        <w:pStyle w:val="Bibliography"/>
-      </w:pPr>
-      <w:r>
-        <w:t xml:space="preserve">26.</w:t>
-      </w:r>
-      <w:r>
-        <w:t xml:space="preserve"> </w:t>
-      </w:r>
-      <w:r>
-        <w:t xml:space="preserve">	</w:t>
-      </w:r>
-      <w:r>
-        <w:t xml:space="preserve">Gómez, J.M.</w:t>
-      </w:r>
-      <w:r>
-        <w:t xml:space="preserve"> </w:t>
-      </w:r>
-      <w:r>
-        <w:rPr>
-          <w:i/>
-          <w:iCs/>
-        </w:rPr>
-        <w:t xml:space="preserve">et al.</w:t>
-      </w:r>
-      <w:r>
-        <w:t xml:space="preserve"> </w:t>
-      </w:r>
-      <w:r>
-        <w:t xml:space="preserve">(2023) The role of phenotypic plasticity in shaping ecological networks.</w:t>
+        <w:t xml:space="preserve">(2022) Disentangling key species interactions in diverse and heterogeneous communities: A bayesian sparse modelling approach.</w:t>
       </w:r>
       <w:r>
         <w:t xml:space="preserve"> </w:t>
@@ -2917,358 +3321,7 @@
         <w:t xml:space="preserve"> </w:t>
       </w:r>
       <w:r>
-        <w:t xml:space="preserve">26, S47–S61</w:t>
-      </w:r>
-    </w:p>
-    <w:bookmarkEnd w:id="63"/>
-    <w:bookmarkStart w:id="64" w:name="ref-lytle2023matrix"/>
-    <w:p>
-      <w:pPr>
-        <w:pStyle w:val="Bibliography"/>
-      </w:pPr>
-      <w:r>
-        <w:t xml:space="preserve">27.</w:t>
-      </w:r>
-      <w:r>
-        <w:t xml:space="preserve"> </w:t>
-      </w:r>
-      <w:r>
-        <w:t xml:space="preserve">	</w:t>
-      </w:r>
-      <w:r>
-        <w:t xml:space="preserve">Lytle, D.A. and Tonkin, J.D. (2023) Matrix community models for ecology and evolution.</w:t>
-      </w:r>
-      <w:r>
-        <w:t xml:space="preserve"> </w:t>
-      </w:r>
-      <w:r>
-        <w:rPr>
-          <w:i/>
-          <w:iCs/>
-        </w:rPr>
-        <w:t xml:space="preserve">npj Biodiversity</w:t>
-      </w:r>
-      <w:r>
-        <w:t xml:space="preserve"> </w:t>
-      </w:r>
-      <w:r>
-        <w:t xml:space="preserve">2, 26</w:t>
-      </w:r>
-    </w:p>
-    <w:bookmarkEnd w:id="64"/>
-    <w:bookmarkStart w:id="65" w:name="ref-petsopoulos2021using"/>
-    <w:p>
-      <w:pPr>
-        <w:pStyle w:val="Bibliography"/>
-      </w:pPr>
-      <w:r>
-        <w:t xml:space="preserve">28.</w:t>
-      </w:r>
-      <w:r>
-        <w:t xml:space="preserve"> </w:t>
-      </w:r>
-      <w:r>
-        <w:t xml:space="preserve">	</w:t>
-      </w:r>
-      <w:r>
-        <w:t xml:space="preserve">Petsopoulos, D.</w:t>
-      </w:r>
-      <w:r>
-        <w:t xml:space="preserve"> </w:t>
-      </w:r>
-      <w:r>
-        <w:rPr>
-          <w:i/>
-          <w:iCs/>
-        </w:rPr>
-        <w:t xml:space="preserve">et al.</w:t>
-      </w:r>
-      <w:r>
-        <w:t xml:space="preserve"> </w:t>
-      </w:r>
-      <w:r>
-        <w:t xml:space="preserve">(2021) Using network ecology to understand and mitigate long-term insect declines.</w:t>
-      </w:r>
-      <w:r>
-        <w:t xml:space="preserve"> </w:t>
-      </w:r>
-      <w:r>
-        <w:rPr>
-          <w:i/>
-          <w:iCs/>
-        </w:rPr>
-        <w:t xml:space="preserve">Ecological Entomology</w:t>
-      </w:r>
-    </w:p>
-    <w:bookmarkEnd w:id="65"/>
-    <w:bookmarkStart w:id="66" w:name="ref-dale2021quantitative"/>
-    <w:p>
-      <w:pPr>
-        <w:pStyle w:val="Bibliography"/>
-      </w:pPr>
-      <w:r>
-        <w:t xml:space="preserve">29.</w:t>
-      </w:r>
-      <w:r>
-        <w:t xml:space="preserve"> </w:t>
-      </w:r>
-      <w:r>
-        <w:t xml:space="preserve">	</w:t>
-      </w:r>
-      <w:r>
-        <w:t xml:space="preserve">Dale, M.R. and Fortin, M.-J. (2021)</w:t>
-      </w:r>
-      <w:r>
-        <w:t xml:space="preserve"> </w:t>
-      </w:r>
-      <w:r>
-        <w:rPr>
-          <w:i/>
-          <w:iCs/>
-        </w:rPr>
-        <w:t xml:space="preserve">Quantitative analysis of ecological networks</w:t>
-      </w:r>
-      <w:r>
-        <w:t xml:space="preserve">, Cambridge University Press</w:t>
-      </w:r>
-    </w:p>
-    <w:bookmarkEnd w:id="66"/>
-    <w:bookmarkStart w:id="67" w:name="ref-lu2023food"/>
-    <w:p>
-      <w:pPr>
-        <w:pStyle w:val="Bibliography"/>
-      </w:pPr>
-      <w:r>
-        <w:t xml:space="preserve">30.</w:t>
-      </w:r>
-      <w:r>
-        <w:t xml:space="preserve"> </w:t>
-      </w:r>
-      <w:r>
-        <w:t xml:space="preserve">	</w:t>
-      </w:r>
-      <w:r>
-        <w:t xml:space="preserve">Lu, Q.</w:t>
-      </w:r>
-      <w:r>
-        <w:t xml:space="preserve"> </w:t>
-      </w:r>
-      <w:r>
-        <w:rPr>
-          <w:i/>
-          <w:iCs/>
-        </w:rPr>
-        <w:t xml:space="preserve">et al.</w:t>
-      </w:r>
-      <w:r>
-        <w:t xml:space="preserve"> </w:t>
-      </w:r>
-      <w:r>
-        <w:t xml:space="preserve">(2023) Food webs reveal coexistence mechanisms and community organization in carnivores.</w:t>
-      </w:r>
-      <w:r>
-        <w:t xml:space="preserve"> </w:t>
-      </w:r>
-      <w:r>
-        <w:rPr>
-          <w:i/>
-          <w:iCs/>
-        </w:rPr>
-        <w:t xml:space="preserve">Current Biology</w:t>
-      </w:r>
-      <w:r>
-        <w:t xml:space="preserve"> </w:t>
-      </w:r>
-      <w:r>
-        <w:t xml:space="preserve">33, 647–659</w:t>
-      </w:r>
-    </w:p>
-    <w:bookmarkEnd w:id="67"/>
-    <w:bookmarkStart w:id="68" w:name="ref-carrara2015inferring"/>
-    <w:p>
-      <w:pPr>
-        <w:pStyle w:val="Bibliography"/>
-      </w:pPr>
-      <w:r>
-        <w:t xml:space="preserve">31.</w:t>
-      </w:r>
-      <w:r>
-        <w:t xml:space="preserve"> </w:t>
-      </w:r>
-      <w:r>
-        <w:t xml:space="preserve">	</w:t>
-      </w:r>
-      <w:r>
-        <w:t xml:space="preserve">Carrara, F.</w:t>
-      </w:r>
-      <w:r>
-        <w:t xml:space="preserve"> </w:t>
-      </w:r>
-      <w:r>
-        <w:rPr>
-          <w:i/>
-          <w:iCs/>
-        </w:rPr>
-        <w:t xml:space="preserve">et al.</w:t>
-      </w:r>
-      <w:r>
-        <w:t xml:space="preserve"> </w:t>
-      </w:r>
-      <w:r>
-        <w:t xml:space="preserve">(2015) Inferring species interactions in ecological communities: A comparison of methods at different levels of complexity.</w:t>
-      </w:r>
-      <w:r>
-        <w:t xml:space="preserve"> </w:t>
-      </w:r>
-      <w:r>
-        <w:rPr>
-          <w:i/>
-          <w:iCs/>
-        </w:rPr>
-        <w:t xml:space="preserve">Methods in Ecology and Evolution</w:t>
-      </w:r>
-      <w:r>
-        <w:t xml:space="preserve"> </w:t>
-      </w:r>
-      <w:r>
-        <w:t xml:space="preserve">6, 895–906</w:t>
-      </w:r>
-    </w:p>
-    <w:bookmarkEnd w:id="68"/>
-    <w:bookmarkStart w:id="69" w:name="ref-vitali2022disruption"/>
-    <w:p>
-      <w:pPr>
-        <w:pStyle w:val="Bibliography"/>
-      </w:pPr>
-      <w:r>
-        <w:t xml:space="preserve">32.</w:t>
-      </w:r>
-      <w:r>
-        <w:t xml:space="preserve"> </w:t>
-      </w:r>
-      <w:r>
-        <w:t xml:space="preserve">	</w:t>
-      </w:r>
-      <w:r>
-        <w:t xml:space="preserve">Vitali, A.</w:t>
-      </w:r>
-      <w:r>
-        <w:t xml:space="preserve"> </w:t>
-      </w:r>
-      <w:r>
-        <w:rPr>
-          <w:i/>
-          <w:iCs/>
-        </w:rPr>
-        <w:t xml:space="preserve">et al.</w:t>
-      </w:r>
-      <w:r>
-        <w:t xml:space="preserve"> </w:t>
-      </w:r>
-      <w:r>
-        <w:t xml:space="preserve">(2022) The disruption of a keystone interaction erodes pollination and seed dispersal networks.</w:t>
-      </w:r>
-      <w:r>
-        <w:t xml:space="preserve"> </w:t>
-      </w:r>
-      <w:r>
-        <w:rPr>
-          <w:i/>
-          <w:iCs/>
-        </w:rPr>
-        <w:t xml:space="preserve">Ecology</w:t>
-      </w:r>
-      <w:r>
-        <w:t xml:space="preserve"> </w:t>
-      </w:r>
-      <w:r>
-        <w:t xml:space="preserve">103, e03547</w:t>
-      </w:r>
-    </w:p>
-    <w:bookmarkEnd w:id="69"/>
-    <w:bookmarkStart w:id="70" w:name="ref-riva2023toward"/>
-    <w:p>
-      <w:pPr>
-        <w:pStyle w:val="Bibliography"/>
-      </w:pPr>
-      <w:r>
-        <w:t xml:space="preserve">33.</w:t>
-      </w:r>
-      <w:r>
-        <w:t xml:space="preserve"> </w:t>
-      </w:r>
-      <w:r>
-        <w:t xml:space="preserve">	</w:t>
-      </w:r>
-      <w:r>
-        <w:t xml:space="preserve">Riva, F.</w:t>
-      </w:r>
-      <w:r>
-        <w:t xml:space="preserve"> </w:t>
-      </w:r>
-      <w:r>
-        <w:rPr>
-          <w:i/>
-          <w:iCs/>
-        </w:rPr>
-        <w:t xml:space="preserve">et al.</w:t>
-      </w:r>
-      <w:r>
-        <w:t xml:space="preserve"> </w:t>
-      </w:r>
-      <w:r>
-        <w:t xml:space="preserve">(2023) Toward a cohesive understanding of ecological complexity.</w:t>
-      </w:r>
-      <w:r>
-        <w:t xml:space="preserve"> </w:t>
-      </w:r>
-      <w:r>
-        <w:rPr>
-          <w:i/>
-          <w:iCs/>
-        </w:rPr>
-        <w:t xml:space="preserve">Science Advances</w:t>
-      </w:r>
-      <w:r>
-        <w:t xml:space="preserve"> </w:t>
-      </w:r>
-      <w:r>
-        <w:t xml:space="preserve">9, eabq4207</w:t>
-      </w:r>
-    </w:p>
-    <w:bookmarkEnd w:id="70"/>
-    <w:bookmarkStart w:id="71" w:name="ref-terry2020finding"/>
-    <w:p>
-      <w:pPr>
-        <w:pStyle w:val="Bibliography"/>
-      </w:pPr>
-      <w:r>
-        <w:t xml:space="preserve">34.</w:t>
-      </w:r>
-      <w:r>
-        <w:t xml:space="preserve"> </w:t>
-      </w:r>
-      <w:r>
-        <w:t xml:space="preserve">	</w:t>
-      </w:r>
-      <w:r>
-        <w:t xml:space="preserve">Terry, J.C.D. and Lewis, O.T. (2020) Finding missing links in interaction networks.</w:t>
-      </w:r>
-      <w:r>
-        <w:t xml:space="preserve"> </w:t>
-      </w:r>
-      <w:r>
-        <w:rPr>
-          <w:i/>
-          <w:iCs/>
-        </w:rPr>
-        <w:t xml:space="preserve">Ecology</w:t>
-      </w:r>
-      <w:r>
-        <w:t xml:space="preserve"> </w:t>
-      </w:r>
-      <w:r>
-        <w:t xml:space="preserve">101, e03047</w:t>
+        <w:t xml:space="preserve">25, 1263–1276</w:t>
       </w:r>
     </w:p>
     <w:bookmarkEnd w:id="71"/>
@@ -3278,7 +3331,7 @@
         <w:pStyle w:val="Bibliography"/>
       </w:pPr>
       <w:r>
-        <w:t xml:space="preserve">35.</w:t>
+        <w:t xml:space="preserve">36.</w:t>
       </w:r>
       <w:r>
         <w:t xml:space="preserve"> </w:t>
@@ -3329,7 +3382,7 @@
         <w:pStyle w:val="Bibliography"/>
       </w:pPr>
       <w:r>
-        <w:t xml:space="preserve">36.</w:t>
+        <w:t xml:space="preserve">37.</w:t>
       </w:r>
       <w:r>
         <w:t xml:space="preserve"> </w:t>
@@ -3380,7 +3433,7 @@
         <w:pStyle w:val="Bibliography"/>
       </w:pPr>
       <w:r>
-        <w:t xml:space="preserve">37.</w:t>
+        <w:t xml:space="preserve">38.</w:t>
       </w:r>
       <w:r>
         <w:t xml:space="preserve"> </w:t>
@@ -3431,7 +3484,7 @@
         <w:pStyle w:val="Bibliography"/>
       </w:pPr>
       <w:r>
-        <w:t xml:space="preserve">38.</w:t>
+        <w:t xml:space="preserve">39.</w:t>
       </w:r>
       <w:r>
         <w:t xml:space="preserve"> </w:t>
@@ -4406,9 +4459,6 @@
     <w:abstractNumId w:val="991"/>
   </w:num>
   <w:num w:numId="1011">
-    <w:abstractNumId w:val="991"/>
-  </w:num>
-  <w:num w:numId="1012">
     <w:abstractNumId w:val="991"/>
   </w:num>
 </w:numbering>

</xml_diff>

<commit_message>
Update cite keys now that we're using paperpile
</commit_message>
<xml_diff>
--- a/ms/ms.docx
+++ b/ms/ms.docx
@@ -7,31 +7,31 @@
         <w:pStyle w:val="Title"/>
       </w:pPr>
       <w:r>
-        <w:t xml:space="preserve">Connecting</w:t>
-      </w:r>
-      <w:r>
-        <w:t xml:space="preserve"> </w:t>
-      </w:r>
-      <w:r>
-        <w:t xml:space="preserve">our</w:t>
-      </w:r>
-      <w:r>
-        <w:t xml:space="preserve"> </w:t>
-      </w:r>
-      <w:r>
-        <w:t xml:space="preserve">models</w:t>
-      </w:r>
-      <w:r>
-        <w:t xml:space="preserve"> </w:t>
-      </w:r>
-      <w:r>
-        <w:t xml:space="preserve">for</w:t>
-      </w:r>
-      <w:r>
-        <w:t xml:space="preserve"> </w:t>
-      </w:r>
-      <w:r>
-        <w:t xml:space="preserve">calculated</w:t>
+        <w:t xml:space="preserve">A</w:t>
+      </w:r>
+      <w:r>
+        <w:t xml:space="preserve"> </w:t>
+      </w:r>
+      <w:r>
+        <w:t xml:space="preserve">systems-modelling</w:t>
+      </w:r>
+      <w:r>
+        <w:t xml:space="preserve"> </w:t>
+      </w:r>
+      <w:r>
+        <w:t xml:space="preserve">approach</w:t>
+      </w:r>
+      <w:r>
+        <w:t xml:space="preserve"> </w:t>
+      </w:r>
+      <w:r>
+        <w:t xml:space="preserve">to</w:t>
+      </w:r>
+      <w:r>
+        <w:t xml:space="preserve"> </w:t>
+      </w:r>
+      <w:r>
+        <w:t xml:space="preserve">predict</w:t>
       </w:r>
       <w:r>
         <w:t xml:space="preserve"> </w:t>
@@ -73,46 +73,67 @@
           <w:b/>
           <w:bCs/>
         </w:rPr>
-        <w:t xml:space="preserve">Alternative Titles</w:t>
-      </w:r>
-      <w:r>
-        <w:t xml:space="preserve">: (just brainstorming)</w:t>
-      </w:r>
-      <w:r>
-        <w:t xml:space="preserve"> </w:t>
-      </w:r>
-      <w:r>
-        <w:t xml:space="preserve">- Integrated modeling approaches for predicting the impacts of extreme heat on communities</w:t>
+        <w:t xml:space="preserve">Target Journal</w:t>
+      </w:r>
+      <w:r>
+        <w:t xml:space="preserve">:</w:t>
+      </w:r>
+      <w:r>
+        <w:t xml:space="preserve"> </w:t>
+      </w:r>
+      <w:r>
+        <w:rPr>
+          <w:i/>
+          <w:iCs/>
+        </w:rPr>
+        <w:t xml:space="preserve">Trends in Ecology and Evolution</w:t>
+      </w:r>
+      <w:r>
+        <w:t xml:space="preserve">, Opinion</w:t>
+      </w:r>
+      <w:r>
+        <w:t xml:space="preserve"> </w:t>
+      </w:r>
+      <w:r>
+        <w:t xml:space="preserve">https://www.cell.com/trends/ecology-evolution/authors</w:t>
+      </w:r>
+    </w:p>
+    <w:p>
+      <w:pPr>
+        <w:pStyle w:val="BodyText"/>
+      </w:pPr>
+      <w:r>
+        <w:t xml:space="preserve">Abstract: 100-120 words</w:t>
       </w:r>
       <w:r>
         <w:br/>
       </w:r>
       <w:r>
-        <w:t xml:space="preserve">- Thermal tolerance landscapes for populations and communities: applications in a changing world</w:t>
+        <w:t xml:space="preserve">Highlights: Provide a short collection of 3-5 statements that concisely convey to the reader the recent advances in the field, including emerging concepts and/or distinctions, that constitute a main motivation for the discussion developed in the article. This summary is prominently featured on the first page of the article, thus allowing readers to immediately get a sense of the current status of the field.</w:t>
       </w:r>
       <w:r>
         <w:br/>
       </w:r>
       <w:r>
-        <w:t xml:space="preserve">- An integrated modelling approach for predicting the impacts of extreme heat on communities</w:t>
+        <w:t xml:space="preserve">Word Count: 3500 words (this limit does not include text in the boxes, glossary, abstract, references, tables or figure legends)</w:t>
       </w:r>
       <w:r>
         <w:br/>
       </w:r>
       <w:r>
-        <w:t xml:space="preserve">- Predicting the resilience of species interactions under extreme heat now and into the future</w:t>
+        <w:t xml:space="preserve">References: 80-100</w:t>
       </w:r>
       <w:r>
         <w:br/>
       </w:r>
       <w:r>
-        <w:t xml:space="preserve">- Calculated responses to the biological impacts of extreme heat: the need to connect our models (Mike) (Dan likes this one as well) </w:t>
-      </w:r>
-      <w:r>
-        <w:t xml:space="preserve"> </w:t>
-      </w:r>
-      <w:r>
-        <w:t xml:space="preserve">- Predicting the resilience of species interactions under extreme heat</w:t>
+        <w:t xml:space="preserve">Outstanding Questions: 350 words</w:t>
+      </w:r>
+      <w:r>
+        <w:br/>
+      </w:r>
+      <w:r>
+        <w:t xml:space="preserve">Glossary: 500 words</w:t>
       </w:r>
       <w:r>
         <w:br/>
@@ -127,70 +148,60 @@
           <w:b/>
           <w:bCs/>
         </w:rPr>
-        <w:t xml:space="preserve">Target Journal</w:t>
+        <w:t xml:space="preserve">Alternative homes</w:t>
       </w:r>
       <w:r>
         <w:t xml:space="preserve">:</w:t>
       </w:r>
-      <w:r>
-        <w:t xml:space="preserve"> </w:t>
-      </w:r>
-      <w:r>
-        <w:rPr>
-          <w:i/>
-          <w:iCs/>
-        </w:rPr>
-        <w:t xml:space="preserve">Trends in Ecology and Evolution</w:t>
-      </w:r>
-      <w:r>
-        <w:t xml:space="preserve">, Opinion</w:t>
-      </w:r>
-      <w:r>
-        <w:t xml:space="preserve"> </w:t>
-      </w:r>
-      <w:r>
-        <w:t xml:space="preserve">https://www.cell.com/trends/ecology-evolution/authors</w:t>
-      </w:r>
     </w:p>
     <w:p>
       <w:pPr>
         <w:pStyle w:val="BodyText"/>
       </w:pPr>
       <w:r>
-        <w:t xml:space="preserve">Abstract: 100-120 words</w:t>
+        <w:rPr>
+          <w:i/>
+          <w:iCs/>
+        </w:rPr>
+        <w:t xml:space="preserve">Nature Ecology and Evolution</w:t>
+      </w:r>
+      <w:r>
+        <w:t xml:space="preserve"> </w:t>
+      </w:r>
+      <w:r>
+        <w:t xml:space="preserve">(Perspective) - 3000-4000 words, 4-6 display items: https://www.nature.com/natecolevol/content</w:t>
       </w:r>
       <w:r>
         <w:br/>
       </w:r>
       <w:r>
-        <w:t xml:space="preserve">Highlights: Provide a short collection of 3-5 statements that concisely convey to the reader the recent advances in the field, including emerging concepts and/or distinctions, that constitute a main motivation for the discussion developed in the article. This summary is prominently featured on the first page of the article, thus allowing readers to immediately get a sense of the current status of the field.</w:t>
+        <w:rPr>
+          <w:i/>
+          <w:iCs/>
+        </w:rPr>
+        <w:t xml:space="preserve">Global Change Biology</w:t>
+      </w:r>
+      <w:r>
+        <w:t xml:space="preserve"> </w:t>
+      </w:r>
+      <w:r>
+        <w:t xml:space="preserve">- 3000 (Mini Review)-5000 (Opinion) words (https://onlinelibrary.wiley.com/page/journal/13652486/homepage/forauthors.html)</w:t>
       </w:r>
       <w:r>
         <w:br/>
       </w:r>
       <w:r>
-        <w:t xml:space="preserve">Word Count: 3500 words (this limit does not include text in the boxes, glossary, abstract, references, tables or figure legends)</w:t>
-      </w:r>
-      <w:r>
-        <w:br/>
-      </w:r>
-      <w:r>
-        <w:t xml:space="preserve">References: 80-100</w:t>
-      </w:r>
-      <w:r>
-        <w:br/>
-      </w:r>
-      <w:r>
-        <w:t xml:space="preserve">Outstanding Questions: 350 words</w:t>
-      </w:r>
-      <w:r>
-        <w:br/>
-      </w:r>
-      <w:r>
-        <w:t xml:space="preserve">Glossary: 500 words</w:t>
-      </w:r>
-      <w:r>
-        <w:br/>
+        <w:rPr>
+          <w:i/>
+          <w:iCs/>
+        </w:rPr>
+        <w:t xml:space="preserve">Ecology Letters</w:t>
+      </w:r>
+      <w:r>
+        <w:t xml:space="preserve"> </w:t>
+      </w:r>
+      <w:r>
+        <w:t xml:space="preserve">(Perspective) - up to 7500 words if needed.</w:t>
       </w:r>
     </w:p>
     <w:p>
@@ -202,60 +213,129 @@
           <w:b/>
           <w:bCs/>
         </w:rPr>
-        <w:t xml:space="preserve">Alternative homes</w:t>
+        <w:t xml:space="preserve">Structure Overview - Sections</w:t>
       </w:r>
       <w:r>
         <w:t xml:space="preserve">:</w:t>
       </w:r>
+      <w:r>
+        <w:br/>
+      </w:r>
+      <w:r>
+        <w:t xml:space="preserve">Proposed Outline:</w:t>
+      </w:r>
+      <w:r>
+        <w:t xml:space="preserve"> </w:t>
+      </w:r>
+      <w:r>
+        <w:t xml:space="preserve">• A need for a mechanistically-informed modelling framework for predicting the effects of extreme heat on community assemblages in natural and managed landscapes (Dan) (~ 500 words - First Draft Done)</w:t>
+      </w:r>
+      <w:r>
+        <w:br/>
+      </w:r>
+      <w:r>
+        <w:t xml:space="preserve">• The next wave of climate models that incorporate feedbacks between biological systems and the atmosphere (Mike, Belinda)</w:t>
+      </w:r>
+      <w:r>
+        <w:br/>
+      </w:r>
+      <w:r>
+        <w:t xml:space="preserve">• Biophysics to the</w:t>
+      </w:r>
+      <w:r>
+        <w:t xml:space="preserve"> </w:t>
+      </w:r>
+      <w:r>
+        <w:t xml:space="preserve">‘</w:t>
+      </w:r>
+      <w:r>
+        <w:t xml:space="preserve">rescue</w:t>
+      </w:r>
+      <w:r>
+        <w:t xml:space="preserve">’</w:t>
+      </w:r>
+      <w:r>
+        <w:t xml:space="preserve">: realistic community wide exposure to extreme heat and dynamic energy budget theory (Mike, Belinda)</w:t>
+      </w:r>
+      <w:r>
+        <w:br/>
+      </w:r>
+      <w:r>
+        <w:t xml:space="preserve">• Capturing the balance between physiological damage and repair to predict multi-species thermal sensitivity (Dan, Adrienne) (~300-500 words)</w:t>
+      </w:r>
+      <w:r>
+        <w:br/>
+      </w:r>
+      <w:r>
+        <w:t xml:space="preserve">• Mechanistic approaches that</w:t>
+      </w:r>
+      <w:r>
+        <w:t xml:space="preserve"> </w:t>
+      </w:r>
+      <w:r>
+        <w:t xml:space="preserve">‘</w:t>
+      </w:r>
+      <w:r>
+        <w:t xml:space="preserve">speak</w:t>
+      </w:r>
+      <w:r>
+        <w:t xml:space="preserve">’</w:t>
+      </w:r>
+      <w:r>
+        <w:t xml:space="preserve"> </w:t>
+      </w:r>
+      <w:r>
+        <w:t xml:space="preserve">to population and community ecology under extreme heat (Margie) (~300-500 words)</w:t>
+      </w:r>
+      <w:r>
+        <w:br/>
+      </w:r>
+      <w:r>
+        <w:t xml:space="preserve">• Incorporating environmental feedback to evaluate resilience of biological systems to extreme heat (Brajesh, Brendan, James, Everyone else who wants to contribute) (~500 words)</w:t>
+      </w:r>
+      <w:r>
+        <w:br/>
+      </w:r>
+      <w:r>
+        <w:t xml:space="preserve">•</w:t>
+      </w:r>
+      <w:r>
+        <w:t xml:space="preserve"> </w:t>
+      </w:r>
+      <w:r>
+        <w:t xml:space="preserve">‘</w:t>
+      </w:r>
+      <w:r>
+        <w:t xml:space="preserve">Hot</w:t>
+      </w:r>
+      <w:r>
+        <w:t xml:space="preserve">’</w:t>
+      </w:r>
+      <w:r>
+        <w:t xml:space="preserve"> </w:t>
+      </w:r>
+      <w:r>
+        <w:t xml:space="preserve">solutions for a changing world (Alison, Owen and Belinda, Mike, Anyone else!) (~300-500 words)</w:t>
+      </w:r>
+      <w:r>
+        <w:br/>
+      </w:r>
+      <w:r>
+        <w:t xml:space="preserve">• Interacting species interacting with people: social-ecological systems (Steven and Xuemei) (~300-500 words)</w:t>
+      </w:r>
+      <w:r>
+        <w:br/>
+      </w:r>
+      <w:r>
+        <w:t xml:space="preserve">• Future directions: modelling challenges, gaps and possible solutions (Mike, Belinda, Dan, Ary, Braj, Everyone) (~300-500 words)</w:t>
+      </w:r>
     </w:p>
     <w:p>
       <w:pPr>
         <w:pStyle w:val="BodyText"/>
       </w:pPr>
       <w:r>
-        <w:rPr>
-          <w:i/>
-          <w:iCs/>
-        </w:rPr>
-        <w:t xml:space="preserve">Nature Ecology and Evolution</w:t>
-      </w:r>
-      <w:r>
-        <w:t xml:space="preserve"> </w:t>
-      </w:r>
-      <w:r>
-        <w:t xml:space="preserve">(Perspective) - 3000-4000 words, 4-6 display items: https://www.nature.com/natecolevol/content</w:t>
-      </w:r>
-      <w:r>
-        <w:br/>
-      </w:r>
-      <w:r>
-        <w:rPr>
-          <w:i/>
-          <w:iCs/>
-        </w:rPr>
-        <w:t xml:space="preserve">Global Change Biology</w:t>
-      </w:r>
-      <w:r>
-        <w:t xml:space="preserve"> </w:t>
-      </w:r>
-      <w:r>
-        <w:t xml:space="preserve">- 3000 (Mini Review)-5000 (Opinion) words (https://onlinelibrary.wiley.com/page/journal/13652486/homepage/forauthors.html)</w:t>
-      </w:r>
-      <w:r>
-        <w:br/>
-      </w:r>
-      <w:r>
-        <w:rPr>
-          <w:i/>
-          <w:iCs/>
-        </w:rPr>
-        <w:t xml:space="preserve">Ecology Letters</w:t>
-      </w:r>
-      <w:r>
-        <w:t xml:space="preserve"> </w:t>
-      </w:r>
-      <w:r>
-        <w:t xml:space="preserve">(Perspective) - up to 7500 words if needed.</w:t>
+        <w:t xml:space="preserve">We will also have three figures and two boxes as part of the paper that discuss / demonstrate the following:</w:t>
       </w:r>
     </w:p>
     <w:p>
@@ -263,158 +343,19 @@
         <w:pStyle w:val="BodyText"/>
       </w:pPr>
       <w:r>
-        <w:rPr>
-          <w:b/>
-          <w:bCs/>
-        </w:rPr>
-        <w:t xml:space="preserve">Structure Overview - Sections</w:t>
-      </w:r>
-      <w:r>
-        <w:t xml:space="preserve">:</w:t>
-      </w:r>
-      <w:r>
-        <w:br/>
-      </w:r>
-      <w:r>
-        <w:t xml:space="preserve">- Abstract (Dan) (~120 words - First Draft Done)</w:t>
-      </w:r>
-      <w:r>
-        <w:br/>
-      </w:r>
-      <w:r>
-        <w:t xml:space="preserve">- A need for a mechanistically informed modelling framework for predicting the effects of extreme heat on community assemblages (Dan) (~ 500 words - First Draft Done)</w:t>
-      </w:r>
-      <w:r>
-        <w:br/>
-      </w:r>
-      <w:r>
-        <w:t xml:space="preserve">- The next wave of climate models (Mike, Belinda)</w:t>
-      </w:r>
-      <w:r>
-        <w:br/>
-      </w:r>
-      <w:r>
-        <w:t xml:space="preserve">- Building thermal biology into biosphere/interaction models</w:t>
-      </w:r>
-      <w:r>
-        <w:br/>
-      </w:r>
-      <w:r>
-        <w:t xml:space="preserve">- Capturing the balance between physiological</w:t>
-      </w:r>
-      <w:r>
-        <w:t xml:space="preserve"> </w:t>
-      </w:r>
-      <w:r>
-        <w:rPr>
-          <w:i/>
-          <w:iCs/>
-        </w:rPr>
-        <w:t xml:space="preserve">damage</w:t>
-      </w:r>
-      <w:r>
-        <w:t xml:space="preserve"> </w:t>
-      </w:r>
-      <w:r>
-        <w:t xml:space="preserve">and</w:t>
-      </w:r>
-      <w:r>
-        <w:t xml:space="preserve"> </w:t>
-      </w:r>
-      <w:r>
-        <w:rPr>
-          <w:i/>
-          <w:iCs/>
-        </w:rPr>
-        <w:t xml:space="preserve">repair</w:t>
-      </w:r>
-      <w:r>
-        <w:t xml:space="preserve"> </w:t>
-      </w:r>
-      <w:r>
-        <w:t xml:space="preserve">to predict multi-species thermal sensitivity (Dan, Adrienne) (~300-500 words)</w:t>
-      </w:r>
-      <w:r>
-        <w:br/>
-      </w:r>
-      <w:r>
-        <w:t xml:space="preserve">- Biophysics to the rescue: realistic community wide</w:t>
-      </w:r>
-      <w:r>
-        <w:t xml:space="preserve"> </w:t>
-      </w:r>
-      <w:r>
-        <w:rPr>
-          <w:i/>
-          <w:iCs/>
-        </w:rPr>
-        <w:t xml:space="preserve">exposure</w:t>
-      </w:r>
-      <w:r>
-        <w:t xml:space="preserve"> </w:t>
-      </w:r>
-      <w:r>
-        <w:t xml:space="preserve">to extreme heat and Dynamic Energy Budget models (Mike, Belinda) (~300-500 word)</w:t>
-      </w:r>
-      <w:r>
-        <w:br/>
-      </w:r>
-      <w:r>
-        <w:t xml:space="preserve">- Mechanistic approaches that</w:t>
-      </w:r>
-      <w:r>
-        <w:t xml:space="preserve"> </w:t>
-      </w:r>
-      <w:r>
-        <w:t xml:space="preserve">‘</w:t>
-      </w:r>
-      <w:r>
-        <w:t xml:space="preserve">speak</w:t>
-      </w:r>
-      <w:r>
-        <w:t xml:space="preserve">’</w:t>
-      </w:r>
-      <w:r>
-        <w:t xml:space="preserve"> </w:t>
-      </w:r>
-      <w:r>
-        <w:t xml:space="preserve">to population and community ecology under extreme heat (Margie) (~300-500 words)</w:t>
-      </w:r>
-      <w:r>
-        <w:br/>
-      </w:r>
-      <w:r>
-        <w:t xml:space="preserve">- Incorporating context-dependent environmental feedback to evaluate resilience to extreme heat (Brajesh, Brendan, James, Everyone else who wants to contribute) (~500 words)</w:t>
-      </w:r>
-      <w:r>
-        <w:br/>
-      </w:r>
-      <w:r>
-        <w:t xml:space="preserve">-</w:t>
-      </w:r>
-      <w:r>
-        <w:t xml:space="preserve"> </w:t>
-      </w:r>
-      <w:r>
-        <w:t xml:space="preserve">‘</w:t>
-      </w:r>
-      <w:r>
-        <w:t xml:space="preserve">Hot</w:t>
-      </w:r>
-      <w:r>
-        <w:t xml:space="preserve">’</w:t>
-      </w:r>
-      <w:r>
-        <w:t xml:space="preserve"> </w:t>
-      </w:r>
-      <w:r>
-        <w:t xml:space="preserve">solutions for a changing world (Alison, Owen and Belinda, Mike, Anyone else!) (~500 words)</w:t>
-      </w:r>
-      <w:r>
-        <w:br/>
-      </w:r>
-      <w:r>
-        <w:t xml:space="preserve">- Future directions: modelling challenges, gaps and possible solutions (Mike, Belinda, Dan, Ary, Braj, Everyone) (~300-500 words)</w:t>
+        <w:t xml:space="preserve">Figure 1: Broad conceptual overview of different modelling frameworks and how they can be integrated (see above)</w:t>
+      </w:r>
+      <w:r>
+        <w:t xml:space="preserve"> </w:t>
+      </w:r>
+      <w:r>
+        <w:t xml:space="preserve">Box 1: Box 1 will provide an example of the distinct ways models can be coupled and used to test different scenarios and interventions. We will have a figure within this box.</w:t>
+      </w:r>
+      <w:r>
+        <w:t xml:space="preserve"> </w:t>
+      </w:r>
+      <w:r>
+        <w:t xml:space="preserve">Box 2: Box 2 will show how to incorporate different environmental contexts and how plasticity of individual organisms and evolution can be integrated into model components. We will have a figure within this box.</w:t>
       </w:r>
     </w:p>
     <w:p>
@@ -426,7 +367,7 @@
         </w:numPr>
       </w:pPr>
       <w:r>
-        <w:t xml:space="preserve">add bios to proposal</w:t>
+        <w:t xml:space="preserve">add cell modelling</w:t>
       </w:r>
     </w:p>
     <w:p>
@@ -438,18 +379,6 @@
         </w:numPr>
       </w:pPr>
       <w:r>
-        <w:t xml:space="preserve">add cell modelling</w:t>
-      </w:r>
-    </w:p>
-    <w:p>
-      <w:pPr>
-        <w:pStyle w:val="Compact"/>
-        <w:numPr>
-          <w:ilvl w:val="0"/>
-          <w:numId w:val="1001"/>
-        </w:numPr>
-      </w:pPr>
-      <w:r>
         <w:t xml:space="preserve">organise weekly writing catchups to push forward. Agree it won’t be done by end of year</w:t>
       </w:r>
     </w:p>
@@ -475,7 +404,7 @@
         <w:pStyle w:val="FirstParagraph"/>
       </w:pPr>
       <w:r>
-        <w:t xml:space="preserve">Anthropogenic climate change is leading to more frequent and extreme heat waves. These short-term but large-scale events are radically re-shaping interactions among organisms, impacting biodiversity, community composition and ecosystem services crucial to natural systems and food security. Predicting heat wave impacts on interacting species requires an understanding of the processes driving differential exposure and sensitivity of organisms to extreme heat events in a life-cycle context. But this, in turn, requires a modelling framework that can capture species-specific responses via habitat-mediated microclimates, biophysics of body temperature, physiological sensitivity, and its effects on vital rates across ontogeny and thermal history. We show how existing models in disparate fields can be linked to achieve this level of understanding to allow calculated responses to extreme heat now and into the future. </w:t>
+        <w:t xml:space="preserve">Anthropogenic climate change is leading to more frequent and extreme heat waves. These short-term but large-scale events are radically re-shaping interactions among organisms, impacting biodiversity, community composition and ecosystem services crucial to natural systems and food security. Predicting heat wave impacts on interacting species requires an understanding of the processes driving differential exposure and sensitivity of organisms to extreme heat events in a life-cycle context. Key to developing this predictive capacity is the formulation of a modelling framework that captures species-specific responses. This includes knowledge of habitat-mediated changes in microclimates, biophysical controls on body temperature, temperature sensitivity of organismal physiology, and how the effects of heatwaves vary depending on thermal history. We show how existing models in disparate fields can be linked to achieve this level of understanding to allow for calculated responses to extreme heat now and into the future with implications for socioecological systems more generally.  </w:t>
       </w:r>
     </w:p>
     <w:bookmarkEnd w:id="20"/>
@@ -1209,7 +1138,7 @@
         <w:t xml:space="preserve"> </w:t>
       </w:r>
       <w:r>
-        <w:t xml:space="preserve">[10]</w:t>
+        <w:t xml:space="preserve">[36]</w:t>
       </w:r>
       <w:r>
         <w:t xml:space="preserve">, so we should be careful to make our narrative distinct. The limitation of this study is it lacks the focus on modelling frameworks, so I think us distinguishing how we link these concepts back into the model would be quite novel and distinguish ourselves from them..</w:t>
@@ -1279,7 +1208,7 @@
         <w:t xml:space="preserve"> </w:t>
       </w:r>
       <w:r>
-        <w:t xml:space="preserve">[36]</w:t>
+        <w:t xml:space="preserve">[37]</w:t>
       </w:r>
       <w:r>
         <w:t xml:space="preserve"> </w:t>
@@ -1372,7 +1301,7 @@
         <w:t xml:space="preserve"> </w:t>
       </w:r>
       <w:r>
-        <w:t xml:space="preserve">[37]</w:t>
+        <w:t xml:space="preserve">[38]</w:t>
       </w:r>
       <w:r>
         <w:t xml:space="preserve">. The paper provides a framework for modelling soil plant interactions</w:t>
@@ -1429,7 +1358,7 @@
         <w:t xml:space="preserve"> </w:t>
       </w:r>
       <w:r>
-        <w:t xml:space="preserve">[38]</w:t>
+        <w:t xml:space="preserve">[39]</w:t>
       </w:r>
       <w:r>
         <w:t xml:space="preserve"> </w:t>
@@ -1472,7 +1401,7 @@
         <w:t xml:space="preserve"> </w:t>
       </w:r>
       <w:r>
-        <w:t xml:space="preserve">[38]</w:t>
+        <w:t xml:space="preserve">[39]</w:t>
       </w:r>
       <w:r>
         <w:t xml:space="preserve"> </w:t>
@@ -1489,6 +1418,23 @@
       </w:pPr>
       <w:r>
         <w:t xml:space="preserve">Acclimation can impact thermal sensitivity of plants and animals (Everyone)</w:t>
+      </w:r>
+    </w:p>
+    <w:p>
+      <w:pPr>
+        <w:pStyle w:val="FirstParagraph"/>
+      </w:pPr>
+      <w:r>
+        <w:t xml:space="preserve">A very important paper</w:t>
+      </w:r>
+      <w:r>
+        <w:t xml:space="preserve"> </w:t>
+      </w:r>
+      <w:r>
+        <w:t xml:space="preserve">[40]</w:t>
+      </w:r>
+      <w:r>
+        <w:t xml:space="preserve">. Connects heat tolerance to population matrix models. And, shows acclimation responses (heat hardening).</w:t>
       </w:r>
     </w:p>
     <w:bookmarkEnd w:id="27"/>
@@ -1704,7 +1650,7 @@
       </w:r>
     </w:p>
     <w:bookmarkEnd w:id="33"/>
-    <w:bookmarkStart w:id="34" w:name="X013a5c9faa6938751e83865a615a83e4f32a47b"/>
+    <w:bookmarkStart w:id="34" w:name="Xebf598c8d62402443261428456b1d908a4618f8"/>
     <w:p>
       <w:pPr>
         <w:pStyle w:val="Heading4"/>
@@ -1723,7 +1669,7 @@
         <w:t xml:space="preserve"> </w:t>
       </w:r>
       <w:r>
-        <w:t xml:space="preserve">[39]</w:t>
+        <w:t xml:space="preserve">[41]</w:t>
       </w:r>
       <w:r>
         <w:t xml:space="preserve"> </w:t>
@@ -1751,7 +1697,7 @@
     </w:p>
     <w:bookmarkEnd w:id="35"/>
     <w:bookmarkEnd w:id="36"/>
-    <w:bookmarkStart w:id="77" w:name="references"/>
+    <w:bookmarkStart w:id="79" w:name="references"/>
     <w:p>
       <w:pPr>
         <w:pStyle w:val="Heading1"/>
@@ -1760,8 +1706,8 @@
         <w:t xml:space="preserve">References</w:t>
       </w:r>
     </w:p>
-    <w:bookmarkStart w:id="76" w:name="refs"/>
-    <w:bookmarkStart w:id="37" w:name="ref-barriopedro2023heat"/>
+    <w:bookmarkStart w:id="78" w:name="refs"/>
+    <w:bookmarkStart w:id="37" w:name="ref-Barriopedro2023"/>
     <w:p>
       <w:pPr>
         <w:pStyle w:val="Bibliography"/>
@@ -1802,7 +1748,7 @@
           <w:i/>
           <w:iCs/>
         </w:rPr>
-        <w:t xml:space="preserve">Reviews of Geophysics</w:t>
+        <w:t xml:space="preserve">Rev. Geophys.</w:t>
       </w:r>
       <w:r>
         <w:t xml:space="preserve"> </w:t>
@@ -1812,7 +1758,7 @@
       </w:r>
     </w:p>
     <w:bookmarkEnd w:id="37"/>
-    <w:bookmarkStart w:id="38" w:name="ref-aglas2024recent"/>
+    <w:bookmarkStart w:id="38" w:name="ref-Aglas-Leitner2024"/>
     <w:p>
       <w:pPr>
         <w:pStyle w:val="Bibliography"/>
@@ -1860,7 +1806,7 @@
       </w:r>
     </w:p>
     <w:bookmarkEnd w:id="38"/>
-    <w:bookmarkStart w:id="39" w:name="ref-reichstein2007reduction"/>
+    <w:bookmarkStart w:id="39" w:name="ref-Reichstein2007"/>
     <w:p>
       <w:pPr>
         <w:pStyle w:val="Bibliography"/>
@@ -1911,7 +1857,7 @@
       </w:r>
     </w:p>
     <w:bookmarkEnd w:id="39"/>
-    <w:bookmarkStart w:id="40" w:name="ref-margalef2020relationship"/>
+    <w:bookmarkStart w:id="40" w:name="ref-Margalef-Marrase2020"/>
     <w:p>
       <w:pPr>
         <w:pStyle w:val="Bibliography"/>
@@ -1962,7 +1908,7 @@
       </w:r>
     </w:p>
     <w:bookmarkEnd w:id="40"/>
-    <w:bookmarkStart w:id="41" w:name="ref-kazenel2024heat"/>
+    <w:bookmarkStart w:id="41" w:name="ref-Kazenel2024"/>
     <w:p>
       <w:pPr>
         <w:pStyle w:val="Bibliography"/>
@@ -2007,7 +1953,7 @@
       </w:r>
     </w:p>
     <w:bookmarkEnd w:id="41"/>
-    <w:bookmarkStart w:id="42" w:name="ref-zhao2017temperature"/>
+    <w:bookmarkStart w:id="42" w:name="ref-Zhao2017"/>
     <w:p>
       <w:pPr>
         <w:pStyle w:val="Bibliography"/>
@@ -2048,7 +1994,7 @@
           <w:i/>
           <w:iCs/>
         </w:rPr>
-        <w:t xml:space="preserve">Proceedings of the National Academy of sciences</w:t>
+        <w:t xml:space="preserve">Proc. Natl. Acad. Sci. U. S. A.</w:t>
       </w:r>
       <w:r>
         <w:t xml:space="preserve"> </w:t>
@@ -2058,7 +2004,7 @@
       </w:r>
     </w:p>
     <w:bookmarkEnd w:id="42"/>
-    <w:bookmarkStart w:id="43" w:name="ref-tito2018global"/>
+    <w:bookmarkStart w:id="43" w:name="ref-Tito2018"/>
     <w:p>
       <w:pPr>
         <w:pStyle w:val="Bibliography"/>
@@ -2109,7 +2055,7 @@
       </w:r>
     </w:p>
     <w:bookmarkEnd w:id="43"/>
-    <w:bookmarkStart w:id="44" w:name="ref-bastos2014analysing"/>
+    <w:bookmarkStart w:id="44" w:name="ref-Bastos2014"/>
     <w:p>
       <w:pPr>
         <w:pStyle w:val="Bibliography"/>
@@ -2160,7 +2106,7 @@
       </w:r>
     </w:p>
     <w:bookmarkEnd w:id="44"/>
-    <w:bookmarkStart w:id="45" w:name="ref-hesketh2023extreme"/>
+    <w:bookmarkStart w:id="45" w:name="ref-Hesketh2023"/>
     <w:p>
       <w:pPr>
         <w:pStyle w:val="Bibliography"/>
@@ -2175,7 +2121,7 @@
         <w:t xml:space="preserve">	</w:t>
       </w:r>
       <w:r>
-        <w:t xml:space="preserve">Hesketh, A.V. and Harley, C.D. (2023) Extreme heatwave drives topography-dependent patterns of mortality in a bed-forming intertidal barnacle, with implications for associated community structure.</w:t>
+        <w:t xml:space="preserve">Hesketh, A.V. and Harley, C.D.G. (2023) Extreme heatwave drives topography-dependent patterns of mortality in a bed-forming intertidal barnacle, with implications for associated community structure.</w:t>
       </w:r>
       <w:r>
         <w:t xml:space="preserve"> </w:t>
@@ -2195,7 +2141,7 @@
       </w:r>
     </w:p>
     <w:bookmarkEnd w:id="45"/>
-    <w:bookmarkStart w:id="46" w:name="ref-martinez2024ecological"/>
+    <w:bookmarkStart w:id="46" w:name="ref-Martinez2023"/>
     <w:p>
       <w:pPr>
         <w:pStyle w:val="Bibliography"/>
@@ -2210,21 +2156,37 @@
         <w:t xml:space="preserve">	</w:t>
       </w:r>
       <w:r>
-        <w:t xml:space="preserve">Martı́nez-De León, G. and Thakur, M.P. (2024) Ecological debts induced by heat extremes.</w:t>
-      </w:r>
-      <w:r>
-        <w:t xml:space="preserve"> </w:t>
-      </w:r>
-      <w:r>
-        <w:rPr>
-          <w:i/>
-          <w:iCs/>
-        </w:rPr>
-        <w:t xml:space="preserve">Trends in Ecology &amp; Evolution</w:t>
+        <w:t xml:space="preserve">Martinez, L.D.</w:t>
+      </w:r>
+      <w:r>
+        <w:t xml:space="preserve"> </w:t>
+      </w:r>
+      <w:r>
+        <w:rPr>
+          <w:i/>
+          <w:iCs/>
+        </w:rPr>
+        <w:t xml:space="preserve">et al.</w:t>
+      </w:r>
+      <w:r>
+        <w:t xml:space="preserve"> </w:t>
+      </w:r>
+      <w:r>
+        <w:t xml:space="preserve">(2023) Effect of simulated heat waves on the behaviour of two mirid predators.</w:t>
+      </w:r>
+      <w:r>
+        <w:t xml:space="preserve"> </w:t>
+      </w:r>
+      <w:r>
+        <w:rPr>
+          <w:i/>
+          <w:iCs/>
+        </w:rPr>
+        <w:t xml:space="preserve">J. Appl. Entomol.</w:t>
       </w:r>
     </w:p>
     <w:bookmarkEnd w:id="46"/>
-    <w:bookmarkStart w:id="47" w:name="ref-rezende2020predicting"/>
+    <w:bookmarkStart w:id="47" w:name="ref-Rezende2020"/>
     <w:p>
       <w:pPr>
         <w:pStyle w:val="Bibliography"/>
@@ -2275,7 +2237,7 @@
       </w:r>
     </w:p>
     <w:bookmarkEnd w:id="47"/>
-    <w:bookmarkStart w:id="48" w:name="ref-orsted2024thermal"/>
+    <w:bookmarkStart w:id="48" w:name="ref-Orsted2024"/>
     <w:p>
       <w:pPr>
         <w:pStyle w:val="Bibliography"/>
@@ -2316,7 +2278,7 @@
           <w:i/>
           <w:iCs/>
         </w:rPr>
-        <w:t xml:space="preserve">Ecology Letters</w:t>
+        <w:t xml:space="preserve">Ecol. Lett.</w:t>
       </w:r>
       <w:r>
         <w:t xml:space="preserve"> </w:t>
@@ -2326,7 +2288,7 @@
       </w:r>
     </w:p>
     <w:bookmarkEnd w:id="48"/>
-    <w:bookmarkStart w:id="49" w:name="ref-lopez2024heat"/>
+    <w:bookmarkStart w:id="49" w:name="ref-Lopez-Goldar2024"/>
     <w:p>
       <w:pPr>
         <w:pStyle w:val="Bibliography"/>
@@ -2367,11 +2329,11 @@
           <w:i/>
           <w:iCs/>
         </w:rPr>
-        <w:t xml:space="preserve">Plant, Cell &amp; Environment</w:t>
+        <w:t xml:space="preserve">Plant Cell Environ.</w:t>
       </w:r>
     </w:p>
     <w:bookmarkEnd w:id="49"/>
-    <w:bookmarkStart w:id="50" w:name="ref-huỳnh2024heatwave"/>
+    <w:bookmarkStart w:id="50" w:name="ref-Huynh2024"/>
     <w:p>
       <w:pPr>
         <w:pStyle w:val="Bibliography"/>
@@ -2412,7 +2374,7 @@
           <w:i/>
           <w:iCs/>
         </w:rPr>
-        <w:t xml:space="preserve">Ecology and Evolution</w:t>
+        <w:t xml:space="preserve">Ecol. Evol.</w:t>
       </w:r>
       <w:r>
         <w:t xml:space="preserve"> </w:t>
@@ -2422,7 +2384,7 @@
       </w:r>
     </w:p>
     <w:bookmarkEnd w:id="50"/>
-    <w:bookmarkStart w:id="51" w:name="ref-trivedi2022plant"/>
+    <w:bookmarkStart w:id="51" w:name="ref-Trivedi2022"/>
     <w:p>
       <w:pPr>
         <w:pStyle w:val="Bibliography"/>
@@ -2463,7 +2425,7 @@
           <w:i/>
           <w:iCs/>
         </w:rPr>
-        <w:t xml:space="preserve">New Phytologist</w:t>
+        <w:t xml:space="preserve">New Phytol.</w:t>
       </w:r>
       <w:r>
         <w:t xml:space="preserve"> </w:t>
@@ -2473,7 +2435,7 @@
       </w:r>
     </w:p>
     <w:bookmarkEnd w:id="51"/>
-    <w:bookmarkStart w:id="52" w:name="ref-kooijman2010dynamic"/>
+    <w:bookmarkStart w:id="52" w:name="ref-Kooijman2010"/>
     <w:p>
       <w:pPr>
         <w:pStyle w:val="Bibliography"/>
@@ -2505,7 +2467,7 @@
       </w:r>
     </w:p>
     <w:bookmarkEnd w:id="52"/>
-    <w:bookmarkStart w:id="53" w:name="ref-kearney2009mechanistic"/>
+    <w:bookmarkStart w:id="53" w:name="ref-Kearney2009b"/>
     <w:p>
       <w:pPr>
         <w:pStyle w:val="Bibliography"/>
@@ -2530,7 +2492,7 @@
           <w:i/>
           <w:iCs/>
         </w:rPr>
-        <w:t xml:space="preserve">Ecology letters</w:t>
+        <w:t xml:space="preserve">Ecol. Lett.</w:t>
       </w:r>
       <w:r>
         <w:t xml:space="preserve"> </w:t>
@@ -2540,7 +2502,7 @@
       </w:r>
     </w:p>
     <w:bookmarkEnd w:id="53"/>
-    <w:bookmarkStart w:id="54" w:name="ref-jusup2024untapped"/>
+    <w:bookmarkStart w:id="54" w:name="ref-Jusup2024"/>
     <w:p>
       <w:pPr>
         <w:pStyle w:val="Bibliography"/>
@@ -2565,11 +2527,11 @@
           <w:i/>
           <w:iCs/>
         </w:rPr>
-        <w:t xml:space="preserve">arXiv preprint arXiv:2408.13998</w:t>
+        <w:t xml:space="preserve">arXiv preprint arXiv:2408. 13998</w:t>
       </w:r>
     </w:p>
     <w:bookmarkEnd w:id="54"/>
-    <w:bookmarkStart w:id="55" w:name="ref-kearney2024fast"/>
+    <w:bookmarkStart w:id="55" w:name="ref-Kearney2024"/>
     <w:p>
       <w:pPr>
         <w:pStyle w:val="Bibliography"/>
@@ -2584,21 +2546,30 @@
         <w:t xml:space="preserve">	</w:t>
       </w:r>
       <w:r>
-        <w:t xml:space="preserve">Kearney, M.R. and Leigh, A. (2024) Fast, accurate and accessible calculations of leaf temperature and its physiological consequences with NicheMapR.</w:t>
-      </w:r>
-      <w:r>
-        <w:t xml:space="preserve"> </w:t>
-      </w:r>
-      <w:r>
-        <w:rPr>
-          <w:i/>
-          <w:iCs/>
-        </w:rPr>
-        <w:t xml:space="preserve">Methods in Ecology and Evolution</w:t>
+        <w:t xml:space="preserve">Kearney, M.R. and Leigh, A. (2024) Fast, accurate and accessible calculations of leaf temperature and its physiological consequences with</w:t>
+      </w:r>
+      <w:r>
+        <w:t xml:space="preserve"> </w:t>
+      </w:r>
+      <w:r>
+        <w:t xml:space="preserve">NicheMapR</w:t>
+      </w:r>
+      <w:r>
+        <w:t xml:space="preserve">.</w:t>
+      </w:r>
+      <w:r>
+        <w:t xml:space="preserve"> </w:t>
+      </w:r>
+      <w:r>
+        <w:rPr>
+          <w:i/>
+          <w:iCs/>
+        </w:rPr>
+        <w:t xml:space="preserve">Methods Ecol. Evol.</w:t>
       </w:r>
     </w:p>
     <w:bookmarkEnd w:id="55"/>
-    <w:bookmarkStart w:id="56" w:name="ref-briscoe2023mechanistic"/>
+    <w:bookmarkStart w:id="56" w:name="ref-Briscoe2023"/>
     <w:p>
       <w:pPr>
         <w:pStyle w:val="Bibliography"/>
@@ -2649,7 +2620,7 @@
       </w:r>
     </w:p>
     <w:bookmarkEnd w:id="56"/>
-    <w:bookmarkStart w:id="57" w:name="ref-rezende2014tolerance"/>
+    <w:bookmarkStart w:id="57" w:name="ref-Rezende2014"/>
     <w:p>
       <w:pPr>
         <w:pStyle w:val="Bibliography"/>
@@ -2690,7 +2661,7 @@
           <w:i/>
           <w:iCs/>
         </w:rPr>
-        <w:t xml:space="preserve">Functional Ecology</w:t>
+        <w:t xml:space="preserve">Funct. Ecol.</w:t>
       </w:r>
       <w:r>
         <w:t xml:space="preserve"> </w:t>
@@ -2700,7 +2671,7 @@
       </w:r>
     </w:p>
     <w:bookmarkEnd w:id="57"/>
-    <w:bookmarkStart w:id="58" w:name="ref-delmas2019analysing"/>
+    <w:bookmarkStart w:id="58" w:name="ref-Delmas2019"/>
     <w:p>
       <w:pPr>
         <w:pStyle w:val="Bibliography"/>
@@ -2741,7 +2712,7 @@
           <w:i/>
           <w:iCs/>
         </w:rPr>
-        <w:t xml:space="preserve">Biological Reviews</w:t>
+        <w:t xml:space="preserve">Biol. Rev. Camb. Philos. Soc.</w:t>
       </w:r>
       <w:r>
         <w:t xml:space="preserve"> </w:t>
@@ -2751,7 +2722,7 @@
       </w:r>
     </w:p>
     <w:bookmarkEnd w:id="58"/>
-    <w:bookmarkStart w:id="59" w:name="ref-godoy2019coexistence"/>
+    <w:bookmarkStart w:id="59" w:name="ref-Godoy2019"/>
     <w:p>
       <w:pPr>
         <w:pStyle w:val="Bibliography"/>
@@ -2776,7 +2747,7 @@
           <w:i/>
           <w:iCs/>
         </w:rPr>
-        <w:t xml:space="preserve">Functional Ecology</w:t>
+        <w:t xml:space="preserve">Funct. Ecol.</w:t>
       </w:r>
       <w:r>
         <w:t xml:space="preserve"> </w:t>
@@ -2786,7 +2757,7 @@
       </w:r>
     </w:p>
     <w:bookmarkEnd w:id="59"/>
-    <w:bookmarkStart w:id="60" w:name="ref-poisot2021global"/>
+    <w:bookmarkStart w:id="60" w:name="ref-Poisot2021"/>
     <w:p>
       <w:pPr>
         <w:pStyle w:val="Bibliography"/>
@@ -2827,7 +2798,7 @@
           <w:i/>
           <w:iCs/>
         </w:rPr>
-        <w:t xml:space="preserve">Journal of Biogeography</w:t>
+        <w:t xml:space="preserve">J. Biogeogr.</w:t>
       </w:r>
       <w:r>
         <w:t xml:space="preserve"> </w:t>
@@ -2837,7 +2808,7 @@
       </w:r>
     </w:p>
     <w:bookmarkEnd w:id="60"/>
-    <w:bookmarkStart w:id="61" w:name="ref-hui2019invade"/>
+    <w:bookmarkStart w:id="61" w:name="ref-Hui2019"/>
     <w:p>
       <w:pPr>
         <w:pStyle w:val="Bibliography"/>
@@ -2862,7 +2833,7 @@
           <w:i/>
           <w:iCs/>
         </w:rPr>
-        <w:t xml:space="preserve">Trends in ecology &amp; evolution</w:t>
+        <w:t xml:space="preserve">Trends Ecol. Evol.</w:t>
       </w:r>
       <w:r>
         <w:t xml:space="preserve"> </w:t>
@@ -2872,7 +2843,7 @@
       </w:r>
     </w:p>
     <w:bookmarkEnd w:id="61"/>
-    <w:bookmarkStart w:id="62" w:name="ref-gomez2023role"/>
+    <w:bookmarkStart w:id="62" w:name="ref-Gomez2023"/>
     <w:p>
       <w:pPr>
         <w:pStyle w:val="Bibliography"/>
@@ -2913,7 +2884,7 @@
           <w:i/>
           <w:iCs/>
         </w:rPr>
-        <w:t xml:space="preserve">Ecology Letters</w:t>
+        <w:t xml:space="preserve">Ecol. Lett.</w:t>
       </w:r>
       <w:r>
         <w:t xml:space="preserve"> </w:t>
@@ -2923,7 +2894,7 @@
       </w:r>
     </w:p>
     <w:bookmarkEnd w:id="62"/>
-    <w:bookmarkStart w:id="63" w:name="ref-lytle2023matrix"/>
+    <w:bookmarkStart w:id="63" w:name="ref-Lytle2023"/>
     <w:p>
       <w:pPr>
         <w:pStyle w:val="Bibliography"/>
@@ -2958,7 +2929,7 @@
       </w:r>
     </w:p>
     <w:bookmarkEnd w:id="63"/>
-    <w:bookmarkStart w:id="64" w:name="ref-petsopoulos2021using"/>
+    <w:bookmarkStart w:id="64" w:name="ref-Petsopoulos2021"/>
     <w:p>
       <w:pPr>
         <w:pStyle w:val="Bibliography"/>
@@ -2999,11 +2970,11 @@
           <w:i/>
           <w:iCs/>
         </w:rPr>
-        <w:t xml:space="preserve">Ecological Entomology</w:t>
+        <w:t xml:space="preserve">Ecol. Entomol.</w:t>
       </w:r>
     </w:p>
     <w:bookmarkEnd w:id="64"/>
-    <w:bookmarkStart w:id="65" w:name="ref-dale2021quantitative"/>
+    <w:bookmarkStart w:id="65" w:name="ref-Dale2021"/>
     <w:p>
       <w:pPr>
         <w:pStyle w:val="Bibliography"/>
@@ -3018,7 +2989,7 @@
         <w:t xml:space="preserve">	</w:t>
       </w:r>
       <w:r>
-        <w:t xml:space="preserve">Dale, M.R. and Fortin, M.-J. (2021)</w:t>
+        <w:t xml:space="preserve">Dale, M.R.T. and Fortin, M.-J. (2021)</w:t>
       </w:r>
       <w:r>
         <w:t xml:space="preserve"> </w:t>
@@ -3035,7 +3006,7 @@
       </w:r>
     </w:p>
     <w:bookmarkEnd w:id="65"/>
-    <w:bookmarkStart w:id="66" w:name="ref-lu2023food"/>
+    <w:bookmarkStart w:id="66" w:name="ref-Lu2023"/>
     <w:p>
       <w:pPr>
         <w:pStyle w:val="Bibliography"/>
@@ -3076,7 +3047,7 @@
           <w:i/>
           <w:iCs/>
         </w:rPr>
-        <w:t xml:space="preserve">Current Biology</w:t>
+        <w:t xml:space="preserve">Curr. Biol.</w:t>
       </w:r>
       <w:r>
         <w:t xml:space="preserve"> </w:t>
@@ -3086,7 +3057,7 @@
       </w:r>
     </w:p>
     <w:bookmarkEnd w:id="66"/>
-    <w:bookmarkStart w:id="67" w:name="ref-carrara2015inferring"/>
+    <w:bookmarkStart w:id="67" w:name="ref-Carrara2015"/>
     <w:p>
       <w:pPr>
         <w:pStyle w:val="Bibliography"/>
@@ -3127,7 +3098,7 @@
           <w:i/>
           <w:iCs/>
         </w:rPr>
-        <w:t xml:space="preserve">Methods in Ecology and Evolution</w:t>
+        <w:t xml:space="preserve">Methods Ecol. Evol.</w:t>
       </w:r>
       <w:r>
         <w:t xml:space="preserve"> </w:t>
@@ -3137,7 +3108,7 @@
       </w:r>
     </w:p>
     <w:bookmarkEnd w:id="67"/>
-    <w:bookmarkStart w:id="68" w:name="ref-vitali2022disruption"/>
+    <w:bookmarkStart w:id="68" w:name="ref-Vitali2022"/>
     <w:p>
       <w:pPr>
         <w:pStyle w:val="Bibliography"/>
@@ -3188,7 +3159,7 @@
       </w:r>
     </w:p>
     <w:bookmarkEnd w:id="68"/>
-    <w:bookmarkStart w:id="69" w:name="ref-riva2023toward"/>
+    <w:bookmarkStart w:id="69" w:name="ref-Riva2023"/>
     <w:p>
       <w:pPr>
         <w:pStyle w:val="Bibliography"/>
@@ -3229,7 +3200,7 @@
           <w:i/>
           <w:iCs/>
         </w:rPr>
-        <w:t xml:space="preserve">Science Advances</w:t>
+        <w:t xml:space="preserve">Sci. Adv.</w:t>
       </w:r>
       <w:r>
         <w:t xml:space="preserve"> </w:t>
@@ -3239,7 +3210,7 @@
       </w:r>
     </w:p>
     <w:bookmarkEnd w:id="69"/>
-    <w:bookmarkStart w:id="70" w:name="ref-terry2020finding"/>
+    <w:bookmarkStart w:id="70" w:name="ref-Terry2020"/>
     <w:p>
       <w:pPr>
         <w:pStyle w:val="Bibliography"/>
@@ -3274,7 +3245,7 @@
       </w:r>
     </w:p>
     <w:bookmarkEnd w:id="70"/>
-    <w:bookmarkStart w:id="71" w:name="ref-weiss2022disentangling"/>
+    <w:bookmarkStart w:id="71" w:name="ref-Weiss-Lehman2022"/>
     <w:p>
       <w:pPr>
         <w:pStyle w:val="Bibliography"/>
@@ -3315,7 +3286,7 @@
           <w:i/>
           <w:iCs/>
         </w:rPr>
-        <w:t xml:space="preserve">Ecology Letters</w:t>
+        <w:t xml:space="preserve">Ecol. Lett.</w:t>
       </w:r>
       <w:r>
         <w:t xml:space="preserve"> </w:t>
@@ -3325,7 +3296,7 @@
       </w:r>
     </w:p>
     <w:bookmarkEnd w:id="71"/>
-    <w:bookmarkStart w:id="72" w:name="ref-marquez2007virus"/>
+    <w:bookmarkStart w:id="72" w:name="ref-Martinez-De_Leon2024"/>
     <w:p>
       <w:pPr>
         <w:pStyle w:val="Bibliography"/>
@@ -3340,6 +3311,35 @@
         <w:t xml:space="preserve">	</w:t>
       </w:r>
       <w:r>
+        <w:t xml:space="preserve">Martínez-De León, G. and Thakur, M.P. (2024) Ecological debts induced by heat extremes.</w:t>
+      </w:r>
+      <w:r>
+        <w:t xml:space="preserve"> </w:t>
+      </w:r>
+      <w:r>
+        <w:rPr>
+          <w:i/>
+          <w:iCs/>
+        </w:rPr>
+        <w:t xml:space="preserve">Trends Ecol. Evol.</w:t>
+      </w:r>
+    </w:p>
+    <w:bookmarkEnd w:id="72"/>
+    <w:bookmarkStart w:id="73" w:name="ref-Marquez2007"/>
+    <w:p>
+      <w:pPr>
+        <w:pStyle w:val="Bibliography"/>
+      </w:pPr>
+      <w:r>
+        <w:t xml:space="preserve">37.</w:t>
+      </w:r>
+      <w:r>
+        <w:t xml:space="preserve"> </w:t>
+      </w:r>
+      <w:r>
+        <w:t xml:space="preserve">	</w:t>
+      </w:r>
+      <w:r>
         <w:t xml:space="preserve">Márquez, L.M.</w:t>
       </w:r>
       <w:r>
@@ -3375,14 +3375,14 @@
         <w:t xml:space="preserve">315, 513–515</w:t>
       </w:r>
     </w:p>
-    <w:bookmarkEnd w:id="72"/>
-    <w:bookmarkStart w:id="73" w:name="ref-zou2024time"/>
+    <w:bookmarkEnd w:id="73"/>
+    <w:bookmarkStart w:id="74" w:name="ref-Zou2024"/>
     <w:p>
       <w:pPr>
         <w:pStyle w:val="Bibliography"/>
       </w:pPr>
       <w:r>
-        <w:t xml:space="preserve">37.</w:t>
+        <w:t xml:space="preserve">38.</w:t>
       </w:r>
       <w:r>
         <w:t xml:space="preserve"> </w:t>
@@ -3417,7 +3417,7 @@
           <w:i/>
           <w:iCs/>
         </w:rPr>
-        <w:t xml:space="preserve">Ecology Letters</w:t>
+        <w:t xml:space="preserve">Ecol. Lett.</w:t>
       </w:r>
       <w:r>
         <w:t xml:space="preserve"> </w:t>
@@ -3426,14 +3426,14 @@
         <w:t xml:space="preserve">27, e14432</w:t>
       </w:r>
     </w:p>
-    <w:bookmarkEnd w:id="73"/>
-    <w:bookmarkStart w:id="74" w:name="ref-li2023interspecific"/>
+    <w:bookmarkEnd w:id="74"/>
+    <w:bookmarkStart w:id="75" w:name="ref-Li2023"/>
     <w:p>
       <w:pPr>
         <w:pStyle w:val="Bibliography"/>
       </w:pPr>
       <w:r>
-        <w:t xml:space="preserve">38.</w:t>
+        <w:t xml:space="preserve">39.</w:t>
       </w:r>
       <w:r>
         <w:t xml:space="preserve"> </w:t>
@@ -3468,7 +3468,7 @@
           <w:i/>
           <w:iCs/>
         </w:rPr>
-        <w:t xml:space="preserve">Journal of Thermal Biology</w:t>
+        <w:t xml:space="preserve">J. Therm. Biol.</w:t>
       </w:r>
       <w:r>
         <w:t xml:space="preserve"> </w:t>
@@ -3477,14 +3477,14 @@
         <w:t xml:space="preserve">114, 103583</w:t>
       </w:r>
     </w:p>
-    <w:bookmarkEnd w:id="74"/>
-    <w:bookmarkStart w:id="75" w:name="ref-kearney2009integrating"/>
+    <w:bookmarkEnd w:id="75"/>
+    <w:bookmarkStart w:id="76" w:name="ref-Zhu2024"/>
     <w:p>
       <w:pPr>
         <w:pStyle w:val="Bibliography"/>
       </w:pPr>
       <w:r>
-        <w:t xml:space="preserve">39.</w:t>
+        <w:t xml:space="preserve">40.</w:t>
       </w:r>
       <w:r>
         <w:t xml:space="preserve"> </w:t>
@@ -3493,6 +3493,57 @@
         <w:t xml:space="preserve">	</w:t>
       </w:r>
       <w:r>
+        <w:t xml:space="preserve">Zhu, L.</w:t>
+      </w:r>
+      <w:r>
+        <w:t xml:space="preserve"> </w:t>
+      </w:r>
+      <w:r>
+        <w:rPr>
+          <w:i/>
+          <w:iCs/>
+        </w:rPr>
+        <w:t xml:space="preserve">et al.</w:t>
+      </w:r>
+      <w:r>
+        <w:t xml:space="preserve"> </w:t>
+      </w:r>
+      <w:r>
+        <w:t xml:space="preserve">(2024) Responses of a widespread pest insect to extreme high temperatures are stage-dependent and divergent among seasonal cohorts.</w:t>
+      </w:r>
+      <w:r>
+        <w:t xml:space="preserve"> </w:t>
+      </w:r>
+      <w:r>
+        <w:rPr>
+          <w:i/>
+          <w:iCs/>
+        </w:rPr>
+        <w:t xml:space="preserve">Funct. Ecol.</w:t>
+      </w:r>
+      <w:r>
+        <w:t xml:space="preserve"> </w:t>
+      </w:r>
+      <w:r>
+        <w:t xml:space="preserve">39, 165–180</w:t>
+      </w:r>
+    </w:p>
+    <w:bookmarkEnd w:id="76"/>
+    <w:bookmarkStart w:id="77" w:name="ref-Kearney2009a"/>
+    <w:p>
+      <w:pPr>
+        <w:pStyle w:val="Bibliography"/>
+      </w:pPr>
+      <w:r>
+        <w:t xml:space="preserve">41.</w:t>
+      </w:r>
+      <w:r>
+        <w:t xml:space="preserve"> </w:t>
+      </w:r>
+      <w:r>
+        <w:t xml:space="preserve">	</w:t>
+      </w:r>
+      <w:r>
         <w:t xml:space="preserve">Kearney, M.</w:t>
       </w:r>
       <w:r>
@@ -3519,7 +3570,7 @@
           <w:i/>
           <w:iCs/>
         </w:rPr>
-        <w:t xml:space="preserve">Functional Ecology</w:t>
+        <w:t xml:space="preserve">Funct. Ecol.</w:t>
       </w:r>
       <w:r>
         <w:t xml:space="preserve"> </w:t>
@@ -3528,9 +3579,9 @@
         <w:t xml:space="preserve">23, 528–538</w:t>
       </w:r>
     </w:p>
-    <w:bookmarkEnd w:id="75"/>
-    <w:bookmarkEnd w:id="76"/>
     <w:bookmarkEnd w:id="77"/>
+    <w:bookmarkEnd w:id="78"/>
+    <w:bookmarkEnd w:id="79"/>
     <w:sectPr>
       <w:pgSz w:h="15840" w:w="12240"/>
       <w:pgMar w:bottom="851" w:footer="720" w:gutter="0" w:header="720" w:left="851" w:right="851" w:top="851"/>

</xml_diff>